<commit_message>
v2.9.0: al importar, preguntar si pasar los archivos a la carpeta de playlists; lo importado sale de Playlists nuevas
Co-Authored-By: Claude Opus 5.5 <noreply@anthropic.com>
Claude-Session: https://claude.ai/code/session_015yBEKQCgZonTqt5J2V9uZ5
</commit_message>
<xml_diff>
--- a/docs/BrainOrder - Manual de usuario.docx
+++ b/docs/BrainOrder - Manual de usuario.docx
@@ -73,7 +73,7 @@
           <w:sz w:val="26"/>
           <w:szCs w:val="26"/>
         </w:rPr>
-        <w:t xml:space="preserve">Versión 2.8.0</w:t>
+        <w:t xml:space="preserve">Versión 2.9.0</w:t>
       </w:r>
     </w:p>
     <w:p>
@@ -83,7 +83,7 @@
           <w:sz w:val="22"/>
           <w:szCs w:val="22"/>
         </w:rPr>
-        <w:t xml:space="preserve">Actualizado: 18 de octubre de 2026 · macOS y Windows</w:t>
+        <w:t xml:space="preserve">Actualizado: 19 de octubre de 2026 · macOS y Windows</w:t>
       </w:r>
     </w:p>
     <w:p>
@@ -356,7 +356,7 @@
           <w:sz w:val="22"/>
           <w:szCs w:val="22"/>
         </w:rPr>
-        <w:t xml:space="preserve">	10</w:t>
+        <w:t xml:space="preserve">	11</w:t>
       </w:r>
     </w:p>
     <w:p>
@@ -382,7 +382,7 @@
           <w:sz w:val="22"/>
           <w:szCs w:val="22"/>
         </w:rPr>
-        <w:t xml:space="preserve">	11</w:t>
+        <w:t xml:space="preserve">	12</w:t>
       </w:r>
     </w:p>
     <w:p>
@@ -434,7 +434,7 @@
           <w:sz w:val="22"/>
           <w:szCs w:val="22"/>
         </w:rPr>
-        <w:t xml:space="preserve">	13</w:t>
+        <w:t xml:space="preserve">	14</w:t>
       </w:r>
     </w:p>
     <w:p>
@@ -460,7 +460,7 @@
           <w:sz w:val="22"/>
           <w:szCs w:val="22"/>
         </w:rPr>
-        <w:t xml:space="preserve">	14</w:t>
+        <w:t xml:space="preserve">	15</w:t>
       </w:r>
     </w:p>
     <w:p>
@@ -486,7 +486,7 @@
           <w:sz w:val="22"/>
           <w:szCs w:val="22"/>
         </w:rPr>
-        <w:t xml:space="preserve">	14</w:t>
+        <w:t xml:space="preserve">	15</w:t>
       </w:r>
     </w:p>
     <w:p>
@@ -512,7 +512,7 @@
           <w:sz w:val="22"/>
           <w:szCs w:val="22"/>
         </w:rPr>
-        <w:t xml:space="preserve">	14</w:t>
+        <w:t xml:space="preserve">	15</w:t>
       </w:r>
     </w:p>
     <w:p>
@@ -538,7 +538,7 @@
           <w:sz w:val="22"/>
           <w:szCs w:val="22"/>
         </w:rPr>
-        <w:t xml:space="preserve">	15</w:t>
+        <w:t xml:space="preserve">	16</w:t>
       </w:r>
     </w:p>
     <w:p>
@@ -564,7 +564,7 @@
           <w:sz w:val="22"/>
           <w:szCs w:val="22"/>
         </w:rPr>
-        <w:t xml:space="preserve">	15</w:t>
+        <w:t xml:space="preserve">	16</w:t>
       </w:r>
     </w:p>
     <w:p>
@@ -590,7 +590,7 @@
           <w:sz w:val="22"/>
           <w:szCs w:val="22"/>
         </w:rPr>
-        <w:t xml:space="preserve">	16</w:t>
+        <w:t xml:space="preserve">	17</w:t>
       </w:r>
     </w:p>
     <w:p>
@@ -616,7 +616,7 @@
           <w:sz w:val="22"/>
           <w:szCs w:val="22"/>
         </w:rPr>
-        <w:t xml:space="preserve">	17</w:t>
+        <w:t xml:space="preserve">	18</w:t>
       </w:r>
     </w:p>
     <w:p>
@@ -5306,6 +5306,191 @@
                 <w:szCs w:val="19"/>
               </w:rPr>
               <w:t xml:space="preserve">Queda solo en BrainOrder y tus programas de DJ. Una carpeta importada así se llena sola con lo que pongas en ella; una playlist de un programa de DJ se relee de ese programa.</w:t>
+            </w:r>
+          </w:p>
+        </w:tc>
+      </w:tr>
+    </w:tbl>
+    <w:p>
+      <w:pPr>
+        <w:spacing w:after="120"/>
+      </w:pPr>
+    </w:p>
+    <w:p>
+      <w:pPr>
+        <w:pStyle w:val="Heading2"/>
+      </w:pPr>
+      <w:r>
+        <w:t xml:space="preserve">¿Paso sus archivos a tu carpeta de playlists?</w:t>
+      </w:r>
+    </w:p>
+    <w:p>
+      <w:pPr>
+        <w:spacing w:after="120" w:line="276"/>
+      </w:pPr>
+      <w:r>
+        <w:t xml:space="preserve">Si la carpeta no está en tu carpeta de playlists (por ejemplo </w:t>
+      </w:r>
+      <w:r>
+        <w:rPr>
+          <w:rFonts w:ascii="Courier New" w:cs="Courier New" w:eastAsia="Courier New" w:hAnsi="Courier New"/>
+          <w:color w:val="1F2A44"/>
+          <w:sz w:val="19"/>
+          <w:szCs w:val="19"/>
+        </w:rPr>
+        <w:t xml:space="preserve">DJ Library/Funk</w:t>
+      </w:r>
+      <w:r>
+        <w:t xml:space="preserve">), o si es una playlist de un programa de DJ, BrainOrder te pregunta si pasa sus archivos a </w:t>
+      </w:r>
+      <w:r>
+        <w:rPr>
+          <w:rFonts w:ascii="Courier New" w:cs="Courier New" w:eastAsia="Courier New" w:hAnsi="Courier New"/>
+          <w:color w:val="1F2A44"/>
+          <w:sz w:val="19"/>
+          <w:szCs w:val="19"/>
+        </w:rPr>
+        <w:t xml:space="preserve">&lt;carpeta de playlists&gt;/&lt;nombre&gt;</w:t>
+      </w:r>
+      <w:r>
+        <w:t xml:space="preserve">, junto a tus otras playlists:</w:t>
+      </w:r>
+    </w:p>
+    <w:p>
+      <w:pPr>
+        <w:pStyle w:val="ListParagraph"/>
+        <w:numPr>
+          <w:ilvl w:val="0"/>
+          <w:numId w:val="2"/>
+        </w:numPr>
+        <w:spacing w:after="60" w:line="276"/>
+      </w:pPr>
+      <w:r>
+        <w:rPr>
+          <w:b/>
+          <w:bCs/>
+        </w:rPr>
+        <w:t xml:space="preserve">Sí, moverlos</w:t>
+      </w:r>
+      <w:r>
+        <w:t xml:space="preserve">: se mueven los archivos (los de subcarpetas también), se corrigen sus rutas en Rekordbox y tus otros programas (cerrados) y queda en </w:t>
+      </w:r>
+      <w:r>
+        <w:rPr>
+          <w:b/>
+          <w:bCs/>
+        </w:rPr>
+        <w:t xml:space="preserve">Historial</w:t>
+      </w:r>
+      <w:r>
+        <w:t xml:space="preserve"> para deshacer. Si era una carpeta y quedó vacía, se elimina.</w:t>
+      </w:r>
+    </w:p>
+    <w:p>
+      <w:pPr>
+        <w:pStyle w:val="ListParagraph"/>
+        <w:numPr>
+          <w:ilvl w:val="0"/>
+          <w:numId w:val="2"/>
+        </w:numPr>
+        <w:spacing w:after="60" w:line="276"/>
+      </w:pPr>
+      <w:r>
+        <w:rPr>
+          <w:b/>
+          <w:bCs/>
+        </w:rPr>
+        <w:t xml:space="preserve">No, dejarlos donde están</w:t>
+      </w:r>
+      <w:r>
+        <w:t xml:space="preserve">: la playlist usa los archivos donde están.</w:t>
+      </w:r>
+    </w:p>
+    <w:p>
+      <w:pPr>
+        <w:pStyle w:val="ListParagraph"/>
+        <w:numPr>
+          <w:ilvl w:val="0"/>
+          <w:numId w:val="2"/>
+        </w:numPr>
+        <w:spacing w:after="60" w:line="276"/>
+      </w:pPr>
+      <w:r>
+        <w:t xml:space="preserve">Si la carpeta ya está en tu carpeta de playlists, no te pregunta. Si una canción de una playlist de DJ también está en otra playlist, se mueve igual; </w:t>
+      </w:r>
+      <w:r>
+        <w:rPr>
+          <w:b/>
+          <w:bCs/>
+        </w:rPr>
+        <w:t xml:space="preserve">Reorganizar</w:t>
+      </w:r>
+      <w:r>
+        <w:t xml:space="preserve"> la puede devolver.</w:t>
+      </w:r>
+    </w:p>
+    <w:tbl>
+      <w:tblPr>
+        <w:tblW w:type="dxa" w:w="9360"/>
+        <w:tblBorders>
+          <w:top w:val="single" w:color="auto" w:sz="4"/>
+          <w:left w:val="single" w:color="auto" w:sz="4"/>
+          <w:bottom w:val="single" w:color="auto" w:sz="4"/>
+          <w:right w:val="single" w:color="auto" w:sz="4"/>
+          <w:insideH w:val="single" w:color="auto" w:sz="4"/>
+          <w:insideV w:val="single" w:color="auto" w:sz="4"/>
+        </w:tblBorders>
+      </w:tblPr>
+      <w:tblGrid>
+        <w:gridCol w:w="9360"/>
+      </w:tblGrid>
+      <w:tr>
+        <w:tc>
+          <w:tcPr>
+            <w:tcW w:type="dxa" w:w="9360"/>
+            <w:tcBorders>
+              <w:top w:val="none" w:color="FFFFFF" w:sz="0"/>
+              <w:left w:val="single" w:color="7FB800" w:sz="24"/>
+              <w:bottom w:val="none" w:color="FFFFFF" w:sz="0"/>
+              <w:right w:val="none" w:color="FFFFFF" w:sz="0"/>
+            </w:tcBorders>
+            <w:shd w:fill="EEF7D6" w:color="auto" w:val="clear"/>
+            <w:tcMar>
+              <w:top w:type="dxa" w:w="120"/>
+              <w:left w:type="dxa" w:w="200"/>
+              <w:bottom w:type="dxa" w:w="120"/>
+              <w:right w:type="dxa" w:w="200"/>
+            </w:tcMar>
+          </w:tcPr>
+          <w:p>
+            <w:pPr>
+              <w:spacing w:after="60"/>
+            </w:pPr>
+            <w:r>
+              <w:rPr>
+                <w:b/>
+                <w:bCs/>
+                <w:color w:val="7FB800"/>
+              </w:rPr>
+              <w:t xml:space="preserve">✅ Resultado</w:t>
+            </w:r>
+          </w:p>
+          <w:p>
+            <w:pPr>
+              <w:spacing w:after="40" w:line="264"/>
+            </w:pPr>
+            <w:r>
+              <w:t xml:space="preserve">Lo que importas </w:t>
+            </w:r>
+            <w:r>
+              <w:rPr>
+                <w:b/>
+                <w:bCs/>
+              </w:rPr>
+              <w:t xml:space="preserve">sale de «Playlists nuevas»</w:t>
+            </w:r>
+            <w:r>
+              <w:t xml:space="preserve">, aunque lo hayas creado en Spotify y la carpeta original siga existiendo.</w:t>
             </w:r>
           </w:p>
         </w:tc>
@@ -9579,7 +9764,7 @@
                 <w:sz w:val="24"/>
                 <w:szCs w:val="24"/>
               </w:rPr>
-              <w:t xml:space="preserve">v2.8.0</w:t>
+              <w:t xml:space="preserve">v2.9.0</w:t>
             </w:r>
           </w:p>
           <w:p>
@@ -9592,7 +9777,7 @@
                 <w:sz w:val="17"/>
                 <w:szCs w:val="17"/>
               </w:rPr>
-              <w:t xml:space="preserve">18 oct 2026</w:t>
+              <w:t xml:space="preserve">19 oct 2026</w:t>
             </w:r>
           </w:p>
         </w:tc>
@@ -9626,7 +9811,7 @@
                 <w:sz w:val="23"/>
                 <w:szCs w:val="23"/>
               </w:rPr>
-              <w:t xml:space="preserve">Playlists nuevas en todas partes</w:t>
+              <w:t xml:space="preserve">Importar y ordenar de una vez</w:t>
             </w:r>
             <w:r>
               <w:rPr>
@@ -9637,6 +9822,187 @@
                 <w:szCs w:val="18"/>
               </w:rPr>
               <w:t xml:space="preserve">   · versión actual</w:t>
+            </w:r>
+          </w:p>
+        </w:tc>
+      </w:tr>
+    </w:tbl>
+    <w:p>
+      <w:pPr>
+        <w:pStyle w:val="ListParagraph"/>
+        <w:keepNext/>
+        <w:keepLines/>
+        <w:numPr>
+          <w:ilvl w:val="0"/>
+          <w:numId w:val="2"/>
+        </w:numPr>
+        <w:spacing w:after="60" w:line="276"/>
+      </w:pPr>
+      <w:r>
+        <w:t xml:space="preserve">Al importar una carpeta o playlist nueva te pregunta si </w:t>
+      </w:r>
+      <w:r>
+        <w:rPr>
+          <w:b/>
+          <w:bCs/>
+        </w:rPr>
+        <w:t xml:space="preserve">pasa sus archivos a tu carpeta de playlists</w:t>
+      </w:r>
+      <w:r>
+        <w:t xml:space="preserve">, junto a las demás.</w:t>
+      </w:r>
+    </w:p>
+    <w:p>
+      <w:pPr>
+        <w:pStyle w:val="ListParagraph"/>
+        <w:keepNext/>
+        <w:keepLines/>
+        <w:numPr>
+          <w:ilvl w:val="0"/>
+          <w:numId w:val="2"/>
+        </w:numPr>
+        <w:spacing w:after="60" w:line="276"/>
+      </w:pPr>
+      <w:r>
+        <w:t xml:space="preserve">Rutas corregidas en Rekordbox y tus otros programas, con </w:t>
+      </w:r>
+      <w:r>
+        <w:rPr>
+          <w:b/>
+          <w:bCs/>
+        </w:rPr>
+        <w:t xml:space="preserve">Deshacer</w:t>
+      </w:r>
+      <w:r>
+        <w:t xml:space="preserve"> en Historial; la carpeta vieja se elimina si queda vacía.</w:t>
+      </w:r>
+    </w:p>
+    <w:p>
+      <w:pPr>
+        <w:pStyle w:val="ListParagraph"/>
+        <w:keepNext w:val="false"/>
+        <w:keepLines/>
+        <w:numPr>
+          <w:ilvl w:val="0"/>
+          <w:numId w:val="2"/>
+        </w:numPr>
+        <w:spacing w:after="60" w:line="276"/>
+      </w:pPr>
+      <w:r>
+        <w:t xml:space="preserve">Lo que importas </w:t>
+      </w:r>
+      <w:r>
+        <w:rPr>
+          <w:b/>
+          <w:bCs/>
+        </w:rPr>
+        <w:t xml:space="preserve">sale de «Playlists nuevas»</w:t>
+      </w:r>
+      <w:r>
+        <w:t xml:space="preserve">, también si lo creaste en Spotify.</w:t>
+      </w:r>
+    </w:p>
+    <w:p>
+      <w:pPr>
+        <w:spacing w:after="80"/>
+      </w:pPr>
+    </w:p>
+    <w:tbl>
+      <w:tblPr>
+        <w:tblW w:type="dxa" w:w="9360"/>
+        <w:tblBorders>
+          <w:top w:val="single" w:color="auto" w:sz="4"/>
+          <w:left w:val="single" w:color="auto" w:sz="4"/>
+          <w:bottom w:val="single" w:color="auto" w:sz="4"/>
+          <w:right w:val="single" w:color="auto" w:sz="4"/>
+          <w:insideH w:val="single" w:color="auto" w:sz="4"/>
+          <w:insideV w:val="single" w:color="auto" w:sz="4"/>
+        </w:tblBorders>
+      </w:tblPr>
+      <w:tblGrid>
+        <w:gridCol w:w="1900"/>
+        <w:gridCol w:w="7460"/>
+      </w:tblGrid>
+      <w:tr>
+        <w:tc>
+          <w:tcPr>
+            <w:tcW w:type="dxa" w:w="1900"/>
+            <w:tcBorders>
+              <w:top w:val="single" w:color="D5D9E0" w:sz="4"/>
+              <w:left w:val="single" w:color="D5D9E0" w:sz="4"/>
+              <w:bottom w:val="single" w:color="D5D9E0" w:sz="4"/>
+              <w:right w:val="single" w:color="D5D9E0" w:sz="4"/>
+            </w:tcBorders>
+            <w:shd w:fill="1F2A44" w:color="auto" w:val="clear"/>
+            <w:tcMar>
+              <w:top w:type="dxa" w:w="80"/>
+              <w:left w:type="dxa" w:w="140"/>
+              <w:bottom w:type="dxa" w:w="80"/>
+              <w:right w:type="dxa" w:w="140"/>
+            </w:tcMar>
+            <w:vAlign w:val="center"/>
+          </w:tcPr>
+          <w:p>
+            <w:pPr>
+              <w:keepNext/>
+              <w:keepLines/>
+            </w:pPr>
+            <w:r>
+              <w:rPr>
+                <w:b/>
+                <w:bCs/>
+                <w:color w:val="FFFFFF"/>
+                <w:sz w:val="24"/>
+                <w:szCs w:val="24"/>
+              </w:rPr>
+              <w:t xml:space="preserve">v2.8.0</w:t>
+            </w:r>
+          </w:p>
+          <w:p>
+            <w:pPr>
+              <w:keepNext/>
+            </w:pPr>
+            <w:r>
+              <w:rPr>
+                <w:color w:val="FFFFFF"/>
+                <w:sz w:val="17"/>
+                <w:szCs w:val="17"/>
+              </w:rPr>
+              <w:t xml:space="preserve">18 oct 2026</w:t>
+            </w:r>
+          </w:p>
+        </w:tc>
+        <w:tc>
+          <w:tcPr>
+            <w:tcW w:type="dxa" w:w="7460"/>
+            <w:tcBorders>
+              <w:top w:val="single" w:color="D5D9E0" w:sz="4"/>
+              <w:left w:val="single" w:color="D5D9E0" w:sz="4"/>
+              <w:bottom w:val="single" w:color="D5D9E0" w:sz="4"/>
+              <w:right w:val="single" w:color="D5D9E0" w:sz="4"/>
+            </w:tcBorders>
+            <w:shd w:fill="F5F7FA" w:color="auto" w:val="clear"/>
+            <w:tcMar>
+              <w:top w:type="dxa" w:w="80"/>
+              <w:left w:type="dxa" w:w="160"/>
+              <w:bottom w:type="dxa" w:w="80"/>
+              <w:right w:type="dxa" w:w="140"/>
+            </w:tcMar>
+            <w:vAlign w:val="center"/>
+          </w:tcPr>
+          <w:p>
+            <w:pPr>
+              <w:keepNext/>
+            </w:pPr>
+            <w:r>
+              <w:rPr>
+                <w:b/>
+                <w:bCs/>
+                <w:color w:val="1F2A44"/>
+                <w:sz w:val="23"/>
+                <w:szCs w:val="23"/>
+              </w:rPr>
+              <w:t xml:space="preserve">Playlists nuevas en todas partes</w:t>
             </w:r>
           </w:p>
         </w:tc>

</xml_diff>

<commit_message>
v2.9.1: no detectar como nueva la carpeta creada al importar; una sola playlist en Spotify y carpetas vinculadas
Co-Authored-By: Claude Opus 5.5 <noreply@anthropic.com>
Claude-Session: https://claude.ai/code/session_015yBEKQCgZonTqt5J2V9uZ5
</commit_message>
<xml_diff>
--- a/docs/BrainOrder - Manual de usuario.docx
+++ b/docs/BrainOrder - Manual de usuario.docx
@@ -73,7 +73,7 @@
           <w:sz w:val="26"/>
           <w:szCs w:val="26"/>
         </w:rPr>
-        <w:t xml:space="preserve">Versión 2.9.0</w:t>
+        <w:t xml:space="preserve">Versión 2.9.1</w:t>
       </w:r>
     </w:p>
     <w:p>
@@ -408,7 +408,7 @@
           <w:sz w:val="22"/>
           <w:szCs w:val="22"/>
         </w:rPr>
-        <w:t xml:space="preserve">	12</w:t>
+        <w:t xml:space="preserve">	13</w:t>
       </w:r>
     </w:p>
     <w:p>
@@ -5490,7 +5490,7 @@
               <w:t xml:space="preserve">sale de «Playlists nuevas»</w:t>
             </w:r>
             <w:r>
-              <w:t xml:space="preserve">, aunque lo hayas creado en Spotify y la carpeta original siga existiendo.</w:t>
+              <w:t xml:space="preserve">, aunque lo hayas creado en Spotify y la carpeta original siga existiendo. La carpeta que BrainOrder crea al mover tampoco se toma como nueva.</w:t>
             </w:r>
           </w:p>
         </w:tc>
@@ -5500,6 +5500,73 @@
       <w:pPr>
         <w:spacing w:after="120"/>
       </w:pPr>
+    </w:p>
+    <w:p>
+      <w:pPr>
+        <w:pStyle w:val="Heading2"/>
+      </w:pPr>
+      <w:r>
+        <w:t xml:space="preserve">Una sola playlist en Spotify</w:t>
+      </w:r>
+    </w:p>
+    <w:p>
+      <w:pPr>
+        <w:pStyle w:val="ListParagraph"/>
+        <w:numPr>
+          <w:ilvl w:val="0"/>
+          <w:numId w:val="2"/>
+        </w:numPr>
+        <w:spacing w:after="60" w:line="276"/>
+      </w:pPr>
+      <w:r>
+        <w:t xml:space="preserve">Si ya tienes en Spotify una playlist con ese nombre, BrainOrder </w:t>
+      </w:r>
+      <w:r>
+        <w:rPr>
+          <w:b/>
+          <w:bCs/>
+        </w:rPr>
+        <w:t xml:space="preserve">usa esa misma</w:t>
+      </w:r>
+      <w:r>
+        <w:t xml:space="preserve"> y solo agrega las canciones que le falten: nunca crea otra igual.</w:t>
+      </w:r>
+    </w:p>
+    <w:p>
+      <w:pPr>
+        <w:pStyle w:val="ListParagraph"/>
+        <w:numPr>
+          <w:ilvl w:val="0"/>
+          <w:numId w:val="2"/>
+        </w:numPr>
+        <w:spacing w:after="60" w:line="276"/>
+      </w:pPr>
+      <w:r>
+        <w:t xml:space="preserve">Si después agregas canciones a una carpeta que importaste a Spotify, te pregunta: </w:t>
+      </w:r>
+      <w:r>
+        <w:rPr>
+          <w:b/>
+          <w:bCs/>
+        </w:rPr>
+        <w:t xml:space="preserve">«¿Las agrego también a tu playlist de Spotify?»</w:t>
+      </w:r>
+      <w:r>
+        <w:t xml:space="preserve">. Se agregan a la misma playlist y solo las que no estén. Si dices que no, no vuelve a preguntar por esas.</w:t>
+      </w:r>
+    </w:p>
+    <w:p>
+      <w:pPr>
+        <w:pStyle w:val="ListParagraph"/>
+        <w:numPr>
+          <w:ilvl w:val="0"/>
+          <w:numId w:val="2"/>
+        </w:numPr>
+        <w:spacing w:after="60" w:line="276"/>
+      </w:pPr>
+      <w:r>
+        <w:t xml:space="preserve">Las canciones que Organizar trae a esa carpeta no cuentan como «agregadas», porque ya son de la playlist.</w:t>
+      </w:r>
     </w:p>
     <w:p>
       <w:pPr>
@@ -9764,7 +9831,7 @@
                 <w:sz w:val="24"/>
                 <w:szCs w:val="24"/>
               </w:rPr>
-              <w:t xml:space="preserve">v2.9.0</w:t>
+              <w:t xml:space="preserve">v2.9.1</w:t>
             </w:r>
           </w:p>
           <w:p>
@@ -9811,7 +9878,7 @@
                 <w:sz w:val="23"/>
                 <w:szCs w:val="23"/>
               </w:rPr>
-              <w:t xml:space="preserve">Importar y ordenar de una vez</w:t>
+              <w:t xml:space="preserve">Sin duplicados en Spotify</w:t>
             </w:r>
             <w:r>
               <w:rPr>
@@ -9822,6 +9889,157 @@
                 <w:szCs w:val="18"/>
               </w:rPr>
               <w:t xml:space="preserve">   · versión actual</w:t>
+            </w:r>
+          </w:p>
+        </w:tc>
+      </w:tr>
+    </w:tbl>
+    <w:p>
+      <w:pPr>
+        <w:pStyle w:val="ListParagraph"/>
+        <w:keepNext/>
+        <w:keepLines/>
+        <w:numPr>
+          <w:ilvl w:val="0"/>
+          <w:numId w:val="2"/>
+        </w:numPr>
+        <w:spacing w:after="60" w:line="276"/>
+      </w:pPr>
+      <w:r>
+        <w:t xml:space="preserve">La carpeta que crea BrainOrder al importar ya no aparece como «nueva».</w:t>
+      </w:r>
+    </w:p>
+    <w:p>
+      <w:pPr>
+        <w:pStyle w:val="ListParagraph"/>
+        <w:keepNext/>
+        <w:keepLines/>
+        <w:numPr>
+          <w:ilvl w:val="0"/>
+          <w:numId w:val="2"/>
+        </w:numPr>
+        <w:spacing w:after="60" w:line="276"/>
+      </w:pPr>
+      <w:r>
+        <w:t xml:space="preserve">En Spotify nunca se duplica una playlist: si ya existe con ese nombre se usa esa.</w:t>
+      </w:r>
+    </w:p>
+    <w:p>
+      <w:pPr>
+        <w:pStyle w:val="ListParagraph"/>
+        <w:keepNext w:val="false"/>
+        <w:keepLines/>
+        <w:numPr>
+          <w:ilvl w:val="0"/>
+          <w:numId w:val="2"/>
+        </w:numPr>
+        <w:spacing w:after="60" w:line="276"/>
+      </w:pPr>
+      <w:r>
+        <w:t xml:space="preserve">Si agregas canciones a una carpeta importada a Spotify, te pregunta si van a esa misma playlist.</w:t>
+      </w:r>
+    </w:p>
+    <w:p>
+      <w:pPr>
+        <w:spacing w:after="80"/>
+      </w:pPr>
+    </w:p>
+    <w:tbl>
+      <w:tblPr>
+        <w:tblW w:type="dxa" w:w="9360"/>
+        <w:tblBorders>
+          <w:top w:val="single" w:color="auto" w:sz="4"/>
+          <w:left w:val="single" w:color="auto" w:sz="4"/>
+          <w:bottom w:val="single" w:color="auto" w:sz="4"/>
+          <w:right w:val="single" w:color="auto" w:sz="4"/>
+          <w:insideH w:val="single" w:color="auto" w:sz="4"/>
+          <w:insideV w:val="single" w:color="auto" w:sz="4"/>
+        </w:tblBorders>
+      </w:tblPr>
+      <w:tblGrid>
+        <w:gridCol w:w="1900"/>
+        <w:gridCol w:w="7460"/>
+      </w:tblGrid>
+      <w:tr>
+        <w:tc>
+          <w:tcPr>
+            <w:tcW w:type="dxa" w:w="1900"/>
+            <w:tcBorders>
+              <w:top w:val="single" w:color="D5D9E0" w:sz="4"/>
+              <w:left w:val="single" w:color="D5D9E0" w:sz="4"/>
+              <w:bottom w:val="single" w:color="D5D9E0" w:sz="4"/>
+              <w:right w:val="single" w:color="D5D9E0" w:sz="4"/>
+            </w:tcBorders>
+            <w:shd w:fill="1F2A44" w:color="auto" w:val="clear"/>
+            <w:tcMar>
+              <w:top w:type="dxa" w:w="80"/>
+              <w:left w:type="dxa" w:w="140"/>
+              <w:bottom w:type="dxa" w:w="80"/>
+              <w:right w:type="dxa" w:w="140"/>
+            </w:tcMar>
+            <w:vAlign w:val="center"/>
+          </w:tcPr>
+          <w:p>
+            <w:pPr>
+              <w:keepNext/>
+              <w:keepLines/>
+            </w:pPr>
+            <w:r>
+              <w:rPr>
+                <w:b/>
+                <w:bCs/>
+                <w:color w:val="FFFFFF"/>
+                <w:sz w:val="24"/>
+                <w:szCs w:val="24"/>
+              </w:rPr>
+              <w:t xml:space="preserve">v2.9.0</w:t>
+            </w:r>
+          </w:p>
+          <w:p>
+            <w:pPr>
+              <w:keepNext/>
+            </w:pPr>
+            <w:r>
+              <w:rPr>
+                <w:color w:val="FFFFFF"/>
+                <w:sz w:val="17"/>
+                <w:szCs w:val="17"/>
+              </w:rPr>
+              <w:t xml:space="preserve">19 oct 2026</w:t>
+            </w:r>
+          </w:p>
+        </w:tc>
+        <w:tc>
+          <w:tcPr>
+            <w:tcW w:type="dxa" w:w="7460"/>
+            <w:tcBorders>
+              <w:top w:val="single" w:color="D5D9E0" w:sz="4"/>
+              <w:left w:val="single" w:color="D5D9E0" w:sz="4"/>
+              <w:bottom w:val="single" w:color="D5D9E0" w:sz="4"/>
+              <w:right w:val="single" w:color="D5D9E0" w:sz="4"/>
+            </w:tcBorders>
+            <w:shd w:fill="F5F7FA" w:color="auto" w:val="clear"/>
+            <w:tcMar>
+              <w:top w:type="dxa" w:w="80"/>
+              <w:left w:type="dxa" w:w="160"/>
+              <w:bottom w:type="dxa" w:w="80"/>
+              <w:right w:type="dxa" w:w="140"/>
+            </w:tcMar>
+            <w:vAlign w:val="center"/>
+          </w:tcPr>
+          <w:p>
+            <w:pPr>
+              <w:keepNext/>
+            </w:pPr>
+            <w:r>
+              <w:rPr>
+                <w:b/>
+                <w:bCs/>
+                <w:color w:val="1F2A44"/>
+                <w:sz w:val="23"/>
+                <w:szCs w:val="23"/>
+              </w:rPr>
+              <w:t xml:space="preserve">Importar y ordenar de una vez</w:t>
             </w:r>
           </w:p>
         </w:tc>

</xml_diff>

<commit_message>
v2.10.0: cola para Spotify (importar durante la pausa y crearla sola cuando se pueda)
Co-Authored-By: Claude Opus 5.5 <noreply@anthropic.com>
Claude-Session: https://claude.ai/code/session_015yBEKQCgZonTqt5J2V9uZ5
</commit_message>
<xml_diff>
--- a/docs/BrainOrder - Manual de usuario.docx
+++ b/docs/BrainOrder - Manual de usuario.docx
@@ -73,7 +73,7 @@
           <w:sz w:val="26"/>
           <w:szCs w:val="26"/>
         </w:rPr>
-        <w:t xml:space="preserve">Versión 2.9.1</w:t>
+        <w:t xml:space="preserve">Versión 2.10.0</w:t>
       </w:r>
     </w:p>
     <w:p>
@@ -8795,6 +8795,82 @@
         <w:t xml:space="preserve">Para no llegar al límite, «Analizar todo» solo relee las playlists que cambiaron y las consultas van espaciadas.</w:t>
       </w:r>
     </w:p>
+    <w:p>
+      <w:pPr>
+        <w:pStyle w:val="ListParagraph"/>
+        <w:numPr>
+          <w:ilvl w:val="0"/>
+          <w:numId w:val="2"/>
+        </w:numPr>
+        <w:spacing w:after="60" w:line="276"/>
+      </w:pPr>
+      <w:r>
+        <w:rPr>
+          <w:b/>
+          <w:bCs/>
+        </w:rPr>
+        <w:t xml:space="preserve">Importar durante la pausa:</w:t>
+      </w:r>
+      <w:r>
+        <w:t xml:space="preserve"> puedes elegir Spotify igual. La playlist queda lista en BrainOrder y tus programas de DJ, entra a una </w:t>
+      </w:r>
+      <w:r>
+        <w:rPr>
+          <w:b/>
+          <w:bCs/>
+        </w:rPr>
+        <w:t xml:space="preserve">cola</w:t>
+      </w:r>
+      <w:r>
+        <w:t xml:space="preserve"> y BrainOrder la crea en Spotify sola en cuanto se pueda (revisa cada minuto). Si ya existe una con ese nombre, usa esa.</w:t>
+      </w:r>
+    </w:p>
+    <w:p>
+      <w:pPr>
+        <w:pStyle w:val="ListParagraph"/>
+        <w:numPr>
+          <w:ilvl w:val="0"/>
+          <w:numId w:val="2"/>
+        </w:numPr>
+        <w:spacing w:after="60" w:line="276"/>
+      </w:pPr>
+      <w:r>
+        <w:t xml:space="preserve">Las canciones nuevas de una carpeta vinculada también esperan en la cola y se agregan a la misma playlist.</w:t>
+      </w:r>
+    </w:p>
+    <w:p>
+      <w:pPr>
+        <w:pStyle w:val="ListParagraph"/>
+        <w:numPr>
+          <w:ilvl w:val="0"/>
+          <w:numId w:val="2"/>
+        </w:numPr>
+        <w:spacing w:after="60" w:line="276"/>
+      </w:pPr>
+      <w:r>
+        <w:t xml:space="preserve">Los pendientes aparecen arriba («· 2 pendientes») y en «Playlists nuevas», donde puedes </w:t>
+      </w:r>
+      <w:r>
+        <w:rPr>
+          <w:b/>
+          <w:bCs/>
+        </w:rPr>
+        <w:t xml:space="preserve">Pasar ya</w:t>
+      </w:r>
+      <w:r>
+        <w:t xml:space="preserve"> o </w:t>
+      </w:r>
+      <w:r>
+        <w:rPr>
+          <w:b/>
+          <w:bCs/>
+        </w:rPr>
+        <w:t xml:space="preserve">Cancelar</w:t>
+      </w:r>
+      <w:r>
+        <w:t xml:space="preserve"> cada uno. Cuando se completan te avisa.</w:t>
+      </w:r>
+    </w:p>
     <w:tbl>
       <w:tblPr>
         <w:tblW w:type="dxa" w:w="9360"/>
@@ -9831,7 +9907,7 @@
                 <w:sz w:val="24"/>
                 <w:szCs w:val="24"/>
               </w:rPr>
-              <w:t xml:space="preserve">v2.9.1</w:t>
+              <w:t xml:space="preserve">v2.10.0</w:t>
             </w:r>
           </w:p>
           <w:p>
@@ -9878,7 +9954,7 @@
                 <w:sz w:val="23"/>
                 <w:szCs w:val="23"/>
               </w:rPr>
-              <w:t xml:space="preserve">Sin duplicados en Spotify</w:t>
+              <w:t xml:space="preserve">Cola para Spotify</w:t>
             </w:r>
             <w:r>
               <w:rPr>
@@ -9889,6 +9965,192 @@
                 <w:szCs w:val="18"/>
               </w:rPr>
               <w:t xml:space="preserve">   · versión actual</w:t>
+            </w:r>
+          </w:p>
+        </w:tc>
+      </w:tr>
+    </w:tbl>
+    <w:p>
+      <w:pPr>
+        <w:pStyle w:val="ListParagraph"/>
+        <w:keepNext/>
+        <w:keepLines/>
+        <w:numPr>
+          <w:ilvl w:val="0"/>
+          <w:numId w:val="2"/>
+        </w:numPr>
+        <w:spacing w:after="60" w:line="276"/>
+      </w:pPr>
+      <w:r>
+        <w:t xml:space="preserve">Puedes elegir </w:t>
+      </w:r>
+      <w:r>
+        <w:rPr>
+          <w:b/>
+          <w:bCs/>
+        </w:rPr>
+        <w:t xml:space="preserve">Spotify</w:t>
+      </w:r>
+      <w:r>
+        <w:t xml:space="preserve"> al importar aunque Spotify esté en pausa por exceso de consultas.</w:t>
+      </w:r>
+    </w:p>
+    <w:p>
+      <w:pPr>
+        <w:pStyle w:val="ListParagraph"/>
+        <w:keepNext/>
+        <w:keepLines/>
+        <w:numPr>
+          <w:ilvl w:val="0"/>
+          <w:numId w:val="2"/>
+        </w:numPr>
+        <w:spacing w:after="60" w:line="276"/>
+      </w:pPr>
+      <w:r>
+        <w:t xml:space="preserve">La playlist queda lista de una vez en BrainOrder y tus programas de DJ, y </w:t>
+      </w:r>
+      <w:r>
+        <w:rPr>
+          <w:b/>
+          <w:bCs/>
+        </w:rPr>
+        <w:t xml:space="preserve">BrainOrder la crea en Spotify sola</w:t>
+      </w:r>
+      <w:r>
+        <w:t xml:space="preserve"> en cuanto Spotify lo permite.</w:t>
+      </w:r>
+    </w:p>
+    <w:p>
+      <w:pPr>
+        <w:pStyle w:val="ListParagraph"/>
+        <w:keepNext/>
+        <w:keepLines/>
+        <w:numPr>
+          <w:ilvl w:val="0"/>
+          <w:numId w:val="2"/>
+        </w:numPr>
+        <w:spacing w:after="60" w:line="276"/>
+      </w:pPr>
+      <w:r>
+        <w:t xml:space="preserve">Lo mismo con las canciones nuevas de una carpeta vinculada: se agregan solas a la misma playlist.</w:t>
+      </w:r>
+    </w:p>
+    <w:p>
+      <w:pPr>
+        <w:pStyle w:val="ListParagraph"/>
+        <w:keepNext w:val="false"/>
+        <w:keepLines/>
+        <w:numPr>
+          <w:ilvl w:val="0"/>
+          <w:numId w:val="2"/>
+        </w:numPr>
+        <w:spacing w:after="60" w:line="276"/>
+      </w:pPr>
+      <w:r>
+        <w:t xml:space="preserve">Los pendientes se ven en «Playlists nuevas» (con «Pasar ya» y «Cancelar») y arriba dice cuántos hay.</w:t>
+      </w:r>
+    </w:p>
+    <w:p>
+      <w:pPr>
+        <w:spacing w:after="80"/>
+      </w:pPr>
+    </w:p>
+    <w:tbl>
+      <w:tblPr>
+        <w:tblW w:type="dxa" w:w="9360"/>
+        <w:tblBorders>
+          <w:top w:val="single" w:color="auto" w:sz="4"/>
+          <w:left w:val="single" w:color="auto" w:sz="4"/>
+          <w:bottom w:val="single" w:color="auto" w:sz="4"/>
+          <w:right w:val="single" w:color="auto" w:sz="4"/>
+          <w:insideH w:val="single" w:color="auto" w:sz="4"/>
+          <w:insideV w:val="single" w:color="auto" w:sz="4"/>
+        </w:tblBorders>
+      </w:tblPr>
+      <w:tblGrid>
+        <w:gridCol w:w="1900"/>
+        <w:gridCol w:w="7460"/>
+      </w:tblGrid>
+      <w:tr>
+        <w:tc>
+          <w:tcPr>
+            <w:tcW w:type="dxa" w:w="1900"/>
+            <w:tcBorders>
+              <w:top w:val="single" w:color="D5D9E0" w:sz="4"/>
+              <w:left w:val="single" w:color="D5D9E0" w:sz="4"/>
+              <w:bottom w:val="single" w:color="D5D9E0" w:sz="4"/>
+              <w:right w:val="single" w:color="D5D9E0" w:sz="4"/>
+            </w:tcBorders>
+            <w:shd w:fill="1F2A44" w:color="auto" w:val="clear"/>
+            <w:tcMar>
+              <w:top w:type="dxa" w:w="80"/>
+              <w:left w:type="dxa" w:w="140"/>
+              <w:bottom w:type="dxa" w:w="80"/>
+              <w:right w:type="dxa" w:w="140"/>
+            </w:tcMar>
+            <w:vAlign w:val="center"/>
+          </w:tcPr>
+          <w:p>
+            <w:pPr>
+              <w:keepNext/>
+              <w:keepLines/>
+            </w:pPr>
+            <w:r>
+              <w:rPr>
+                <w:b/>
+                <w:bCs/>
+                <w:color w:val="FFFFFF"/>
+                <w:sz w:val="24"/>
+                <w:szCs w:val="24"/>
+              </w:rPr>
+              <w:t xml:space="preserve">v2.9.1</w:t>
+            </w:r>
+          </w:p>
+          <w:p>
+            <w:pPr>
+              <w:keepNext/>
+            </w:pPr>
+            <w:r>
+              <w:rPr>
+                <w:color w:val="FFFFFF"/>
+                <w:sz w:val="17"/>
+                <w:szCs w:val="17"/>
+              </w:rPr>
+              <w:t xml:space="preserve">19 oct 2026</w:t>
+            </w:r>
+          </w:p>
+        </w:tc>
+        <w:tc>
+          <w:tcPr>
+            <w:tcW w:type="dxa" w:w="7460"/>
+            <w:tcBorders>
+              <w:top w:val="single" w:color="D5D9E0" w:sz="4"/>
+              <w:left w:val="single" w:color="D5D9E0" w:sz="4"/>
+              <w:bottom w:val="single" w:color="D5D9E0" w:sz="4"/>
+              <w:right w:val="single" w:color="D5D9E0" w:sz="4"/>
+            </w:tcBorders>
+            <w:shd w:fill="F5F7FA" w:color="auto" w:val="clear"/>
+            <w:tcMar>
+              <w:top w:type="dxa" w:w="80"/>
+              <w:left w:type="dxa" w:w="160"/>
+              <w:bottom w:type="dxa" w:w="80"/>
+              <w:right w:type="dxa" w:w="140"/>
+            </w:tcMar>
+            <w:vAlign w:val="center"/>
+          </w:tcPr>
+          <w:p>
+            <w:pPr>
+              <w:keepNext/>
+            </w:pPr>
+            <w:r>
+              <w:rPr>
+                <w:b/>
+                <w:bCs/>
+                <w:color w:val="1F2A44"/>
+                <w:sz w:val="23"/>
+                <w:szCs w:val="23"/>
+              </w:rPr>
+              <w:t xml:space="preserve">Sin duplicados en Spotify</w:t>
             </w:r>
           </w:p>
         </w:tc>

</xml_diff>

<commit_message>
v2.10.1: las playlists de carpeta recuerdan sus canciones (borrar un repetido no las vacía ni toca Spotify)
Co-Authored-By: Claude Opus 5.5 <noreply@anthropic.com>
Claude-Session: https://claude.ai/code/session_015yBEKQCgZonTqt5J2V9uZ5
</commit_message>
<xml_diff>
--- a/docs/BrainOrder - Manual de usuario.docx
+++ b/docs/BrainOrder - Manual de usuario.docx
@@ -73,7 +73,7 @@
           <w:sz w:val="26"/>
           <w:szCs w:val="26"/>
         </w:rPr>
-        <w:t xml:space="preserve">Versión 2.10.0</w:t>
+        <w:t xml:space="preserve">Versión 2.10.1</w:t>
       </w:r>
     </w:p>
     <w:p>
@@ -5566,6 +5566,111 @@
       </w:pPr>
       <w:r>
         <w:t xml:space="preserve">Las canciones que Organizar trae a esa carpeta no cuentan como «agregadas», porque ya son de la playlist.</w:t>
+      </w:r>
+    </w:p>
+    <w:p>
+      <w:pPr>
+        <w:pStyle w:val="Heading2"/>
+      </w:pPr>
+      <w:r>
+        <w:t xml:space="preserve">Borrar archivos repetidos no vacía la playlist</w:t>
+      </w:r>
+    </w:p>
+    <w:p>
+      <w:pPr>
+        <w:spacing w:after="120" w:line="276"/>
+      </w:pPr>
+      <w:r>
+        <w:t xml:space="preserve">Si borras (o mueves) un archivo de una carpeta-playlist porque esa canción ya la tienes en otra playlist, </w:t>
+      </w:r>
+      <w:r>
+        <w:rPr>
+          <w:b/>
+          <w:bCs/>
+        </w:rPr>
+        <w:t xml:space="preserve">la canción sigue en la playlist</w:t>
+      </w:r>
+      <w:r>
+        <w:t xml:space="preserve"> usando la otra copia, igual que en Rekordbox: la playlist queda completa con un solo archivo.</w:t>
+      </w:r>
+    </w:p>
+    <w:p>
+      <w:pPr>
+        <w:pStyle w:val="ListParagraph"/>
+        <w:numPr>
+          <w:ilvl w:val="0"/>
+          <w:numId w:val="2"/>
+        </w:numPr>
+        <w:spacing w:after="60" w:line="276"/>
+      </w:pPr>
+      <w:r>
+        <w:rPr>
+          <w:b/>
+          <w:bCs/>
+        </w:rPr>
+        <w:t xml:space="preserve">Spotify nunca se toca</w:t>
+      </w:r>
+      <w:r>
+        <w:t xml:space="preserve"> por borrar archivos: tus playlists de Spotify quedan completas.</w:t>
+      </w:r>
+    </w:p>
+    <w:p>
+      <w:pPr>
+        <w:pStyle w:val="ListParagraph"/>
+        <w:numPr>
+          <w:ilvl w:val="0"/>
+          <w:numId w:val="2"/>
+        </w:numPr>
+        <w:spacing w:after="60" w:line="276"/>
+      </w:pPr>
+      <w:r>
+        <w:t xml:space="preserve">En Rekordbox y tus otros programas, la playlist sigue con esa canción apuntando a la copia que conservas.</w:t>
+      </w:r>
+    </w:p>
+    <w:p>
+      <w:pPr>
+        <w:pStyle w:val="ListParagraph"/>
+        <w:numPr>
+          <w:ilvl w:val="0"/>
+          <w:numId w:val="2"/>
+        </w:numPr>
+        <w:spacing w:after="60" w:line="276"/>
+      </w:pPr>
+      <w:r>
+        <w:t xml:space="preserve">Si borras la </w:t>
+      </w:r>
+      <w:r>
+        <w:rPr>
+          <w:b/>
+          <w:bCs/>
+        </w:rPr>
+        <w:t xml:space="preserve">única</w:t>
+      </w:r>
+      <w:r>
+        <w:t xml:space="preserve"> copia que tenías, la canción sale de la playlist (la borraste de verdad).</w:t>
+      </w:r>
+    </w:p>
+    <w:p>
+      <w:pPr>
+        <w:pStyle w:val="ListParagraph"/>
+        <w:numPr>
+          <w:ilvl w:val="0"/>
+          <w:numId w:val="2"/>
+        </w:numPr>
+        <w:spacing w:after="60" w:line="276"/>
+      </w:pPr>
+      <w:r>
+        <w:t xml:space="preserve">Para sacar de la playlist una canción recordada: clic derecho → </w:t>
+      </w:r>
+      <w:r>
+        <w:rPr>
+          <w:b/>
+          <w:bCs/>
+        </w:rPr>
+        <w:t xml:space="preserve">➖ Quitar de esta playlist</w:t>
+      </w:r>
+      <w:r>
+        <w:t xml:space="preserve"> (no toca ningún archivo).</w:t>
       </w:r>
     </w:p>
     <w:p>
@@ -9907,7 +10012,7 @@
                 <w:sz w:val="24"/>
                 <w:szCs w:val="24"/>
               </w:rPr>
-              <w:t xml:space="preserve">v2.10.0</w:t>
+              <w:t xml:space="preserve">v2.10.1</w:t>
             </w:r>
           </w:p>
           <w:p>
@@ -9954,7 +10059,7 @@
                 <w:sz w:val="23"/>
                 <w:szCs w:val="23"/>
               </w:rPr>
-              <w:t xml:space="preserve">Cola para Spotify</w:t>
+              <w:t xml:space="preserve">Playlists completas con un solo archivo</w:t>
             </w:r>
             <w:r>
               <w:rPr>
@@ -9965,6 +10070,177 @@
                 <w:szCs w:val="18"/>
               </w:rPr>
               <w:t xml:space="preserve">   · versión actual</w:t>
+            </w:r>
+          </w:p>
+        </w:tc>
+      </w:tr>
+    </w:tbl>
+    <w:p>
+      <w:pPr>
+        <w:pStyle w:val="ListParagraph"/>
+        <w:keepNext/>
+        <w:keepLines/>
+        <w:numPr>
+          <w:ilvl w:val="0"/>
+          <w:numId w:val="2"/>
+        </w:numPr>
+        <w:spacing w:after="60" w:line="276"/>
+      </w:pPr>
+      <w:r>
+        <w:t xml:space="preserve">Si borras un archivo repetido de una carpeta-playlist, la canción </w:t>
+      </w:r>
+      <w:r>
+        <w:rPr>
+          <w:b/>
+          <w:bCs/>
+        </w:rPr>
+        <w:t xml:space="preserve">sigue en la playlist</w:t>
+      </w:r>
+      <w:r>
+        <w:t xml:space="preserve"> usando la otra copia (como en Rekordbox) y Spotify no se toca.</w:t>
+      </w:r>
+    </w:p>
+    <w:p>
+      <w:pPr>
+        <w:pStyle w:val="ListParagraph"/>
+        <w:keepNext/>
+        <w:keepLines/>
+        <w:numPr>
+          <w:ilvl w:val="0"/>
+          <w:numId w:val="2"/>
+        </w:numPr>
+        <w:spacing w:after="60" w:line="276"/>
+      </w:pPr>
+      <w:r>
+        <w:t xml:space="preserve">Solo sale si borras la única copia, o con clic derecho → </w:t>
+      </w:r>
+      <w:r>
+        <w:rPr>
+          <w:b/>
+          <w:bCs/>
+        </w:rPr>
+        <w:t xml:space="preserve">Quitar de esta playlist</w:t>
+      </w:r>
+      <w:r>
+        <w:t xml:space="preserve">.</w:t>
+      </w:r>
+    </w:p>
+    <w:p>
+      <w:pPr>
+        <w:pStyle w:val="ListParagraph"/>
+        <w:keepNext w:val="false"/>
+        <w:keepLines/>
+        <w:numPr>
+          <w:ilvl w:val="0"/>
+          <w:numId w:val="2"/>
+        </w:numPr>
+        <w:spacing w:after="60" w:line="276"/>
+      </w:pPr>
+      <w:r>
+        <w:t xml:space="preserve">Al pasar una carpeta a Spotify (también desde la cola) van todas sus canciones, incluidas las que borraste por repetidas.</w:t>
+      </w:r>
+    </w:p>
+    <w:p>
+      <w:pPr>
+        <w:spacing w:after="80"/>
+      </w:pPr>
+    </w:p>
+    <w:tbl>
+      <w:tblPr>
+        <w:tblW w:type="dxa" w:w="9360"/>
+        <w:tblBorders>
+          <w:top w:val="single" w:color="auto" w:sz="4"/>
+          <w:left w:val="single" w:color="auto" w:sz="4"/>
+          <w:bottom w:val="single" w:color="auto" w:sz="4"/>
+          <w:right w:val="single" w:color="auto" w:sz="4"/>
+          <w:insideH w:val="single" w:color="auto" w:sz="4"/>
+          <w:insideV w:val="single" w:color="auto" w:sz="4"/>
+        </w:tblBorders>
+      </w:tblPr>
+      <w:tblGrid>
+        <w:gridCol w:w="1900"/>
+        <w:gridCol w:w="7460"/>
+      </w:tblGrid>
+      <w:tr>
+        <w:tc>
+          <w:tcPr>
+            <w:tcW w:type="dxa" w:w="1900"/>
+            <w:tcBorders>
+              <w:top w:val="single" w:color="D5D9E0" w:sz="4"/>
+              <w:left w:val="single" w:color="D5D9E0" w:sz="4"/>
+              <w:bottom w:val="single" w:color="D5D9E0" w:sz="4"/>
+              <w:right w:val="single" w:color="D5D9E0" w:sz="4"/>
+            </w:tcBorders>
+            <w:shd w:fill="1F2A44" w:color="auto" w:val="clear"/>
+            <w:tcMar>
+              <w:top w:type="dxa" w:w="80"/>
+              <w:left w:type="dxa" w:w="140"/>
+              <w:bottom w:type="dxa" w:w="80"/>
+              <w:right w:type="dxa" w:w="140"/>
+            </w:tcMar>
+            <w:vAlign w:val="center"/>
+          </w:tcPr>
+          <w:p>
+            <w:pPr>
+              <w:keepNext/>
+              <w:keepLines/>
+            </w:pPr>
+            <w:r>
+              <w:rPr>
+                <w:b/>
+                <w:bCs/>
+                <w:color w:val="FFFFFF"/>
+                <w:sz w:val="24"/>
+                <w:szCs w:val="24"/>
+              </w:rPr>
+              <w:t xml:space="preserve">v2.10.0</w:t>
+            </w:r>
+          </w:p>
+          <w:p>
+            <w:pPr>
+              <w:keepNext/>
+            </w:pPr>
+            <w:r>
+              <w:rPr>
+                <w:color w:val="FFFFFF"/>
+                <w:sz w:val="17"/>
+                <w:szCs w:val="17"/>
+              </w:rPr>
+              <w:t xml:space="preserve">19 oct 2026</w:t>
+            </w:r>
+          </w:p>
+        </w:tc>
+        <w:tc>
+          <w:tcPr>
+            <w:tcW w:type="dxa" w:w="7460"/>
+            <w:tcBorders>
+              <w:top w:val="single" w:color="D5D9E0" w:sz="4"/>
+              <w:left w:val="single" w:color="D5D9E0" w:sz="4"/>
+              <w:bottom w:val="single" w:color="D5D9E0" w:sz="4"/>
+              <w:right w:val="single" w:color="D5D9E0" w:sz="4"/>
+            </w:tcBorders>
+            <w:shd w:fill="F5F7FA" w:color="auto" w:val="clear"/>
+            <w:tcMar>
+              <w:top w:type="dxa" w:w="80"/>
+              <w:left w:type="dxa" w:w="160"/>
+              <w:bottom w:type="dxa" w:w="80"/>
+              <w:right w:type="dxa" w:w="140"/>
+            </w:tcMar>
+            <w:vAlign w:val="center"/>
+          </w:tcPr>
+          <w:p>
+            <w:pPr>
+              <w:keepNext/>
+            </w:pPr>
+            <w:r>
+              <w:rPr>
+                <w:b/>
+                <w:bCs/>
+                <w:color w:val="1F2A44"/>
+                <w:sz w:val="23"/>
+                <w:szCs w:val="23"/>
+              </w:rPr>
+              <w:t xml:space="preserve">Cola para Spotify</w:t>
             </w:r>
           </w:p>
         </w:tc>

</xml_diff>

<commit_message>
v2.11.0: clic derecho en una playlist: renombrar, fusionar y eliminar en todas partes
Co-Authored-By: Claude Opus 5.5 <noreply@anthropic.com>
Claude-Session: https://claude.ai/code/session_015yBEKQCgZonTqt5J2V9uZ5
</commit_message>
<xml_diff>
--- a/docs/BrainOrder - Manual de usuario.docx
+++ b/docs/BrainOrder - Manual de usuario.docx
@@ -73,7 +73,7 @@
           <w:sz w:val="26"/>
           <w:szCs w:val="26"/>
         </w:rPr>
-        <w:t xml:space="preserve">Versión 2.10.1</w:t>
+        <w:t xml:space="preserve">Versión 2.11.0</w:t>
       </w:r>
     </w:p>
     <w:p>
@@ -252,7 +252,7 @@
           <w:sz w:val="22"/>
           <w:szCs w:val="22"/>
         </w:rPr>
-        <w:t xml:space="preserve">	8</w:t>
+        <w:t xml:space="preserve">	9</w:t>
       </w:r>
     </w:p>
     <w:p>
@@ -278,7 +278,7 @@
           <w:sz w:val="22"/>
           <w:szCs w:val="22"/>
         </w:rPr>
-        <w:t xml:space="preserve">	8</w:t>
+        <w:t xml:space="preserve">	9</w:t>
       </w:r>
     </w:p>
     <w:p>
@@ -304,7 +304,7 @@
           <w:sz w:val="22"/>
           <w:szCs w:val="22"/>
         </w:rPr>
-        <w:t xml:space="preserve">	9</w:t>
+        <w:t xml:space="preserve">	10</w:t>
       </w:r>
     </w:p>
     <w:p>
@@ -330,7 +330,7 @@
           <w:sz w:val="22"/>
           <w:szCs w:val="22"/>
         </w:rPr>
-        <w:t xml:space="preserve">	10</w:t>
+        <w:t xml:space="preserve">	11</w:t>
       </w:r>
     </w:p>
     <w:p>
@@ -356,7 +356,7 @@
           <w:sz w:val="22"/>
           <w:szCs w:val="22"/>
         </w:rPr>
-        <w:t xml:space="preserve">	11</w:t>
+        <w:t xml:space="preserve">	12</w:t>
       </w:r>
     </w:p>
     <w:p>
@@ -382,7 +382,7 @@
           <w:sz w:val="22"/>
           <w:szCs w:val="22"/>
         </w:rPr>
-        <w:t xml:space="preserve">	12</w:t>
+        <w:t xml:space="preserve">	13</w:t>
       </w:r>
     </w:p>
     <w:p>
@@ -408,7 +408,7 @@
           <w:sz w:val="22"/>
           <w:szCs w:val="22"/>
         </w:rPr>
-        <w:t xml:space="preserve">	13</w:t>
+        <w:t xml:space="preserve">	14</w:t>
       </w:r>
     </w:p>
     <w:p>
@@ -434,7 +434,7 @@
           <w:sz w:val="22"/>
           <w:szCs w:val="22"/>
         </w:rPr>
-        <w:t xml:space="preserve">	14</w:t>
+        <w:t xml:space="preserve">	15</w:t>
       </w:r>
     </w:p>
     <w:p>
@@ -460,7 +460,7 @@
           <w:sz w:val="22"/>
           <w:szCs w:val="22"/>
         </w:rPr>
-        <w:t xml:space="preserve">	15</w:t>
+        <w:t xml:space="preserve">	16</w:t>
       </w:r>
     </w:p>
     <w:p>
@@ -486,7 +486,7 @@
           <w:sz w:val="22"/>
           <w:szCs w:val="22"/>
         </w:rPr>
-        <w:t xml:space="preserve">	15</w:t>
+        <w:t xml:space="preserve">	16</w:t>
       </w:r>
     </w:p>
     <w:p>
@@ -512,7 +512,7 @@
           <w:sz w:val="22"/>
           <w:szCs w:val="22"/>
         </w:rPr>
-        <w:t xml:space="preserve">	15</w:t>
+        <w:t xml:space="preserve">	16</w:t>
       </w:r>
     </w:p>
     <w:p>
@@ -538,7 +538,7 @@
           <w:sz w:val="22"/>
           <w:szCs w:val="22"/>
         </w:rPr>
-        <w:t xml:space="preserve">	16</w:t>
+        <w:t xml:space="preserve">	17</w:t>
       </w:r>
     </w:p>
     <w:p>
@@ -564,7 +564,7 @@
           <w:sz w:val="22"/>
           <w:szCs w:val="22"/>
         </w:rPr>
-        <w:t xml:space="preserve">	16</w:t>
+        <w:t xml:space="preserve">	17</w:t>
       </w:r>
     </w:p>
     <w:p>
@@ -590,7 +590,7 @@
           <w:sz w:val="22"/>
           <w:szCs w:val="22"/>
         </w:rPr>
-        <w:t xml:space="preserve">	17</w:t>
+        <w:t xml:space="preserve">	18</w:t>
       </w:r>
     </w:p>
     <w:p>
@@ -616,7 +616,7 @@
           <w:sz w:val="22"/>
           <w:szCs w:val="22"/>
         </w:rPr>
-        <w:t xml:space="preserve">	18</w:t>
+        <w:t xml:space="preserve">	19</w:t>
       </w:r>
     </w:p>
     <w:p>
@@ -4258,6 +4258,530 @@
       <w:pPr>
         <w:spacing w:after="120"/>
       </w:pPr>
+    </w:p>
+    <w:p>
+      <w:pPr>
+        <w:pStyle w:val="Heading2"/>
+      </w:pPr>
+      <w:r>
+        <w:t xml:space="preserve">Clic derecho en una playlist</w:t>
+      </w:r>
+    </w:p>
+    <w:p>
+      <w:pPr>
+        <w:spacing w:after="120" w:line="276"/>
+      </w:pPr>
+      <w:r>
+        <w:t xml:space="preserve">En la lista de playlists (a la izquierda), el clic derecho sobre una playlist ofrece </w:t>
+      </w:r>
+      <w:r>
+        <w:rPr>
+          <w:b/>
+          <w:bCs/>
+        </w:rPr>
+        <w:t xml:space="preserve">Renombrar</w:t>
+      </w:r>
+      <w:r>
+        <w:t xml:space="preserve">, </w:t>
+      </w:r>
+      <w:r>
+        <w:rPr>
+          <w:b/>
+          <w:bCs/>
+        </w:rPr>
+        <w:t xml:space="preserve">Fusionar con otra</w:t>
+      </w:r>
+      <w:r>
+        <w:t xml:space="preserve"> y </w:t>
+      </w:r>
+      <w:r>
+        <w:rPr>
+          <w:b/>
+          <w:bCs/>
+        </w:rPr>
+        <w:t xml:space="preserve">Eliminar</w:t>
+      </w:r>
+      <w:r>
+        <w:t xml:space="preserve">. El cambio se hace </w:t>
+      </w:r>
+      <w:r>
+        <w:rPr>
+          <w:b/>
+          <w:bCs/>
+        </w:rPr>
+        <w:t xml:space="preserve">en todas partes</w:t>
+      </w:r>
+      <w:r>
+        <w:t xml:space="preserve">: BrainOrder, su carpeta, tus programas de DJ y su plataforma.</w:t>
+      </w:r>
+    </w:p>
+    <w:tbl>
+      <w:tblPr>
+        <w:tblW w:type="dxa" w:w="9360"/>
+        <w:tblBorders>
+          <w:top w:val="single" w:color="auto" w:sz="4"/>
+          <w:left w:val="single" w:color="auto" w:sz="4"/>
+          <w:bottom w:val="single" w:color="auto" w:sz="4"/>
+          <w:right w:val="single" w:color="auto" w:sz="4"/>
+          <w:insideH w:val="single" w:color="auto" w:sz="4"/>
+          <w:insideV w:val="single" w:color="auto" w:sz="4"/>
+        </w:tblBorders>
+      </w:tblPr>
+      <w:tblGrid>
+        <w:gridCol w:w="2400"/>
+        <w:gridCol w:w="6960"/>
+      </w:tblGrid>
+      <w:tr>
+        <w:trPr>
+          <w:tblHeader/>
+        </w:trPr>
+        <w:tc>
+          <w:tcPr>
+            <w:tcW w:type="dxa" w:w="2400"/>
+            <w:tcBorders>
+              <w:top w:val="single" w:color="D5D9E0" w:sz="4"/>
+              <w:left w:val="single" w:color="D5D9E0" w:sz="4"/>
+              <w:bottom w:val="single" w:color="D5D9E0" w:sz="4"/>
+              <w:right w:val="single" w:color="D5D9E0" w:sz="4"/>
+            </w:tcBorders>
+            <w:shd w:fill="1F2A44" w:color="auto" w:val="clear"/>
+            <w:tcMar>
+              <w:top w:type="dxa" w:w="90"/>
+              <w:left w:type="dxa" w:w="120"/>
+              <w:bottom w:type="dxa" w:w="90"/>
+              <w:right w:type="dxa" w:w="120"/>
+            </w:tcMar>
+            <w:vAlign w:val="center"/>
+          </w:tcPr>
+          <w:p>
+            <w:pPr>
+              <w:spacing w:after="40"/>
+            </w:pPr>
+            <w:r>
+              <w:rPr>
+                <w:b/>
+                <w:bCs/>
+                <w:color w:val="FFFFFF"/>
+                <w:sz w:val="19"/>
+                <w:szCs w:val="19"/>
+              </w:rPr>
+              <w:t xml:space="preserve">Opción</w:t>
+            </w:r>
+          </w:p>
+        </w:tc>
+        <w:tc>
+          <w:tcPr>
+            <w:tcW w:type="dxa" w:w="6960"/>
+            <w:tcBorders>
+              <w:top w:val="single" w:color="D5D9E0" w:sz="4"/>
+              <w:left w:val="single" w:color="D5D9E0" w:sz="4"/>
+              <w:bottom w:val="single" w:color="D5D9E0" w:sz="4"/>
+              <w:right w:val="single" w:color="D5D9E0" w:sz="4"/>
+            </w:tcBorders>
+            <w:shd w:fill="1F2A44" w:color="auto" w:val="clear"/>
+            <w:tcMar>
+              <w:top w:type="dxa" w:w="90"/>
+              <w:left w:type="dxa" w:w="120"/>
+              <w:bottom w:type="dxa" w:w="90"/>
+              <w:right w:type="dxa" w:w="120"/>
+            </w:tcMar>
+            <w:vAlign w:val="center"/>
+          </w:tcPr>
+          <w:p>
+            <w:pPr>
+              <w:spacing w:after="40"/>
+            </w:pPr>
+            <w:r>
+              <w:rPr>
+                <w:b/>
+                <w:bCs/>
+                <w:color w:val="FFFFFF"/>
+                <w:sz w:val="19"/>
+                <w:szCs w:val="19"/>
+              </w:rPr>
+              <w:t xml:space="preserve">Qué hace</w:t>
+            </w:r>
+          </w:p>
+        </w:tc>
+      </w:tr>
+      <w:tr>
+        <w:trPr>
+          <w:cantSplit/>
+        </w:trPr>
+        <w:tc>
+          <w:tcPr>
+            <w:tcW w:type="dxa" w:w="2400"/>
+            <w:tcBorders>
+              <w:top w:val="single" w:color="D5D9E0" w:sz="4"/>
+              <w:left w:val="single" w:color="D5D9E0" w:sz="4"/>
+              <w:bottom w:val="single" w:color="D5D9E0" w:sz="4"/>
+              <w:right w:val="single" w:color="D5D9E0" w:sz="4"/>
+            </w:tcBorders>
+            <w:tcMar>
+              <w:top w:type="dxa" w:w="90"/>
+              <w:left w:type="dxa" w:w="120"/>
+              <w:bottom w:type="dxa" w:w="90"/>
+              <w:right w:type="dxa" w:w="120"/>
+            </w:tcMar>
+            <w:vAlign w:val="center"/>
+          </w:tcPr>
+          <w:p>
+            <w:pPr>
+              <w:spacing w:after="40"/>
+            </w:pPr>
+            <w:r>
+              <w:rPr>
+                <w:sz w:val="19"/>
+                <w:szCs w:val="19"/>
+              </w:rPr>
+              <w:t xml:space="preserve">✏️ </w:t>
+            </w:r>
+            <w:r>
+              <w:rPr>
+                <w:b/>
+                <w:bCs/>
+                <w:sz w:val="19"/>
+                <w:szCs w:val="19"/>
+              </w:rPr>
+              <w:t xml:space="preserve">Renombrar</w:t>
+            </w:r>
+          </w:p>
+        </w:tc>
+        <w:tc>
+          <w:tcPr>
+            <w:tcW w:type="dxa" w:w="6960"/>
+            <w:tcBorders>
+              <w:top w:val="single" w:color="D5D9E0" w:sz="4"/>
+              <w:left w:val="single" w:color="D5D9E0" w:sz="4"/>
+              <w:bottom w:val="single" w:color="D5D9E0" w:sz="4"/>
+              <w:right w:val="single" w:color="D5D9E0" w:sz="4"/>
+            </w:tcBorders>
+            <w:tcMar>
+              <w:top w:type="dxa" w:w="90"/>
+              <w:left w:type="dxa" w:w="120"/>
+              <w:bottom w:type="dxa" w:w="90"/>
+              <w:right w:type="dxa" w:w="120"/>
+            </w:tcMar>
+            <w:vAlign w:val="center"/>
+          </w:tcPr>
+          <w:p>
+            <w:pPr>
+              <w:spacing w:after="40"/>
+            </w:pPr>
+            <w:r>
+              <w:rPr>
+                <w:sz w:val="19"/>
+                <w:szCs w:val="19"/>
+              </w:rPr>
+              <w:t xml:space="preserve">Cambia el nombre en BrainOrder, en Spotify, en Rekordbox, Traktor, Serato, Engine DJ y las M3U, y pasa sus archivos a la carpeta con el nombre nuevo (rutas corregidas, con Deshacer). Si ya hay una playlist con ese nombre te propone fusionarlas.</w:t>
+            </w:r>
+          </w:p>
+        </w:tc>
+      </w:tr>
+      <w:tr>
+        <w:trPr>
+          <w:cantSplit/>
+        </w:trPr>
+        <w:tc>
+          <w:tcPr>
+            <w:tcW w:type="dxa" w:w="2400"/>
+            <w:tcBorders>
+              <w:top w:val="single" w:color="D5D9E0" w:sz="4"/>
+              <w:left w:val="single" w:color="D5D9E0" w:sz="4"/>
+              <w:bottom w:val="single" w:color="D5D9E0" w:sz="4"/>
+              <w:right w:val="single" w:color="D5D9E0" w:sz="4"/>
+            </w:tcBorders>
+            <w:shd w:fill="F5F7FA" w:color="auto" w:val="clear"/>
+            <w:tcMar>
+              <w:top w:type="dxa" w:w="90"/>
+              <w:left w:type="dxa" w:w="120"/>
+              <w:bottom w:type="dxa" w:w="90"/>
+              <w:right w:type="dxa" w:w="120"/>
+            </w:tcMar>
+            <w:vAlign w:val="center"/>
+          </w:tcPr>
+          <w:p>
+            <w:pPr>
+              <w:spacing w:after="40"/>
+            </w:pPr>
+            <w:r>
+              <w:rPr>
+                <w:sz w:val="19"/>
+                <w:szCs w:val="19"/>
+              </w:rPr>
+              <w:t xml:space="preserve">🔀 </w:t>
+            </w:r>
+            <w:r>
+              <w:rPr>
+                <w:b/>
+                <w:bCs/>
+                <w:sz w:val="19"/>
+                <w:szCs w:val="19"/>
+              </w:rPr>
+              <w:t xml:space="preserve">Fusionar con otra</w:t>
+            </w:r>
+          </w:p>
+        </w:tc>
+        <w:tc>
+          <w:tcPr>
+            <w:tcW w:type="dxa" w:w="6960"/>
+            <w:tcBorders>
+              <w:top w:val="single" w:color="D5D9E0" w:sz="4"/>
+              <w:left w:val="single" w:color="D5D9E0" w:sz="4"/>
+              <w:bottom w:val="single" w:color="D5D9E0" w:sz="4"/>
+              <w:right w:val="single" w:color="D5D9E0" w:sz="4"/>
+            </w:tcBorders>
+            <w:shd w:fill="F5F7FA" w:color="auto" w:val="clear"/>
+            <w:tcMar>
+              <w:top w:type="dxa" w:w="90"/>
+              <w:left w:type="dxa" w:w="120"/>
+              <w:bottom w:type="dxa" w:w="90"/>
+              <w:right w:type="dxa" w:w="120"/>
+            </w:tcMar>
+            <w:vAlign w:val="center"/>
+          </w:tcPr>
+          <w:p>
+            <w:pPr>
+              <w:spacing w:after="40"/>
+            </w:pPr>
+            <w:r>
+              <w:rPr>
+                <w:sz w:val="19"/>
+                <w:szCs w:val="19"/>
+              </w:rPr>
+              <w:t xml:space="preserve">Agrega las canciones que falten al final de la playlist que elijas (también en Spotify), pasa sus archivos a la carpeta de esa (la copia repetida va a </w:t>
+            </w:r>
+            <w:r>
+              <w:rPr>
+                <w:rFonts w:ascii="Courier New" w:cs="Courier New" w:eastAsia="Courier New" w:hAnsi="Courier New"/>
+                <w:color w:val="1F2A44"/>
+                <w:sz w:val="19"/>
+                <w:szCs w:val="19"/>
+              </w:rPr>
+              <w:t xml:space="preserve">_duplicados</w:t>
+            </w:r>
+            <w:r>
+              <w:rPr>
+                <w:sz w:val="19"/>
+                <w:szCs w:val="19"/>
+              </w:rPr>
+              <w:t xml:space="preserve">) y elimina la primera en todas partes. Opcionalmente actualiza enseguida la playlist en tus programas de DJ.</w:t>
+            </w:r>
+          </w:p>
+        </w:tc>
+      </w:tr>
+      <w:tr>
+        <w:trPr>
+          <w:cantSplit/>
+        </w:trPr>
+        <w:tc>
+          <w:tcPr>
+            <w:tcW w:type="dxa" w:w="2400"/>
+            <w:tcBorders>
+              <w:top w:val="single" w:color="D5D9E0" w:sz="4"/>
+              <w:left w:val="single" w:color="D5D9E0" w:sz="4"/>
+              <w:bottom w:val="single" w:color="D5D9E0" w:sz="4"/>
+              <w:right w:val="single" w:color="D5D9E0" w:sz="4"/>
+            </w:tcBorders>
+            <w:tcMar>
+              <w:top w:type="dxa" w:w="90"/>
+              <w:left w:type="dxa" w:w="120"/>
+              <w:bottom w:type="dxa" w:w="90"/>
+              <w:right w:type="dxa" w:w="120"/>
+            </w:tcMar>
+            <w:vAlign w:val="center"/>
+          </w:tcPr>
+          <w:p>
+            <w:pPr>
+              <w:spacing w:after="40"/>
+            </w:pPr>
+            <w:r>
+              <w:rPr>
+                <w:sz w:val="19"/>
+                <w:szCs w:val="19"/>
+              </w:rPr>
+              <w:t xml:space="preserve">🗑 </w:t>
+            </w:r>
+            <w:r>
+              <w:rPr>
+                <w:b/>
+                <w:bCs/>
+                <w:sz w:val="19"/>
+                <w:szCs w:val="19"/>
+              </w:rPr>
+              <w:t xml:space="preserve">Eliminar</w:t>
+            </w:r>
+          </w:p>
+        </w:tc>
+        <w:tc>
+          <w:tcPr>
+            <w:tcW w:type="dxa" w:w="6960"/>
+            <w:tcBorders>
+              <w:top w:val="single" w:color="D5D9E0" w:sz="4"/>
+              <w:left w:val="single" w:color="D5D9E0" w:sz="4"/>
+              <w:bottom w:val="single" w:color="D5D9E0" w:sz="4"/>
+              <w:right w:val="single" w:color="D5D9E0" w:sz="4"/>
+            </w:tcBorders>
+            <w:tcMar>
+              <w:top w:type="dxa" w:w="90"/>
+              <w:left w:type="dxa" w:w="120"/>
+              <w:bottom w:type="dxa" w:w="90"/>
+              <w:right w:type="dxa" w:w="120"/>
+            </w:tcMar>
+            <w:vAlign w:val="center"/>
+          </w:tcPr>
+          <w:p>
+            <w:pPr>
+              <w:spacing w:after="40"/>
+            </w:pPr>
+            <w:r>
+              <w:rPr>
+                <w:sz w:val="19"/>
+                <w:szCs w:val="19"/>
+              </w:rPr>
+              <w:t xml:space="preserve">La quita de BrainOrder, de tus programas de DJ y de Spotify. Sus archivos: </w:t>
+            </w:r>
+            <w:r>
+              <w:rPr>
+                <w:b/>
+                <w:bCs/>
+                <w:sz w:val="19"/>
+                <w:szCs w:val="19"/>
+              </w:rPr>
+              <w:t xml:space="preserve">Ordenarlos</w:t>
+            </w:r>
+            <w:r>
+              <w:rPr>
+                <w:sz w:val="19"/>
+                <w:szCs w:val="19"/>
+              </w:rPr>
+              <w:t xml:space="preserve"> (las canciones que están en otras playlists pasan a la carpeta de esas y el resto a </w:t>
+            </w:r>
+            <w:r>
+              <w:rPr>
+                <w:rFonts w:ascii="Courier New" w:cs="Courier New" w:eastAsia="Courier New" w:hAnsi="Courier New"/>
+                <w:color w:val="1F2A44"/>
+                <w:sz w:val="19"/>
+                <w:szCs w:val="19"/>
+              </w:rPr>
+              <w:t xml:space="preserve">_Playlists eliminadas/&lt;nombre&gt;</w:t>
+            </w:r>
+            <w:r>
+              <w:rPr>
+                <w:sz w:val="19"/>
+                <w:szCs w:val="19"/>
+              </w:rPr>
+              <w:t xml:space="preserve">) o </w:t>
+            </w:r>
+            <w:r>
+              <w:rPr>
+                <w:b/>
+                <w:bCs/>
+                <w:sz w:val="19"/>
+                <w:szCs w:val="19"/>
+              </w:rPr>
+              <w:t xml:space="preserve">Dejarlos en su carpeta</w:t>
+            </w:r>
+            <w:r>
+              <w:rPr>
+                <w:sz w:val="19"/>
+                <w:szCs w:val="19"/>
+              </w:rPr>
+              <w:t xml:space="preserve">. La música nunca se borra.</w:t>
+            </w:r>
+          </w:p>
+        </w:tc>
+      </w:tr>
+    </w:tbl>
+    <w:p>
+      <w:pPr>
+        <w:spacing w:after="120"/>
+      </w:pPr>
+    </w:p>
+    <w:p>
+      <w:pPr>
+        <w:pStyle w:val="ListParagraph"/>
+        <w:numPr>
+          <w:ilvl w:val="0"/>
+          <w:numId w:val="2"/>
+        </w:numPr>
+        <w:spacing w:after="60" w:line="276"/>
+      </w:pPr>
+      <w:r>
+        <w:t xml:space="preserve">Tus programas de DJ tienen que estar </w:t>
+      </w:r>
+      <w:r>
+        <w:rPr>
+          <w:b/>
+          <w:bCs/>
+        </w:rPr>
+        <w:t xml:space="preserve">cerrados</w:t>
+      </w:r>
+      <w:r>
+        <w:t xml:space="preserve"> (se respaldan antes de cambiarlos).</w:t>
+      </w:r>
+    </w:p>
+    <w:p>
+      <w:pPr>
+        <w:pStyle w:val="ListParagraph"/>
+        <w:numPr>
+          <w:ilvl w:val="0"/>
+          <w:numId w:val="2"/>
+        </w:numPr>
+        <w:spacing w:after="60" w:line="276"/>
+      </w:pPr>
+      <w:r>
+        <w:t xml:space="preserve">Si Spotify está </w:t>
+      </w:r>
+      <w:r>
+        <w:rPr>
+          <w:b/>
+          <w:bCs/>
+        </w:rPr>
+        <w:t xml:space="preserve">en pausa</w:t>
+      </w:r>
+      <w:r>
+        <w:t xml:space="preserve"> por exceso de consultas, en BrainOrder y tus programas se hace ya y en Spotify queda en la cola (capítulo 17).</w:t>
+      </w:r>
+    </w:p>
+    <w:p>
+      <w:pPr>
+        <w:pStyle w:val="ListParagraph"/>
+        <w:numPr>
+          <w:ilvl w:val="0"/>
+          <w:numId w:val="2"/>
+        </w:numPr>
+        <w:spacing w:after="60" w:line="276"/>
+      </w:pPr>
+      <w:r>
+        <w:t xml:space="preserve">Deezer y los archivos exportados no dejan cambiar sus playlists desde una app: el cambio queda en BrainOrder y tus programas. Una playlist que nació en un programa de DJ conserva su original allí.</w:t>
+      </w:r>
+    </w:p>
+    <w:p>
+      <w:pPr>
+        <w:pStyle w:val="ListParagraph"/>
+        <w:numPr>
+          <w:ilvl w:val="0"/>
+          <w:numId w:val="2"/>
+        </w:numPr>
+        <w:spacing w:after="60" w:line="276"/>
+      </w:pPr>
+      <w:r>
+        <w:t xml:space="preserve">Se puede fusionar dentro de una playlist tuya de Spotify o de una carpeta. «Me gusta» se puede renombrar, pero no fusionar ni eliminar.</w:t>
+      </w:r>
+    </w:p>
+    <w:p>
+      <w:pPr>
+        <w:pStyle w:val="ListParagraph"/>
+        <w:numPr>
+          <w:ilvl w:val="0"/>
+          <w:numId w:val="2"/>
+        </w:numPr>
+        <w:spacing w:after="60" w:line="276"/>
+      </w:pPr>
+      <w:r>
+        <w:t xml:space="preserve">Si te arrepientes de eliminar una de Spotify, Spotify deja recuperarla desde tu cuenta (Recuperar playlists).</w:t>
+      </w:r>
     </w:p>
     <w:p>
       <w:pPr>
@@ -10012,7 +10536,7 @@
                 <w:sz w:val="24"/>
                 <w:szCs w:val="24"/>
               </w:rPr>
-              <w:t xml:space="preserve">v2.10.1</w:t>
+              <w:t xml:space="preserve">v2.11.0</w:t>
             </w:r>
           </w:p>
           <w:p>
@@ -10025,7 +10549,7 @@
                 <w:sz w:val="17"/>
                 <w:szCs w:val="17"/>
               </w:rPr>
-              <w:t xml:space="preserve">19 oct 2026</w:t>
+              <w:t xml:space="preserve">20 oct 2026</w:t>
             </w:r>
           </w:p>
         </w:tc>
@@ -10059,7 +10583,7 @@
                 <w:sz w:val="23"/>
                 <w:szCs w:val="23"/>
               </w:rPr>
-              <w:t xml:space="preserve">Playlists completas con un solo archivo</w:t>
+              <w:t xml:space="preserve">Renombrar, fusionar y eliminar playlists</w:t>
             </w:r>
             <w:r>
               <w:rPr>
@@ -10070,6 +10594,199 @@
                 <w:szCs w:val="18"/>
               </w:rPr>
               <w:t xml:space="preserve">   · versión actual</w:t>
+            </w:r>
+          </w:p>
+        </w:tc>
+      </w:tr>
+    </w:tbl>
+    <w:p>
+      <w:pPr>
+        <w:pStyle w:val="ListParagraph"/>
+        <w:keepNext/>
+        <w:keepLines/>
+        <w:numPr>
+          <w:ilvl w:val="0"/>
+          <w:numId w:val="2"/>
+        </w:numPr>
+        <w:spacing w:after="60" w:line="276"/>
+      </w:pPr>
+      <w:r>
+        <w:rPr>
+          <w:b/>
+          <w:bCs/>
+        </w:rPr>
+        <w:t xml:space="preserve">Clic derecho en una playlist</w:t>
+      </w:r>
+      <w:r>
+        <w:t xml:space="preserve">: Renombrar, Fusionar con otra o Eliminar, </w:t>
+      </w:r>
+      <w:r>
+        <w:rPr>
+          <w:b/>
+          <w:bCs/>
+        </w:rPr>
+        <w:t xml:space="preserve">en todas partes</w:t>
+      </w:r>
+      <w:r>
+        <w:t xml:space="preserve">: BrainOrder, su carpeta, Spotify, Rekordbox, Traktor, Serato, Engine DJ y M3U.</w:t>
+      </w:r>
+    </w:p>
+    <w:p>
+      <w:pPr>
+        <w:pStyle w:val="ListParagraph"/>
+        <w:keepNext/>
+        <w:keepLines/>
+        <w:numPr>
+          <w:ilvl w:val="0"/>
+          <w:numId w:val="2"/>
+        </w:numPr>
+        <w:spacing w:after="60" w:line="276"/>
+      </w:pPr>
+      <w:r>
+        <w:t xml:space="preserve">Los archivos se mueven con rutas corregidas y </w:t>
+      </w:r>
+      <w:r>
+        <w:rPr>
+          <w:b/>
+          <w:bCs/>
+        </w:rPr>
+        <w:t xml:space="preserve">Deshacer</w:t>
+      </w:r>
+      <w:r>
+        <w:t xml:space="preserve"> en Historial; al eliminar se ordenan (o se dejan donde están), nunca se borran.</w:t>
+      </w:r>
+    </w:p>
+    <w:p>
+      <w:pPr>
+        <w:pStyle w:val="ListParagraph"/>
+        <w:keepNext/>
+        <w:keepLines/>
+        <w:numPr>
+          <w:ilvl w:val="0"/>
+          <w:numId w:val="2"/>
+        </w:numPr>
+        <w:spacing w:after="60" w:line="276"/>
+      </w:pPr>
+      <w:r>
+        <w:t xml:space="preserve">Si Spotify está en pausa, el cambio allá queda en la cola y se hace solo.</w:t>
+      </w:r>
+    </w:p>
+    <w:p>
+      <w:pPr>
+        <w:pStyle w:val="ListParagraph"/>
+        <w:keepNext w:val="false"/>
+        <w:keepLines/>
+        <w:numPr>
+          <w:ilvl w:val="0"/>
+          <w:numId w:val="2"/>
+        </w:numPr>
+        <w:spacing w:after="60" w:line="276"/>
+      </w:pPr>
+      <w:r>
+        <w:t xml:space="preserve">Las playlists importadas de una carpeta fuera de tu carpeta de playlists usan esa carpeta (ya no se crea otra vacía con el informe).</w:t>
+      </w:r>
+    </w:p>
+    <w:p>
+      <w:pPr>
+        <w:spacing w:after="80"/>
+      </w:pPr>
+    </w:p>
+    <w:tbl>
+      <w:tblPr>
+        <w:tblW w:type="dxa" w:w="9360"/>
+        <w:tblBorders>
+          <w:top w:val="single" w:color="auto" w:sz="4"/>
+          <w:left w:val="single" w:color="auto" w:sz="4"/>
+          <w:bottom w:val="single" w:color="auto" w:sz="4"/>
+          <w:right w:val="single" w:color="auto" w:sz="4"/>
+          <w:insideH w:val="single" w:color="auto" w:sz="4"/>
+          <w:insideV w:val="single" w:color="auto" w:sz="4"/>
+        </w:tblBorders>
+      </w:tblPr>
+      <w:tblGrid>
+        <w:gridCol w:w="1900"/>
+        <w:gridCol w:w="7460"/>
+      </w:tblGrid>
+      <w:tr>
+        <w:tc>
+          <w:tcPr>
+            <w:tcW w:type="dxa" w:w="1900"/>
+            <w:tcBorders>
+              <w:top w:val="single" w:color="D5D9E0" w:sz="4"/>
+              <w:left w:val="single" w:color="D5D9E0" w:sz="4"/>
+              <w:bottom w:val="single" w:color="D5D9E0" w:sz="4"/>
+              <w:right w:val="single" w:color="D5D9E0" w:sz="4"/>
+            </w:tcBorders>
+            <w:shd w:fill="1F2A44" w:color="auto" w:val="clear"/>
+            <w:tcMar>
+              <w:top w:type="dxa" w:w="80"/>
+              <w:left w:type="dxa" w:w="140"/>
+              <w:bottom w:type="dxa" w:w="80"/>
+              <w:right w:type="dxa" w:w="140"/>
+            </w:tcMar>
+            <w:vAlign w:val="center"/>
+          </w:tcPr>
+          <w:p>
+            <w:pPr>
+              <w:keepNext/>
+              <w:keepLines/>
+            </w:pPr>
+            <w:r>
+              <w:rPr>
+                <w:b/>
+                <w:bCs/>
+                <w:color w:val="FFFFFF"/>
+                <w:sz w:val="24"/>
+                <w:szCs w:val="24"/>
+              </w:rPr>
+              <w:t xml:space="preserve">v2.10.1</w:t>
+            </w:r>
+          </w:p>
+          <w:p>
+            <w:pPr>
+              <w:keepNext/>
+            </w:pPr>
+            <w:r>
+              <w:rPr>
+                <w:color w:val="FFFFFF"/>
+                <w:sz w:val="17"/>
+                <w:szCs w:val="17"/>
+              </w:rPr>
+              <w:t xml:space="preserve">19 oct 2026</w:t>
+            </w:r>
+          </w:p>
+        </w:tc>
+        <w:tc>
+          <w:tcPr>
+            <w:tcW w:type="dxa" w:w="7460"/>
+            <w:tcBorders>
+              <w:top w:val="single" w:color="D5D9E0" w:sz="4"/>
+              <w:left w:val="single" w:color="D5D9E0" w:sz="4"/>
+              <w:bottom w:val="single" w:color="D5D9E0" w:sz="4"/>
+              <w:right w:val="single" w:color="D5D9E0" w:sz="4"/>
+            </w:tcBorders>
+            <w:shd w:fill="F5F7FA" w:color="auto" w:val="clear"/>
+            <w:tcMar>
+              <w:top w:type="dxa" w:w="80"/>
+              <w:left w:type="dxa" w:w="160"/>
+              <w:bottom w:type="dxa" w:w="80"/>
+              <w:right w:type="dxa" w:w="140"/>
+            </w:tcMar>
+            <w:vAlign w:val="center"/>
+          </w:tcPr>
+          <w:p>
+            <w:pPr>
+              <w:keepNext/>
+            </w:pPr>
+            <w:r>
+              <w:rPr>
+                <w:b/>
+                <w:bCs/>
+                <w:color w:val="1F2A44"/>
+                <w:sz w:val="23"/>
+                <w:szCs w:val="23"/>
+              </w:rPr>
+              <w:t xml:space="preserve">Playlists completas con un solo archivo</w:t>
             </w:r>
           </w:p>
         </w:tc>

</xml_diff>

<commit_message>
v2.12.0: comparar dos playlists
Co-Authored-By: Claude Opus 5.5 <noreply@anthropic.com>
Claude-Session: https://claude.ai/code/session_015yBEKQCgZonTqt5J2V9uZ5
</commit_message>
<xml_diff>
--- a/docs/BrainOrder - Manual de usuario.docx
+++ b/docs/BrainOrder - Manual de usuario.docx
@@ -73,7 +73,7 @@
           <w:sz w:val="26"/>
           <w:szCs w:val="26"/>
         </w:rPr>
-        <w:t xml:space="preserve">Versión 2.11.0</w:t>
+        <w:t xml:space="preserve">Versión 2.12.0</w:t>
       </w:r>
     </w:p>
     <w:p>
@@ -4279,6 +4279,16 @@
           <w:b/>
           <w:bCs/>
         </w:rPr>
+        <w:t xml:space="preserve">Comparar con…</w:t>
+      </w:r>
+      <w:r>
+        <w:t xml:space="preserve">, </w:t>
+      </w:r>
+      <w:r>
+        <w:rPr>
+          <w:b/>
+          <w:bCs/>
+        </w:rPr>
         <w:t xml:space="preserve">Renombrar</w:t>
       </w:r>
       <w:r>
@@ -4434,16 +4444,16 @@
                 <w:sz w:val="19"/>
                 <w:szCs w:val="19"/>
               </w:rPr>
-              <w:t xml:space="preserve">✏️ </w:t>
-            </w:r>
-            <w:r>
-              <w:rPr>
-                <w:b/>
-                <w:bCs/>
-                <w:sz w:val="19"/>
-                <w:szCs w:val="19"/>
-              </w:rPr>
-              <w:t xml:space="preserve">Renombrar</w:t>
+              <w:t xml:space="preserve">⚖️ </w:t>
+            </w:r>
+            <w:r>
+              <w:rPr>
+                <w:b/>
+                <w:bCs/>
+                <w:sz w:val="19"/>
+                <w:szCs w:val="19"/>
+              </w:rPr>
+              <w:t xml:space="preserve">Comparar con…</w:t>
             </w:r>
           </w:p>
         </w:tc>
@@ -4473,7 +4483,39 @@
                 <w:sz w:val="19"/>
                 <w:szCs w:val="19"/>
               </w:rPr>
-              <w:t xml:space="preserve">Cambia el nombre en BrainOrder, en Spotify, en Rekordbox, Traktor, Serato, Engine DJ y las M3U, y pasa sus archivos a la carpeta con el nombre nuevo (rutas corregidas, con Deshacer). Si ya hay una playlist con ese nombre te propone fusionarlas.</w:t>
+              <w:t xml:space="preserve">Pone dos playlists lado a lado (no cambia nada): cuántas canciones tienen </w:t>
+            </w:r>
+            <w:r>
+              <w:rPr>
+                <w:b/>
+                <w:bCs/>
+                <w:sz w:val="19"/>
+                <w:szCs w:val="19"/>
+              </w:rPr>
+              <w:t xml:space="preserve">en común</w:t>
+            </w:r>
+            <w:r>
+              <w:rPr>
+                <w:sz w:val="19"/>
+                <w:szCs w:val="19"/>
+              </w:rPr>
+              <w:t xml:space="preserve">, cuántas están </w:t>
+            </w:r>
+            <w:r>
+              <w:rPr>
+                <w:b/>
+                <w:bCs/>
+                <w:sz w:val="19"/>
+                <w:szCs w:val="19"/>
+              </w:rPr>
+              <w:t xml:space="preserve">solo en una</w:t>
+            </w:r>
+            <w:r>
+              <w:rPr>
+                <w:sz w:val="19"/>
+                <w:szCs w:val="19"/>
+              </w:rPr>
+              <w:t xml:space="preserve"> y qué tan parecidas son (%). También qué porcentaje de cada una está en la otra, de cuántas en común tienes el archivo, los artistas que comparten y, si hay datos de Mixed In Key, BPM promedio y keys más usadas. Tiene pestañas con cada lista, buscador, «Copiar» la lista y un atajo para fusionarlas. Reconoce la misma canción por Spotify, ISRC, el mismo archivo o artista + título (sin tildes ni «feat.»).</w:t>
             </w:r>
           </w:p>
         </w:tc>
@@ -4509,16 +4551,16 @@
                 <w:sz w:val="19"/>
                 <w:szCs w:val="19"/>
               </w:rPr>
-              <w:t xml:space="preserve">🔀 </w:t>
-            </w:r>
-            <w:r>
-              <w:rPr>
-                <w:b/>
-                <w:bCs/>
-                <w:sz w:val="19"/>
-                <w:szCs w:val="19"/>
-              </w:rPr>
-              <w:t xml:space="preserve">Fusionar con otra</w:t>
+              <w:t xml:space="preserve">✏️ </w:t>
+            </w:r>
+            <w:r>
+              <w:rPr>
+                <w:b/>
+                <w:bCs/>
+                <w:sz w:val="19"/>
+                <w:szCs w:val="19"/>
+              </w:rPr>
+              <w:t xml:space="preserve">Renombrar</w:t>
             </w:r>
           </w:p>
         </w:tc>
@@ -4549,23 +4591,7 @@
                 <w:sz w:val="19"/>
                 <w:szCs w:val="19"/>
               </w:rPr>
-              <w:t xml:space="preserve">Agrega las canciones que falten al final de la playlist que elijas (también en Spotify), pasa sus archivos a la carpeta de esa (la copia repetida va a </w:t>
-            </w:r>
-            <w:r>
-              <w:rPr>
-                <w:rFonts w:ascii="Courier New" w:cs="Courier New" w:eastAsia="Courier New" w:hAnsi="Courier New"/>
-                <w:color w:val="1F2A44"/>
-                <w:sz w:val="19"/>
-                <w:szCs w:val="19"/>
-              </w:rPr>
-              <w:t xml:space="preserve">_duplicados</w:t>
-            </w:r>
-            <w:r>
-              <w:rPr>
-                <w:sz w:val="19"/>
-                <w:szCs w:val="19"/>
-              </w:rPr>
-              <w:t xml:space="preserve">) y elimina la primera en todas partes. Opcionalmente actualiza enseguida la playlist en tus programas de DJ.</w:t>
+              <w:t xml:space="preserve">Cambia el nombre en BrainOrder, en Spotify, en Rekordbox, Traktor, Serato, Engine DJ y las M3U, y pasa sus archivos a la carpeta con el nombre nuevo (rutas corregidas, con Deshacer). Si ya hay una playlist con ese nombre te propone fusionarlas.</w:t>
             </w:r>
           </w:p>
         </w:tc>
@@ -4600,6 +4626,97 @@
                 <w:sz w:val="19"/>
                 <w:szCs w:val="19"/>
               </w:rPr>
+              <w:t xml:space="preserve">🔀 </w:t>
+            </w:r>
+            <w:r>
+              <w:rPr>
+                <w:b/>
+                <w:bCs/>
+                <w:sz w:val="19"/>
+                <w:szCs w:val="19"/>
+              </w:rPr>
+              <w:t xml:space="preserve">Fusionar con otra</w:t>
+            </w:r>
+          </w:p>
+        </w:tc>
+        <w:tc>
+          <w:tcPr>
+            <w:tcW w:type="dxa" w:w="6960"/>
+            <w:tcBorders>
+              <w:top w:val="single" w:color="D5D9E0" w:sz="4"/>
+              <w:left w:val="single" w:color="D5D9E0" w:sz="4"/>
+              <w:bottom w:val="single" w:color="D5D9E0" w:sz="4"/>
+              <w:right w:val="single" w:color="D5D9E0" w:sz="4"/>
+            </w:tcBorders>
+            <w:tcMar>
+              <w:top w:type="dxa" w:w="90"/>
+              <w:left w:type="dxa" w:w="120"/>
+              <w:bottom w:type="dxa" w:w="90"/>
+              <w:right w:type="dxa" w:w="120"/>
+            </w:tcMar>
+            <w:vAlign w:val="center"/>
+          </w:tcPr>
+          <w:p>
+            <w:pPr>
+              <w:spacing w:after="40"/>
+            </w:pPr>
+            <w:r>
+              <w:rPr>
+                <w:sz w:val="19"/>
+                <w:szCs w:val="19"/>
+              </w:rPr>
+              <w:t xml:space="preserve">Agrega las canciones que falten al final de la playlist que elijas (también en Spotify), pasa sus archivos a la carpeta de esa (la copia repetida va a </w:t>
+            </w:r>
+            <w:r>
+              <w:rPr>
+                <w:rFonts w:ascii="Courier New" w:cs="Courier New" w:eastAsia="Courier New" w:hAnsi="Courier New"/>
+                <w:color w:val="1F2A44"/>
+                <w:sz w:val="19"/>
+                <w:szCs w:val="19"/>
+              </w:rPr>
+              <w:t xml:space="preserve">_duplicados</w:t>
+            </w:r>
+            <w:r>
+              <w:rPr>
+                <w:sz w:val="19"/>
+                <w:szCs w:val="19"/>
+              </w:rPr>
+              <w:t xml:space="preserve">) y elimina la primera en todas partes. Opcionalmente actualiza enseguida la playlist en tus programas de DJ.</w:t>
+            </w:r>
+          </w:p>
+        </w:tc>
+      </w:tr>
+      <w:tr>
+        <w:trPr>
+          <w:cantSplit/>
+        </w:trPr>
+        <w:tc>
+          <w:tcPr>
+            <w:tcW w:type="dxa" w:w="2400"/>
+            <w:tcBorders>
+              <w:top w:val="single" w:color="D5D9E0" w:sz="4"/>
+              <w:left w:val="single" w:color="D5D9E0" w:sz="4"/>
+              <w:bottom w:val="single" w:color="D5D9E0" w:sz="4"/>
+              <w:right w:val="single" w:color="D5D9E0" w:sz="4"/>
+            </w:tcBorders>
+            <w:shd w:fill="F5F7FA" w:color="auto" w:val="clear"/>
+            <w:tcMar>
+              <w:top w:type="dxa" w:w="90"/>
+              <w:left w:type="dxa" w:w="120"/>
+              <w:bottom w:type="dxa" w:w="90"/>
+              <w:right w:type="dxa" w:w="120"/>
+            </w:tcMar>
+            <w:vAlign w:val="center"/>
+          </w:tcPr>
+          <w:p>
+            <w:pPr>
+              <w:spacing w:after="40"/>
+            </w:pPr>
+            <w:r>
+              <w:rPr>
+                <w:sz w:val="19"/>
+                <w:szCs w:val="19"/>
+              </w:rPr>
               <w:t xml:space="preserve">🗑 </w:t>
             </w:r>
             <w:r>
@@ -4622,6 +4739,7 @@
               <w:bottom w:val="single" w:color="D5D9E0" w:sz="4"/>
               <w:right w:val="single" w:color="D5D9E0" w:sz="4"/>
             </w:tcBorders>
+            <w:shd w:fill="F5F7FA" w:color="auto" w:val="clear"/>
             <w:tcMar>
               <w:top w:type="dxa" w:w="90"/>
               <w:left w:type="dxa" w:w="120"/>
@@ -10536,7 +10654,7 @@
                 <w:sz w:val="24"/>
                 <w:szCs w:val="24"/>
               </w:rPr>
-              <w:t xml:space="preserve">v2.11.0</w:t>
+              <w:t xml:space="preserve">v2.12.0</w:t>
             </w:r>
           </w:p>
           <w:p>
@@ -10583,7 +10701,7 @@
                 <w:sz w:val="23"/>
                 <w:szCs w:val="23"/>
               </w:rPr>
-              <w:t xml:space="preserve">Renombrar, fusionar y eliminar playlists</w:t>
+              <w:t xml:space="preserve">Comparar playlists</w:t>
             </w:r>
             <w:r>
               <w:rPr>
@@ -10594,6 +10712,167 @@
                 <w:szCs w:val="18"/>
               </w:rPr>
               <w:t xml:space="preserve">   · versión actual</w:t>
+            </w:r>
+          </w:p>
+        </w:tc>
+      </w:tr>
+    </w:tbl>
+    <w:p>
+      <w:pPr>
+        <w:pStyle w:val="ListParagraph"/>
+        <w:keepNext/>
+        <w:keepLines/>
+        <w:numPr>
+          <w:ilvl w:val="0"/>
+          <w:numId w:val="2"/>
+        </w:numPr>
+        <w:spacing w:after="60" w:line="276"/>
+      </w:pPr>
+      <w:r>
+        <w:t xml:space="preserve">Clic derecho en una playlist → </w:t>
+      </w:r>
+      <w:r>
+        <w:rPr>
+          <w:b/>
+          <w:bCs/>
+        </w:rPr>
+        <w:t xml:space="preserve">⚖️ Comparar con…</w:t>
+      </w:r>
+      <w:r>
+        <w:t xml:space="preserve">: canciones en común, solo en cada una y % de parecido.</w:t>
+      </w:r>
+    </w:p>
+    <w:p>
+      <w:pPr>
+        <w:pStyle w:val="ListParagraph"/>
+        <w:keepNext/>
+        <w:keepLines/>
+        <w:numPr>
+          <w:ilvl w:val="0"/>
+          <w:numId w:val="2"/>
+        </w:numPr>
+        <w:spacing w:after="60" w:line="276"/>
+      </w:pPr>
+      <w:r>
+        <w:t xml:space="preserve">Qué parte de cada una está en la otra, cuántas en común ya tienes, artistas compartidos, BPM y keys.</w:t>
+      </w:r>
+    </w:p>
+    <w:p>
+      <w:pPr>
+        <w:pStyle w:val="ListParagraph"/>
+        <w:keepNext w:val="false"/>
+        <w:keepLines/>
+        <w:numPr>
+          <w:ilvl w:val="0"/>
+          <w:numId w:val="2"/>
+        </w:numPr>
+        <w:spacing w:after="60" w:line="276"/>
+      </w:pPr>
+      <w:r>
+        <w:t xml:space="preserve">Pestañas con cada lista, buscador, Copiar y atajo para fusionar.</w:t>
+      </w:r>
+    </w:p>
+    <w:p>
+      <w:pPr>
+        <w:spacing w:after="80"/>
+      </w:pPr>
+    </w:p>
+    <w:tbl>
+      <w:tblPr>
+        <w:tblW w:type="dxa" w:w="9360"/>
+        <w:tblBorders>
+          <w:top w:val="single" w:color="auto" w:sz="4"/>
+          <w:left w:val="single" w:color="auto" w:sz="4"/>
+          <w:bottom w:val="single" w:color="auto" w:sz="4"/>
+          <w:right w:val="single" w:color="auto" w:sz="4"/>
+          <w:insideH w:val="single" w:color="auto" w:sz="4"/>
+          <w:insideV w:val="single" w:color="auto" w:sz="4"/>
+        </w:tblBorders>
+      </w:tblPr>
+      <w:tblGrid>
+        <w:gridCol w:w="1900"/>
+        <w:gridCol w:w="7460"/>
+      </w:tblGrid>
+      <w:tr>
+        <w:tc>
+          <w:tcPr>
+            <w:tcW w:type="dxa" w:w="1900"/>
+            <w:tcBorders>
+              <w:top w:val="single" w:color="D5D9E0" w:sz="4"/>
+              <w:left w:val="single" w:color="D5D9E0" w:sz="4"/>
+              <w:bottom w:val="single" w:color="D5D9E0" w:sz="4"/>
+              <w:right w:val="single" w:color="D5D9E0" w:sz="4"/>
+            </w:tcBorders>
+            <w:shd w:fill="1F2A44" w:color="auto" w:val="clear"/>
+            <w:tcMar>
+              <w:top w:type="dxa" w:w="80"/>
+              <w:left w:type="dxa" w:w="140"/>
+              <w:bottom w:type="dxa" w:w="80"/>
+              <w:right w:type="dxa" w:w="140"/>
+            </w:tcMar>
+            <w:vAlign w:val="center"/>
+          </w:tcPr>
+          <w:p>
+            <w:pPr>
+              <w:keepNext/>
+              <w:keepLines/>
+            </w:pPr>
+            <w:r>
+              <w:rPr>
+                <w:b/>
+                <w:bCs/>
+                <w:color w:val="FFFFFF"/>
+                <w:sz w:val="24"/>
+                <w:szCs w:val="24"/>
+              </w:rPr>
+              <w:t xml:space="preserve">v2.11.0</w:t>
+            </w:r>
+          </w:p>
+          <w:p>
+            <w:pPr>
+              <w:keepNext/>
+            </w:pPr>
+            <w:r>
+              <w:rPr>
+                <w:color w:val="FFFFFF"/>
+                <w:sz w:val="17"/>
+                <w:szCs w:val="17"/>
+              </w:rPr>
+              <w:t xml:space="preserve">20 oct 2026</w:t>
+            </w:r>
+          </w:p>
+        </w:tc>
+        <w:tc>
+          <w:tcPr>
+            <w:tcW w:type="dxa" w:w="7460"/>
+            <w:tcBorders>
+              <w:top w:val="single" w:color="D5D9E0" w:sz="4"/>
+              <w:left w:val="single" w:color="D5D9E0" w:sz="4"/>
+              <w:bottom w:val="single" w:color="D5D9E0" w:sz="4"/>
+              <w:right w:val="single" w:color="D5D9E0" w:sz="4"/>
+            </w:tcBorders>
+            <w:shd w:fill="F5F7FA" w:color="auto" w:val="clear"/>
+            <w:tcMar>
+              <w:top w:type="dxa" w:w="80"/>
+              <w:left w:type="dxa" w:w="160"/>
+              <w:bottom w:type="dxa" w:w="80"/>
+              <w:right w:type="dxa" w:w="140"/>
+            </w:tcMar>
+            <w:vAlign w:val="center"/>
+          </w:tcPr>
+          <w:p>
+            <w:pPr>
+              <w:keepNext/>
+            </w:pPr>
+            <w:r>
+              <w:rPr>
+                <w:b/>
+                <w:bCs/>
+                <w:color w:val="1F2A44"/>
+                <w:sz w:val="23"/>
+                <w:szCs w:val="23"/>
+              </w:rPr>
+              <w:t xml:space="preserve">Renombrar, fusionar y eliminar playlists</w:t>
             </w:r>
           </w:p>
         </w:tc>

</xml_diff>

<commit_message>
v2.13.0: renombrar la carpeta de BrainOrder en todos los programas; cancelar lo que está en cola
Co-Authored-By: Claude Opus 5.5 <noreply@anthropic.com>
Claude-Session: https://claude.ai/code/session_015yBEKQCgZonTqt5J2V9uZ5
</commit_message>
<xml_diff>
--- a/docs/BrainOrder - Manual de usuario.docx
+++ b/docs/BrainOrder - Manual de usuario.docx
@@ -73,7 +73,7 @@
           <w:sz w:val="26"/>
           <w:szCs w:val="26"/>
         </w:rPr>
-        <w:t xml:space="preserve">Versión 2.12.0</w:t>
+        <w:t xml:space="preserve">Versión 2.13.0</w:t>
       </w:r>
     </w:p>
     <w:p>
@@ -382,7 +382,7 @@
           <w:sz w:val="22"/>
           <w:szCs w:val="22"/>
         </w:rPr>
-        <w:t xml:space="preserve">	13</w:t>
+        <w:t xml:space="preserve">	14</w:t>
       </w:r>
     </w:p>
     <w:p>
@@ -434,7 +434,7 @@
           <w:sz w:val="22"/>
           <w:szCs w:val="22"/>
         </w:rPr>
-        <w:t xml:space="preserve">	15</w:t>
+        <w:t xml:space="preserve">	16</w:t>
       </w:r>
     </w:p>
     <w:p>
@@ -460,7 +460,7 @@
           <w:sz w:val="22"/>
           <w:szCs w:val="22"/>
         </w:rPr>
-        <w:t xml:space="preserve">	16</w:t>
+        <w:t xml:space="preserve">	17</w:t>
       </w:r>
     </w:p>
     <w:p>
@@ -486,7 +486,7 @@
           <w:sz w:val="22"/>
           <w:szCs w:val="22"/>
         </w:rPr>
-        <w:t xml:space="preserve">	16</w:t>
+        <w:t xml:space="preserve">	17</w:t>
       </w:r>
     </w:p>
     <w:p>
@@ -512,7 +512,7 @@
           <w:sz w:val="22"/>
           <w:szCs w:val="22"/>
         </w:rPr>
-        <w:t xml:space="preserve">	16</w:t>
+        <w:t xml:space="preserve">	17</w:t>
       </w:r>
     </w:p>
     <w:p>
@@ -538,7 +538,7 @@
           <w:sz w:val="22"/>
           <w:szCs w:val="22"/>
         </w:rPr>
-        <w:t xml:space="preserve">	17</w:t>
+        <w:t xml:space="preserve">	18</w:t>
       </w:r>
     </w:p>
     <w:p>
@@ -564,7 +564,7 @@
           <w:sz w:val="22"/>
           <w:szCs w:val="22"/>
         </w:rPr>
-        <w:t xml:space="preserve">	17</w:t>
+        <w:t xml:space="preserve">	18</w:t>
       </w:r>
     </w:p>
     <w:p>
@@ -590,7 +590,7 @@
           <w:sz w:val="22"/>
           <w:szCs w:val="22"/>
         </w:rPr>
-        <w:t xml:space="preserve">	18</w:t>
+        <w:t xml:space="preserve">	19</w:t>
       </w:r>
     </w:p>
     <w:p>
@@ -616,7 +616,7 @@
           <w:sz w:val="22"/>
           <w:szCs w:val="22"/>
         </w:rPr>
-        <w:t xml:space="preserve">	19</w:t>
+        <w:t xml:space="preserve">	20</w:t>
       </w:r>
     </w:p>
     <w:p>
@@ -7385,7 +7385,7 @@
               <w:spacing w:after="40" w:line="264"/>
             </w:pPr>
             <w:r>
-              <w:t xml:space="preserve">El nombre de la carpeta que BrainOrder crea en cada programa se cambia en Conexiones. Al Reorganizar, Unificar, apartar duplicados o Deshacer, también se corrigen las rutas en todos tus programas.</w:t>
+              <w:t xml:space="preserve">Al Reorganizar, Unificar, apartar duplicados o Deshacer, también se corrigen las rutas en todos tus programas.</w:t>
             </w:r>
           </w:p>
         </w:tc>
@@ -7395,6 +7395,114 @@
       <w:pPr>
         <w:spacing w:after="120"/>
       </w:pPr>
+    </w:p>
+    <w:p>
+      <w:pPr>
+        <w:pStyle w:val="Heading2"/>
+      </w:pPr>
+      <w:r>
+        <w:t xml:space="preserve">Cambiar el nombre de la carpeta de BrainOrder</w:t>
+      </w:r>
+    </w:p>
+    <w:p>
+      <w:pPr>
+        <w:spacing w:after="120" w:line="276"/>
+      </w:pPr>
+      <w:r>
+        <w:t xml:space="preserve">El nombre de la carpeta donde BrainOrder pone tus playlists en cada programa se cambia en </w:t>
+      </w:r>
+      <w:r>
+        <w:rPr>
+          <w:b/>
+          <w:bCs/>
+        </w:rPr>
+        <w:t xml:space="preserve">Conexiones</w:t>
+      </w:r>
+      <w:r>
+        <w:t xml:space="preserve"> (o en Ajustes). Al cambiarlo, BrainOrder </w:t>
+      </w:r>
+      <w:r>
+        <w:rPr>
+          <w:b/>
+          <w:bCs/>
+        </w:rPr>
+        <w:t xml:space="preserve">renombra esa carpeta</w:t>
+      </w:r>
+      <w:r>
+        <w:t xml:space="preserve"> en Rekordbox, Traktor, Serato, Engine DJ y las M3U:</w:t>
+      </w:r>
+    </w:p>
+    <w:p>
+      <w:pPr>
+        <w:pStyle w:val="ListParagraph"/>
+        <w:numPr>
+          <w:ilvl w:val="0"/>
+          <w:numId w:val="2"/>
+        </w:numPr>
+        <w:spacing w:after="60" w:line="276"/>
+      </w:pPr>
+      <w:r>
+        <w:t xml:space="preserve">Son </w:t>
+      </w:r>
+      <w:r>
+        <w:rPr>
+          <w:b/>
+          <w:bCs/>
+        </w:rPr>
+        <w:t xml:space="preserve">las mismas playlists</w:t>
+      </w:r>
+      <w:r>
+        <w:t xml:space="preserve">: no se duplican, no aparecen en «Playlists nuevas» y en «Cambios en Rekordbox» no salen como borradas.</w:t>
+      </w:r>
+    </w:p>
+    <w:p>
+      <w:pPr>
+        <w:pStyle w:val="ListParagraph"/>
+        <w:numPr>
+          <w:ilvl w:val="0"/>
+          <w:numId w:val="2"/>
+        </w:numPr>
+        <w:spacing w:after="60" w:line="276"/>
+      </w:pPr>
+      <w:r>
+        <w:t xml:space="preserve">Si un programa está abierto, se renombra solo en cuanto lo cierras (o al Organizar). Mientras tanto, Organizar no le crea otra carpeta.</w:t>
+      </w:r>
+    </w:p>
+    <w:p>
+      <w:pPr>
+        <w:pStyle w:val="ListParagraph"/>
+        <w:numPr>
+          <w:ilvl w:val="0"/>
+          <w:numId w:val="2"/>
+        </w:numPr>
+        <w:spacing w:after="60" w:line="276"/>
+      </w:pPr>
+      <w:r>
+        <w:t xml:space="preserve">Si le cambias el nombre a la carpeta </w:t>
+      </w:r>
+      <w:r>
+        <w:rPr>
+          <w:b/>
+          <w:bCs/>
+        </w:rPr>
+        <w:t xml:space="preserve">dentro de Rekordbox</w:t>
+      </w:r>
+      <w:r>
+        <w:t xml:space="preserve">, BrainOrder lo reconoce por sus playlists, usa ese nombre y lo pasa a tus otros programas.</w:t>
+      </w:r>
+    </w:p>
+    <w:p>
+      <w:pPr>
+        <w:pStyle w:val="ListParagraph"/>
+        <w:numPr>
+          <w:ilvl w:val="0"/>
+          <w:numId w:val="2"/>
+        </w:numPr>
+        <w:spacing w:after="60" w:line="276"/>
+      </w:pPr>
+      <w:r>
+        <w:t xml:space="preserve">Si ya habías cambiado el nombre en una versión anterior, BrainOrder encuentra la carpeta vieja (por las playlists que tiene) y la renombra.</w:t>
+      </w:r>
     </w:p>
     <w:p>
       <w:pPr>
@@ -8438,7 +8546,7 @@
               <w:spacing w:after="40" w:line="264"/>
             </w:pPr>
             <w:r>
-              <w:t xml:space="preserve">Mientras no decidas, Organizar no toca esas playlists. Deezer y los archivos exportados solo se pueden leer; los cambios en playlists de esas fuentes se quedan en Rekordbox.</w:t>
+              <w:t xml:space="preserve">Mientras no decidas, Organizar no toca esas playlists. Deezer y los archivos exportados solo se pueden leer; los cambios en playlists de esas fuentes se quedan en Rekordbox. Renombrar la carpeta de BrainOrder (en BrainOrder o en Rekordbox) no cuenta como cambio: tus playlists no aparecen como borradas.</w:t>
             </w:r>
           </w:p>
         </w:tc>
@@ -9595,7 +9703,17 @@
         <w:spacing w:after="60" w:line="276"/>
       </w:pPr>
       <w:r>
-        <w:t xml:space="preserve">Los pendientes aparecen arriba («· 2 pendientes») y en «Playlists nuevas», donde puedes </w:t>
+        <w:t xml:space="preserve">Los pendientes aparecen arriba («· 2 pendientes», con clic ves la lista) y en «Playlists nuevas». Cada uno se cancela con su </w:t>
+      </w:r>
+      <w:r>
+        <w:rPr>
+          <w:b/>
+          <w:bCs/>
+        </w:rPr>
+        <w:t xml:space="preserve">✕</w:t>
+      </w:r>
+      <w:r>
+        <w:t xml:space="preserve"> o con clic derecho; también puedes </w:t>
       </w:r>
       <w:r>
         <w:rPr>
@@ -9605,17 +9723,7 @@
         <w:t xml:space="preserve">Pasar ya</w:t>
       </w:r>
       <w:r>
-        <w:t xml:space="preserve"> o </w:t>
-      </w:r>
-      <w:r>
-        <w:rPr>
-          <w:b/>
-          <w:bCs/>
-        </w:rPr>
-        <w:t xml:space="preserve">Cancelar</w:t>
-      </w:r>
-      <w:r>
-        <w:t xml:space="preserve"> cada uno. Cuando se completan te avisa.</w:t>
+        <w:t xml:space="preserve">. Cuando se completan te avisa.</w:t>
       </w:r>
     </w:p>
     <w:tbl>
@@ -10654,7 +10762,7 @@
                 <w:sz w:val="24"/>
                 <w:szCs w:val="24"/>
               </w:rPr>
-              <w:t xml:space="preserve">v2.12.0</w:t>
+              <w:t xml:space="preserve">v2.13.0</w:t>
             </w:r>
           </w:p>
           <w:p>
@@ -10701,7 +10809,7 @@
                 <w:sz w:val="23"/>
                 <w:szCs w:val="23"/>
               </w:rPr>
-              <w:t xml:space="preserve">Comparar playlists</w:t>
+              <w:t xml:space="preserve">Renombrar la carpeta de BrainOrder y cancelar</w:t>
             </w:r>
             <w:r>
               <w:rPr>
@@ -10712,6 +10820,174 @@
                 <w:szCs w:val="18"/>
               </w:rPr>
               <w:t xml:space="preserve">   · versión actual</w:t>
+            </w:r>
+          </w:p>
+        </w:tc>
+      </w:tr>
+    </w:tbl>
+    <w:p>
+      <w:pPr>
+        <w:pStyle w:val="ListParagraph"/>
+        <w:keepNext/>
+        <w:keepLines/>
+        <w:numPr>
+          <w:ilvl w:val="0"/>
+          <w:numId w:val="2"/>
+        </w:numPr>
+        <w:spacing w:after="60" w:line="276"/>
+      </w:pPr>
+      <w:r>
+        <w:t xml:space="preserve">Cambiar el nombre de la carpeta de BrainOrder en tus programas </w:t>
+      </w:r>
+      <w:r>
+        <w:rPr>
+          <w:b/>
+          <w:bCs/>
+        </w:rPr>
+        <w:t xml:space="preserve">la renombra</w:t>
+      </w:r>
+      <w:r>
+        <w:t xml:space="preserve"> en Rekordbox, Traktor, Serato, Engine DJ y M3U: no se duplica, no aparece en «Playlists nuevas» ni como borrada en «Cambios en Rekordbox».</w:t>
+      </w:r>
+    </w:p>
+    <w:p>
+      <w:pPr>
+        <w:pStyle w:val="ListParagraph"/>
+        <w:keepNext/>
+        <w:keepLines/>
+        <w:numPr>
+          <w:ilvl w:val="0"/>
+          <w:numId w:val="2"/>
+        </w:numPr>
+        <w:spacing w:after="60" w:line="276"/>
+      </w:pPr>
+      <w:r>
+        <w:t xml:space="preserve">Si la renombras dentro de Rekordbox, BrainOrder la reconoce y la renombra también en tus otros programas. Si ya la habías cambiado antes, la encuentra y la arregla.</w:t>
+      </w:r>
+    </w:p>
+    <w:p>
+      <w:pPr>
+        <w:pStyle w:val="ListParagraph"/>
+        <w:keepNext w:val="false"/>
+        <w:keepLines/>
+        <w:numPr>
+          <w:ilvl w:val="0"/>
+          <w:numId w:val="2"/>
+        </w:numPr>
+        <w:spacing w:after="60" w:line="276"/>
+      </w:pPr>
+      <w:r>
+        <w:rPr>
+          <w:b/>
+          <w:bCs/>
+        </w:rPr>
+        <w:t xml:space="preserve">Cancelar</w:t>
+      </w:r>
+      <w:r>
+        <w:t xml:space="preserve">: lo que está en cola (esperando su turno) se cancela con ✕ o clic derecho; también cada pendiente para Spotify.</w:t>
+      </w:r>
+    </w:p>
+    <w:p>
+      <w:pPr>
+        <w:spacing w:after="80"/>
+      </w:pPr>
+    </w:p>
+    <w:tbl>
+      <w:tblPr>
+        <w:tblW w:type="dxa" w:w="9360"/>
+        <w:tblBorders>
+          <w:top w:val="single" w:color="auto" w:sz="4"/>
+          <w:left w:val="single" w:color="auto" w:sz="4"/>
+          <w:bottom w:val="single" w:color="auto" w:sz="4"/>
+          <w:right w:val="single" w:color="auto" w:sz="4"/>
+          <w:insideH w:val="single" w:color="auto" w:sz="4"/>
+          <w:insideV w:val="single" w:color="auto" w:sz="4"/>
+        </w:tblBorders>
+      </w:tblPr>
+      <w:tblGrid>
+        <w:gridCol w:w="1900"/>
+        <w:gridCol w:w="7460"/>
+      </w:tblGrid>
+      <w:tr>
+        <w:tc>
+          <w:tcPr>
+            <w:tcW w:type="dxa" w:w="1900"/>
+            <w:tcBorders>
+              <w:top w:val="single" w:color="D5D9E0" w:sz="4"/>
+              <w:left w:val="single" w:color="D5D9E0" w:sz="4"/>
+              <w:bottom w:val="single" w:color="D5D9E0" w:sz="4"/>
+              <w:right w:val="single" w:color="D5D9E0" w:sz="4"/>
+            </w:tcBorders>
+            <w:shd w:fill="1F2A44" w:color="auto" w:val="clear"/>
+            <w:tcMar>
+              <w:top w:type="dxa" w:w="80"/>
+              <w:left w:type="dxa" w:w="140"/>
+              <w:bottom w:type="dxa" w:w="80"/>
+              <w:right w:type="dxa" w:w="140"/>
+            </w:tcMar>
+            <w:vAlign w:val="center"/>
+          </w:tcPr>
+          <w:p>
+            <w:pPr>
+              <w:keepNext/>
+              <w:keepLines/>
+            </w:pPr>
+            <w:r>
+              <w:rPr>
+                <w:b/>
+                <w:bCs/>
+                <w:color w:val="FFFFFF"/>
+                <w:sz w:val="24"/>
+                <w:szCs w:val="24"/>
+              </w:rPr>
+              <w:t xml:space="preserve">v2.12.0</w:t>
+            </w:r>
+          </w:p>
+          <w:p>
+            <w:pPr>
+              <w:keepNext/>
+            </w:pPr>
+            <w:r>
+              <w:rPr>
+                <w:color w:val="FFFFFF"/>
+                <w:sz w:val="17"/>
+                <w:szCs w:val="17"/>
+              </w:rPr>
+              <w:t xml:space="preserve">20 oct 2026</w:t>
+            </w:r>
+          </w:p>
+        </w:tc>
+        <w:tc>
+          <w:tcPr>
+            <w:tcW w:type="dxa" w:w="7460"/>
+            <w:tcBorders>
+              <w:top w:val="single" w:color="D5D9E0" w:sz="4"/>
+              <w:left w:val="single" w:color="D5D9E0" w:sz="4"/>
+              <w:bottom w:val="single" w:color="D5D9E0" w:sz="4"/>
+              <w:right w:val="single" w:color="D5D9E0" w:sz="4"/>
+            </w:tcBorders>
+            <w:shd w:fill="F5F7FA" w:color="auto" w:val="clear"/>
+            <w:tcMar>
+              <w:top w:type="dxa" w:w="80"/>
+              <w:left w:type="dxa" w:w="160"/>
+              <w:bottom w:type="dxa" w:w="80"/>
+              <w:right w:type="dxa" w:w="140"/>
+            </w:tcMar>
+            <w:vAlign w:val="center"/>
+          </w:tcPr>
+          <w:p>
+            <w:pPr>
+              <w:keepNext/>
+            </w:pPr>
+            <w:r>
+              <w:rPr>
+                <w:b/>
+                <w:bCs/>
+                <w:color w:val="1F2A44"/>
+                <w:sz w:val="23"/>
+                <w:szCs w:val="23"/>
+              </w:rPr>
+              <w:t xml:space="preserve">Comparar playlists</w:t>
             </w:r>
           </w:p>
         </w:tc>

</xml_diff>

<commit_message>
v2.13.1: ordenar las playlists al comparar (nombre, fecha de creación, más en común…)
Co-Authored-By: Claude Opus 5.5 <noreply@anthropic.com>
Claude-Session: https://claude.ai/code/session_015yBEKQCgZonTqt5J2V9uZ5
</commit_message>
<xml_diff>
--- a/docs/BrainOrder - Manual de usuario.docx
+++ b/docs/BrainOrder - Manual de usuario.docx
@@ -73,7 +73,7 @@
           <w:sz w:val="26"/>
           <w:szCs w:val="26"/>
         </w:rPr>
-        <w:t xml:space="preserve">Versión 2.13.0</w:t>
+        <w:t xml:space="preserve">Versión 2.13.1</w:t>
       </w:r>
     </w:p>
     <w:p>
@@ -4515,7 +4515,39 @@
                 <w:sz w:val="19"/>
                 <w:szCs w:val="19"/>
               </w:rPr>
-              <w:t xml:space="preserve"> y qué tan parecidas son (%). También qué porcentaje de cada una está en la otra, de cuántas en común tienes el archivo, los artistas que comparten y, si hay datos de Mixed In Key, BPM promedio y keys más usadas. Tiene pestañas con cada lista, buscador, «Copiar» la lista y un atajo para fusionarlas. Reconoce la misma canción por Spotify, ISRC, el mismo archivo o artista + título (sin tildes ni «feat.»).</w:t>
+              <w:t xml:space="preserve"> y qué tan parecidas son (%). También qué porcentaje de cada una está en la otra, de cuántas en común tienes el archivo, los artistas que comparten y, si hay datos de Mixed In Key, BPM promedio y keys más usadas. Para elegir, las playlists se pueden </w:t>
+            </w:r>
+            <w:r>
+              <w:rPr>
+                <w:b/>
+                <w:bCs/>
+                <w:sz w:val="19"/>
+                <w:szCs w:val="19"/>
+              </w:rPr>
+              <w:t xml:space="preserve">ordenar por</w:t>
+            </w:r>
+            <w:r>
+              <w:rPr>
+                <w:sz w:val="19"/>
+                <w:szCs w:val="19"/>
+              </w:rPr>
+              <w:t xml:space="preserve"> nombre, fecha de creación, canciones agregadas hace poco, cantidad de canciones o </w:t>
+            </w:r>
+            <w:r>
+              <w:rPr>
+                <w:b/>
+                <w:bCs/>
+                <w:sz w:val="19"/>
+                <w:szCs w:val="19"/>
+              </w:rPr>
+              <w:t xml:space="preserve">más en común</w:t>
+            </w:r>
+            <w:r>
+              <w:rPr>
+                <w:sz w:val="19"/>
+                <w:szCs w:val="19"/>
+              </w:rPr>
+              <w:t xml:space="preserve"> (al lado de cada una sale la fecha, la cantidad o cuántas comparten). Tiene pestañas con cada lista, buscador, «Copiar» la lista y un atajo para fusionarlas. Reconoce la misma canción por Spotify, ISRC, el mismo archivo o artista + título (sin tildes ni «feat.»).</w:t>
             </w:r>
           </w:p>
         </w:tc>
@@ -10762,7 +10794,7 @@
                 <w:sz w:val="24"/>
                 <w:szCs w:val="24"/>
               </w:rPr>
-              <w:t xml:space="preserve">v2.13.0</w:t>
+              <w:t xml:space="preserve">v2.13.1</w:t>
             </w:r>
           </w:p>
           <w:p>
@@ -10809,7 +10841,7 @@
                 <w:sz w:val="23"/>
                 <w:szCs w:val="23"/>
               </w:rPr>
-              <w:t xml:space="preserve">Renombrar la carpeta de BrainOrder y cancelar</w:t>
+              <w:t xml:space="preserve">Ordenar al comparar</w:t>
             </w:r>
             <w:r>
               <w:rPr>
@@ -10820,6 +10852,167 @@
                 <w:szCs w:val="18"/>
               </w:rPr>
               <w:t xml:space="preserve">   · versión actual</w:t>
+            </w:r>
+          </w:p>
+        </w:tc>
+      </w:tr>
+    </w:tbl>
+    <w:p>
+      <w:pPr>
+        <w:pStyle w:val="ListParagraph"/>
+        <w:keepNext/>
+        <w:keepLines/>
+        <w:numPr>
+          <w:ilvl w:val="0"/>
+          <w:numId w:val="2"/>
+        </w:numPr>
+        <w:spacing w:after="60" w:line="276"/>
+      </w:pPr>
+      <w:r>
+        <w:t xml:space="preserve">Al comparar, las playlists para elegir se ordenan por nombre, fecha de creación, canciones agregadas hace poco, cantidad o </w:t>
+      </w:r>
+      <w:r>
+        <w:rPr>
+          <w:b/>
+          <w:bCs/>
+        </w:rPr>
+        <w:t xml:space="preserve">más en común</w:t>
+      </w:r>
+      <w:r>
+        <w:t xml:space="preserve">.</w:t>
+      </w:r>
+    </w:p>
+    <w:p>
+      <w:pPr>
+        <w:pStyle w:val="ListParagraph"/>
+        <w:keepNext/>
+        <w:keepLines/>
+        <w:numPr>
+          <w:ilvl w:val="0"/>
+          <w:numId w:val="2"/>
+        </w:numPr>
+        <w:spacing w:after="60" w:line="276"/>
+      </w:pPr>
+      <w:r>
+        <w:t xml:space="preserve">La lista de la izquierda también se puede ordenar por fecha de creación.</w:t>
+      </w:r>
+    </w:p>
+    <w:p>
+      <w:pPr>
+        <w:pStyle w:val="ListParagraph"/>
+        <w:keepNext w:val="false"/>
+        <w:keepLines/>
+        <w:numPr>
+          <w:ilvl w:val="0"/>
+          <w:numId w:val="2"/>
+        </w:numPr>
+        <w:spacing w:after="60" w:line="276"/>
+      </w:pPr>
+      <w:r>
+        <w:t xml:space="preserve">Spotify no da la fecha de creación de una playlist: se usa cuándo se agregó su primera canción (o, si aún no se sabe, cuándo se creó su carpeta, marcada «aprox.»).</w:t>
+      </w:r>
+    </w:p>
+    <w:p>
+      <w:pPr>
+        <w:spacing w:after="80"/>
+      </w:pPr>
+    </w:p>
+    <w:tbl>
+      <w:tblPr>
+        <w:tblW w:type="dxa" w:w="9360"/>
+        <w:tblBorders>
+          <w:top w:val="single" w:color="auto" w:sz="4"/>
+          <w:left w:val="single" w:color="auto" w:sz="4"/>
+          <w:bottom w:val="single" w:color="auto" w:sz="4"/>
+          <w:right w:val="single" w:color="auto" w:sz="4"/>
+          <w:insideH w:val="single" w:color="auto" w:sz="4"/>
+          <w:insideV w:val="single" w:color="auto" w:sz="4"/>
+        </w:tblBorders>
+      </w:tblPr>
+      <w:tblGrid>
+        <w:gridCol w:w="1900"/>
+        <w:gridCol w:w="7460"/>
+      </w:tblGrid>
+      <w:tr>
+        <w:tc>
+          <w:tcPr>
+            <w:tcW w:type="dxa" w:w="1900"/>
+            <w:tcBorders>
+              <w:top w:val="single" w:color="D5D9E0" w:sz="4"/>
+              <w:left w:val="single" w:color="D5D9E0" w:sz="4"/>
+              <w:bottom w:val="single" w:color="D5D9E0" w:sz="4"/>
+              <w:right w:val="single" w:color="D5D9E0" w:sz="4"/>
+            </w:tcBorders>
+            <w:shd w:fill="1F2A44" w:color="auto" w:val="clear"/>
+            <w:tcMar>
+              <w:top w:type="dxa" w:w="80"/>
+              <w:left w:type="dxa" w:w="140"/>
+              <w:bottom w:type="dxa" w:w="80"/>
+              <w:right w:type="dxa" w:w="140"/>
+            </w:tcMar>
+            <w:vAlign w:val="center"/>
+          </w:tcPr>
+          <w:p>
+            <w:pPr>
+              <w:keepNext/>
+              <w:keepLines/>
+            </w:pPr>
+            <w:r>
+              <w:rPr>
+                <w:b/>
+                <w:bCs/>
+                <w:color w:val="FFFFFF"/>
+                <w:sz w:val="24"/>
+                <w:szCs w:val="24"/>
+              </w:rPr>
+              <w:t xml:space="preserve">v2.13.0</w:t>
+            </w:r>
+          </w:p>
+          <w:p>
+            <w:pPr>
+              <w:keepNext/>
+            </w:pPr>
+            <w:r>
+              <w:rPr>
+                <w:color w:val="FFFFFF"/>
+                <w:sz w:val="17"/>
+                <w:szCs w:val="17"/>
+              </w:rPr>
+              <w:t xml:space="preserve">20 oct 2026</w:t>
+            </w:r>
+          </w:p>
+        </w:tc>
+        <w:tc>
+          <w:tcPr>
+            <w:tcW w:type="dxa" w:w="7460"/>
+            <w:tcBorders>
+              <w:top w:val="single" w:color="D5D9E0" w:sz="4"/>
+              <w:left w:val="single" w:color="D5D9E0" w:sz="4"/>
+              <w:bottom w:val="single" w:color="D5D9E0" w:sz="4"/>
+              <w:right w:val="single" w:color="D5D9E0" w:sz="4"/>
+            </w:tcBorders>
+            <w:shd w:fill="F5F7FA" w:color="auto" w:val="clear"/>
+            <w:tcMar>
+              <w:top w:type="dxa" w:w="80"/>
+              <w:left w:type="dxa" w:w="160"/>
+              <w:bottom w:type="dxa" w:w="80"/>
+              <w:right w:type="dxa" w:w="140"/>
+            </w:tcMar>
+            <w:vAlign w:val="center"/>
+          </w:tcPr>
+          <w:p>
+            <w:pPr>
+              <w:keepNext/>
+            </w:pPr>
+            <w:r>
+              <w:rPr>
+                <w:b/>
+                <w:bCs/>
+                <w:color w:val="1F2A44"/>
+                <w:sz w:val="23"/>
+                <w:szCs w:val="23"/>
+              </w:rPr>
+              <w:t xml:space="preserve">Renombrar la carpeta de BrainOrder y cancelar</w:t>
             </w:r>
           </w:p>
         </w:tc>

</xml_diff>

<commit_message>
v2.13.2: fusionar/eliminar no deja la carpeta vieja ni la toma como playlist nueva
Co-Authored-By: Claude Opus 5.5 <noreply@anthropic.com>
Claude-Session: https://claude.ai/code/session_015yBEKQCgZonTqt5J2V9uZ5
</commit_message>
<xml_diff>
--- a/docs/BrainOrder - Manual de usuario.docx
+++ b/docs/BrainOrder - Manual de usuario.docx
@@ -73,7 +73,7 @@
           <w:sz w:val="26"/>
           <w:szCs w:val="26"/>
         </w:rPr>
-        <w:t xml:space="preserve">Versión 2.13.1</w:t>
+        <w:t xml:space="preserve">Versión 2.13.2</w:t>
       </w:r>
     </w:p>
     <w:p>
@@ -4931,6 +4931,41 @@
       </w:pPr>
       <w:r>
         <w:t xml:space="preserve">Si te arrepientes de eliminar una de Spotify, Spotify deja recuperarla desde tu cuenta (Recuperar playlists).</w:t>
+      </w:r>
+    </w:p>
+    <w:p>
+      <w:pPr>
+        <w:pStyle w:val="ListParagraph"/>
+        <w:numPr>
+          <w:ilvl w:val="0"/>
+          <w:numId w:val="2"/>
+        </w:numPr>
+        <w:spacing w:after="60" w:line="276"/>
+      </w:pPr>
+      <w:r>
+        <w:t xml:space="preserve">Al fusionar o eliminar (con «Ordenarlos»), la carpeta vieja </w:t>
+      </w:r>
+      <w:r>
+        <w:rPr>
+          <w:b/>
+          <w:bCs/>
+        </w:rPr>
+        <w:t xml:space="preserve">desaparece</w:t>
+      </w:r>
+      <w:r>
+        <w:t xml:space="preserve">: si un archivo choca con otro del mismo nombre va a </w:t>
+      </w:r>
+      <w:r>
+        <w:rPr>
+          <w:rFonts w:ascii="Courier New" w:cs="Courier New" w:eastAsia="Courier New" w:hAnsi="Courier New"/>
+          <w:color w:val="1F2A44"/>
+          <w:sz w:val="19"/>
+          <w:szCs w:val="19"/>
+        </w:rPr>
+        <w:t xml:space="preserve">_duplicados</w:t>
+      </w:r>
+      <w:r>
+        <w:t xml:space="preserve"> (nunca se pisa) y la basura del sistema (.DS_Store, «._archivo») se limpia. Si algo no se puede mover, te lo dice y esa carpeta no vuelve a aparecer como «playlist nueva».</w:t>
       </w:r>
     </w:p>
     <w:p>
@@ -10794,7 +10829,7 @@
                 <w:sz w:val="24"/>
                 <w:szCs w:val="24"/>
               </w:rPr>
-              <w:t xml:space="preserve">v2.13.1</w:t>
+              <w:t xml:space="preserve">v2.13.2</w:t>
             </w:r>
           </w:p>
           <w:p>
@@ -10841,7 +10876,7 @@
                 <w:sz w:val="23"/>
                 <w:szCs w:val="23"/>
               </w:rPr>
-              <w:t xml:space="preserve">Ordenar al comparar</w:t>
+              <w:t xml:space="preserve">Fusionar sin dejar carpetas atrás</w:t>
             </w:r>
             <w:r>
               <w:rPr>
@@ -10852,6 +10887,154 @@
                 <w:szCs w:val="18"/>
               </w:rPr>
               <w:t xml:space="preserve">   · versión actual</w:t>
+            </w:r>
+          </w:p>
+        </w:tc>
+      </w:tr>
+    </w:tbl>
+    <w:p>
+      <w:pPr>
+        <w:pStyle w:val="ListParagraph"/>
+        <w:keepNext/>
+        <w:keepLines/>
+        <w:numPr>
+          <w:ilvl w:val="0"/>
+          <w:numId w:val="2"/>
+        </w:numPr>
+        <w:spacing w:after="60" w:line="276"/>
+      </w:pPr>
+      <w:r>
+        <w:t xml:space="preserve">Al fusionar o eliminar una playlist su carpeta ya no queda rezagada: los archivos que chocan por nombre van a </w:t>
+      </w:r>
+      <w:r>
+        <w:rPr>
+          <w:rFonts w:ascii="Courier New" w:cs="Courier New" w:eastAsia="Courier New" w:hAnsi="Courier New"/>
+          <w:color w:val="1F2A44"/>
+          <w:sz w:val="19"/>
+          <w:szCs w:val="19"/>
+        </w:rPr>
+        <w:t xml:space="preserve">_duplicados</w:t>
+      </w:r>
+      <w:r>
+        <w:t xml:space="preserve"> y se limpia la basura de macOS.</w:t>
+      </w:r>
+    </w:p>
+    <w:p>
+      <w:pPr>
+        <w:pStyle w:val="ListParagraph"/>
+        <w:keepNext w:val="false"/>
+        <w:keepLines/>
+        <w:numPr>
+          <w:ilvl w:val="0"/>
+          <w:numId w:val="2"/>
+        </w:numPr>
+        <w:spacing w:after="60" w:line="276"/>
+      </w:pPr>
+      <w:r>
+        <w:t xml:space="preserve">Si algo no se puede mover, te avisa y la carpeta no se toma como «playlist nueva». Las que quedaron de fusiones anteriores también se reconocen.</w:t>
+      </w:r>
+    </w:p>
+    <w:p>
+      <w:pPr>
+        <w:spacing w:after="80"/>
+      </w:pPr>
+    </w:p>
+    <w:tbl>
+      <w:tblPr>
+        <w:tblW w:type="dxa" w:w="9360"/>
+        <w:tblBorders>
+          <w:top w:val="single" w:color="auto" w:sz="4"/>
+          <w:left w:val="single" w:color="auto" w:sz="4"/>
+          <w:bottom w:val="single" w:color="auto" w:sz="4"/>
+          <w:right w:val="single" w:color="auto" w:sz="4"/>
+          <w:insideH w:val="single" w:color="auto" w:sz="4"/>
+          <w:insideV w:val="single" w:color="auto" w:sz="4"/>
+        </w:tblBorders>
+      </w:tblPr>
+      <w:tblGrid>
+        <w:gridCol w:w="1900"/>
+        <w:gridCol w:w="7460"/>
+      </w:tblGrid>
+      <w:tr>
+        <w:tc>
+          <w:tcPr>
+            <w:tcW w:type="dxa" w:w="1900"/>
+            <w:tcBorders>
+              <w:top w:val="single" w:color="D5D9E0" w:sz="4"/>
+              <w:left w:val="single" w:color="D5D9E0" w:sz="4"/>
+              <w:bottom w:val="single" w:color="D5D9E0" w:sz="4"/>
+              <w:right w:val="single" w:color="D5D9E0" w:sz="4"/>
+            </w:tcBorders>
+            <w:shd w:fill="1F2A44" w:color="auto" w:val="clear"/>
+            <w:tcMar>
+              <w:top w:type="dxa" w:w="80"/>
+              <w:left w:type="dxa" w:w="140"/>
+              <w:bottom w:type="dxa" w:w="80"/>
+              <w:right w:type="dxa" w:w="140"/>
+            </w:tcMar>
+            <w:vAlign w:val="center"/>
+          </w:tcPr>
+          <w:p>
+            <w:pPr>
+              <w:keepNext/>
+              <w:keepLines/>
+            </w:pPr>
+            <w:r>
+              <w:rPr>
+                <w:b/>
+                <w:bCs/>
+                <w:color w:val="FFFFFF"/>
+                <w:sz w:val="24"/>
+                <w:szCs w:val="24"/>
+              </w:rPr>
+              <w:t xml:space="preserve">v2.13.1</w:t>
+            </w:r>
+          </w:p>
+          <w:p>
+            <w:pPr>
+              <w:keepNext/>
+            </w:pPr>
+            <w:r>
+              <w:rPr>
+                <w:color w:val="FFFFFF"/>
+                <w:sz w:val="17"/>
+                <w:szCs w:val="17"/>
+              </w:rPr>
+              <w:t xml:space="preserve">20 oct 2026</w:t>
+            </w:r>
+          </w:p>
+        </w:tc>
+        <w:tc>
+          <w:tcPr>
+            <w:tcW w:type="dxa" w:w="7460"/>
+            <w:tcBorders>
+              <w:top w:val="single" w:color="D5D9E0" w:sz="4"/>
+              <w:left w:val="single" w:color="D5D9E0" w:sz="4"/>
+              <w:bottom w:val="single" w:color="D5D9E0" w:sz="4"/>
+              <w:right w:val="single" w:color="D5D9E0" w:sz="4"/>
+            </w:tcBorders>
+            <w:shd w:fill="F5F7FA" w:color="auto" w:val="clear"/>
+            <w:tcMar>
+              <w:top w:type="dxa" w:w="80"/>
+              <w:left w:type="dxa" w:w="160"/>
+              <w:bottom w:type="dxa" w:w="80"/>
+              <w:right w:type="dxa" w:w="140"/>
+            </w:tcMar>
+            <w:vAlign w:val="center"/>
+          </w:tcPr>
+          <w:p>
+            <w:pPr>
+              <w:keepNext/>
+            </w:pPr>
+            <w:r>
+              <w:rPr>
+                <w:b/>
+                <w:bCs/>
+                <w:color w:val="1F2A44"/>
+                <w:sz w:val="23"/>
+                <w:szCs w:val="23"/>
+              </w:rPr>
+              <w:t xml:space="preserve">Ordenar al comparar</w:t>
             </w:r>
           </w:p>
         </w:tc>

</xml_diff>

<commit_message>
v2.14.0: vista previa de canciones (archivo propio o 30 s de Deezer)
Co-Authored-By: Claude Opus 5.5 <noreply@anthropic.com>
Claude-Session: https://claude.ai/code/session_015yBEKQCgZonTqt5J2V9uZ5
</commit_message>
<xml_diff>
--- a/docs/BrainOrder - Manual de usuario.docx
+++ b/docs/BrainOrder - Manual de usuario.docx
@@ -73,7 +73,7 @@
           <w:sz w:val="26"/>
           <w:szCs w:val="26"/>
         </w:rPr>
-        <w:t xml:space="preserve">Versión 2.13.2</w:t>
+        <w:t xml:space="preserve">Versión 2.14.0</w:t>
       </w:r>
     </w:p>
     <w:p>
@@ -278,7 +278,7 @@
           <w:sz w:val="22"/>
           <w:szCs w:val="22"/>
         </w:rPr>
-        <w:t xml:space="preserve">	9</w:t>
+        <w:t xml:space="preserve">	10</w:t>
       </w:r>
     </w:p>
     <w:p>
@@ -330,7 +330,7 @@
           <w:sz w:val="22"/>
           <w:szCs w:val="22"/>
         </w:rPr>
-        <w:t xml:space="preserve">	11</w:t>
+        <w:t xml:space="preserve">	12</w:t>
       </w:r>
     </w:p>
     <w:p>
@@ -356,7 +356,7 @@
           <w:sz w:val="22"/>
           <w:szCs w:val="22"/>
         </w:rPr>
-        <w:t xml:space="preserve">	12</w:t>
+        <w:t xml:space="preserve">	13</w:t>
       </w:r>
     </w:p>
     <w:p>
@@ -382,7 +382,7 @@
           <w:sz w:val="22"/>
           <w:szCs w:val="22"/>
         </w:rPr>
-        <w:t xml:space="preserve">	14</w:t>
+        <w:t xml:space="preserve">	15</w:t>
       </w:r>
     </w:p>
     <w:p>
@@ -408,7 +408,7 @@
           <w:sz w:val="22"/>
           <w:szCs w:val="22"/>
         </w:rPr>
-        <w:t xml:space="preserve">	14</w:t>
+        <w:t xml:space="preserve">	15</w:t>
       </w:r>
     </w:p>
     <w:p>
@@ -434,7 +434,7 @@
           <w:sz w:val="22"/>
           <w:szCs w:val="22"/>
         </w:rPr>
-        <w:t xml:space="preserve">	16</w:t>
+        <w:t xml:space="preserve">	17</w:t>
       </w:r>
     </w:p>
     <w:p>
@@ -460,7 +460,7 @@
           <w:sz w:val="22"/>
           <w:szCs w:val="22"/>
         </w:rPr>
-        <w:t xml:space="preserve">	17</w:t>
+        <w:t xml:space="preserve">	18</w:t>
       </w:r>
     </w:p>
     <w:p>
@@ -486,7 +486,7 @@
           <w:sz w:val="22"/>
           <w:szCs w:val="22"/>
         </w:rPr>
-        <w:t xml:space="preserve">	17</w:t>
+        <w:t xml:space="preserve">	18</w:t>
       </w:r>
     </w:p>
     <w:p>
@@ -512,7 +512,7 @@
           <w:sz w:val="22"/>
           <w:szCs w:val="22"/>
         </w:rPr>
-        <w:t xml:space="preserve">	17</w:t>
+        <w:t xml:space="preserve">	18</w:t>
       </w:r>
     </w:p>
     <w:p>
@@ -538,7 +538,7 @@
           <w:sz w:val="22"/>
           <w:szCs w:val="22"/>
         </w:rPr>
-        <w:t xml:space="preserve">	18</w:t>
+        <w:t xml:space="preserve">	19</w:t>
       </w:r>
     </w:p>
     <w:p>
@@ -564,7 +564,7 @@
           <w:sz w:val="22"/>
           <w:szCs w:val="22"/>
         </w:rPr>
-        <w:t xml:space="preserve">	18</w:t>
+        <w:t xml:space="preserve">	19</w:t>
       </w:r>
     </w:p>
     <w:p>
@@ -590,7 +590,7 @@
           <w:sz w:val="22"/>
           <w:szCs w:val="22"/>
         </w:rPr>
-        <w:t xml:space="preserve">	19</w:t>
+        <w:t xml:space="preserve">	20</w:t>
       </w:r>
     </w:p>
     <w:p>
@@ -616,7 +616,7 @@
           <w:sz w:val="22"/>
           <w:szCs w:val="22"/>
         </w:rPr>
-        <w:t xml:space="preserve">	20</w:t>
+        <w:t xml:space="preserve">	21</w:t>
       </w:r>
     </w:p>
     <w:p>
@@ -3885,6 +3885,115 @@
       </w:pPr>
       <w:r>
         <w:t xml:space="preserve">Las listas largas se muestran de 400 en 400 con «Mostrar más» y «Mostrar todas», para que la ventana nunca se trabe.</w:t>
+      </w:r>
+    </w:p>
+    <w:p>
+      <w:pPr>
+        <w:pStyle w:val="Heading2"/>
+      </w:pPr>
+      <w:r>
+        <w:t xml:space="preserve">Escuchar una vista previa</w:t>
+      </w:r>
+    </w:p>
+    <w:p>
+      <w:pPr>
+        <w:spacing w:after="120" w:line="276"/>
+      </w:pPr>
+      <w:r>
+        <w:t xml:space="preserve">Cada canción tiene un botón </w:t>
+      </w:r>
+      <w:r>
+        <w:rPr>
+          <w:b/>
+          <w:bCs/>
+        </w:rPr>
+        <w:t xml:space="preserve">▶</w:t>
+      </w:r>
+      <w:r>
+        <w:t xml:space="preserve"> (también en Faltan por descargar y en Comparar, y con clic derecho → «Escuchar»). Abajo aparece un reproductor con pausa (o la </w:t>
+      </w:r>
+      <w:r>
+        <w:rPr>
+          <w:b/>
+          <w:bCs/>
+        </w:rPr>
+        <w:t xml:space="preserve">barra espaciadora</w:t>
+      </w:r>
+      <w:r>
+        <w:t xml:space="preserve">), barra para adelantar, −15 / +15 s y </w:t>
+      </w:r>
+      <w:r>
+        <w:rPr>
+          <w:b/>
+          <w:bCs/>
+        </w:rPr>
+        <w:t xml:space="preserve">½</w:t>
+      </w:r>
+      <w:r>
+        <w:t xml:space="preserve"> para saltar a la mitad, donde suele estar el drop.</w:t>
+      </w:r>
+    </w:p>
+    <w:p>
+      <w:pPr>
+        <w:pStyle w:val="ListParagraph"/>
+        <w:numPr>
+          <w:ilvl w:val="0"/>
+          <w:numId w:val="2"/>
+        </w:numPr>
+        <w:spacing w:after="60" w:line="276"/>
+      </w:pPr>
+      <w:r>
+        <w:rPr>
+          <w:b/>
+          <w:bCs/>
+        </w:rPr>
+        <w:t xml:space="preserve">Si tienes el archivo</w:t>
+      </w:r>
+      <w:r>
+        <w:t xml:space="preserve">, suena tu archivo, empezando en el 25 % para saltar la intro.</w:t>
+      </w:r>
+    </w:p>
+    <w:p>
+      <w:pPr>
+        <w:pStyle w:val="ListParagraph"/>
+        <w:numPr>
+          <w:ilvl w:val="0"/>
+          <w:numId w:val="2"/>
+        </w:numPr>
+        <w:spacing w:after="60" w:line="276"/>
+      </w:pPr>
+      <w:r>
+        <w:rPr>
+          <w:b/>
+          <w:bCs/>
+        </w:rPr>
+        <w:t xml:space="preserve">Si te falta</w:t>
+      </w:r>
+      <w:r>
+        <w:t xml:space="preserve">, suenan </w:t>
+      </w:r>
+      <w:r>
+        <w:rPr>
+          <w:b/>
+          <w:bCs/>
+        </w:rPr>
+        <w:t xml:space="preserve">30 s de Deezer</w:t>
+      </w:r>
+      <w:r>
+        <w:t xml:space="preserve"> (con link para abrirla allá).</w:t>
+      </w:r>
+    </w:p>
+    <w:p>
+      <w:pPr>
+        <w:pStyle w:val="ListParagraph"/>
+        <w:numPr>
+          <w:ilvl w:val="0"/>
+          <w:numId w:val="2"/>
+        </w:numPr>
+        <w:spacing w:after="60" w:line="276"/>
+      </w:pPr>
+      <w:r>
+        <w:t xml:space="preserve">No mueve ni cambia nada. Tus archivos solo se leen dentro de tus carpetas de música y solo desde BrainOrder.</w:t>
       </w:r>
     </w:p>
     <w:p>
@@ -10829,7 +10938,7 @@
                 <w:sz w:val="24"/>
                 <w:szCs w:val="24"/>
               </w:rPr>
-              <w:t xml:space="preserve">v2.13.2</w:t>
+              <w:t xml:space="preserve">v2.14.0</w:t>
             </w:r>
           </w:p>
           <w:p>
@@ -10876,7 +10985,7 @@
                 <w:sz w:val="23"/>
                 <w:szCs w:val="23"/>
               </w:rPr>
-              <w:t xml:space="preserve">Fusionar sin dejar carpetas atrás</w:t>
+              <w:t xml:space="preserve">Vista previa de canciones</w:t>
             </w:r>
             <w:r>
               <w:rPr>
@@ -10887,6 +10996,167 @@
                 <w:szCs w:val="18"/>
               </w:rPr>
               <w:t xml:space="preserve">   · versión actual</w:t>
+            </w:r>
+          </w:p>
+        </w:tc>
+      </w:tr>
+    </w:tbl>
+    <w:p>
+      <w:pPr>
+        <w:pStyle w:val="ListParagraph"/>
+        <w:keepNext/>
+        <w:keepLines/>
+        <w:numPr>
+          <w:ilvl w:val="0"/>
+          <w:numId w:val="2"/>
+        </w:numPr>
+        <w:spacing w:after="60" w:line="276"/>
+      </w:pPr>
+      <w:r>
+        <w:t xml:space="preserve">Botón </w:t>
+      </w:r>
+      <w:r>
+        <w:rPr>
+          <w:b/>
+          <w:bCs/>
+        </w:rPr>
+        <w:t xml:space="preserve">▶</w:t>
+      </w:r>
+      <w:r>
+        <w:t xml:space="preserve"> en cada canción (playlists, faltantes y Comparar) y clic derecho → «Escuchar».</w:t>
+      </w:r>
+    </w:p>
+    <w:p>
+      <w:pPr>
+        <w:pStyle w:val="ListParagraph"/>
+        <w:keepNext/>
+        <w:keepLines/>
+        <w:numPr>
+          <w:ilvl w:val="0"/>
+          <w:numId w:val="2"/>
+        </w:numPr>
+        <w:spacing w:after="60" w:line="276"/>
+      </w:pPr>
+      <w:r>
+        <w:t xml:space="preserve">Suena tu archivo (desde el 25 %, sin la intro) o, si te falta, 30 s de Deezer.</w:t>
+      </w:r>
+    </w:p>
+    <w:p>
+      <w:pPr>
+        <w:pStyle w:val="ListParagraph"/>
+        <w:keepNext w:val="false"/>
+        <w:keepLines/>
+        <w:numPr>
+          <w:ilvl w:val="0"/>
+          <w:numId w:val="2"/>
+        </w:numPr>
+        <w:spacing w:after="60" w:line="276"/>
+      </w:pPr>
+      <w:r>
+        <w:t xml:space="preserve">Reproductor abajo: pausa con la barra espaciadora, adelantar, −15 / +15 s y saltar a la mitad.</w:t>
+      </w:r>
+    </w:p>
+    <w:p>
+      <w:pPr>
+        <w:spacing w:after="80"/>
+      </w:pPr>
+    </w:p>
+    <w:tbl>
+      <w:tblPr>
+        <w:tblW w:type="dxa" w:w="9360"/>
+        <w:tblBorders>
+          <w:top w:val="single" w:color="auto" w:sz="4"/>
+          <w:left w:val="single" w:color="auto" w:sz="4"/>
+          <w:bottom w:val="single" w:color="auto" w:sz="4"/>
+          <w:right w:val="single" w:color="auto" w:sz="4"/>
+          <w:insideH w:val="single" w:color="auto" w:sz="4"/>
+          <w:insideV w:val="single" w:color="auto" w:sz="4"/>
+        </w:tblBorders>
+      </w:tblPr>
+      <w:tblGrid>
+        <w:gridCol w:w="1900"/>
+        <w:gridCol w:w="7460"/>
+      </w:tblGrid>
+      <w:tr>
+        <w:tc>
+          <w:tcPr>
+            <w:tcW w:type="dxa" w:w="1900"/>
+            <w:tcBorders>
+              <w:top w:val="single" w:color="D5D9E0" w:sz="4"/>
+              <w:left w:val="single" w:color="D5D9E0" w:sz="4"/>
+              <w:bottom w:val="single" w:color="D5D9E0" w:sz="4"/>
+              <w:right w:val="single" w:color="D5D9E0" w:sz="4"/>
+            </w:tcBorders>
+            <w:shd w:fill="1F2A44" w:color="auto" w:val="clear"/>
+            <w:tcMar>
+              <w:top w:type="dxa" w:w="80"/>
+              <w:left w:type="dxa" w:w="140"/>
+              <w:bottom w:type="dxa" w:w="80"/>
+              <w:right w:type="dxa" w:w="140"/>
+            </w:tcMar>
+            <w:vAlign w:val="center"/>
+          </w:tcPr>
+          <w:p>
+            <w:pPr>
+              <w:keepNext/>
+              <w:keepLines/>
+            </w:pPr>
+            <w:r>
+              <w:rPr>
+                <w:b/>
+                <w:bCs/>
+                <w:color w:val="FFFFFF"/>
+                <w:sz w:val="24"/>
+                <w:szCs w:val="24"/>
+              </w:rPr>
+              <w:t xml:space="preserve">v2.13.2</w:t>
+            </w:r>
+          </w:p>
+          <w:p>
+            <w:pPr>
+              <w:keepNext/>
+            </w:pPr>
+            <w:r>
+              <w:rPr>
+                <w:color w:val="FFFFFF"/>
+                <w:sz w:val="17"/>
+                <w:szCs w:val="17"/>
+              </w:rPr>
+              <w:t xml:space="preserve">20 oct 2026</w:t>
+            </w:r>
+          </w:p>
+        </w:tc>
+        <w:tc>
+          <w:tcPr>
+            <w:tcW w:type="dxa" w:w="7460"/>
+            <w:tcBorders>
+              <w:top w:val="single" w:color="D5D9E0" w:sz="4"/>
+              <w:left w:val="single" w:color="D5D9E0" w:sz="4"/>
+              <w:bottom w:val="single" w:color="D5D9E0" w:sz="4"/>
+              <w:right w:val="single" w:color="D5D9E0" w:sz="4"/>
+            </w:tcBorders>
+            <w:shd w:fill="F5F7FA" w:color="auto" w:val="clear"/>
+            <w:tcMar>
+              <w:top w:type="dxa" w:w="80"/>
+              <w:left w:type="dxa" w:w="160"/>
+              <w:bottom w:type="dxa" w:w="80"/>
+              <w:right w:type="dxa" w:w="140"/>
+            </w:tcMar>
+            <w:vAlign w:val="center"/>
+          </w:tcPr>
+          <w:p>
+            <w:pPr>
+              <w:keepNext/>
+            </w:pPr>
+            <w:r>
+              <w:rPr>
+                <w:b/>
+                <w:bCs/>
+                <w:color w:val="1F2A44"/>
+                <w:sz w:val="23"/>
+                <w:szCs w:val="23"/>
+              </w:rPr>
+              <w:t xml:space="preserve">Fusionar sin dejar carpetas atrás</w:t>
             </w:r>
           </w:p>
         </w:tc>

</xml_diff>

<commit_message>
v2.14.1: links de Deezer de la misma versión; descargas en otra versión con «Usar esta versión»
Co-Authored-By: Claude Opus 5.5 <noreply@anthropic.com>
Claude-Session: https://claude.ai/code/session_015yBEKQCgZonTqt5J2V9uZ5
</commit_message>
<xml_diff>
--- a/docs/BrainOrder - Manual de usuario.docx
+++ b/docs/BrainOrder - Manual de usuario.docx
@@ -73,7 +73,7 @@
           <w:sz w:val="26"/>
           <w:szCs w:val="26"/>
         </w:rPr>
-        <w:t xml:space="preserve">Versión 2.14.0</w:t>
+        <w:t xml:space="preserve">Versión 2.14.1</w:t>
       </w:r>
     </w:p>
     <w:p>
@@ -304,7 +304,7 @@
           <w:sz w:val="22"/>
           <w:szCs w:val="22"/>
         </w:rPr>
-        <w:t xml:space="preserve">	10</w:t>
+        <w:t xml:space="preserve">	11</w:t>
       </w:r>
     </w:p>
     <w:p>
@@ -5447,6 +5447,105 @@
       <w:pPr>
         <w:spacing w:after="120"/>
       </w:pPr>
+    </w:p>
+    <w:p>
+      <w:pPr>
+        <w:pStyle w:val="Heading2"/>
+      </w:pPr>
+      <w:r>
+        <w:t xml:space="preserve">«Parecen de tus playlists»: la misma canción en otra versión</w:t>
+      </w:r>
+    </w:p>
+    <w:p>
+      <w:pPr>
+        <w:spacing w:after="120" w:line="276"/>
+      </w:pPr>
+      <w:r>
+        <w:t xml:space="preserve">BrainOrder reconoce una descarga solo si es </w:t>
+      </w:r>
+      <w:r>
+        <w:rPr>
+          <w:b/>
+          <w:bCs/>
+        </w:rPr>
+        <w:t xml:space="preserve">la misma grabación</w:t>
+      </w:r>
+      <w:r>
+        <w:t xml:space="preserve"> que la de tu playlist (mismo título y artista, y si cambian palabras como «Radio Edit», la misma duración). Si bajaste otra versión (Dream Version, un remix, el corte largo…), al organizar aparece en </w:t>
+      </w:r>
+      <w:r>
+        <w:rPr>
+          <w:b/>
+          <w:bCs/>
+        </w:rPr>
+        <w:t xml:space="preserve">«Parecen de tus playlists»</w:t>
+      </w:r>
+      <w:r>
+        <w:t xml:space="preserve"> con la canción a la que se parece:</w:t>
+      </w:r>
+    </w:p>
+    <w:p>
+      <w:pPr>
+        <w:pStyle w:val="ListParagraph"/>
+        <w:numPr>
+          <w:ilvl w:val="0"/>
+          <w:numId w:val="2"/>
+        </w:numPr>
+        <w:spacing w:after="60" w:line="276"/>
+      </w:pPr>
+      <w:r>
+        <w:rPr>
+          <w:b/>
+          <w:bCs/>
+        </w:rPr>
+        <w:t xml:space="preserve">▶</w:t>
+      </w:r>
+      <w:r>
+        <w:t xml:space="preserve"> para escucharla y </w:t>
+      </w:r>
+      <w:r>
+        <w:rPr>
+          <w:b/>
+          <w:bCs/>
+        </w:rPr>
+        <w:t xml:space="preserve">Usar esta versión</w:t>
+      </w:r>
+      <w:r>
+        <w:t xml:space="preserve"> para que cuente como esa canción: se organiza con ella y queda en la playlist en tus programas de DJ.</w:t>
+      </w:r>
+    </w:p>
+    <w:p>
+      <w:pPr>
+        <w:pStyle w:val="ListParagraph"/>
+        <w:numPr>
+          <w:ilvl w:val="0"/>
+          <w:numId w:val="2"/>
+        </w:numPr>
+        <w:spacing w:after="60" w:line="276"/>
+      </w:pPr>
+      <w:r>
+        <w:t xml:space="preserve">Los links de Deezer ahora buscan </w:t>
+      </w:r>
+      <w:r>
+        <w:rPr>
+          <w:b/>
+          <w:bCs/>
+        </w:rPr>
+        <w:t xml:space="preserve">la misma versión</w:t>
+      </w:r>
+      <w:r>
+        <w:t xml:space="preserve"> (título y duración). Si Deezer no la tiene, el link dice </w:t>
+      </w:r>
+      <w:r>
+        <w:rPr>
+          <w:b/>
+          <w:bCs/>
+        </w:rPr>
+        <w:t xml:space="preserve">«Deezer (otra versión)»</w:t>
+      </w:r>
+      <w:r>
+        <w:t xml:space="preserve"> para que sepas antes de bajarla.</w:t>
+      </w:r>
     </w:p>
     <w:p>
       <w:pPr>
@@ -10938,7 +11037,7 @@
                 <w:sz w:val="24"/>
                 <w:szCs w:val="24"/>
               </w:rPr>
-              <w:t xml:space="preserve">v2.14.0</w:t>
+              <w:t xml:space="preserve">v2.14.1</w:t>
             </w:r>
           </w:p>
           <w:p>
@@ -10985,7 +11084,7 @@
                 <w:sz w:val="23"/>
                 <w:szCs w:val="23"/>
               </w:rPr>
-              <w:t xml:space="preserve">Vista previa de canciones</w:t>
+              <w:t xml:space="preserve">Descargas en otra versión</w:t>
             </w:r>
             <w:r>
               <w:rPr>
@@ -10996,6 +11095,177 @@
                 <w:szCs w:val="18"/>
               </w:rPr>
               <w:t xml:space="preserve">   · versión actual</w:t>
+            </w:r>
+          </w:p>
+        </w:tc>
+      </w:tr>
+    </w:tbl>
+    <w:p>
+      <w:pPr>
+        <w:pStyle w:val="ListParagraph"/>
+        <w:keepNext/>
+        <w:keepLines/>
+        <w:numPr>
+          <w:ilvl w:val="0"/>
+          <w:numId w:val="2"/>
+        </w:numPr>
+        <w:spacing w:after="60" w:line="276"/>
+      </w:pPr>
+      <w:r>
+        <w:t xml:space="preserve">Los links de Deezer buscan la </w:t>
+      </w:r>
+      <w:r>
+        <w:rPr>
+          <w:b/>
+          <w:bCs/>
+        </w:rPr>
+        <w:t xml:space="preserve">misma versión</w:t>
+      </w:r>
+      <w:r>
+        <w:t xml:space="preserve"> que tu playlist (antes podían llevar a un remix o a la versión larga, y esa descarga quedaba «sin playlist»).</w:t>
+      </w:r>
+    </w:p>
+    <w:p>
+      <w:pPr>
+        <w:pStyle w:val="ListParagraph"/>
+        <w:keepNext/>
+        <w:keepLines/>
+        <w:numPr>
+          <w:ilvl w:val="0"/>
+          <w:numId w:val="2"/>
+        </w:numPr>
+        <w:spacing w:after="60" w:line="276"/>
+      </w:pPr>
+      <w:r>
+        <w:t xml:space="preserve">Si Deezer no tiene esa versión, el link lo dice: «Deezer (otra versión)».</w:t>
+      </w:r>
+    </w:p>
+    <w:p>
+      <w:pPr>
+        <w:pStyle w:val="ListParagraph"/>
+        <w:keepNext w:val="false"/>
+        <w:keepLines/>
+        <w:numPr>
+          <w:ilvl w:val="0"/>
+          <w:numId w:val="2"/>
+        </w:numPr>
+        <w:spacing w:after="60" w:line="276"/>
+      </w:pPr>
+      <w:r>
+        <w:t xml:space="preserve">Al organizar, las descargas que son la misma canción en otra versión aparecen en «Parecen de tus playlists» con </w:t>
+      </w:r>
+      <w:r>
+        <w:rPr>
+          <w:b/>
+          <w:bCs/>
+        </w:rPr>
+        <w:t xml:space="preserve">Usar esta versión</w:t>
+      </w:r>
+      <w:r>
+        <w:t xml:space="preserve">.</w:t>
+      </w:r>
+    </w:p>
+    <w:p>
+      <w:pPr>
+        <w:spacing w:after="80"/>
+      </w:pPr>
+    </w:p>
+    <w:tbl>
+      <w:tblPr>
+        <w:tblW w:type="dxa" w:w="9360"/>
+        <w:tblBorders>
+          <w:top w:val="single" w:color="auto" w:sz="4"/>
+          <w:left w:val="single" w:color="auto" w:sz="4"/>
+          <w:bottom w:val="single" w:color="auto" w:sz="4"/>
+          <w:right w:val="single" w:color="auto" w:sz="4"/>
+          <w:insideH w:val="single" w:color="auto" w:sz="4"/>
+          <w:insideV w:val="single" w:color="auto" w:sz="4"/>
+        </w:tblBorders>
+      </w:tblPr>
+      <w:tblGrid>
+        <w:gridCol w:w="1900"/>
+        <w:gridCol w:w="7460"/>
+      </w:tblGrid>
+      <w:tr>
+        <w:tc>
+          <w:tcPr>
+            <w:tcW w:type="dxa" w:w="1900"/>
+            <w:tcBorders>
+              <w:top w:val="single" w:color="D5D9E0" w:sz="4"/>
+              <w:left w:val="single" w:color="D5D9E0" w:sz="4"/>
+              <w:bottom w:val="single" w:color="D5D9E0" w:sz="4"/>
+              <w:right w:val="single" w:color="D5D9E0" w:sz="4"/>
+            </w:tcBorders>
+            <w:shd w:fill="1F2A44" w:color="auto" w:val="clear"/>
+            <w:tcMar>
+              <w:top w:type="dxa" w:w="80"/>
+              <w:left w:type="dxa" w:w="140"/>
+              <w:bottom w:type="dxa" w:w="80"/>
+              <w:right w:type="dxa" w:w="140"/>
+            </w:tcMar>
+            <w:vAlign w:val="center"/>
+          </w:tcPr>
+          <w:p>
+            <w:pPr>
+              <w:keepNext/>
+              <w:keepLines/>
+            </w:pPr>
+            <w:r>
+              <w:rPr>
+                <w:b/>
+                <w:bCs/>
+                <w:color w:val="FFFFFF"/>
+                <w:sz w:val="24"/>
+                <w:szCs w:val="24"/>
+              </w:rPr>
+              <w:t xml:space="preserve">v2.14.0</w:t>
+            </w:r>
+          </w:p>
+          <w:p>
+            <w:pPr>
+              <w:keepNext/>
+            </w:pPr>
+            <w:r>
+              <w:rPr>
+                <w:color w:val="FFFFFF"/>
+                <w:sz w:val="17"/>
+                <w:szCs w:val="17"/>
+              </w:rPr>
+              <w:t xml:space="preserve">20 oct 2026</w:t>
+            </w:r>
+          </w:p>
+        </w:tc>
+        <w:tc>
+          <w:tcPr>
+            <w:tcW w:type="dxa" w:w="7460"/>
+            <w:tcBorders>
+              <w:top w:val="single" w:color="D5D9E0" w:sz="4"/>
+              <w:left w:val="single" w:color="D5D9E0" w:sz="4"/>
+              <w:bottom w:val="single" w:color="D5D9E0" w:sz="4"/>
+              <w:right w:val="single" w:color="D5D9E0" w:sz="4"/>
+            </w:tcBorders>
+            <w:shd w:fill="F5F7FA" w:color="auto" w:val="clear"/>
+            <w:tcMar>
+              <w:top w:type="dxa" w:w="80"/>
+              <w:left w:type="dxa" w:w="160"/>
+              <w:bottom w:type="dxa" w:w="80"/>
+              <w:right w:type="dxa" w:w="140"/>
+            </w:tcMar>
+            <w:vAlign w:val="center"/>
+          </w:tcPr>
+          <w:p>
+            <w:pPr>
+              <w:keepNext/>
+            </w:pPr>
+            <w:r>
+              <w:rPr>
+                <w:b/>
+                <w:bCs/>
+                <w:color w:val="1F2A44"/>
+                <w:sz w:val="23"/>
+                <w:szCs w:val="23"/>
+              </w:rPr>
+              <w:t xml:space="preserve">Vista previa de canciones</w:t>
             </w:r>
           </w:p>
         </w:tc>

</xml_diff>

<commit_message>
v2.14.2: íconos centrados (SVG), números alineados y sin círculo de carga fantasma
Co-Authored-By: Claude Opus 5.5 <noreply@anthropic.com>
Claude-Session: https://claude.ai/code/session_015yBEKQCgZonTqt5J2V9uZ5
</commit_message>
<xml_diff>
--- a/docs/BrainOrder - Manual de usuario.docx
+++ b/docs/BrainOrder - Manual de usuario.docx
@@ -73,7 +73,7 @@
           <w:sz w:val="26"/>
           <w:szCs w:val="26"/>
         </w:rPr>
-        <w:t xml:space="preserve">Versión 2.14.1</w:t>
+        <w:t xml:space="preserve">Versión 2.14.2</w:t>
       </w:r>
     </w:p>
     <w:p>
@@ -11037,7 +11037,7 @@
                 <w:sz w:val="24"/>
                 <w:szCs w:val="24"/>
               </w:rPr>
-              <w:t xml:space="preserve">v2.14.1</w:t>
+              <w:t xml:space="preserve">v2.14.2</w:t>
             </w:r>
           </w:p>
           <w:p>
@@ -11084,7 +11084,7 @@
                 <w:sz w:val="23"/>
                 <w:szCs w:val="23"/>
               </w:rPr>
-              <w:t xml:space="preserve">Descargas en otra versión</w:t>
+              <w:t xml:space="preserve">Detalles visuales</w:t>
             </w:r>
             <w:r>
               <w:rPr>
@@ -11095,6 +11095,167 @@
                 <w:szCs w:val="18"/>
               </w:rPr>
               <w:t xml:space="preserve">   · versión actual</w:t>
+            </w:r>
+          </w:p>
+        </w:tc>
+      </w:tr>
+    </w:tbl>
+    <w:p>
+      <w:pPr>
+        <w:pStyle w:val="ListParagraph"/>
+        <w:keepNext/>
+        <w:keepLines/>
+        <w:numPr>
+          <w:ilvl w:val="0"/>
+          <w:numId w:val="2"/>
+        </w:numPr>
+        <w:spacing w:after="60" w:line="276"/>
+      </w:pPr>
+      <w:r>
+        <w:t xml:space="preserve">Los íconos (▶ / pausa, ✕, flechas, recargar, intercambiar) quedan </w:t>
+      </w:r>
+      <w:r>
+        <w:rPr>
+          <w:b/>
+          <w:bCs/>
+        </w:rPr>
+        <w:t xml:space="preserve">centrados</w:t>
+      </w:r>
+      <w:r>
+        <w:t xml:space="preserve"> en sus botones en cualquier pantalla.</w:t>
+      </w:r>
+    </w:p>
+    <w:p>
+      <w:pPr>
+        <w:pStyle w:val="ListParagraph"/>
+        <w:keepNext/>
+        <w:keepLines/>
+        <w:numPr>
+          <w:ilvl w:val="0"/>
+          <w:numId w:val="2"/>
+        </w:numPr>
+        <w:spacing w:after="60" w:line="276"/>
+      </w:pPr>
+      <w:r>
+        <w:t xml:space="preserve">Los números de los botones y filtros quedan alineados con su texto.</w:t>
+      </w:r>
+    </w:p>
+    <w:p>
+      <w:pPr>
+        <w:pStyle w:val="ListParagraph"/>
+        <w:keepNext w:val="false"/>
+        <w:keepLines/>
+        <w:numPr>
+          <w:ilvl w:val="0"/>
+          <w:numId w:val="2"/>
+        </w:numPr>
+        <w:spacing w:after="60" w:line="276"/>
+      </w:pPr>
+      <w:r>
+        <w:t xml:space="preserve">Arreglado: el círculo de «cargando» de la barra de estado ya no aparece cuando no hay nada en curso.</w:t>
+      </w:r>
+    </w:p>
+    <w:p>
+      <w:pPr>
+        <w:spacing w:after="80"/>
+      </w:pPr>
+    </w:p>
+    <w:tbl>
+      <w:tblPr>
+        <w:tblW w:type="dxa" w:w="9360"/>
+        <w:tblBorders>
+          <w:top w:val="single" w:color="auto" w:sz="4"/>
+          <w:left w:val="single" w:color="auto" w:sz="4"/>
+          <w:bottom w:val="single" w:color="auto" w:sz="4"/>
+          <w:right w:val="single" w:color="auto" w:sz="4"/>
+          <w:insideH w:val="single" w:color="auto" w:sz="4"/>
+          <w:insideV w:val="single" w:color="auto" w:sz="4"/>
+        </w:tblBorders>
+      </w:tblPr>
+      <w:tblGrid>
+        <w:gridCol w:w="1900"/>
+        <w:gridCol w:w="7460"/>
+      </w:tblGrid>
+      <w:tr>
+        <w:tc>
+          <w:tcPr>
+            <w:tcW w:type="dxa" w:w="1900"/>
+            <w:tcBorders>
+              <w:top w:val="single" w:color="D5D9E0" w:sz="4"/>
+              <w:left w:val="single" w:color="D5D9E0" w:sz="4"/>
+              <w:bottom w:val="single" w:color="D5D9E0" w:sz="4"/>
+              <w:right w:val="single" w:color="D5D9E0" w:sz="4"/>
+            </w:tcBorders>
+            <w:shd w:fill="1F2A44" w:color="auto" w:val="clear"/>
+            <w:tcMar>
+              <w:top w:type="dxa" w:w="80"/>
+              <w:left w:type="dxa" w:w="140"/>
+              <w:bottom w:type="dxa" w:w="80"/>
+              <w:right w:type="dxa" w:w="140"/>
+            </w:tcMar>
+            <w:vAlign w:val="center"/>
+          </w:tcPr>
+          <w:p>
+            <w:pPr>
+              <w:keepNext/>
+              <w:keepLines/>
+            </w:pPr>
+            <w:r>
+              <w:rPr>
+                <w:b/>
+                <w:bCs/>
+                <w:color w:val="FFFFFF"/>
+                <w:sz w:val="24"/>
+                <w:szCs w:val="24"/>
+              </w:rPr>
+              <w:t xml:space="preserve">v2.14.1</w:t>
+            </w:r>
+          </w:p>
+          <w:p>
+            <w:pPr>
+              <w:keepNext/>
+            </w:pPr>
+            <w:r>
+              <w:rPr>
+                <w:color w:val="FFFFFF"/>
+                <w:sz w:val="17"/>
+                <w:szCs w:val="17"/>
+              </w:rPr>
+              <w:t xml:space="preserve">20 oct 2026</w:t>
+            </w:r>
+          </w:p>
+        </w:tc>
+        <w:tc>
+          <w:tcPr>
+            <w:tcW w:type="dxa" w:w="7460"/>
+            <w:tcBorders>
+              <w:top w:val="single" w:color="D5D9E0" w:sz="4"/>
+              <w:left w:val="single" w:color="D5D9E0" w:sz="4"/>
+              <w:bottom w:val="single" w:color="D5D9E0" w:sz="4"/>
+              <w:right w:val="single" w:color="D5D9E0" w:sz="4"/>
+            </w:tcBorders>
+            <w:shd w:fill="F5F7FA" w:color="auto" w:val="clear"/>
+            <w:tcMar>
+              <w:top w:type="dxa" w:w="80"/>
+              <w:left w:type="dxa" w:w="160"/>
+              <w:bottom w:type="dxa" w:w="80"/>
+              <w:right w:type="dxa" w:w="140"/>
+            </w:tcMar>
+            <w:vAlign w:val="center"/>
+          </w:tcPr>
+          <w:p>
+            <w:pPr>
+              <w:keepNext/>
+            </w:pPr>
+            <w:r>
+              <w:rPr>
+                <w:b/>
+                <w:bCs/>
+                <w:color w:val="1F2A44"/>
+                <w:sz w:val="23"/>
+                <w:szCs w:val="23"/>
+              </w:rPr>
+              <w:t xml:space="preserve">Descargas en otra versión</w:t>
             </w:r>
           </w:p>
         </w:tc>

</xml_diff>

<commit_message>
v2.15.0: sección «Sin Mixed In Key» y mandar canciones a Mixed In Key
Co-Authored-By: Claude Opus 5.5 <noreply@anthropic.com>
Claude-Session: https://claude.ai/code/session_015yBEKQCgZonTqt5J2V9uZ5
</commit_message>
<xml_diff>
--- a/docs/BrainOrder - Manual de usuario.docx
+++ b/docs/BrainOrder - Manual de usuario.docx
@@ -73,7 +73,7 @@
           <w:sz w:val="26"/>
           <w:szCs w:val="26"/>
         </w:rPr>
-        <w:t xml:space="preserve">Versión 2.14.2</w:t>
+        <w:t xml:space="preserve">Versión 2.15.0</w:t>
       </w:r>
     </w:p>
     <w:p>
@@ -408,7 +408,7 @@
           <w:sz w:val="22"/>
           <w:szCs w:val="22"/>
         </w:rPr>
-        <w:t xml:space="preserve">	15</w:t>
+        <w:t xml:space="preserve">	16</w:t>
       </w:r>
     </w:p>
     <w:p>
@@ -7786,6 +7786,137 @@
       </w:pPr>
       <w:r>
         <w:t xml:space="preserve">11. Mixed In Key</w:t>
+      </w:r>
+    </w:p>
+    <w:p>
+      <w:pPr>
+        <w:pStyle w:val="Heading2"/>
+      </w:pPr>
+      <w:r>
+        <w:t xml:space="preserve">Sin Mixed In Key: lo que falta por analizar</w:t>
+      </w:r>
+    </w:p>
+    <w:p>
+      <w:pPr>
+        <w:spacing w:after="120" w:line="276"/>
+      </w:pPr>
+      <w:r>
+        <w:t xml:space="preserve">En el menú de la izquierda, </w:t>
+      </w:r>
+      <w:r>
+        <w:rPr>
+          <w:b/>
+          <w:bCs/>
+        </w:rPr>
+        <w:t xml:space="preserve">Sin Mixed In Key</w:t>
+      </w:r>
+      <w:r>
+        <w:t xml:space="preserve"> muestra (con su número) las canciones que tienes y que Mixed In Key todavía no ha analizado: un archivo por canción, con sus playlists.</w:t>
+      </w:r>
+    </w:p>
+    <w:p>
+      <w:pPr>
+        <w:pStyle w:val="ListParagraph"/>
+        <w:numPr>
+          <w:ilvl w:val="0"/>
+          <w:numId w:val="8"/>
+        </w:numPr>
+        <w:spacing w:after="80" w:line="276"/>
+      </w:pPr>
+      <w:r>
+        <w:t xml:space="preserve">Filtra por playlist o busca, y </w:t>
+      </w:r>
+      <w:r>
+        <w:rPr>
+          <w:b/>
+          <w:bCs/>
+        </w:rPr>
+        <w:t xml:space="preserve">marca</w:t>
+      </w:r>
+      <w:r>
+        <w:t xml:space="preserve"> las que quieras (o «Marcar las de la lista»).</w:t>
+      </w:r>
+    </w:p>
+    <w:p>
+      <w:pPr>
+        <w:pStyle w:val="ListParagraph"/>
+        <w:numPr>
+          <w:ilvl w:val="0"/>
+          <w:numId w:val="8"/>
+        </w:numPr>
+        <w:spacing w:after="80" w:line="276"/>
+      </w:pPr>
+      <w:r>
+        <w:t xml:space="preserve">Dale </w:t>
+      </w:r>
+      <w:r>
+        <w:rPr>
+          <w:b/>
+          <w:bCs/>
+        </w:rPr>
+        <w:t xml:space="preserve">🎹 Mandar a Mixed In Key</w:t>
+      </w:r>
+      <w:r>
+        <w:t xml:space="preserve">: se abren en tu Mixed In Key y quedan en su lista. Dale analizar allá.</w:t>
+      </w:r>
+    </w:p>
+    <w:p>
+      <w:pPr>
+        <w:pStyle w:val="ListParagraph"/>
+        <w:numPr>
+          <w:ilvl w:val="0"/>
+          <w:numId w:val="8"/>
+        </w:numPr>
+        <w:spacing w:after="80" w:line="276"/>
+      </w:pPr>
+      <w:r>
+        <w:t xml:space="preserve">Cuando Mixed In Key termina, BrainOrder lo nota solo y las saca de la lista (también puedes darle </w:t>
+      </w:r>
+      <w:r>
+        <w:rPr>
+          <w:b/>
+          <w:bCs/>
+        </w:rPr>
+        <w:t xml:space="preserve">↻ Revisar</w:t>
+      </w:r>
+      <w:r>
+        <w:t xml:space="preserve">). Al Organizar, su key, energía y hot cues pasan a tus programas de DJ.</w:t>
+      </w:r>
+    </w:p>
+    <w:p>
+      <w:pPr>
+        <w:pStyle w:val="ListParagraph"/>
+        <w:numPr>
+          <w:ilvl w:val="0"/>
+          <w:numId w:val="2"/>
+        </w:numPr>
+        <w:spacing w:after="60" w:line="276"/>
+      </w:pPr>
+      <w:r>
+        <w:t xml:space="preserve">También con clic derecho en una canción → </w:t>
+      </w:r>
+      <w:r>
+        <w:rPr>
+          <w:b/>
+          <w:bCs/>
+        </w:rPr>
+        <w:t xml:space="preserve">Mandar a Mixed In Key</w:t>
+      </w:r>
+      <w:r>
+        <w:t xml:space="preserve">, y en cada playlist con el filtro «Sin Mixed In Key».</w:t>
+      </w:r>
+    </w:p>
+    <w:p>
+      <w:pPr>
+        <w:pStyle w:val="ListParagraph"/>
+        <w:numPr>
+          <w:ilvl w:val="0"/>
+          <w:numId w:val="2"/>
+        </w:numPr>
+        <w:spacing w:after="60" w:line="276"/>
+      </w:pPr>
+      <w:r>
+        <w:t xml:space="preserve">Si no encuentra Mixed In Key en Aplicaciones, te abre las carpetas en Finder para que arrastres los archivos.</w:t>
       </w:r>
     </w:p>
     <w:p>
@@ -8883,7 +9014,7 @@
         <w:pStyle w:val="ListParagraph"/>
         <w:numPr>
           <w:ilvl w:val="0"/>
-          <w:numId w:val="8"/>
+          <w:numId w:val="9"/>
         </w:numPr>
         <w:spacing w:after="80" w:line="276"/>
       </w:pPr>
@@ -8896,7 +9027,7 @@
         <w:pStyle w:val="ListParagraph"/>
         <w:numPr>
           <w:ilvl w:val="0"/>
-          <w:numId w:val="8"/>
+          <w:numId w:val="9"/>
         </w:numPr>
         <w:spacing w:after="80" w:line="276"/>
       </w:pPr>
@@ -8909,7 +9040,7 @@
         <w:pStyle w:val="ListParagraph"/>
         <w:numPr>
           <w:ilvl w:val="0"/>
-          <w:numId w:val="8"/>
+          <w:numId w:val="9"/>
         </w:numPr>
         <w:spacing w:after="80" w:line="276"/>
       </w:pPr>
@@ -8922,7 +9053,7 @@
         <w:pStyle w:val="ListParagraph"/>
         <w:numPr>
           <w:ilvl w:val="0"/>
-          <w:numId w:val="8"/>
+          <w:numId w:val="9"/>
         </w:numPr>
         <w:spacing w:after="80" w:line="276"/>
       </w:pPr>
@@ -8935,7 +9066,7 @@
         <w:pStyle w:val="ListParagraph"/>
         <w:numPr>
           <w:ilvl w:val="0"/>
-          <w:numId w:val="8"/>
+          <w:numId w:val="9"/>
         </w:numPr>
         <w:spacing w:after="80" w:line="276"/>
       </w:pPr>
@@ -8948,7 +9079,7 @@
         <w:pStyle w:val="ListParagraph"/>
         <w:numPr>
           <w:ilvl w:val="0"/>
-          <w:numId w:val="8"/>
+          <w:numId w:val="9"/>
         </w:numPr>
         <w:spacing w:after="80" w:line="276"/>
       </w:pPr>
@@ -10227,7 +10358,7 @@
         <w:pStyle w:val="ListParagraph"/>
         <w:numPr>
           <w:ilvl w:val="0"/>
-          <w:numId w:val="9"/>
+          <w:numId w:val="10"/>
         </w:numPr>
         <w:spacing w:after="80" w:line="276"/>
       </w:pPr>
@@ -10240,7 +10371,7 @@
         <w:pStyle w:val="ListParagraph"/>
         <w:numPr>
           <w:ilvl w:val="0"/>
-          <w:numId w:val="9"/>
+          <w:numId w:val="10"/>
         </w:numPr>
         <w:spacing w:after="80" w:line="276"/>
       </w:pPr>
@@ -10277,7 +10408,7 @@
         <w:pStyle w:val="ListParagraph"/>
         <w:numPr>
           <w:ilvl w:val="0"/>
-          <w:numId w:val="9"/>
+          <w:numId w:val="10"/>
         </w:numPr>
         <w:spacing w:after="80" w:line="276"/>
       </w:pPr>
@@ -10314,7 +10445,7 @@
         <w:pStyle w:val="ListParagraph"/>
         <w:numPr>
           <w:ilvl w:val="0"/>
-          <w:numId w:val="9"/>
+          <w:numId w:val="10"/>
         </w:numPr>
         <w:spacing w:after="80" w:line="276"/>
       </w:pPr>
@@ -11037,7 +11168,7 @@
                 <w:sz w:val="24"/>
                 <w:szCs w:val="24"/>
               </w:rPr>
-              <w:t xml:space="preserve">v2.14.2</w:t>
+              <w:t xml:space="preserve">v2.15.0</w:t>
             </w:r>
           </w:p>
           <w:p>
@@ -11084,7 +11215,7 @@
                 <w:sz w:val="23"/>
                 <w:szCs w:val="23"/>
               </w:rPr>
-              <w:t xml:space="preserve">Detalles visuales</w:t>
+              <w:t xml:space="preserve">Sin Mixed In Key</w:t>
             </w:r>
             <w:r>
               <w:rPr>
@@ -11095,6 +11226,174 @@
                 <w:szCs w:val="18"/>
               </w:rPr>
               <w:t xml:space="preserve">   · versión actual</w:t>
+            </w:r>
+          </w:p>
+        </w:tc>
+      </w:tr>
+    </w:tbl>
+    <w:p>
+      <w:pPr>
+        <w:pStyle w:val="ListParagraph"/>
+        <w:keepNext/>
+        <w:keepLines/>
+        <w:numPr>
+          <w:ilvl w:val="0"/>
+          <w:numId w:val="2"/>
+        </w:numPr>
+        <w:spacing w:after="60" w:line="276"/>
+      </w:pPr>
+      <w:r>
+        <w:t xml:space="preserve">Sección </w:t>
+      </w:r>
+      <w:r>
+        <w:rPr>
+          <w:b/>
+          <w:bCs/>
+        </w:rPr>
+        <w:t xml:space="preserve">Sin Mixed In Key</w:t>
+      </w:r>
+      <w:r>
+        <w:t xml:space="preserve">: las canciones que te faltan por analizar, con filtro por playlist y búsqueda.</w:t>
+      </w:r>
+    </w:p>
+    <w:p>
+      <w:pPr>
+        <w:pStyle w:val="ListParagraph"/>
+        <w:keepNext/>
+        <w:keepLines/>
+        <w:numPr>
+          <w:ilvl w:val="0"/>
+          <w:numId w:val="2"/>
+        </w:numPr>
+        <w:spacing w:after="60" w:line="276"/>
+      </w:pPr>
+      <w:r>
+        <w:rPr>
+          <w:b/>
+          <w:bCs/>
+        </w:rPr>
+        <w:t xml:space="preserve">Mandar a Mixed In Key</w:t>
+      </w:r>
+      <w:r>
+        <w:t xml:space="preserve"> las abre en tu Mixed In Key; cuando termina, salen solas de la lista.</w:t>
+      </w:r>
+    </w:p>
+    <w:p>
+      <w:pPr>
+        <w:pStyle w:val="ListParagraph"/>
+        <w:keepNext w:val="false"/>
+        <w:keepLines/>
+        <w:numPr>
+          <w:ilvl w:val="0"/>
+          <w:numId w:val="2"/>
+        </w:numPr>
+        <w:spacing w:after="60" w:line="276"/>
+      </w:pPr>
+      <w:r>
+        <w:t xml:space="preserve">También con clic derecho en una canción. En Ajustes se ve qué programas de DJ están activos (botón a Conexiones).</w:t>
+      </w:r>
+    </w:p>
+    <w:p>
+      <w:pPr>
+        <w:spacing w:after="80"/>
+      </w:pPr>
+    </w:p>
+    <w:tbl>
+      <w:tblPr>
+        <w:tblW w:type="dxa" w:w="9360"/>
+        <w:tblBorders>
+          <w:top w:val="single" w:color="auto" w:sz="4"/>
+          <w:left w:val="single" w:color="auto" w:sz="4"/>
+          <w:bottom w:val="single" w:color="auto" w:sz="4"/>
+          <w:right w:val="single" w:color="auto" w:sz="4"/>
+          <w:insideH w:val="single" w:color="auto" w:sz="4"/>
+          <w:insideV w:val="single" w:color="auto" w:sz="4"/>
+        </w:tblBorders>
+      </w:tblPr>
+      <w:tblGrid>
+        <w:gridCol w:w="1900"/>
+        <w:gridCol w:w="7460"/>
+      </w:tblGrid>
+      <w:tr>
+        <w:tc>
+          <w:tcPr>
+            <w:tcW w:type="dxa" w:w="1900"/>
+            <w:tcBorders>
+              <w:top w:val="single" w:color="D5D9E0" w:sz="4"/>
+              <w:left w:val="single" w:color="D5D9E0" w:sz="4"/>
+              <w:bottom w:val="single" w:color="D5D9E0" w:sz="4"/>
+              <w:right w:val="single" w:color="D5D9E0" w:sz="4"/>
+            </w:tcBorders>
+            <w:shd w:fill="1F2A44" w:color="auto" w:val="clear"/>
+            <w:tcMar>
+              <w:top w:type="dxa" w:w="80"/>
+              <w:left w:type="dxa" w:w="140"/>
+              <w:bottom w:type="dxa" w:w="80"/>
+              <w:right w:type="dxa" w:w="140"/>
+            </w:tcMar>
+            <w:vAlign w:val="center"/>
+          </w:tcPr>
+          <w:p>
+            <w:pPr>
+              <w:keepNext/>
+              <w:keepLines/>
+            </w:pPr>
+            <w:r>
+              <w:rPr>
+                <w:b/>
+                <w:bCs/>
+                <w:color w:val="FFFFFF"/>
+                <w:sz w:val="24"/>
+                <w:szCs w:val="24"/>
+              </w:rPr>
+              <w:t xml:space="preserve">v2.14.2</w:t>
+            </w:r>
+          </w:p>
+          <w:p>
+            <w:pPr>
+              <w:keepNext/>
+            </w:pPr>
+            <w:r>
+              <w:rPr>
+                <w:color w:val="FFFFFF"/>
+                <w:sz w:val="17"/>
+                <w:szCs w:val="17"/>
+              </w:rPr>
+              <w:t xml:space="preserve">20 oct 2026</w:t>
+            </w:r>
+          </w:p>
+        </w:tc>
+        <w:tc>
+          <w:tcPr>
+            <w:tcW w:type="dxa" w:w="7460"/>
+            <w:tcBorders>
+              <w:top w:val="single" w:color="D5D9E0" w:sz="4"/>
+              <w:left w:val="single" w:color="D5D9E0" w:sz="4"/>
+              <w:bottom w:val="single" w:color="D5D9E0" w:sz="4"/>
+              <w:right w:val="single" w:color="D5D9E0" w:sz="4"/>
+            </w:tcBorders>
+            <w:shd w:fill="F5F7FA" w:color="auto" w:val="clear"/>
+            <w:tcMar>
+              <w:top w:type="dxa" w:w="80"/>
+              <w:left w:type="dxa" w:w="160"/>
+              <w:bottom w:type="dxa" w:w="80"/>
+              <w:right w:type="dxa" w:w="140"/>
+            </w:tcMar>
+            <w:vAlign w:val="center"/>
+          </w:tcPr>
+          <w:p>
+            <w:pPr>
+              <w:keepNext/>
+            </w:pPr>
+            <w:r>
+              <w:rPr>
+                <w:b/>
+                <w:bCs/>
+                <w:color w:val="1F2A44"/>
+                <w:sz w:val="23"/>
+                <w:szCs w:val="23"/>
+              </w:rPr>
+              <w:t xml:space="preserve">Detalles visuales</w:t>
             </w:r>
           </w:p>
         </w:tc>
@@ -16958,6 +17257,23 @@
     </w:lvl>
   </w:abstractNum>
   <w:abstractNum w:abstractNumId="9" w15:restartNumberingAfterBreak="0">
+    <w:multiLevelType w:val="hybridMultilevel"/>
+    <w:lvl w:ilvl="0" w15:tentative="1">
+      <w:start w:val="1"/>
+      <w:numFmt w:val="decimal"/>
+      <w:lvlText w:val="%1."/>
+      <w:lvlJc w:val="left"/>
+      <w:pPr>
+        <w:ind w:left="540" w:hanging="320"/>
+      </w:pPr>
+      <w:rPr>
+        <w:b/>
+        <w:bCs/>
+        <w:color w:val="7FB800"/>
+      </w:rPr>
+    </w:lvl>
+  </w:abstractNum>
+  <w:abstractNum w:abstractNumId="10" w15:restartNumberingAfterBreak="0">
     <w:multiLevelType w:val="hybridMultilevel"/>
     <w:lvl w:ilvl="0" w15:tentative="1">
       <w:start w:val="1"/>
@@ -17024,6 +17340,12 @@
   </w:num>
   <w:num w:numId="9">
     <w:abstractNumId w:val="9"/>
+    <w:lvlOverride w:ilvl="0">
+      <w:startOverride w:val="1"/>
+    </w:lvlOverride>
+  </w:num>
+  <w:num w:numId="10">
+    <w:abstractNumId w:val="10"/>
     <w:lvlOverride w:ilvl="0">
       <w:startOverride w:val="1"/>
     </w:lvlOverride>

</xml_diff>

<commit_message>
v2.16.0: ocultar playlists de las estadísticas
Co-Authored-By: Claude Opus 5.5 <noreply@anthropic.com>
Claude-Session: https://claude.ai/code/session_015yBEKQCgZonTqt5J2V9uZ5
</commit_message>
<xml_diff>
--- a/docs/BrainOrder - Manual de usuario.docx
+++ b/docs/BrainOrder - Manual de usuario.docx
@@ -73,7 +73,7 @@
           <w:sz w:val="26"/>
           <w:szCs w:val="26"/>
         </w:rPr>
-        <w:t xml:space="preserve">Versión 2.15.0</w:t>
+        <w:t xml:space="preserve">Versión 2.16.0</w:t>
       </w:r>
     </w:p>
     <w:p>
@@ -4858,6 +4858,97 @@
                 <w:sz w:val="19"/>
                 <w:szCs w:val="19"/>
               </w:rPr>
+              <w:t xml:space="preserve">🙈 </w:t>
+            </w:r>
+            <w:r>
+              <w:rPr>
+                <w:b/>
+                <w:bCs/>
+                <w:sz w:val="19"/>
+                <w:szCs w:val="19"/>
+              </w:rPr>
+              <w:t xml:space="preserve">Ocultar de mis estadísticas</w:t>
+            </w:r>
+          </w:p>
+        </w:tc>
+        <w:tc>
+          <w:tcPr>
+            <w:tcW w:type="dxa" w:w="6960"/>
+            <w:tcBorders>
+              <w:top w:val="single" w:color="D5D9E0" w:sz="4"/>
+              <w:left w:val="single" w:color="D5D9E0" w:sz="4"/>
+              <w:bottom w:val="single" w:color="D5D9E0" w:sz="4"/>
+              <w:right w:val="single" w:color="D5D9E0" w:sz="4"/>
+            </w:tcBorders>
+            <w:shd w:fill="F5F7FA" w:color="auto" w:val="clear"/>
+            <w:tcMar>
+              <w:top w:type="dxa" w:w="90"/>
+              <w:left w:type="dxa" w:w="120"/>
+              <w:bottom w:type="dxa" w:w="90"/>
+              <w:right w:type="dxa" w:w="120"/>
+            </w:tcMar>
+            <w:vAlign w:val="center"/>
+          </w:tcPr>
+          <w:p>
+            <w:pPr>
+              <w:spacing w:after="40"/>
+            </w:pPr>
+            <w:r>
+              <w:rPr>
+                <w:sz w:val="19"/>
+                <w:szCs w:val="19"/>
+              </w:rPr>
+              <w:t xml:space="preserve">La playlist deja de contar en tus números (Estadísticas, las tarjetas de arriba, «Faltan por descargar» y el Excel de faltantes), pero se sigue organizando y yendo a tus programas de DJ. En la lista sale con 🙈. Para volver a contarla: clic derecho → </w:t>
+            </w:r>
+            <w:r>
+              <w:rPr>
+                <w:b/>
+                <w:bCs/>
+                <w:sz w:val="19"/>
+                <w:szCs w:val="19"/>
+              </w:rPr>
+              <w:t xml:space="preserve">Volver a contarla</w:t>
+            </w:r>
+            <w:r>
+              <w:rPr>
+                <w:sz w:val="19"/>
+                <w:szCs w:val="19"/>
+              </w:rPr>
+              <w:t xml:space="preserve">, o en Estadísticas → «Fuera de tus estadísticas».</w:t>
+            </w:r>
+          </w:p>
+        </w:tc>
+      </w:tr>
+      <w:tr>
+        <w:trPr>
+          <w:cantSplit/>
+        </w:trPr>
+        <w:tc>
+          <w:tcPr>
+            <w:tcW w:type="dxa" w:w="2400"/>
+            <w:tcBorders>
+              <w:top w:val="single" w:color="D5D9E0" w:sz="4"/>
+              <w:left w:val="single" w:color="D5D9E0" w:sz="4"/>
+              <w:bottom w:val="single" w:color="D5D9E0" w:sz="4"/>
+              <w:right w:val="single" w:color="D5D9E0" w:sz="4"/>
+            </w:tcBorders>
+            <w:tcMar>
+              <w:top w:type="dxa" w:w="90"/>
+              <w:left w:type="dxa" w:w="120"/>
+              <w:bottom w:type="dxa" w:w="90"/>
+              <w:right w:type="dxa" w:w="120"/>
+            </w:tcMar>
+            <w:vAlign w:val="center"/>
+          </w:tcPr>
+          <w:p>
+            <w:pPr>
+              <w:spacing w:after="40"/>
+            </w:pPr>
+            <w:r>
+              <w:rPr>
+                <w:sz w:val="19"/>
+                <w:szCs w:val="19"/>
+              </w:rPr>
               <w:t xml:space="preserve">🗑 </w:t>
             </w:r>
             <w:r>
@@ -4880,7 +4971,6 @@
               <w:bottom w:val="single" w:color="D5D9E0" w:sz="4"/>
               <w:right w:val="single" w:color="D5D9E0" w:sz="4"/>
             </w:tcBorders>
-            <w:shd w:fill="F5F7FA" w:color="auto" w:val="clear"/>
             <w:tcMar>
               <w:top w:type="dxa" w:w="90"/>
               <w:left w:type="dxa" w:w="120"/>
@@ -11168,7 +11258,7 @@
                 <w:sz w:val="24"/>
                 <w:szCs w:val="24"/>
               </w:rPr>
-              <w:t xml:space="preserve">v2.15.0</w:t>
+              <w:t xml:space="preserve">v2.16.0</w:t>
             </w:r>
           </w:p>
           <w:p>
@@ -11215,7 +11305,7 @@
                 <w:sz w:val="23"/>
                 <w:szCs w:val="23"/>
               </w:rPr>
-              <w:t xml:space="preserve">Sin Mixed In Key</w:t>
+              <w:t xml:space="preserve">Ocultar playlists de tus estadísticas</w:t>
             </w:r>
             <w:r>
               <w:rPr>
@@ -11226,6 +11316,152 @@
                 <w:szCs w:val="18"/>
               </w:rPr>
               <w:t xml:space="preserve">   · versión actual</w:t>
+            </w:r>
+          </w:p>
+        </w:tc>
+      </w:tr>
+    </w:tbl>
+    <w:p>
+      <w:pPr>
+        <w:pStyle w:val="ListParagraph"/>
+        <w:keepNext/>
+        <w:keepLines/>
+        <w:numPr>
+          <w:ilvl w:val="0"/>
+          <w:numId w:val="2"/>
+        </w:numPr>
+        <w:spacing w:after="60" w:line="276"/>
+      </w:pPr>
+      <w:r>
+        <w:t xml:space="preserve">Clic derecho en una playlist → </w:t>
+      </w:r>
+      <w:r>
+        <w:rPr>
+          <w:b/>
+          <w:bCs/>
+        </w:rPr>
+        <w:t xml:space="preserve">Ocultar de mis estadísticas</w:t>
+      </w:r>
+      <w:r>
+        <w:t xml:space="preserve">: no cuenta en tus números ni en «Faltan por descargar», pero se sigue organizando.</w:t>
+      </w:r>
+    </w:p>
+    <w:p>
+      <w:pPr>
+        <w:pStyle w:val="ListParagraph"/>
+        <w:keepNext w:val="false"/>
+        <w:keepLines/>
+        <w:numPr>
+          <w:ilvl w:val="0"/>
+          <w:numId w:val="2"/>
+        </w:numPr>
+        <w:spacing w:after="60" w:line="276"/>
+      </w:pPr>
+      <w:r>
+        <w:t xml:space="preserve">Se vuelve a mostrar con clic derecho → «Volver a contarla» o desde Estadísticas.</w:t>
+      </w:r>
+    </w:p>
+    <w:p>
+      <w:pPr>
+        <w:spacing w:after="80"/>
+      </w:pPr>
+    </w:p>
+    <w:tbl>
+      <w:tblPr>
+        <w:tblW w:type="dxa" w:w="9360"/>
+        <w:tblBorders>
+          <w:top w:val="single" w:color="auto" w:sz="4"/>
+          <w:left w:val="single" w:color="auto" w:sz="4"/>
+          <w:bottom w:val="single" w:color="auto" w:sz="4"/>
+          <w:right w:val="single" w:color="auto" w:sz="4"/>
+          <w:insideH w:val="single" w:color="auto" w:sz="4"/>
+          <w:insideV w:val="single" w:color="auto" w:sz="4"/>
+        </w:tblBorders>
+      </w:tblPr>
+      <w:tblGrid>
+        <w:gridCol w:w="1900"/>
+        <w:gridCol w:w="7460"/>
+      </w:tblGrid>
+      <w:tr>
+        <w:tc>
+          <w:tcPr>
+            <w:tcW w:type="dxa" w:w="1900"/>
+            <w:tcBorders>
+              <w:top w:val="single" w:color="D5D9E0" w:sz="4"/>
+              <w:left w:val="single" w:color="D5D9E0" w:sz="4"/>
+              <w:bottom w:val="single" w:color="D5D9E0" w:sz="4"/>
+              <w:right w:val="single" w:color="D5D9E0" w:sz="4"/>
+            </w:tcBorders>
+            <w:shd w:fill="1F2A44" w:color="auto" w:val="clear"/>
+            <w:tcMar>
+              <w:top w:type="dxa" w:w="80"/>
+              <w:left w:type="dxa" w:w="140"/>
+              <w:bottom w:type="dxa" w:w="80"/>
+              <w:right w:type="dxa" w:w="140"/>
+            </w:tcMar>
+            <w:vAlign w:val="center"/>
+          </w:tcPr>
+          <w:p>
+            <w:pPr>
+              <w:keepNext/>
+              <w:keepLines/>
+            </w:pPr>
+            <w:r>
+              <w:rPr>
+                <w:b/>
+                <w:bCs/>
+                <w:color w:val="FFFFFF"/>
+                <w:sz w:val="24"/>
+                <w:szCs w:val="24"/>
+              </w:rPr>
+              <w:t xml:space="preserve">v2.15.0</w:t>
+            </w:r>
+          </w:p>
+          <w:p>
+            <w:pPr>
+              <w:keepNext/>
+            </w:pPr>
+            <w:r>
+              <w:rPr>
+                <w:color w:val="FFFFFF"/>
+                <w:sz w:val="17"/>
+                <w:szCs w:val="17"/>
+              </w:rPr>
+              <w:t xml:space="preserve">20 oct 2026</w:t>
+            </w:r>
+          </w:p>
+        </w:tc>
+        <w:tc>
+          <w:tcPr>
+            <w:tcW w:type="dxa" w:w="7460"/>
+            <w:tcBorders>
+              <w:top w:val="single" w:color="D5D9E0" w:sz="4"/>
+              <w:left w:val="single" w:color="D5D9E0" w:sz="4"/>
+              <w:bottom w:val="single" w:color="D5D9E0" w:sz="4"/>
+              <w:right w:val="single" w:color="D5D9E0" w:sz="4"/>
+            </w:tcBorders>
+            <w:shd w:fill="F5F7FA" w:color="auto" w:val="clear"/>
+            <w:tcMar>
+              <w:top w:type="dxa" w:w="80"/>
+              <w:left w:type="dxa" w:w="160"/>
+              <w:bottom w:type="dxa" w:w="80"/>
+              <w:right w:type="dxa" w:w="140"/>
+            </w:tcMar>
+            <w:vAlign w:val="center"/>
+          </w:tcPr>
+          <w:p>
+            <w:pPr>
+              <w:keepNext/>
+            </w:pPr>
+            <w:r>
+              <w:rPr>
+                <w:b/>
+                <w:bCs/>
+                <w:color w:val="1F2A44"/>
+                <w:sz w:val="23"/>
+                <w:szCs w:val="23"/>
+              </w:rPr>
+              <w:t xml:space="preserve">Sin Mixed In Key</w:t>
             </w:r>
           </w:p>
         </w:tc>

</xml_diff>

<commit_message>
v2.16.1: descargas en playlists de Rekordbox; Organizar corrige rutas en los programas de DJ
Co-Authored-By: Claude Opus 5.5 <noreply@anthropic.com>
Claude-Session: https://claude.ai/code/session_015yBEKQCgZonTqt5J2V9uZ5
</commit_message>
<xml_diff>
--- a/docs/BrainOrder - Manual de usuario.docx
+++ b/docs/BrainOrder - Manual de usuario.docx
@@ -73,7 +73,7 @@
           <w:sz w:val="26"/>
           <w:szCs w:val="26"/>
         </w:rPr>
-        <w:t xml:space="preserve">Versión 2.16.0</w:t>
+        <w:t xml:space="preserve">Versión 2.16.1</w:t>
       </w:r>
     </w:p>
     <w:p>
@@ -5537,6 +5537,95 @@
       <w:pPr>
         <w:spacing w:after="120"/>
       </w:pPr>
+    </w:p>
+    <w:p>
+      <w:pPr>
+        <w:pStyle w:val="Heading2"/>
+      </w:pPr>
+      <w:r>
+        <w:t xml:space="preserve">Descargas que ya pusiste en una playlist de tu programa de DJ</w:t>
+      </w:r>
+    </w:p>
+    <w:p>
+      <w:pPr>
+        <w:spacing w:after="120" w:line="276"/>
+      </w:pPr>
+      <w:r>
+        <w:t xml:space="preserve">Si arrastras descargas a una playlist que armas en </w:t>
+      </w:r>
+      <w:r>
+        <w:rPr>
+          <w:b/>
+          <w:bCs/>
+        </w:rPr>
+        <w:t xml:space="preserve">Rekordbox</w:t>
+      </w:r>
+      <w:r>
+        <w:t xml:space="preserve"> (u otro programa) —por ejemplo «50 dance» o «Faltantes»—, esas canciones no son de ninguna playlist de BrainOrder. Al organizar aparecen en </w:t>
+      </w:r>
+      <w:r>
+        <w:rPr>
+          <w:b/>
+          <w:bCs/>
+        </w:rPr>
+        <w:t xml:space="preserve">«🎛️ Ya están en tus playlists de tu programa de DJ»</w:t>
+      </w:r>
+      <w:r>
+        <w:t xml:space="preserve"> con la playlist donde las pusiste:</w:t>
+      </w:r>
+    </w:p>
+    <w:p>
+      <w:pPr>
+        <w:pStyle w:val="ListParagraph"/>
+        <w:numPr>
+          <w:ilvl w:val="0"/>
+          <w:numId w:val="2"/>
+        </w:numPr>
+        <w:spacing w:after="60" w:line="276"/>
+      </w:pPr>
+      <w:r>
+        <w:rPr>
+          <w:b/>
+          <w:bCs/>
+        </w:rPr>
+        <w:t xml:space="preserve">Importarla…</w:t>
+      </w:r>
+      <w:r>
+        <w:t xml:space="preserve"> la vuelve playlist de BrainOrder (también en Spotify si quieres). Sus descargas pasan a su carpeta y Rekordbox queda apuntando a ellas. Las canciones que ya son de otra de tus playlists se quedan donde están.</w:t>
+      </w:r>
+    </w:p>
+    <w:p>
+      <w:pPr>
+        <w:pStyle w:val="ListParagraph"/>
+        <w:numPr>
+          <w:ilvl w:val="0"/>
+          <w:numId w:val="2"/>
+        </w:numPr>
+        <w:spacing w:after="60" w:line="276"/>
+      </w:pPr>
+      <w:r>
+        <w:t xml:space="preserve">Al </w:t>
+      </w:r>
+      <w:r>
+        <w:rPr>
+          <w:b/>
+          <w:bCs/>
+        </w:rPr>
+        <w:t xml:space="preserve">Organizar</w:t>
+      </w:r>
+      <w:r>
+        <w:t xml:space="preserve">, cualquier descarga que ya esté en tu librería de Rekordbox se mueve </w:t>
+      </w:r>
+      <w:r>
+        <w:rPr>
+          <w:b/>
+          <w:bCs/>
+        </w:rPr>
+        <w:t xml:space="preserve">corrigiendo su ruta allá</w:t>
+      </w:r>
+      <w:r>
+        <w:t xml:space="preserve"> (con respaldo), así no quedan canciones «perdidas» en Rekordbox. Rekordbox tiene que estar cerrado.</w:t>
+      </w:r>
     </w:p>
     <w:p>
       <w:pPr>
@@ -11258,7 +11347,7 @@
                 <w:sz w:val="24"/>
                 <w:szCs w:val="24"/>
               </w:rPr>
-              <w:t xml:space="preserve">v2.16.0</w:t>
+              <w:t xml:space="preserve">v2.16.1</w:t>
             </w:r>
           </w:p>
           <w:p>
@@ -11271,7 +11360,7 @@
                 <w:sz w:val="17"/>
                 <w:szCs w:val="17"/>
               </w:rPr>
-              <w:t xml:space="preserve">20 oct 2026</w:t>
+              <w:t xml:space="preserve">21 oct 2026</w:t>
             </w:r>
           </w:p>
         </w:tc>
@@ -11305,7 +11394,7 @@
                 <w:sz w:val="23"/>
                 <w:szCs w:val="23"/>
               </w:rPr>
-              <w:t xml:space="preserve">Ocultar playlists de tus estadísticas</w:t>
+              <w:t xml:space="preserve">Descargas que ya usas en Rekordbox</w:t>
             </w:r>
             <w:r>
               <w:rPr>
@@ -11316,6 +11405,174 @@
                 <w:szCs w:val="18"/>
               </w:rPr>
               <w:t xml:space="preserve">   · versión actual</w:t>
+            </w:r>
+          </w:p>
+        </w:tc>
+      </w:tr>
+    </w:tbl>
+    <w:p>
+      <w:pPr>
+        <w:pStyle w:val="ListParagraph"/>
+        <w:keepNext/>
+        <w:keepLines/>
+        <w:numPr>
+          <w:ilvl w:val="0"/>
+          <w:numId w:val="2"/>
+        </w:numPr>
+        <w:spacing w:after="60" w:line="276"/>
+      </w:pPr>
+      <w:r>
+        <w:t xml:space="preserve">Las descargas que pusiste en una playlist de Rekordbox (como «50 dance» o «Faltantes») ya no salen como «sin playlist» sin explicación: al organizar ves en qué playlist están y la puedes </w:t>
+      </w:r>
+      <w:r>
+        <w:rPr>
+          <w:b/>
+          <w:bCs/>
+        </w:rPr>
+        <w:t xml:space="preserve">importar</w:t>
+      </w:r>
+      <w:r>
+        <w:t xml:space="preserve">.</w:t>
+      </w:r>
+    </w:p>
+    <w:p>
+      <w:pPr>
+        <w:pStyle w:val="ListParagraph"/>
+        <w:keepNext/>
+        <w:keepLines/>
+        <w:numPr>
+          <w:ilvl w:val="0"/>
+          <w:numId w:val="2"/>
+        </w:numPr>
+        <w:spacing w:after="60" w:line="276"/>
+      </w:pPr>
+      <w:r>
+        <w:rPr>
+          <w:b/>
+          <w:bCs/>
+        </w:rPr>
+        <w:t xml:space="preserve">Arreglado:</w:t>
+      </w:r>
+      <w:r>
+        <w:t xml:space="preserve"> Organizar movía descargas que ya estaban en tu librería de Rekordbox sin corregir su ruta allá (quedaban perdidas). Ahora la corrige, y en Traktor, Serato y Engine también.</w:t>
+      </w:r>
+    </w:p>
+    <w:p>
+      <w:pPr>
+        <w:pStyle w:val="ListParagraph"/>
+        <w:keepNext w:val="false"/>
+        <w:keepLines/>
+        <w:numPr>
+          <w:ilvl w:val="0"/>
+          <w:numId w:val="2"/>
+        </w:numPr>
+        <w:spacing w:after="60" w:line="276"/>
+      </w:pPr>
+      <w:r>
+        <w:t xml:space="preserve">Importar una playlist de DJ ya no le quita archivos a tus otras playlists. Revisar Rekordbox antes de mover es mucho más rápido.</w:t>
+      </w:r>
+    </w:p>
+    <w:p>
+      <w:pPr>
+        <w:spacing w:after="80"/>
+      </w:pPr>
+    </w:p>
+    <w:tbl>
+      <w:tblPr>
+        <w:tblW w:type="dxa" w:w="9360"/>
+        <w:tblBorders>
+          <w:top w:val="single" w:color="auto" w:sz="4"/>
+          <w:left w:val="single" w:color="auto" w:sz="4"/>
+          <w:bottom w:val="single" w:color="auto" w:sz="4"/>
+          <w:right w:val="single" w:color="auto" w:sz="4"/>
+          <w:insideH w:val="single" w:color="auto" w:sz="4"/>
+          <w:insideV w:val="single" w:color="auto" w:sz="4"/>
+        </w:tblBorders>
+      </w:tblPr>
+      <w:tblGrid>
+        <w:gridCol w:w="1900"/>
+        <w:gridCol w:w="7460"/>
+      </w:tblGrid>
+      <w:tr>
+        <w:tc>
+          <w:tcPr>
+            <w:tcW w:type="dxa" w:w="1900"/>
+            <w:tcBorders>
+              <w:top w:val="single" w:color="D5D9E0" w:sz="4"/>
+              <w:left w:val="single" w:color="D5D9E0" w:sz="4"/>
+              <w:bottom w:val="single" w:color="D5D9E0" w:sz="4"/>
+              <w:right w:val="single" w:color="D5D9E0" w:sz="4"/>
+            </w:tcBorders>
+            <w:shd w:fill="1F2A44" w:color="auto" w:val="clear"/>
+            <w:tcMar>
+              <w:top w:type="dxa" w:w="80"/>
+              <w:left w:type="dxa" w:w="140"/>
+              <w:bottom w:type="dxa" w:w="80"/>
+              <w:right w:type="dxa" w:w="140"/>
+            </w:tcMar>
+            <w:vAlign w:val="center"/>
+          </w:tcPr>
+          <w:p>
+            <w:pPr>
+              <w:keepNext/>
+              <w:keepLines/>
+            </w:pPr>
+            <w:r>
+              <w:rPr>
+                <w:b/>
+                <w:bCs/>
+                <w:color w:val="FFFFFF"/>
+                <w:sz w:val="24"/>
+                <w:szCs w:val="24"/>
+              </w:rPr>
+              <w:t xml:space="preserve">v2.16.0</w:t>
+            </w:r>
+          </w:p>
+          <w:p>
+            <w:pPr>
+              <w:keepNext/>
+            </w:pPr>
+            <w:r>
+              <w:rPr>
+                <w:color w:val="FFFFFF"/>
+                <w:sz w:val="17"/>
+                <w:szCs w:val="17"/>
+              </w:rPr>
+              <w:t xml:space="preserve">20 oct 2026</w:t>
+            </w:r>
+          </w:p>
+        </w:tc>
+        <w:tc>
+          <w:tcPr>
+            <w:tcW w:type="dxa" w:w="7460"/>
+            <w:tcBorders>
+              <w:top w:val="single" w:color="D5D9E0" w:sz="4"/>
+              <w:left w:val="single" w:color="D5D9E0" w:sz="4"/>
+              <w:bottom w:val="single" w:color="D5D9E0" w:sz="4"/>
+              <w:right w:val="single" w:color="D5D9E0" w:sz="4"/>
+            </w:tcBorders>
+            <w:shd w:fill="F5F7FA" w:color="auto" w:val="clear"/>
+            <w:tcMar>
+              <w:top w:type="dxa" w:w="80"/>
+              <w:left w:type="dxa" w:w="160"/>
+              <w:bottom w:type="dxa" w:w="80"/>
+              <w:right w:type="dxa" w:w="140"/>
+            </w:tcMar>
+            <w:vAlign w:val="center"/>
+          </w:tcPr>
+          <w:p>
+            <w:pPr>
+              <w:keepNext/>
+            </w:pPr>
+            <w:r>
+              <w:rPr>
+                <w:b/>
+                <w:bCs/>
+                <w:color w:val="1F2A44"/>
+                <w:sz w:val="23"/>
+                <w:szCs w:val="23"/>
+              </w:rPr>
+              <w:t xml:space="preserve">Ocultar playlists de tus estadísticas</w:t>
             </w:r>
           </w:p>
         </w:tc>

</xml_diff>

<commit_message>
v2.16.2: los informes de faltantes ya no se leen como playlists exportadas
Co-Authored-By: Claude Opus 5.5 <noreply@anthropic.com>
Claude-Session: https://claude.ai/code/session_015yBEKQCgZonTqt5J2V9uZ5
</commit_message>
<xml_diff>
--- a/docs/BrainOrder - Manual de usuario.docx
+++ b/docs/BrainOrder - Manual de usuario.docx
@@ -73,7 +73,7 @@
           <w:sz w:val="26"/>
           <w:szCs w:val="26"/>
         </w:rPr>
-        <w:t xml:space="preserve">Versión 2.16.1</w:t>
+        <w:t xml:space="preserve">Versión 2.16.2</w:t>
       </w:r>
     </w:p>
     <w:p>
@@ -11347,7 +11347,7 @@
                 <w:sz w:val="24"/>
                 <w:szCs w:val="24"/>
               </w:rPr>
-              <w:t xml:space="preserve">v2.16.1</w:t>
+              <w:t xml:space="preserve">v2.16.2</w:t>
             </w:r>
           </w:p>
           <w:p>
@@ -11394,7 +11394,7 @@
                 <w:sz w:val="23"/>
                 <w:szCs w:val="23"/>
               </w:rPr>
-              <w:t xml:space="preserve">Descargas que ya usas en Rekordbox</w:t>
+              <w:t xml:space="preserve">Sin playlists fantasma</w:t>
             </w:r>
             <w:r>
               <w:rPr>
@@ -11405,6 +11405,149 @@
                 <w:szCs w:val="18"/>
               </w:rPr>
               <w:t xml:space="preserve">   · versión actual</w:t>
+            </w:r>
+          </w:p>
+        </w:tc>
+      </w:tr>
+    </w:tbl>
+    <w:p>
+      <w:pPr>
+        <w:pStyle w:val="ListParagraph"/>
+        <w:keepNext/>
+        <w:keepLines/>
+        <w:numPr>
+          <w:ilvl w:val="0"/>
+          <w:numId w:val="2"/>
+        </w:numPr>
+        <w:spacing w:after="60" w:line="276"/>
+      </w:pPr>
+      <w:r>
+        <w:rPr>
+          <w:b/>
+          <w:bCs/>
+        </w:rPr>
+        <w:t xml:space="preserve">Arreglado:</w:t>
+      </w:r>
+      <w:r>
+        <w:t xml:space="preserve"> si la carpeta de «Archivos exportados» incluía tu carpeta de playlists, los informes «_FALTAN EN ESTA CARPETA» aparecían como playlists «(no se pudo leer)» en Reglas y en la lista. Ya no se leen, y las que habían quedado se quitan solas.</w:t>
+      </w:r>
+    </w:p>
+    <w:p>
+      <w:pPr>
+        <w:pStyle w:val="ListParagraph"/>
+        <w:keepNext w:val="false"/>
+        <w:keepLines/>
+        <w:numPr>
+          <w:ilvl w:val="0"/>
+          <w:numId w:val="2"/>
+        </w:numPr>
+        <w:spacing w:after="60" w:line="276"/>
+      </w:pPr>
+      <w:r>
+        <w:t xml:space="preserve">Los .txt que no son playlists exportadas se ignoran en vez de aparecer como playlists con error.</w:t>
+      </w:r>
+    </w:p>
+    <w:p>
+      <w:pPr>
+        <w:spacing w:after="80"/>
+      </w:pPr>
+    </w:p>
+    <w:tbl>
+      <w:tblPr>
+        <w:tblW w:type="dxa" w:w="9360"/>
+        <w:tblBorders>
+          <w:top w:val="single" w:color="auto" w:sz="4"/>
+          <w:left w:val="single" w:color="auto" w:sz="4"/>
+          <w:bottom w:val="single" w:color="auto" w:sz="4"/>
+          <w:right w:val="single" w:color="auto" w:sz="4"/>
+          <w:insideH w:val="single" w:color="auto" w:sz="4"/>
+          <w:insideV w:val="single" w:color="auto" w:sz="4"/>
+        </w:tblBorders>
+      </w:tblPr>
+      <w:tblGrid>
+        <w:gridCol w:w="1900"/>
+        <w:gridCol w:w="7460"/>
+      </w:tblGrid>
+      <w:tr>
+        <w:tc>
+          <w:tcPr>
+            <w:tcW w:type="dxa" w:w="1900"/>
+            <w:tcBorders>
+              <w:top w:val="single" w:color="D5D9E0" w:sz="4"/>
+              <w:left w:val="single" w:color="D5D9E0" w:sz="4"/>
+              <w:bottom w:val="single" w:color="D5D9E0" w:sz="4"/>
+              <w:right w:val="single" w:color="D5D9E0" w:sz="4"/>
+            </w:tcBorders>
+            <w:shd w:fill="1F2A44" w:color="auto" w:val="clear"/>
+            <w:tcMar>
+              <w:top w:type="dxa" w:w="80"/>
+              <w:left w:type="dxa" w:w="140"/>
+              <w:bottom w:type="dxa" w:w="80"/>
+              <w:right w:type="dxa" w:w="140"/>
+            </w:tcMar>
+            <w:vAlign w:val="center"/>
+          </w:tcPr>
+          <w:p>
+            <w:pPr>
+              <w:keepNext/>
+              <w:keepLines/>
+            </w:pPr>
+            <w:r>
+              <w:rPr>
+                <w:b/>
+                <w:bCs/>
+                <w:color w:val="FFFFFF"/>
+                <w:sz w:val="24"/>
+                <w:szCs w:val="24"/>
+              </w:rPr>
+              <w:t xml:space="preserve">v2.16.1</w:t>
+            </w:r>
+          </w:p>
+          <w:p>
+            <w:pPr>
+              <w:keepNext/>
+            </w:pPr>
+            <w:r>
+              <w:rPr>
+                <w:color w:val="FFFFFF"/>
+                <w:sz w:val="17"/>
+                <w:szCs w:val="17"/>
+              </w:rPr>
+              <w:t xml:space="preserve">21 oct 2026</w:t>
+            </w:r>
+          </w:p>
+        </w:tc>
+        <w:tc>
+          <w:tcPr>
+            <w:tcW w:type="dxa" w:w="7460"/>
+            <w:tcBorders>
+              <w:top w:val="single" w:color="D5D9E0" w:sz="4"/>
+              <w:left w:val="single" w:color="D5D9E0" w:sz="4"/>
+              <w:bottom w:val="single" w:color="D5D9E0" w:sz="4"/>
+              <w:right w:val="single" w:color="D5D9E0" w:sz="4"/>
+            </w:tcBorders>
+            <w:shd w:fill="F5F7FA" w:color="auto" w:val="clear"/>
+            <w:tcMar>
+              <w:top w:type="dxa" w:w="80"/>
+              <w:left w:type="dxa" w:w="160"/>
+              <w:bottom w:type="dxa" w:w="80"/>
+              <w:right w:type="dxa" w:w="140"/>
+            </w:tcMar>
+            <w:vAlign w:val="center"/>
+          </w:tcPr>
+          <w:p>
+            <w:pPr>
+              <w:keepNext/>
+            </w:pPr>
+            <w:r>
+              <w:rPr>
+                <w:b/>
+                <w:bCs/>
+                <w:color w:val="1F2A44"/>
+                <w:sz w:val="23"/>
+                <w:szCs w:val="23"/>
+              </w:rPr>
+              <w:t xml:space="preserve">Descargas que ya usas en Rekordbox</w:t>
             </w:r>
           </w:p>
         </w:tc>

</xml_diff>

<commit_message>
Manual: instaladores .dmg/.exe y asistente de instalación
Co-Authored-By: Claude Opus 5.5 <noreply@anthropic.com>
Claude-Session: https://claude.ai/code/session_015yBEKQCgZonTqt5J2V9uZ5
</commit_message>
<xml_diff>
--- a/docs/BrainOrder - Manual de usuario.docx
+++ b/docs/BrainOrder - Manual de usuario.docx
@@ -73,7 +73,7 @@
           <w:sz w:val="26"/>
           <w:szCs w:val="26"/>
         </w:rPr>
-        <w:t xml:space="preserve">Versión 2.16.2</w:t>
+        <w:t xml:space="preserve">Versión 2.17.0</w:t>
       </w:r>
     </w:p>
     <w:p>
@@ -200,7 +200,7 @@
           <w:sz w:val="22"/>
           <w:szCs w:val="22"/>
         </w:rPr>
-        <w:t xml:space="preserve">	5</w:t>
+        <w:t xml:space="preserve">	6</w:t>
       </w:r>
     </w:p>
     <w:p>
@@ -226,7 +226,7 @@
           <w:sz w:val="22"/>
           <w:szCs w:val="22"/>
         </w:rPr>
-        <w:t xml:space="preserve">	7</w:t>
+        <w:t xml:space="preserve">	8</w:t>
       </w:r>
     </w:p>
     <w:p>
@@ -252,7 +252,7 @@
           <w:sz w:val="22"/>
           <w:szCs w:val="22"/>
         </w:rPr>
-        <w:t xml:space="preserve">	9</w:t>
+        <w:t xml:space="preserve">	10</w:t>
       </w:r>
     </w:p>
     <w:p>
@@ -278,7 +278,7 @@
           <w:sz w:val="22"/>
           <w:szCs w:val="22"/>
         </w:rPr>
-        <w:t xml:space="preserve">	10</w:t>
+        <w:t xml:space="preserve">	11</w:t>
       </w:r>
     </w:p>
     <w:p>
@@ -304,7 +304,7 @@
           <w:sz w:val="22"/>
           <w:szCs w:val="22"/>
         </w:rPr>
-        <w:t xml:space="preserve">	11</w:t>
+        <w:t xml:space="preserve">	12</w:t>
       </w:r>
     </w:p>
     <w:p>
@@ -330,7 +330,7 @@
           <w:sz w:val="22"/>
           <w:szCs w:val="22"/>
         </w:rPr>
-        <w:t xml:space="preserve">	12</w:t>
+        <w:t xml:space="preserve">	13</w:t>
       </w:r>
     </w:p>
     <w:p>
@@ -356,7 +356,7 @@
           <w:sz w:val="22"/>
           <w:szCs w:val="22"/>
         </w:rPr>
-        <w:t xml:space="preserve">	13</w:t>
+        <w:t xml:space="preserve">	14</w:t>
       </w:r>
     </w:p>
     <w:p>
@@ -382,7 +382,7 @@
           <w:sz w:val="22"/>
           <w:szCs w:val="22"/>
         </w:rPr>
-        <w:t xml:space="preserve">	15</w:t>
+        <w:t xml:space="preserve">	16</w:t>
       </w:r>
     </w:p>
     <w:p>
@@ -408,7 +408,7 @@
           <w:sz w:val="22"/>
           <w:szCs w:val="22"/>
         </w:rPr>
-        <w:t xml:space="preserve">	16</w:t>
+        <w:t xml:space="preserve">	17</w:t>
       </w:r>
     </w:p>
     <w:p>
@@ -434,7 +434,7 @@
           <w:sz w:val="22"/>
           <w:szCs w:val="22"/>
         </w:rPr>
-        <w:t xml:space="preserve">	17</w:t>
+        <w:t xml:space="preserve">	18</w:t>
       </w:r>
     </w:p>
     <w:p>
@@ -460,7 +460,7 @@
           <w:sz w:val="22"/>
           <w:szCs w:val="22"/>
         </w:rPr>
-        <w:t xml:space="preserve">	18</w:t>
+        <w:t xml:space="preserve">	19</w:t>
       </w:r>
     </w:p>
     <w:p>
@@ -486,7 +486,7 @@
           <w:sz w:val="22"/>
           <w:szCs w:val="22"/>
         </w:rPr>
-        <w:t xml:space="preserve">	18</w:t>
+        <w:t xml:space="preserve">	19</w:t>
       </w:r>
     </w:p>
     <w:p>
@@ -512,7 +512,7 @@
           <w:sz w:val="22"/>
           <w:szCs w:val="22"/>
         </w:rPr>
-        <w:t xml:space="preserve">	18</w:t>
+        <w:t xml:space="preserve">	19</w:t>
       </w:r>
     </w:p>
     <w:p>
@@ -538,7 +538,7 @@
           <w:sz w:val="22"/>
           <w:szCs w:val="22"/>
         </w:rPr>
-        <w:t xml:space="preserve">	19</w:t>
+        <w:t xml:space="preserve">	20</w:t>
       </w:r>
     </w:p>
     <w:p>
@@ -564,7 +564,7 @@
           <w:sz w:val="22"/>
           <w:szCs w:val="22"/>
         </w:rPr>
-        <w:t xml:space="preserve">	19</w:t>
+        <w:t xml:space="preserve">	20</w:t>
       </w:r>
     </w:p>
     <w:p>
@@ -590,7 +590,7 @@
           <w:sz w:val="22"/>
           <w:szCs w:val="22"/>
         </w:rPr>
-        <w:t xml:space="preserve">	20</w:t>
+        <w:t xml:space="preserve">	21</w:t>
       </w:r>
     </w:p>
     <w:p>
@@ -616,7 +616,7 @@
           <w:sz w:val="22"/>
           <w:szCs w:val="22"/>
         </w:rPr>
-        <w:t xml:space="preserve">	21</w:t>
+        <w:t xml:space="preserve">	22</w:t>
       </w:r>
     </w:p>
     <w:p>
@@ -1447,14 +1447,14 @@
         <w:spacing w:after="60" w:line="276"/>
       </w:pPr>
       <w:r>
-        <w:rPr>
-          <w:b/>
-          <w:bCs/>
-        </w:rPr>
-        <w:t xml:space="preserve">Python 3.9 o superior</w:t>
-      </w:r>
-      <w:r>
-        <w:t xml:space="preserve"> (el instalador crea su propio entorno; no toca tu Python del sistema).</w:t>
+        <w:t xml:space="preserve">macOS 11 o superior (Mac con chip Apple o con Intel) o Windows 10 / 11. </w:t>
+      </w:r>
+      <w:r>
+        <w:rPr>
+          <w:b/>
+          <w:bCs/>
+        </w:rPr>
+        <w:t xml:space="preserve">Con el instalador no necesitas Python.</w:t>
       </w:r>
     </w:p>
     <w:p>
@@ -1477,7 +1477,7 @@
         <w:t xml:space="preserve">Premium</w:t>
       </w:r>
       <w:r>
-        <w:t xml:space="preserve"> (Spotify lo exige para crear la app de desarrollador, ver capítulo 3).</w:t>
+        <w:t xml:space="preserve"> (Spotify lo exige para crear la app de desarrollador).</w:t>
       </w:r>
     </w:p>
     <w:p>
@@ -1498,7 +1498,363 @@
         <w:pStyle w:val="Heading2"/>
       </w:pPr>
       <w:r>
-        <w:t xml:space="preserve">macOS</w:t>
+        <w:t xml:space="preserve">Con el instalador (recomendado)</w:t>
+      </w:r>
+    </w:p>
+    <w:p>
+      <w:pPr>
+        <w:spacing w:after="120" w:line="276"/>
+      </w:pPr>
+      <w:r>
+        <w:t xml:space="preserve">Descarga el instalador de la última versión en </w:t>
+      </w:r>
+      <w:r>
+        <w:rPr>
+          <w:b/>
+          <w:bCs/>
+        </w:rPr>
+        <w:t xml:space="preserve">github.com/Brainwasher77/BrainOrder/releases</w:t>
+      </w:r>
+      <w:r>
+        <w:t xml:space="preserve">:</w:t>
+      </w:r>
+    </w:p>
+    <w:tbl>
+      <w:tblPr>
+        <w:tblW w:type="dxa" w:w="9360"/>
+        <w:tblBorders>
+          <w:top w:val="single" w:color="auto" w:sz="4"/>
+          <w:left w:val="single" w:color="auto" w:sz="4"/>
+          <w:bottom w:val="single" w:color="auto" w:sz="4"/>
+          <w:right w:val="single" w:color="auto" w:sz="4"/>
+          <w:insideH w:val="single" w:color="auto" w:sz="4"/>
+          <w:insideV w:val="single" w:color="auto" w:sz="4"/>
+        </w:tblBorders>
+      </w:tblPr>
+      <w:tblGrid>
+        <w:gridCol w:w="4200"/>
+        <w:gridCol w:w="5160"/>
+      </w:tblGrid>
+      <w:tr>
+        <w:trPr>
+          <w:tblHeader/>
+        </w:trPr>
+        <w:tc>
+          <w:tcPr>
+            <w:tcW w:type="dxa" w:w="4200"/>
+            <w:tcBorders>
+              <w:top w:val="single" w:color="D5D9E0" w:sz="4"/>
+              <w:left w:val="single" w:color="D5D9E0" w:sz="4"/>
+              <w:bottom w:val="single" w:color="D5D9E0" w:sz="4"/>
+              <w:right w:val="single" w:color="D5D9E0" w:sz="4"/>
+            </w:tcBorders>
+            <w:shd w:fill="1F2A44" w:color="auto" w:val="clear"/>
+            <w:tcMar>
+              <w:top w:type="dxa" w:w="90"/>
+              <w:left w:type="dxa" w:w="120"/>
+              <w:bottom w:type="dxa" w:w="90"/>
+              <w:right w:type="dxa" w:w="120"/>
+            </w:tcMar>
+            <w:vAlign w:val="center"/>
+          </w:tcPr>
+          <w:p>
+            <w:pPr>
+              <w:spacing w:after="40"/>
+            </w:pPr>
+            <w:r>
+              <w:rPr>
+                <w:b/>
+                <w:bCs/>
+                <w:color w:val="FFFFFF"/>
+                <w:sz w:val="19"/>
+                <w:szCs w:val="19"/>
+              </w:rPr>
+              <w:t xml:space="preserve">Tu computador</w:t>
+            </w:r>
+          </w:p>
+        </w:tc>
+        <w:tc>
+          <w:tcPr>
+            <w:tcW w:type="dxa" w:w="5160"/>
+            <w:tcBorders>
+              <w:top w:val="single" w:color="D5D9E0" w:sz="4"/>
+              <w:left w:val="single" w:color="D5D9E0" w:sz="4"/>
+              <w:bottom w:val="single" w:color="D5D9E0" w:sz="4"/>
+              <w:right w:val="single" w:color="D5D9E0" w:sz="4"/>
+            </w:tcBorders>
+            <w:shd w:fill="1F2A44" w:color="auto" w:val="clear"/>
+            <w:tcMar>
+              <w:top w:type="dxa" w:w="90"/>
+              <w:left w:type="dxa" w:w="120"/>
+              <w:bottom w:type="dxa" w:w="90"/>
+              <w:right w:type="dxa" w:w="120"/>
+            </w:tcMar>
+            <w:vAlign w:val="center"/>
+          </w:tcPr>
+          <w:p>
+            <w:pPr>
+              <w:spacing w:after="40"/>
+            </w:pPr>
+            <w:r>
+              <w:rPr>
+                <w:b/>
+                <w:bCs/>
+                <w:color w:val="FFFFFF"/>
+                <w:sz w:val="19"/>
+                <w:szCs w:val="19"/>
+              </w:rPr>
+              <w:t xml:space="preserve">Archivo</w:t>
+            </w:r>
+          </w:p>
+        </w:tc>
+      </w:tr>
+      <w:tr>
+        <w:trPr>
+          <w:cantSplit/>
+        </w:trPr>
+        <w:tc>
+          <w:tcPr>
+            <w:tcW w:type="dxa" w:w="4200"/>
+            <w:tcBorders>
+              <w:top w:val="single" w:color="D5D9E0" w:sz="4"/>
+              <w:left w:val="single" w:color="D5D9E0" w:sz="4"/>
+              <w:bottom w:val="single" w:color="D5D9E0" w:sz="4"/>
+              <w:right w:val="single" w:color="D5D9E0" w:sz="4"/>
+            </w:tcBorders>
+            <w:tcMar>
+              <w:top w:type="dxa" w:w="90"/>
+              <w:left w:type="dxa" w:w="120"/>
+              <w:bottom w:type="dxa" w:w="90"/>
+              <w:right w:type="dxa" w:w="120"/>
+            </w:tcMar>
+            <w:vAlign w:val="center"/>
+          </w:tcPr>
+          <w:p>
+            <w:pPr>
+              <w:spacing w:after="40"/>
+            </w:pPr>
+            <w:r>
+              <w:rPr>
+                <w:sz w:val="19"/>
+                <w:szCs w:val="19"/>
+              </w:rPr>
+              <w:t xml:space="preserve">Mac con chip Apple (M1, M2, M3, M4…)</w:t>
+            </w:r>
+          </w:p>
+        </w:tc>
+        <w:tc>
+          <w:tcPr>
+            <w:tcW w:type="dxa" w:w="5160"/>
+            <w:tcBorders>
+              <w:top w:val="single" w:color="D5D9E0" w:sz="4"/>
+              <w:left w:val="single" w:color="D5D9E0" w:sz="4"/>
+              <w:bottom w:val="single" w:color="D5D9E0" w:sz="4"/>
+              <w:right w:val="single" w:color="D5D9E0" w:sz="4"/>
+            </w:tcBorders>
+            <w:tcMar>
+              <w:top w:type="dxa" w:w="90"/>
+              <w:left w:type="dxa" w:w="120"/>
+              <w:bottom w:type="dxa" w:w="90"/>
+              <w:right w:type="dxa" w:w="120"/>
+            </w:tcMar>
+            <w:vAlign w:val="center"/>
+          </w:tcPr>
+          <w:p>
+            <w:pPr>
+              <w:spacing w:after="40"/>
+            </w:pPr>
+            <w:r>
+              <w:rPr>
+                <w:sz w:val="19"/>
+                <w:szCs w:val="19"/>
+              </w:rPr>
+              <w:t xml:space="preserve">BrainOrder-&lt;versión&gt;-Mac-AppleSilicon.dmg</w:t>
+            </w:r>
+          </w:p>
+        </w:tc>
+      </w:tr>
+      <w:tr>
+        <w:trPr>
+          <w:cantSplit/>
+        </w:trPr>
+        <w:tc>
+          <w:tcPr>
+            <w:tcW w:type="dxa" w:w="4200"/>
+            <w:tcBorders>
+              <w:top w:val="single" w:color="D5D9E0" w:sz="4"/>
+              <w:left w:val="single" w:color="D5D9E0" w:sz="4"/>
+              <w:bottom w:val="single" w:color="D5D9E0" w:sz="4"/>
+              <w:right w:val="single" w:color="D5D9E0" w:sz="4"/>
+            </w:tcBorders>
+            <w:shd w:fill="F5F7FA" w:color="auto" w:val="clear"/>
+            <w:tcMar>
+              <w:top w:type="dxa" w:w="90"/>
+              <w:left w:type="dxa" w:w="120"/>
+              <w:bottom w:type="dxa" w:w="90"/>
+              <w:right w:type="dxa" w:w="120"/>
+            </w:tcMar>
+            <w:vAlign w:val="center"/>
+          </w:tcPr>
+          <w:p>
+            <w:pPr>
+              <w:spacing w:after="40"/>
+            </w:pPr>
+            <w:r>
+              <w:rPr>
+                <w:sz w:val="19"/>
+                <w:szCs w:val="19"/>
+              </w:rPr>
+              <w:t xml:space="preserve">Mac con Intel</w:t>
+            </w:r>
+          </w:p>
+        </w:tc>
+        <w:tc>
+          <w:tcPr>
+            <w:tcW w:type="dxa" w:w="5160"/>
+            <w:tcBorders>
+              <w:top w:val="single" w:color="D5D9E0" w:sz="4"/>
+              <w:left w:val="single" w:color="D5D9E0" w:sz="4"/>
+              <w:bottom w:val="single" w:color="D5D9E0" w:sz="4"/>
+              <w:right w:val="single" w:color="D5D9E0" w:sz="4"/>
+            </w:tcBorders>
+            <w:shd w:fill="F5F7FA" w:color="auto" w:val="clear"/>
+            <w:tcMar>
+              <w:top w:type="dxa" w:w="90"/>
+              <w:left w:type="dxa" w:w="120"/>
+              <w:bottom w:type="dxa" w:w="90"/>
+              <w:right w:type="dxa" w:w="120"/>
+            </w:tcMar>
+            <w:vAlign w:val="center"/>
+          </w:tcPr>
+          <w:p>
+            <w:pPr>
+              <w:spacing w:after="40"/>
+            </w:pPr>
+            <w:r>
+              <w:rPr>
+                <w:sz w:val="19"/>
+                <w:szCs w:val="19"/>
+              </w:rPr>
+              <w:t xml:space="preserve">BrainOrder-&lt;versión&gt;-Mac-Intel.dmg</w:t>
+            </w:r>
+          </w:p>
+        </w:tc>
+      </w:tr>
+      <w:tr>
+        <w:trPr>
+          <w:cantSplit/>
+        </w:trPr>
+        <w:tc>
+          <w:tcPr>
+            <w:tcW w:type="dxa" w:w="4200"/>
+            <w:tcBorders>
+              <w:top w:val="single" w:color="D5D9E0" w:sz="4"/>
+              <w:left w:val="single" w:color="D5D9E0" w:sz="4"/>
+              <w:bottom w:val="single" w:color="D5D9E0" w:sz="4"/>
+              <w:right w:val="single" w:color="D5D9E0" w:sz="4"/>
+            </w:tcBorders>
+            <w:tcMar>
+              <w:top w:type="dxa" w:w="90"/>
+              <w:left w:type="dxa" w:w="120"/>
+              <w:bottom w:type="dxa" w:w="90"/>
+              <w:right w:type="dxa" w:w="120"/>
+            </w:tcMar>
+            <w:vAlign w:val="center"/>
+          </w:tcPr>
+          <w:p>
+            <w:pPr>
+              <w:spacing w:after="40"/>
+            </w:pPr>
+            <w:r>
+              <w:rPr>
+                <w:sz w:val="19"/>
+                <w:szCs w:val="19"/>
+              </w:rPr>
+              <w:t xml:space="preserve">Windows 10 / 11</w:t>
+            </w:r>
+          </w:p>
+        </w:tc>
+        <w:tc>
+          <w:tcPr>
+            <w:tcW w:type="dxa" w:w="5160"/>
+            <w:tcBorders>
+              <w:top w:val="single" w:color="D5D9E0" w:sz="4"/>
+              <w:left w:val="single" w:color="D5D9E0" w:sz="4"/>
+              <w:bottom w:val="single" w:color="D5D9E0" w:sz="4"/>
+              <w:right w:val="single" w:color="D5D9E0" w:sz="4"/>
+            </w:tcBorders>
+            <w:tcMar>
+              <w:top w:type="dxa" w:w="90"/>
+              <w:left w:type="dxa" w:w="120"/>
+              <w:bottom w:type="dxa" w:w="90"/>
+              <w:right w:type="dxa" w:w="120"/>
+            </w:tcMar>
+            <w:vAlign w:val="center"/>
+          </w:tcPr>
+          <w:p>
+            <w:pPr>
+              <w:spacing w:after="40"/>
+            </w:pPr>
+            <w:r>
+              <w:rPr>
+                <w:sz w:val="19"/>
+                <w:szCs w:val="19"/>
+              </w:rPr>
+              <w:t xml:space="preserve">BrainOrder-&lt;versión&gt;-Windows.exe</w:t>
+            </w:r>
+          </w:p>
+        </w:tc>
+      </w:tr>
+    </w:tbl>
+    <w:p>
+      <w:pPr>
+        <w:spacing w:after="120"/>
+      </w:pPr>
+    </w:p>
+    <w:p>
+      <w:pPr>
+        <w:spacing w:after="120" w:line="276"/>
+      </w:pPr>
+      <w:r>
+        <w:t xml:space="preserve">Traen su propio Python y todo lo necesario. Durante la instalación eliges </w:t>
+      </w:r>
+      <w:r>
+        <w:rPr>
+          <w:b/>
+          <w:bCs/>
+        </w:rPr>
+        <w:t xml:space="preserve">tus carpetas</w:t>
+      </w:r>
+      <w:r>
+        <w:t xml:space="preserve"> y te guía para crear la </w:t>
+      </w:r>
+      <w:r>
+        <w:rPr>
+          <w:b/>
+          <w:bCs/>
+        </w:rPr>
+        <w:t xml:space="preserve">app de Spotify</w:t>
+      </w:r>
+      <w:r>
+        <w:t xml:space="preserve"> y pegar el </w:t>
+      </w:r>
+      <w:r>
+        <w:rPr>
+          <w:b/>
+          <w:bCs/>
+        </w:rPr>
+        <w:t xml:space="preserve">Client ID</w:t>
+      </w:r>
+      <w:r>
+        <w:t xml:space="preserve">; al final autorizas Spotify en el navegador y queda todo hecho.</w:t>
+      </w:r>
+    </w:p>
+    <w:p>
+      <w:pPr>
+        <w:pStyle w:val="Heading3"/>
+      </w:pPr>
+      <w:r>
+        <w:t xml:space="preserve">macOS (.dmg)</w:t>
       </w:r>
     </w:p>
     <w:p>
@@ -1511,19 +1867,37 @@
         <w:spacing w:after="80" w:line="276"/>
       </w:pPr>
       <w:r>
-        <w:t xml:space="preserve">Si no tienes Python: </w:t>
-      </w:r>
-      <w:r>
-        <w:rPr>
-          <w:rFonts w:ascii="Courier New" w:cs="Courier New" w:eastAsia="Courier New" w:hAnsi="Courier New"/>
-          <w:color w:val="1F2A44"/>
-          <w:sz w:val="19"/>
-          <w:szCs w:val="19"/>
-        </w:rPr>
-        <w:t xml:space="preserve">brew install python</w:t>
-      </w:r>
-      <w:r>
-        <w:t xml:space="preserve"> (o descárgalo de python.org).</w:t>
+        <w:t xml:space="preserve">Abre el </w:t>
+      </w:r>
+      <w:r>
+        <w:rPr>
+          <w:b/>
+          <w:bCs/>
+        </w:rPr>
+        <w:t xml:space="preserve">.dmg</w:t>
+      </w:r>
+      <w:r>
+        <w:t xml:space="preserve"> y arrastra </w:t>
+      </w:r>
+      <w:r>
+        <w:rPr>
+          <w:b/>
+          <w:bCs/>
+        </w:rPr>
+        <w:t xml:space="preserve">BrainOrder</w:t>
+      </w:r>
+      <w:r>
+        <w:t xml:space="preserve"> a </w:t>
+      </w:r>
+      <w:r>
+        <w:rPr>
+          <w:b/>
+          <w:bCs/>
+        </w:rPr>
+        <w:t xml:space="preserve">Aplicaciones</w:t>
+      </w:r>
+      <w:r>
+        <w:t xml:space="preserve">.</w:t>
       </w:r>
     </w:p>
     <w:p>
@@ -1536,17 +1910,17 @@
         <w:spacing w:after="80" w:line="276"/>
       </w:pPr>
       <w:r>
-        <w:t xml:space="preserve">Doble clic en </w:t>
-      </w:r>
-      <w:r>
-        <w:rPr>
-          <w:b/>
-          <w:bCs/>
-        </w:rPr>
-        <w:t xml:space="preserve">Instalar BrainOrder.command</w:t>
-      </w:r>
-      <w:r>
-        <w:t xml:space="preserve">. Si macOS lo bloquea: clic derecho → Abrir.</w:t>
+        <w:t xml:space="preserve">Ábrela. Como no está firmada con una cuenta de Apple de pago, la primera vez macOS dice que no puede verificarla: toca </w:t>
+      </w:r>
+      <w:r>
+        <w:rPr>
+          <w:b/>
+          <w:bCs/>
+        </w:rPr>
+        <w:t xml:space="preserve">Listo</w:t>
+      </w:r>
+      <w:r>
+        <w:t xml:space="preserve">.</w:t>
       </w:r>
     </w:p>
     <w:p>
@@ -1559,6 +1933,212 @@
         <w:spacing w:after="80" w:line="276"/>
       </w:pPr>
       <w:r>
+        <w:t xml:space="preserve">Ve a </w:t>
+      </w:r>
+      <w:r>
+        <w:rPr>
+          <w:b/>
+          <w:bCs/>
+        </w:rPr>
+        <w:t xml:space="preserve">Configuración del Sistema → Privacidad y seguridad</w:t>
+      </w:r>
+      <w:r>
+        <w:t xml:space="preserve">, baja hasta «BrainOrder se bloqueó» y toca </w:t>
+      </w:r>
+      <w:r>
+        <w:rPr>
+          <w:b/>
+          <w:bCs/>
+        </w:rPr>
+        <w:t xml:space="preserve">Abrir igualmente</w:t>
+      </w:r>
+      <w:r>
+        <w:t xml:space="preserve"> (en macOS 14 o anterior también sirve clic derecho → Abrir).</w:t>
+      </w:r>
+    </w:p>
+    <w:p>
+      <w:pPr>
+        <w:pStyle w:val="ListParagraph"/>
+        <w:numPr>
+          <w:ilvl w:val="0"/>
+          <w:numId w:val="3"/>
+        </w:numPr>
+        <w:spacing w:after="80" w:line="276"/>
+      </w:pPr>
+      <w:r>
+        <w:t xml:space="preserve">Se abre el </w:t>
+      </w:r>
+      <w:r>
+        <w:rPr>
+          <w:b/>
+          <w:bCs/>
+        </w:rPr>
+        <w:t xml:space="preserve">asistente de instalación</w:t>
+      </w:r>
+      <w:r>
+        <w:t xml:space="preserve">: carpetas → programas de DJ → fuentes → </w:t>
+      </w:r>
+      <w:r>
+        <w:rPr>
+          <w:b/>
+          <w:bCs/>
+        </w:rPr>
+        <w:t xml:space="preserve">Conectar Spotify</w:t>
+      </w:r>
+      <w:r>
+        <w:t xml:space="preserve"> → listo (capítulo 3).</w:t>
+      </w:r>
+    </w:p>
+    <w:p>
+      <w:pPr>
+        <w:pStyle w:val="Heading3"/>
+      </w:pPr>
+      <w:r>
+        <w:t xml:space="preserve">Windows (.exe)</w:t>
+      </w:r>
+    </w:p>
+    <w:p>
+      <w:pPr>
+        <w:pStyle w:val="ListParagraph"/>
+        <w:numPr>
+          <w:ilvl w:val="0"/>
+          <w:numId w:val="4"/>
+        </w:numPr>
+        <w:spacing w:after="80" w:line="276"/>
+      </w:pPr>
+      <w:r>
+        <w:t xml:space="preserve">Abre el </w:t>
+      </w:r>
+      <w:r>
+        <w:rPr>
+          <w:b/>
+          <w:bCs/>
+        </w:rPr>
+        <w:t xml:space="preserve">.exe</w:t>
+      </w:r>
+      <w:r>
+        <w:t xml:space="preserve">. Si aparece «Windows protegió tu PC»: </w:t>
+      </w:r>
+      <w:r>
+        <w:rPr>
+          <w:b/>
+          <w:bCs/>
+        </w:rPr>
+        <w:t xml:space="preserve">Más información → Ejecutar de todas formas</w:t>
+      </w:r>
+      <w:r>
+        <w:t xml:space="preserve">.</w:t>
+      </w:r>
+    </w:p>
+    <w:p>
+      <w:pPr>
+        <w:pStyle w:val="ListParagraph"/>
+        <w:numPr>
+          <w:ilvl w:val="0"/>
+          <w:numId w:val="4"/>
+        </w:numPr>
+        <w:spacing w:after="80" w:line="276"/>
+      </w:pPr>
+      <w:r>
+        <w:t xml:space="preserve">Elige tu carpeta de </w:t>
+      </w:r>
+      <w:r>
+        <w:rPr>
+          <w:b/>
+          <w:bCs/>
+        </w:rPr>
+        <w:t xml:space="preserve">música organizada</w:t>
+      </w:r>
+      <w:r>
+        <w:t xml:space="preserve"> y la de </w:t>
+      </w:r>
+      <w:r>
+        <w:rPr>
+          <w:b/>
+          <w:bCs/>
+        </w:rPr>
+        <w:t xml:space="preserve">descargas</w:t>
+      </w:r>
+      <w:r>
+        <w:t xml:space="preserve">.</w:t>
+      </w:r>
+    </w:p>
+    <w:p>
+      <w:pPr>
+        <w:pStyle w:val="ListParagraph"/>
+        <w:numPr>
+          <w:ilvl w:val="0"/>
+          <w:numId w:val="4"/>
+        </w:numPr>
+        <w:spacing w:after="80" w:line="276"/>
+      </w:pPr>
+      <w:r>
+        <w:t xml:space="preserve">Página </w:t>
+      </w:r>
+      <w:r>
+        <w:rPr>
+          <w:b/>
+          <w:bCs/>
+        </w:rPr>
+        <w:t xml:space="preserve">Conectar Spotify</w:t>
+      </w:r>
+      <w:r>
+        <w:t xml:space="preserve">: el botón abre el panel de Spotify, el Redirect URI está listo para copiar y pegas tu </w:t>
+      </w:r>
+      <w:r>
+        <w:rPr>
+          <w:b/>
+          <w:bCs/>
+        </w:rPr>
+        <w:t xml:space="preserve">Client ID</w:t>
+      </w:r>
+      <w:r>
+        <w:t xml:space="preserve"> (te avisa si está incompleto; también puedes dejarlo para después).</w:t>
+      </w:r>
+    </w:p>
+    <w:p>
+      <w:pPr>
+        <w:pStyle w:val="ListParagraph"/>
+        <w:numPr>
+          <w:ilvl w:val="0"/>
+          <w:numId w:val="4"/>
+        </w:numPr>
+        <w:spacing w:after="80" w:line="276"/>
+      </w:pPr>
+      <w:r>
+        <w:t xml:space="preserve">Al terminar se abre BrainOrder con todo puesto: revisas, tocas </w:t>
+      </w:r>
+      <w:r>
+        <w:rPr>
+          <w:b/>
+          <w:bCs/>
+        </w:rPr>
+        <w:t xml:space="preserve">Conectar y probar</w:t>
+      </w:r>
+      <w:r>
+        <w:t xml:space="preserve"> o </w:t>
+      </w:r>
+      <w:r>
+        <w:rPr>
+          <w:b/>
+          <w:bCs/>
+        </w:rPr>
+        <w:t xml:space="preserve">Terminar instalación</w:t>
+      </w:r>
+      <w:r>
+        <w:t xml:space="preserve"> y autorizas Spotify en el navegador.</w:t>
+      </w:r>
+    </w:p>
+    <w:p>
+      <w:pPr>
+        <w:pStyle w:val="ListParagraph"/>
+        <w:numPr>
+          <w:ilvl w:val="0"/>
+          <w:numId w:val="4"/>
+        </w:numPr>
+        <w:spacing w:after="80" w:line="276"/>
+      </w:pPr>
+      <w:r>
         <w:t xml:space="preserve">Queda </w:t>
       </w:r>
       <w:r>
@@ -1569,96 +2149,7 @@
         <w:t xml:space="preserve">BrainOrder</w:t>
       </w:r>
       <w:r>
-        <w:t xml:space="preserve"> en Aplicaciones. Ábrelo con Spotlight (⌘ + espacio) y, si quieres, déjalo fijo en el Dock.</w:t>
-      </w:r>
-    </w:p>
-    <w:p>
-      <w:pPr>
-        <w:pStyle w:val="Heading2"/>
-      </w:pPr>
-      <w:r>
-        <w:t xml:space="preserve">Windows 10 / 11</w:t>
-      </w:r>
-    </w:p>
-    <w:p>
-      <w:pPr>
-        <w:pStyle w:val="ListParagraph"/>
-        <w:numPr>
-          <w:ilvl w:val="0"/>
-          <w:numId w:val="4"/>
-        </w:numPr>
-        <w:spacing w:after="80" w:line="276"/>
-      </w:pPr>
-      <w:r>
-        <w:t xml:space="preserve">Si no tienes Python: instálalo desde python.org marcando </w:t>
-      </w:r>
-      <w:r>
-        <w:rPr>
-          <w:b/>
-          <w:bCs/>
-        </w:rPr>
-        <w:t xml:space="preserve">«Add python.exe to PATH»</w:t>
-      </w:r>
-      <w:r>
-        <w:t xml:space="preserve"> (o </w:t>
-      </w:r>
-      <w:r>
-        <w:rPr>
-          <w:rFonts w:ascii="Courier New" w:cs="Courier New" w:eastAsia="Courier New" w:hAnsi="Courier New"/>
-          <w:color w:val="1F2A44"/>
-          <w:sz w:val="19"/>
-          <w:szCs w:val="19"/>
-        </w:rPr>
-        <w:t xml:space="preserve">winget install Python.Python.3.12</w:t>
-      </w:r>
-      <w:r>
-        <w:t xml:space="preserve">).</w:t>
-      </w:r>
-    </w:p>
-    <w:p>
-      <w:pPr>
-        <w:pStyle w:val="ListParagraph"/>
-        <w:numPr>
-          <w:ilvl w:val="0"/>
-          <w:numId w:val="4"/>
-        </w:numPr>
-        <w:spacing w:after="80" w:line="276"/>
-      </w:pPr>
-      <w:r>
-        <w:t xml:space="preserve">Doble clic en </w:t>
-      </w:r>
-      <w:r>
-        <w:rPr>
-          <w:b/>
-          <w:bCs/>
-        </w:rPr>
-        <w:t xml:space="preserve">Instalar BrainOrder (Windows).bat</w:t>
-      </w:r>
-      <w:r>
-        <w:t xml:space="preserve">. Si aparece «Windows protegió tu PC»: Más información → Ejecutar de todas formas.</w:t>
-      </w:r>
-    </w:p>
-    <w:p>
-      <w:pPr>
-        <w:pStyle w:val="ListParagraph"/>
-        <w:numPr>
-          <w:ilvl w:val="0"/>
-          <w:numId w:val="4"/>
-        </w:numPr>
-        <w:spacing w:after="80" w:line="276"/>
-      </w:pPr>
-      <w:r>
-        <w:t xml:space="preserve">Queda un acceso directo </w:t>
-      </w:r>
-      <w:r>
-        <w:rPr>
-          <w:b/>
-          <w:bCs/>
-        </w:rPr>
-        <w:t xml:space="preserve">BrainOrder</w:t>
-      </w:r>
-      <w:r>
-        <w:t xml:space="preserve"> en el Escritorio y en el Menú Inicio.</w:t>
+        <w:t xml:space="preserve"> en el Escritorio y en el Menú Inicio. Se instala solo para tu usuario (no pide administrador).</w:t>
       </w:r>
     </w:p>
     <w:tbl>
@@ -1682,11 +2173,11 @@
             <w:tcW w:type="dxa" w:w="9360"/>
             <w:tcBorders>
               <w:top w:val="none" w:color="FFFFFF" w:sz="0"/>
-              <w:left w:val="single" w:color="7FB800" w:sz="24"/>
+              <w:left w:val="single" w:color="2F6FDE" w:sz="24"/>
               <w:bottom w:val="none" w:color="FFFFFF" w:sz="0"/>
               <w:right w:val="none" w:color="FFFFFF" w:sz="0"/>
             </w:tcBorders>
-            <w:shd w:fill="EEF7D6" w:color="auto" w:val="clear"/>
+            <w:shd w:fill="E3ECFB" w:color="auto" w:val="clear"/>
             <w:tcMar>
               <w:top w:type="dxa" w:w="120"/>
               <w:left w:type="dxa" w:w="200"/>
@@ -1702,9 +2193,9 @@
               <w:rPr>
                 <w:b/>
                 <w:bCs/>
-                <w:color w:val="7FB800"/>
-              </w:rPr>
-              <w:t xml:space="preserve">💡 Consejo</w:t>
+                <w:color w:val="2F6FDE"/>
+              </w:rPr>
+              <w:t xml:space="preserve">ℹ️ Bueno saber</w:t>
             </w:r>
           </w:p>
           <w:p>
@@ -1712,7 +2203,25 @@
               <w:spacing w:after="40" w:line="264"/>
             </w:pPr>
             <w:r>
-              <w:t xml:space="preserve">Después de instalar puedes borrar la carpeta que descargaste: la app queda instalada en tu carpeta de datos y se actualiza sola.</w:t>
+              <w:t xml:space="preserve">Si ya tenías BrainOrder (o SpotiSync), el instalador conserva tu configuración, historial y cachés, y no vuelve a preguntar.</w:t>
+            </w:r>
+          </w:p>
+          <w:p>
+            <w:pPr>
+              <w:spacing w:after="40" w:line="264"/>
+            </w:pPr>
+            <w:r>
+              <w:t xml:space="preserve">Windows necesita </w:t>
+            </w:r>
+            <w:r>
+              <w:rPr>
+                <w:b/>
+                <w:bCs/>
+              </w:rPr>
+              <w:t xml:space="preserve">Microsoft Edge WebView2</w:t>
+            </w:r>
+            <w:r>
+              <w:t xml:space="preserve"> (viene con Windows 11 y casi todos los Windows 10). Si falta, el instalador te ofrece la página para instalarlo.</w:t>
             </w:r>
           </w:p>
         </w:tc>
@@ -1728,43 +2237,27 @@
         <w:pStyle w:val="Heading2"/>
       </w:pPr>
       <w:r>
-        <w:t xml:space="preserve">Actualizaciones automáticas</w:t>
-      </w:r>
-    </w:p>
-    <w:p>
-      <w:pPr>
-        <w:pStyle w:val="ListParagraph"/>
-        <w:numPr>
-          <w:ilvl w:val="0"/>
-          <w:numId w:val="2"/>
-        </w:numPr>
-        <w:spacing w:after="60" w:line="276"/>
-      </w:pPr>
-      <w:r>
-        <w:t xml:space="preserve">Cada vez que abres BrainOrder revisa si hay una versión nueva. Si la hay, la descarga en segundo plano y te ofrece </w:t>
-      </w:r>
-      <w:r>
-        <w:rPr>
-          <w:b/>
-          <w:bCs/>
-        </w:rPr>
-        <w:t xml:space="preserve">Reiniciar ahora</w:t>
-      </w:r>
-      <w:r>
-        <w:t xml:space="preserve">; si dices «Después», se instala sola la próxima vez que la abras.</w:t>
-      </w:r>
-    </w:p>
-    <w:p>
-      <w:pPr>
-        <w:pStyle w:val="ListParagraph"/>
-        <w:numPr>
-          <w:ilvl w:val="0"/>
-          <w:numId w:val="2"/>
-        </w:numPr>
-        <w:spacing w:after="60" w:line="276"/>
-      </w:pPr>
-      <w:r>
-        <w:t xml:space="preserve">Si Python cambia en tu computador (por ejemplo tras </w:t>
+        <w:t xml:space="preserve">Con el script (si ya tienes Python 3.9+)</w:t>
+      </w:r>
+    </w:p>
+    <w:p>
+      <w:pPr>
+        <w:pStyle w:val="ListParagraph"/>
+        <w:numPr>
+          <w:ilvl w:val="0"/>
+          <w:numId w:val="2"/>
+        </w:numPr>
+        <w:spacing w:after="60" w:line="276"/>
+      </w:pPr>
+      <w:r>
+        <w:rPr>
+          <w:b/>
+          <w:bCs/>
+        </w:rPr>
+        <w:t xml:space="preserve">macOS:</w:t>
+      </w:r>
+      <w:r>
+        <w:t xml:space="preserve"> </w:t>
       </w:r>
       <w:r>
         <w:rPr>
@@ -1773,235 +2266,166 @@
           <w:sz w:val="19"/>
           <w:szCs w:val="19"/>
         </w:rPr>
-        <w:t xml:space="preserve">brew upgrade</w:t>
-      </w:r>
-      <w:r>
-        <w:t xml:space="preserve">), el lanzador rehace el entorno solo. Esa primera vez tarda un par de minutos.</w:t>
-      </w:r>
-    </w:p>
-    <w:p>
-      <w:pPr>
-        <w:pStyle w:val="ListParagraph"/>
-        <w:numPr>
-          <w:ilvl w:val="0"/>
-          <w:numId w:val="2"/>
-        </w:numPr>
-        <w:spacing w:after="60" w:line="276"/>
-      </w:pPr>
-      <w:r>
-        <w:t xml:space="preserve">Si una versión nueva necesita componentes nuevos, los instala sola al abrirla.</w:t>
-      </w:r>
-    </w:p>
-    <w:p>
-      <w:pPr>
-        <w:pStyle w:val="ListParagraph"/>
-        <w:numPr>
-          <w:ilvl w:val="0"/>
-          <w:numId w:val="2"/>
-        </w:numPr>
-        <w:spacing w:after="60" w:line="276"/>
-      </w:pPr>
-      <w:r>
-        <w:t xml:space="preserve">Si una versión nueva no llegara a arrancar, BrainOrder </w:t>
-      </w:r>
-      <w:r>
-        <w:rPr>
-          <w:b/>
-          <w:bCs/>
-        </w:rPr>
-        <w:t xml:space="preserve">vuelve sola a la anterior</w:t>
-      </w:r>
-      <w:r>
-        <w:t xml:space="preserve"> y no reintenta esa versión.</w:t>
-      </w:r>
-    </w:p>
-    <w:p>
-      <w:pPr>
-        <w:pStyle w:val="ListParagraph"/>
-        <w:numPr>
-          <w:ilvl w:val="0"/>
-          <w:numId w:val="2"/>
-        </w:numPr>
-        <w:spacing w:after="60" w:line="276"/>
-      </w:pPr>
-      <w:r>
-        <w:t xml:space="preserve">Solo hay que volver a correr el instalador si cambias de computador.</w:t>
-      </w:r>
-    </w:p>
-    <w:p>
-      <w:pPr>
-        <w:pStyle w:val="Heading1"/>
-        <w:spacing w:after="200" w:before="480"/>
-      </w:pPr>
-      <w:r>
-        <w:t xml:space="preserve">3. Primer uso</w:t>
-      </w:r>
+        <w:t xml:space="preserve">brew install python</w:t>
+      </w:r>
+      <w:r>
+        <w:t xml:space="preserve"> si no lo tienes y doble clic en </w:t>
+      </w:r>
+      <w:r>
+        <w:rPr>
+          <w:b/>
+          <w:bCs/>
+        </w:rPr>
+        <w:t xml:space="preserve">Instalar BrainOrder.command</w:t>
+      </w:r>
+      <w:r>
+        <w:t xml:space="preserve"> (si macOS lo bloquea: clic derecho → Abrir).</w:t>
+      </w:r>
+    </w:p>
+    <w:p>
+      <w:pPr>
+        <w:pStyle w:val="ListParagraph"/>
+        <w:numPr>
+          <w:ilvl w:val="0"/>
+          <w:numId w:val="2"/>
+        </w:numPr>
+        <w:spacing w:after="60" w:line="276"/>
+      </w:pPr>
+      <w:r>
+        <w:rPr>
+          <w:b/>
+          <w:bCs/>
+        </w:rPr>
+        <w:t xml:space="preserve">Windows:</w:t>
+      </w:r>
+      <w:r>
+        <w:t xml:space="preserve"> Python desde python.org marcando </w:t>
+      </w:r>
+      <w:r>
+        <w:rPr>
+          <w:b/>
+          <w:bCs/>
+        </w:rPr>
+        <w:t xml:space="preserve">«Add python.exe to PATH»</w:t>
+      </w:r>
+      <w:r>
+        <w:t xml:space="preserve"> y doble clic en </w:t>
+      </w:r>
+      <w:r>
+        <w:rPr>
+          <w:b/>
+          <w:bCs/>
+        </w:rPr>
+        <w:t xml:space="preserve">Instalar BrainOrder (Windows).bat</w:t>
+      </w:r>
+      <w:r>
+        <w:t xml:space="preserve">.</w:t>
+      </w:r>
+    </w:p>
+    <w:tbl>
+      <w:tblPr>
+        <w:tblW w:type="dxa" w:w="9360"/>
+        <w:tblBorders>
+          <w:top w:val="single" w:color="auto" w:sz="4"/>
+          <w:left w:val="single" w:color="auto" w:sz="4"/>
+          <w:bottom w:val="single" w:color="auto" w:sz="4"/>
+          <w:right w:val="single" w:color="auto" w:sz="4"/>
+          <w:insideH w:val="single" w:color="auto" w:sz="4"/>
+          <w:insideV w:val="single" w:color="auto" w:sz="4"/>
+        </w:tblBorders>
+      </w:tblPr>
+      <w:tblGrid>
+        <w:gridCol w:w="9360"/>
+      </w:tblGrid>
+      <w:tr>
+        <w:tc>
+          <w:tcPr>
+            <w:tcW w:type="dxa" w:w="9360"/>
+            <w:tcBorders>
+              <w:top w:val="none" w:color="FFFFFF" w:sz="0"/>
+              <w:left w:val="single" w:color="7FB800" w:sz="24"/>
+              <w:bottom w:val="none" w:color="FFFFFF" w:sz="0"/>
+              <w:right w:val="none" w:color="FFFFFF" w:sz="0"/>
+            </w:tcBorders>
+            <w:shd w:fill="EEF7D6" w:color="auto" w:val="clear"/>
+            <w:tcMar>
+              <w:top w:type="dxa" w:w="120"/>
+              <w:left w:type="dxa" w:w="200"/>
+              <w:bottom w:type="dxa" w:w="120"/>
+              <w:right w:type="dxa" w:w="200"/>
+            </w:tcMar>
+          </w:tcPr>
+          <w:p>
+            <w:pPr>
+              <w:spacing w:after="60"/>
+            </w:pPr>
+            <w:r>
+              <w:rPr>
+                <w:b/>
+                <w:bCs/>
+                <w:color w:val="7FB800"/>
+              </w:rPr>
+              <w:t xml:space="preserve">💡 Consejo</w:t>
+            </w:r>
+          </w:p>
+          <w:p>
+            <w:pPr>
+              <w:spacing w:after="40" w:line="264"/>
+            </w:pPr>
+            <w:r>
+              <w:t xml:space="preserve">Después de instalar con el script puedes borrar la carpeta que descargaste: la app queda instalada en tu carpeta de datos y se actualiza sola.</w:t>
+            </w:r>
+          </w:p>
+        </w:tc>
+      </w:tr>
+    </w:tbl>
+    <w:p>
+      <w:pPr>
+        <w:spacing w:after="120"/>
+      </w:pPr>
     </w:p>
     <w:p>
       <w:pPr>
         <w:pStyle w:val="Heading2"/>
       </w:pPr>
       <w:r>
-        <w:t xml:space="preserve">Asistente de configuración</w:t>
-      </w:r>
-    </w:p>
-    <w:p>
-      <w:pPr>
-        <w:spacing w:after="120" w:line="276"/>
-      </w:pPr>
-      <w:r>
-        <w:t xml:space="preserve">La primera vez se abre un asistente de 4 pasos (se puede volver a abrir desde </w:t>
-      </w:r>
-      <w:r>
-        <w:rPr>
-          <w:b/>
-          <w:bCs/>
-        </w:rPr>
-        <w:t xml:space="preserve">Ajustes → Asistente de configuración</w:t>
-      </w:r>
-      <w:r>
-        <w:t xml:space="preserve">):</w:t>
-      </w:r>
-    </w:p>
-    <w:p>
-      <w:pPr>
-        <w:pStyle w:val="ListParagraph"/>
-        <w:numPr>
-          <w:ilvl w:val="0"/>
-          <w:numId w:val="5"/>
-        </w:numPr>
-        <w:spacing w:after="80" w:line="276"/>
-      </w:pPr>
-      <w:r>
-        <w:rPr>
-          <w:b/>
-          <w:bCs/>
-        </w:rPr>
-        <w:t xml:space="preserve">Programas de DJ</w:t>
-      </w:r>
-      <w:r>
-        <w:t xml:space="preserve">: detecta los que tienes instalados y eliges cuáles usar.</w:t>
-      </w:r>
-    </w:p>
-    <w:p>
-      <w:pPr>
-        <w:pStyle w:val="ListParagraph"/>
-        <w:numPr>
-          <w:ilvl w:val="0"/>
-          <w:numId w:val="5"/>
-        </w:numPr>
-        <w:spacing w:after="80" w:line="276"/>
-      </w:pPr>
-      <w:r>
-        <w:rPr>
-          <w:b/>
-          <w:bCs/>
-        </w:rPr>
-        <w:t xml:space="preserve">De dónde vienen tus playlists</w:t>
-      </w:r>
-      <w:r>
-        <w:t xml:space="preserve">: Spotify, Deezer o archivos exportados.</w:t>
-      </w:r>
-    </w:p>
-    <w:p>
-      <w:pPr>
-        <w:pStyle w:val="ListParagraph"/>
-        <w:numPr>
-          <w:ilvl w:val="0"/>
-          <w:numId w:val="5"/>
-        </w:numPr>
-        <w:spacing w:after="80" w:line="276"/>
-      </w:pPr>
-      <w:r>
-        <w:rPr>
-          <w:b/>
-          <w:bCs/>
-        </w:rPr>
-        <w:t xml:space="preserve">Tus carpetas</w:t>
-      </w:r>
-      <w:r>
-        <w:t xml:space="preserve">: la carpeta de playlists, la de descargas y tus otras carpetas de música (sugiere las que ya tienen música).</w:t>
-      </w:r>
-    </w:p>
-    <w:p>
-      <w:pPr>
-        <w:pStyle w:val="ListParagraph"/>
-        <w:numPr>
-          <w:ilvl w:val="0"/>
-          <w:numId w:val="5"/>
-        </w:numPr>
-        <w:spacing w:after="80" w:line="276"/>
-      </w:pPr>
-      <w:r>
-        <w:rPr>
-          <w:b/>
-          <w:bCs/>
-        </w:rPr>
-        <w:t xml:space="preserve">Listo</w:t>
-      </w:r>
-      <w:r>
-        <w:t xml:space="preserve">: guarda todo y te lleva a la pantalla principal.</w:t>
-      </w:r>
-    </w:p>
-    <w:p>
-      <w:pPr>
-        <w:pStyle w:val="Heading2"/>
-      </w:pPr>
-      <w:r>
-        <w:t xml:space="preserve">Conectar Spotify (una sola vez)</w:t>
-      </w:r>
-    </w:p>
-    <w:p>
-      <w:pPr>
-        <w:pStyle w:val="ListParagraph"/>
-        <w:numPr>
-          <w:ilvl w:val="0"/>
-          <w:numId w:val="6"/>
-        </w:numPr>
-        <w:spacing w:after="80" w:line="276"/>
-      </w:pPr>
-      <w:r>
-        <w:t xml:space="preserve">Entra a </w:t>
-      </w:r>
-      <w:r>
-        <w:rPr>
-          <w:b/>
-          <w:bCs/>
-        </w:rPr>
-        <w:t xml:space="preserve">developer.spotify.com/dashboard</w:t>
-      </w:r>
-      <w:r>
-        <w:t xml:space="preserve"> con tu cuenta (el dueño de la app debe ser Premium).</w:t>
-      </w:r>
-    </w:p>
-    <w:p>
-      <w:pPr>
-        <w:pStyle w:val="ListParagraph"/>
-        <w:numPr>
-          <w:ilvl w:val="0"/>
-          <w:numId w:val="6"/>
-        </w:numPr>
-        <w:spacing w:after="80" w:line="276"/>
-      </w:pPr>
-      <w:r>
-        <w:rPr>
-          <w:b/>
-          <w:bCs/>
-        </w:rPr>
-        <w:t xml:space="preserve">Create app</w:t>
-      </w:r>
-      <w:r>
-        <w:t xml:space="preserve"> → API: </w:t>
-      </w:r>
-      <w:r>
-        <w:rPr>
-          <w:b/>
-          <w:bCs/>
-        </w:rPr>
-        <w:t xml:space="preserve">Web API</w:t>
-      </w:r>
-      <w:r>
-        <w:t xml:space="preserve"> → Redirect URI: </w:t>
+        <w:t xml:space="preserve">Actualizaciones automáticas</w:t>
+      </w:r>
+    </w:p>
+    <w:p>
+      <w:pPr>
+        <w:pStyle w:val="ListParagraph"/>
+        <w:numPr>
+          <w:ilvl w:val="0"/>
+          <w:numId w:val="2"/>
+        </w:numPr>
+        <w:spacing w:after="60" w:line="276"/>
+      </w:pPr>
+      <w:r>
+        <w:t xml:space="preserve">Cada vez que abres BrainOrder revisa si hay una versión nueva. Si la hay, la descarga en segundo plano y te ofrece </w:t>
+      </w:r>
+      <w:r>
+        <w:rPr>
+          <w:b/>
+          <w:bCs/>
+        </w:rPr>
+        <w:t xml:space="preserve">Reiniciar ahora</w:t>
+      </w:r>
+      <w:r>
+        <w:t xml:space="preserve">; si dices «Después», se instala sola la próxima vez que la abras.</w:t>
+      </w:r>
+    </w:p>
+    <w:p>
+      <w:pPr>
+        <w:pStyle w:val="ListParagraph"/>
+        <w:numPr>
+          <w:ilvl w:val="0"/>
+          <w:numId w:val="2"/>
+        </w:numPr>
+        <w:spacing w:after="60" w:line="276"/>
+      </w:pPr>
+      <w:r>
+        <w:t xml:space="preserve">Instalación con script: si Python cambia en tu computador (por ejemplo tras </w:t>
       </w:r>
       <w:r>
         <w:rPr>
@@ -2010,10 +2434,323 @@
           <w:sz w:val="19"/>
           <w:szCs w:val="19"/>
         </w:rPr>
+        <w:t xml:space="preserve">brew upgrade</w:t>
+      </w:r>
+      <w:r>
+        <w:t xml:space="preserve">), el lanzador rehace el entorno solo. Con el instalador no aplica: trae su propio Python.</w:t>
+      </w:r>
+    </w:p>
+    <w:p>
+      <w:pPr>
+        <w:pStyle w:val="ListParagraph"/>
+        <w:numPr>
+          <w:ilvl w:val="0"/>
+          <w:numId w:val="2"/>
+        </w:numPr>
+        <w:spacing w:after="60" w:line="276"/>
+      </w:pPr>
+      <w:r>
+        <w:t xml:space="preserve">Si instalas un .dmg/.exe más nuevo que tu versión, su código reemplaza al anterior; si es más viejo, sigue la versión actualizada.</w:t>
+      </w:r>
+    </w:p>
+    <w:p>
+      <w:pPr>
+        <w:pStyle w:val="ListParagraph"/>
+        <w:numPr>
+          <w:ilvl w:val="0"/>
+          <w:numId w:val="2"/>
+        </w:numPr>
+        <w:spacing w:after="60" w:line="276"/>
+      </w:pPr>
+      <w:r>
+        <w:t xml:space="preserve">Si una versión nueva necesita componentes nuevos, los instala sola al abrirla.</w:t>
+      </w:r>
+    </w:p>
+    <w:p>
+      <w:pPr>
+        <w:pStyle w:val="ListParagraph"/>
+        <w:numPr>
+          <w:ilvl w:val="0"/>
+          <w:numId w:val="2"/>
+        </w:numPr>
+        <w:spacing w:after="60" w:line="276"/>
+      </w:pPr>
+      <w:r>
+        <w:t xml:space="preserve">Si una versión nueva no llegara a arrancar, BrainOrder </w:t>
+      </w:r>
+      <w:r>
+        <w:rPr>
+          <w:b/>
+          <w:bCs/>
+        </w:rPr>
+        <w:t xml:space="preserve">vuelve sola a la anterior</w:t>
+      </w:r>
+      <w:r>
+        <w:t xml:space="preserve"> y no reintenta esa versión.</w:t>
+      </w:r>
+    </w:p>
+    <w:p>
+      <w:pPr>
+        <w:pStyle w:val="ListParagraph"/>
+        <w:numPr>
+          <w:ilvl w:val="0"/>
+          <w:numId w:val="2"/>
+        </w:numPr>
+        <w:spacing w:after="60" w:line="276"/>
+      </w:pPr>
+      <w:r>
+        <w:t xml:space="preserve">Solo hay que volver a instalar si cambias de computador.</w:t>
+      </w:r>
+    </w:p>
+    <w:p>
+      <w:pPr>
+        <w:pStyle w:val="Heading1"/>
+        <w:spacing w:after="200" w:before="480"/>
+      </w:pPr>
+      <w:r>
+        <w:t xml:space="preserve">3. Primer uso</w:t>
+      </w:r>
+    </w:p>
+    <w:p>
+      <w:pPr>
+        <w:pStyle w:val="Heading2"/>
+      </w:pPr>
+      <w:r>
+        <w:t xml:space="preserve">Asistente de instalación</w:t>
+      </w:r>
+    </w:p>
+    <w:p>
+      <w:pPr>
+        <w:spacing w:after="120" w:line="276"/>
+      </w:pPr>
+      <w:r>
+        <w:t xml:space="preserve">La primera vez se abre el asistente de instalación (se puede volver a abrir desde </w:t>
+      </w:r>
+      <w:r>
+        <w:rPr>
+          <w:b/>
+          <w:bCs/>
+        </w:rPr>
+        <w:t xml:space="preserve">Ajustes → Asistente de configuración</w:t>
+      </w:r>
+      <w:r>
+        <w:t xml:space="preserve">). Si instalaste con el .exe, las carpetas y el Client ID ya vienen puestos:</w:t>
+      </w:r>
+    </w:p>
+    <w:p>
+      <w:pPr>
+        <w:pStyle w:val="ListParagraph"/>
+        <w:numPr>
+          <w:ilvl w:val="0"/>
+          <w:numId w:val="5"/>
+        </w:numPr>
+        <w:spacing w:after="80" w:line="276"/>
+      </w:pPr>
+      <w:r>
+        <w:rPr>
+          <w:b/>
+          <w:bCs/>
+        </w:rPr>
+        <w:t xml:space="preserve">Tus carpetas</w:t>
+      </w:r>
+      <w:r>
+        <w:t xml:space="preserve">: la de música organizada, la de descargas y tus otras carpetas de música (sugiere las que ya tienen música).</w:t>
+      </w:r>
+    </w:p>
+    <w:p>
+      <w:pPr>
+        <w:pStyle w:val="ListParagraph"/>
+        <w:numPr>
+          <w:ilvl w:val="0"/>
+          <w:numId w:val="5"/>
+        </w:numPr>
+        <w:spacing w:after="80" w:line="276"/>
+      </w:pPr>
+      <w:r>
+        <w:rPr>
+          <w:b/>
+          <w:bCs/>
+        </w:rPr>
+        <w:t xml:space="preserve">Programas de DJ</w:t>
+      </w:r>
+      <w:r>
+        <w:t xml:space="preserve">: detecta los que tienes instalados y eliges cuáles usar.</w:t>
+      </w:r>
+    </w:p>
+    <w:p>
+      <w:pPr>
+        <w:pStyle w:val="ListParagraph"/>
+        <w:numPr>
+          <w:ilvl w:val="0"/>
+          <w:numId w:val="5"/>
+        </w:numPr>
+        <w:spacing w:after="80" w:line="276"/>
+      </w:pPr>
+      <w:r>
+        <w:rPr>
+          <w:b/>
+          <w:bCs/>
+        </w:rPr>
+        <w:t xml:space="preserve">De dónde vienen tus playlists</w:t>
+      </w:r>
+      <w:r>
+        <w:t xml:space="preserve">: Spotify, Deezer o archivos exportados.</w:t>
+      </w:r>
+    </w:p>
+    <w:p>
+      <w:pPr>
+        <w:pStyle w:val="ListParagraph"/>
+        <w:numPr>
+          <w:ilvl w:val="0"/>
+          <w:numId w:val="5"/>
+        </w:numPr>
+        <w:spacing w:after="80" w:line="276"/>
+      </w:pPr>
+      <w:r>
+        <w:rPr>
+          <w:b/>
+          <w:bCs/>
+        </w:rPr>
+        <w:t xml:space="preserve">Conectar Spotify</w:t>
+      </w:r>
+      <w:r>
+        <w:t xml:space="preserve"> (si lo usas): la guía de abajo, con botón </w:t>
+      </w:r>
+      <w:r>
+        <w:rPr>
+          <w:b/>
+          <w:bCs/>
+        </w:rPr>
+        <w:t xml:space="preserve">Conectar y probar</w:t>
+      </w:r>
+      <w:r>
+        <w:t xml:space="preserve">.</w:t>
+      </w:r>
+    </w:p>
+    <w:p>
+      <w:pPr>
+        <w:pStyle w:val="ListParagraph"/>
+        <w:numPr>
+          <w:ilvl w:val="0"/>
+          <w:numId w:val="5"/>
+        </w:numPr>
+        <w:spacing w:after="80" w:line="276"/>
+      </w:pPr>
+      <w:r>
+        <w:rPr>
+          <w:b/>
+          <w:bCs/>
+        </w:rPr>
+        <w:t xml:space="preserve">Listo</w:t>
+      </w:r>
+      <w:r>
+        <w:t xml:space="preserve">: guarda todo, abre la autorización de Spotify si falta y trae tus playlists.</w:t>
+      </w:r>
+    </w:p>
+    <w:p>
+      <w:pPr>
+        <w:pStyle w:val="Heading2"/>
+      </w:pPr>
+      <w:r>
+        <w:t xml:space="preserve">Conectar Spotify (una sola vez)</w:t>
+      </w:r>
+    </w:p>
+    <w:p>
+      <w:pPr>
+        <w:pStyle w:val="ListParagraph"/>
+        <w:numPr>
+          <w:ilvl w:val="0"/>
+          <w:numId w:val="6"/>
+        </w:numPr>
+        <w:spacing w:after="80" w:line="276"/>
+      </w:pPr>
+      <w:r>
+        <w:t xml:space="preserve">Abre el </w:t>
+      </w:r>
+      <w:r>
+        <w:rPr>
+          <w:b/>
+          <w:bCs/>
+        </w:rPr>
+        <w:t xml:space="preserve">panel de desarrolladores de Spotify</w:t>
+      </w:r>
+      <w:r>
+        <w:t xml:space="preserve"> (developer.spotify.com/dashboard; hay un enlace en el asistente) e inicia sesión. El dueño de la app debe ser Premium.</w:t>
+      </w:r>
+    </w:p>
+    <w:p>
+      <w:pPr>
+        <w:pStyle w:val="ListParagraph"/>
+        <w:numPr>
+          <w:ilvl w:val="0"/>
+          <w:numId w:val="6"/>
+        </w:numPr>
+        <w:spacing w:after="80" w:line="276"/>
+      </w:pPr>
+      <w:r>
+        <w:rPr>
+          <w:b/>
+          <w:bCs/>
+        </w:rPr>
+        <w:t xml:space="preserve">Create app</w:t>
+      </w:r>
+      <w:r>
+        <w:t xml:space="preserve">: nombre y descripción, lo que quieras (por ejemplo «BrainOrder»).</w:t>
+      </w:r>
+    </w:p>
+    <w:p>
+      <w:pPr>
+        <w:pStyle w:val="ListParagraph"/>
+        <w:numPr>
+          <w:ilvl w:val="0"/>
+          <w:numId w:val="6"/>
+        </w:numPr>
+        <w:spacing w:after="80" w:line="276"/>
+      </w:pPr>
+      <w:r>
+        <w:t xml:space="preserve">En </w:t>
+      </w:r>
+      <w:r>
+        <w:rPr>
+          <w:b/>
+          <w:bCs/>
+        </w:rPr>
+        <w:t xml:space="preserve">Redirect URIs</w:t>
+      </w:r>
+      <w:r>
+        <w:t xml:space="preserve"> pega </w:t>
+      </w:r>
+      <w:r>
+        <w:rPr>
+          <w:rFonts w:ascii="Courier New" w:cs="Courier New" w:eastAsia="Courier New" w:hAnsi="Courier New"/>
+          <w:color w:val="1F2A44"/>
+          <w:sz w:val="19"/>
+          <w:szCs w:val="19"/>
+        </w:rPr>
         <w:t xml:space="preserve">http://127.0.0.1:8888/callback</w:t>
       </w:r>
       <w:r>
-        <w:t xml:space="preserve"> (exacto).</w:t>
+        <w:t xml:space="preserve"> (botón </w:t>
+      </w:r>
+      <w:r>
+        <w:rPr>
+          <w:b/>
+          <w:bCs/>
+        </w:rPr>
+        <w:t xml:space="preserve">Copiar</w:t>
+      </w:r>
+      <w:r>
+        <w:t xml:space="preserve"> en el asistente) y toca </w:t>
+      </w:r>
+      <w:r>
+        <w:rPr>
+          <w:b/>
+          <w:bCs/>
+        </w:rPr>
+        <w:t xml:space="preserve">Add</w:t>
+      </w:r>
+      <w:r>
+        <w:t xml:space="preserve">.</w:t>
       </w:r>
     </w:p>
     <w:p>
@@ -2026,7 +2763,50 @@
         <w:spacing w:after="80" w:line="276"/>
       </w:pPr>
       <w:r>
-        <w:t xml:space="preserve">Copia el </w:t>
+        <w:t xml:space="preserve">Marca </w:t>
+      </w:r>
+      <w:r>
+        <w:rPr>
+          <w:b/>
+          <w:bCs/>
+        </w:rPr>
+        <w:t xml:space="preserve">Web API</w:t>
+      </w:r>
+      <w:r>
+        <w:t xml:space="preserve">, acepta los términos y toca </w:t>
+      </w:r>
+      <w:r>
+        <w:rPr>
+          <w:b/>
+          <w:bCs/>
+        </w:rPr>
+        <w:t xml:space="preserve">Save</w:t>
+      </w:r>
+      <w:r>
+        <w:t xml:space="preserve">.</w:t>
+      </w:r>
+    </w:p>
+    <w:p>
+      <w:pPr>
+        <w:pStyle w:val="ListParagraph"/>
+        <w:numPr>
+          <w:ilvl w:val="0"/>
+          <w:numId w:val="6"/>
+        </w:numPr>
+        <w:spacing w:after="80" w:line="276"/>
+      </w:pPr>
+      <w:r>
+        <w:t xml:space="preserve">En </w:t>
+      </w:r>
+      <w:r>
+        <w:rPr>
+          <w:b/>
+          <w:bCs/>
+        </w:rPr>
+        <w:t xml:space="preserve">Settings</w:t>
+      </w:r>
+      <w:r>
+        <w:t xml:space="preserve"> de tu app copia el </w:t>
       </w:r>
       <w:r>
         <w:rPr>
@@ -2036,7 +2816,30 @@
         <w:t xml:space="preserve">Client ID</w:t>
       </w:r>
       <w:r>
-        <w:t xml:space="preserve"> (no hace falta el Client Secret) y pégalo en BrainOrder → </w:t>
+        <w:t xml:space="preserve"> (no hace falta el Client Secret) y pégalo en el asistente. Te avisa si no tiene sus 32 letras y números.</w:t>
+      </w:r>
+    </w:p>
+    <w:p>
+      <w:pPr>
+        <w:pStyle w:val="ListParagraph"/>
+        <w:numPr>
+          <w:ilvl w:val="0"/>
+          <w:numId w:val="6"/>
+        </w:numPr>
+        <w:spacing w:after="80" w:line="276"/>
+      </w:pPr>
+      <w:r>
+        <w:t xml:space="preserve">Toca </w:t>
+      </w:r>
+      <w:r>
+        <w:rPr>
+          <w:b/>
+          <w:bCs/>
+        </w:rPr>
+        <w:t xml:space="preserve">Conectar y probar</w:t>
+      </w:r>
+      <w:r>
+        <w:t xml:space="preserve"> y autoriza en el navegador: aparece «✅ Conectado como …». Si prefieres, sigue sin conectar y lo haces luego en </w:t>
       </w:r>
       <w:r>
         <w:rPr>
@@ -2047,29 +2850,6 @@
       </w:r>
       <w:r>
         <w:t xml:space="preserve">.</w:t>
-      </w:r>
-    </w:p>
-    <w:p>
-      <w:pPr>
-        <w:pStyle w:val="ListParagraph"/>
-        <w:numPr>
-          <w:ilvl w:val="0"/>
-          <w:numId w:val="6"/>
-        </w:numPr>
-        <w:spacing w:after="80" w:line="276"/>
-      </w:pPr>
-      <w:r>
-        <w:t xml:space="preserve">Toca </w:t>
-      </w:r>
-      <w:r>
-        <w:rPr>
-          <w:b/>
-          <w:bCs/>
-        </w:rPr>
-        <w:t xml:space="preserve">Conectar Spotify</w:t>
-      </w:r>
-      <w:r>
-        <w:t xml:space="preserve"> y autoriza en el navegador.</w:t>
       </w:r>
     </w:p>
     <w:tbl>
@@ -11347,7 +12127,7 @@
                 <w:sz w:val="24"/>
                 <w:szCs w:val="24"/>
               </w:rPr>
-              <w:t xml:space="preserve">v2.16.2</w:t>
+              <w:t xml:space="preserve">v2.17.0</w:t>
             </w:r>
           </w:p>
           <w:p>
@@ -11394,7 +12174,7 @@
                 <w:sz w:val="23"/>
                 <w:szCs w:val="23"/>
               </w:rPr>
-              <w:t xml:space="preserve">Sin playlists fantasma</w:t>
+              <w:t xml:space="preserve">Instaladores .dmg y .exe</w:t>
             </w:r>
             <w:r>
               <w:rPr>
@@ -11405,6 +12185,216 @@
                 <w:szCs w:val="18"/>
               </w:rPr>
               <w:t xml:space="preserve">   · versión actual</w:t>
+            </w:r>
+          </w:p>
+        </w:tc>
+      </w:tr>
+    </w:tbl>
+    <w:p>
+      <w:pPr>
+        <w:pStyle w:val="ListParagraph"/>
+        <w:keepNext/>
+        <w:keepLines/>
+        <w:numPr>
+          <w:ilvl w:val="0"/>
+          <w:numId w:val="2"/>
+        </w:numPr>
+        <w:spacing w:after="60" w:line="276"/>
+      </w:pPr>
+      <w:r>
+        <w:rPr>
+          <w:b/>
+          <w:bCs/>
+        </w:rPr>
+        <w:t xml:space="preserve">Instaladores para Mac (.dmg) y Windows (.exe)</w:t>
+      </w:r>
+      <w:r>
+        <w:t xml:space="preserve"> con su propio Python: no hace falta instalar nada más.</w:t>
+      </w:r>
+    </w:p>
+    <w:p>
+      <w:pPr>
+        <w:pStyle w:val="ListParagraph"/>
+        <w:keepNext/>
+        <w:keepLines/>
+        <w:numPr>
+          <w:ilvl w:val="0"/>
+          <w:numId w:val="2"/>
+        </w:numPr>
+        <w:spacing w:after="60" w:line="276"/>
+      </w:pPr>
+      <w:r>
+        <w:t xml:space="preserve">Durante la instalación eliges </w:t>
+      </w:r>
+      <w:r>
+        <w:rPr>
+          <w:b/>
+          <w:bCs/>
+        </w:rPr>
+        <w:t xml:space="preserve">tus carpetas</w:t>
+      </w:r>
+      <w:r>
+        <w:t xml:space="preserve"> y te guía con la </w:t>
+      </w:r>
+      <w:r>
+        <w:rPr>
+          <w:b/>
+          <w:bCs/>
+        </w:rPr>
+        <w:t xml:space="preserve">app de Spotify</w:t>
+      </w:r>
+      <w:r>
+        <w:t xml:space="preserve"> (Redirect URI para copiar, Client ID revisado).</w:t>
+      </w:r>
+    </w:p>
+    <w:p>
+      <w:pPr>
+        <w:pStyle w:val="ListParagraph"/>
+        <w:keepNext/>
+        <w:keepLines/>
+        <w:numPr>
+          <w:ilvl w:val="0"/>
+          <w:numId w:val="2"/>
+        </w:numPr>
+        <w:spacing w:after="60" w:line="276"/>
+      </w:pPr>
+      <w:r>
+        <w:rPr>
+          <w:b/>
+          <w:bCs/>
+        </w:rPr>
+        <w:t xml:space="preserve">Asistente de instalación</w:t>
+      </w:r>
+      <w:r>
+        <w:t xml:space="preserve"> renovado: paso propio para Spotify con </w:t>
+      </w:r>
+      <w:r>
+        <w:rPr>
+          <w:b/>
+          <w:bCs/>
+        </w:rPr>
+        <w:t xml:space="preserve">Conectar y probar</w:t>
+      </w:r>
+      <w:r>
+        <w:t xml:space="preserve">; al terminar trae tus playlists solo.</w:t>
+      </w:r>
+    </w:p>
+    <w:p>
+      <w:pPr>
+        <w:pStyle w:val="ListParagraph"/>
+        <w:keepNext w:val="false"/>
+        <w:keepLines/>
+        <w:numPr>
+          <w:ilvl w:val="0"/>
+          <w:numId w:val="2"/>
+        </w:numPr>
+        <w:spacing w:after="60" w:line="276"/>
+      </w:pPr>
+      <w:r>
+        <w:t xml:space="preserve">Los instaladores se arman solos en GitHub con cada versión y quedan en Releases.</w:t>
+      </w:r>
+    </w:p>
+    <w:p>
+      <w:pPr>
+        <w:spacing w:after="80"/>
+      </w:pPr>
+    </w:p>
+    <w:tbl>
+      <w:tblPr>
+        <w:tblW w:type="dxa" w:w="9360"/>
+        <w:tblBorders>
+          <w:top w:val="single" w:color="auto" w:sz="4"/>
+          <w:left w:val="single" w:color="auto" w:sz="4"/>
+          <w:bottom w:val="single" w:color="auto" w:sz="4"/>
+          <w:right w:val="single" w:color="auto" w:sz="4"/>
+          <w:insideH w:val="single" w:color="auto" w:sz="4"/>
+          <w:insideV w:val="single" w:color="auto" w:sz="4"/>
+        </w:tblBorders>
+      </w:tblPr>
+      <w:tblGrid>
+        <w:gridCol w:w="1900"/>
+        <w:gridCol w:w="7460"/>
+      </w:tblGrid>
+      <w:tr>
+        <w:tc>
+          <w:tcPr>
+            <w:tcW w:type="dxa" w:w="1900"/>
+            <w:tcBorders>
+              <w:top w:val="single" w:color="D5D9E0" w:sz="4"/>
+              <w:left w:val="single" w:color="D5D9E0" w:sz="4"/>
+              <w:bottom w:val="single" w:color="D5D9E0" w:sz="4"/>
+              <w:right w:val="single" w:color="D5D9E0" w:sz="4"/>
+            </w:tcBorders>
+            <w:shd w:fill="1F2A44" w:color="auto" w:val="clear"/>
+            <w:tcMar>
+              <w:top w:type="dxa" w:w="80"/>
+              <w:left w:type="dxa" w:w="140"/>
+              <w:bottom w:type="dxa" w:w="80"/>
+              <w:right w:type="dxa" w:w="140"/>
+            </w:tcMar>
+            <w:vAlign w:val="center"/>
+          </w:tcPr>
+          <w:p>
+            <w:pPr>
+              <w:keepNext/>
+              <w:keepLines/>
+            </w:pPr>
+            <w:r>
+              <w:rPr>
+                <w:b/>
+                <w:bCs/>
+                <w:color w:val="FFFFFF"/>
+                <w:sz w:val="24"/>
+                <w:szCs w:val="24"/>
+              </w:rPr>
+              <w:t xml:space="preserve">v2.16.2</w:t>
+            </w:r>
+          </w:p>
+          <w:p>
+            <w:pPr>
+              <w:keepNext/>
+            </w:pPr>
+            <w:r>
+              <w:rPr>
+                <w:color w:val="FFFFFF"/>
+                <w:sz w:val="17"/>
+                <w:szCs w:val="17"/>
+              </w:rPr>
+              <w:t xml:space="preserve">21 oct 2026</w:t>
+            </w:r>
+          </w:p>
+        </w:tc>
+        <w:tc>
+          <w:tcPr>
+            <w:tcW w:type="dxa" w:w="7460"/>
+            <w:tcBorders>
+              <w:top w:val="single" w:color="D5D9E0" w:sz="4"/>
+              <w:left w:val="single" w:color="D5D9E0" w:sz="4"/>
+              <w:bottom w:val="single" w:color="D5D9E0" w:sz="4"/>
+              <w:right w:val="single" w:color="D5D9E0" w:sz="4"/>
+            </w:tcBorders>
+            <w:shd w:fill="F5F7FA" w:color="auto" w:val="clear"/>
+            <w:tcMar>
+              <w:top w:type="dxa" w:w="80"/>
+              <w:left w:type="dxa" w:w="160"/>
+              <w:bottom w:type="dxa" w:w="80"/>
+              <w:right w:type="dxa" w:w="140"/>
+            </w:tcMar>
+            <w:vAlign w:val="center"/>
+          </w:tcPr>
+          <w:p>
+            <w:pPr>
+              <w:keepNext/>
+            </w:pPr>
+            <w:r>
+              <w:rPr>
+                <w:b/>
+                <w:bCs/>
+                <w:color w:val="1F2A44"/>
+                <w:sz w:val="23"/>
+                <w:szCs w:val="23"/>
+              </w:rPr>
+              <w:t xml:space="preserve">Sin playlists fantasma</w:t>
             </w:r>
           </w:p>
         </w:tc>

</xml_diff>

<commit_message>
v2.17.1: Windows abre (ícono .ico); el instalador de Windows se prueba antes de publicarse
Co-Authored-By: Claude Opus 5.5 <noreply@anthropic.com>
Claude-Session: https://claude.ai/code/session_015yBEKQCgZonTqt5J2V9uZ5
</commit_message>
<xml_diff>
--- a/docs/BrainOrder - Manual de usuario.docx
+++ b/docs/BrainOrder - Manual de usuario.docx
@@ -73,7 +73,7 @@
           <w:sz w:val="26"/>
           <w:szCs w:val="26"/>
         </w:rPr>
-        <w:t xml:space="preserve">Versión 2.17.0</w:t>
+        <w:t xml:space="preserve">Versión 2.17.1</w:t>
       </w:r>
     </w:p>
     <w:p>
@@ -12127,7 +12127,7 @@
                 <w:sz w:val="24"/>
                 <w:szCs w:val="24"/>
               </w:rPr>
-              <w:t xml:space="preserve">v2.17.0</w:t>
+              <w:t xml:space="preserve">v2.17.1</w:t>
             </w:r>
           </w:p>
           <w:p>
@@ -12174,7 +12174,7 @@
                 <w:sz w:val="23"/>
                 <w:szCs w:val="23"/>
               </w:rPr>
-              <w:t xml:space="preserve">Instaladores .dmg y .exe</w:t>
+              <w:t xml:space="preserve">Windows abre</w:t>
             </w:r>
             <w:r>
               <w:rPr>
@@ -12185,6 +12185,149 @@
                 <w:szCs w:val="18"/>
               </w:rPr>
               <w:t xml:space="preserve">   · versión actual</w:t>
+            </w:r>
+          </w:p>
+        </w:tc>
+      </w:tr>
+    </w:tbl>
+    <w:p>
+      <w:pPr>
+        <w:pStyle w:val="ListParagraph"/>
+        <w:keepNext/>
+        <w:keepLines/>
+        <w:numPr>
+          <w:ilvl w:val="0"/>
+          <w:numId w:val="2"/>
+        </w:numPr>
+        <w:spacing w:after="60" w:line="276"/>
+      </w:pPr>
+      <w:r>
+        <w:rPr>
+          <w:b/>
+          <w:bCs/>
+        </w:rPr>
+        <w:t xml:space="preserve">Arreglado:</w:t>
+      </w:r>
+      <w:r>
+        <w:t xml:space="preserve"> en Windows, BrainOrder instalada con el .exe no abría (se cerraba al mostrar la ventana).</w:t>
+      </w:r>
+    </w:p>
+    <w:p>
+      <w:pPr>
+        <w:pStyle w:val="ListParagraph"/>
+        <w:keepNext w:val="false"/>
+        <w:keepLines/>
+        <w:numPr>
+          <w:ilvl w:val="0"/>
+          <w:numId w:val="2"/>
+        </w:numPr>
+        <w:spacing w:after="60" w:line="276"/>
+      </w:pPr>
+      <w:r>
+        <w:t xml:space="preserve">Cada instalador de Windows ahora se prueba solo (se instala y se abre) antes de publicarse.</w:t>
+      </w:r>
+    </w:p>
+    <w:p>
+      <w:pPr>
+        <w:spacing w:after="80"/>
+      </w:pPr>
+    </w:p>
+    <w:tbl>
+      <w:tblPr>
+        <w:tblW w:type="dxa" w:w="9360"/>
+        <w:tblBorders>
+          <w:top w:val="single" w:color="auto" w:sz="4"/>
+          <w:left w:val="single" w:color="auto" w:sz="4"/>
+          <w:bottom w:val="single" w:color="auto" w:sz="4"/>
+          <w:right w:val="single" w:color="auto" w:sz="4"/>
+          <w:insideH w:val="single" w:color="auto" w:sz="4"/>
+          <w:insideV w:val="single" w:color="auto" w:sz="4"/>
+        </w:tblBorders>
+      </w:tblPr>
+      <w:tblGrid>
+        <w:gridCol w:w="1900"/>
+        <w:gridCol w:w="7460"/>
+      </w:tblGrid>
+      <w:tr>
+        <w:tc>
+          <w:tcPr>
+            <w:tcW w:type="dxa" w:w="1900"/>
+            <w:tcBorders>
+              <w:top w:val="single" w:color="D5D9E0" w:sz="4"/>
+              <w:left w:val="single" w:color="D5D9E0" w:sz="4"/>
+              <w:bottom w:val="single" w:color="D5D9E0" w:sz="4"/>
+              <w:right w:val="single" w:color="D5D9E0" w:sz="4"/>
+            </w:tcBorders>
+            <w:shd w:fill="1F2A44" w:color="auto" w:val="clear"/>
+            <w:tcMar>
+              <w:top w:type="dxa" w:w="80"/>
+              <w:left w:type="dxa" w:w="140"/>
+              <w:bottom w:type="dxa" w:w="80"/>
+              <w:right w:type="dxa" w:w="140"/>
+            </w:tcMar>
+            <w:vAlign w:val="center"/>
+          </w:tcPr>
+          <w:p>
+            <w:pPr>
+              <w:keepNext/>
+              <w:keepLines/>
+            </w:pPr>
+            <w:r>
+              <w:rPr>
+                <w:b/>
+                <w:bCs/>
+                <w:color w:val="FFFFFF"/>
+                <w:sz w:val="24"/>
+                <w:szCs w:val="24"/>
+              </w:rPr>
+              <w:t xml:space="preserve">v2.17.0</w:t>
+            </w:r>
+          </w:p>
+          <w:p>
+            <w:pPr>
+              <w:keepNext/>
+            </w:pPr>
+            <w:r>
+              <w:rPr>
+                <w:color w:val="FFFFFF"/>
+                <w:sz w:val="17"/>
+                <w:szCs w:val="17"/>
+              </w:rPr>
+              <w:t xml:space="preserve">21 oct 2026</w:t>
+            </w:r>
+          </w:p>
+        </w:tc>
+        <w:tc>
+          <w:tcPr>
+            <w:tcW w:type="dxa" w:w="7460"/>
+            <w:tcBorders>
+              <w:top w:val="single" w:color="D5D9E0" w:sz="4"/>
+              <w:left w:val="single" w:color="D5D9E0" w:sz="4"/>
+              <w:bottom w:val="single" w:color="D5D9E0" w:sz="4"/>
+              <w:right w:val="single" w:color="D5D9E0" w:sz="4"/>
+            </w:tcBorders>
+            <w:shd w:fill="F5F7FA" w:color="auto" w:val="clear"/>
+            <w:tcMar>
+              <w:top w:type="dxa" w:w="80"/>
+              <w:left w:type="dxa" w:w="160"/>
+              <w:bottom w:type="dxa" w:w="80"/>
+              <w:right w:type="dxa" w:w="140"/>
+            </w:tcMar>
+            <w:vAlign w:val="center"/>
+          </w:tcPr>
+          <w:p>
+            <w:pPr>
+              <w:keepNext/>
+            </w:pPr>
+            <w:r>
+              <w:rPr>
+                <w:b/>
+                <w:bCs/>
+                <w:color w:val="1F2A44"/>
+                <w:sz w:val="23"/>
+                <w:szCs w:val="23"/>
+              </w:rPr>
+              <w:t xml:space="preserve">Instaladores .dmg y .exe</w:t>
             </w:r>
           </w:p>
         </w:tc>

</xml_diff>

<commit_message>
v2.17.2: Mixed In Key se encuentra en Windows (registro, carpetas, Menú Inicio) y se puede elegir a mano; sin menciones al nombre anterior
Co-Authored-By: Claude Opus 5.5 <noreply@anthropic.com>
Claude-Session: https://claude.ai/code/session_015yBEKQCgZonTqt5J2V9uZ5
</commit_message>
<xml_diff>
--- a/docs/BrainOrder - Manual de usuario.docx
+++ b/docs/BrainOrder - Manual de usuario.docx
@@ -73,7 +73,7 @@
           <w:sz w:val="26"/>
           <w:szCs w:val="26"/>
         </w:rPr>
-        <w:t xml:space="preserve">Versión 2.17.1</w:t>
+        <w:t xml:space="preserve">Versión 2.17.2</w:t>
       </w:r>
     </w:p>
     <w:p>
@@ -148,7 +148,7 @@
           <w:sz w:val="22"/>
           <w:szCs w:val="22"/>
         </w:rPr>
-        <w:t xml:space="preserve">	4</w:t>
+        <w:t xml:space="preserve">	3</w:t>
       </w:r>
     </w:p>
     <w:p>
@@ -1348,78 +1348,6 @@
         <w:spacing w:after="120"/>
       </w:pPr>
     </w:p>
-    <w:tbl>
-      <w:tblPr>
-        <w:tblW w:type="dxa" w:w="9360"/>
-        <w:tblBorders>
-          <w:top w:val="single" w:color="auto" w:sz="4"/>
-          <w:left w:val="single" w:color="auto" w:sz="4"/>
-          <w:bottom w:val="single" w:color="auto" w:sz="4"/>
-          <w:right w:val="single" w:color="auto" w:sz="4"/>
-          <w:insideH w:val="single" w:color="auto" w:sz="4"/>
-          <w:insideV w:val="single" w:color="auto" w:sz="4"/>
-        </w:tblBorders>
-      </w:tblPr>
-      <w:tblGrid>
-        <w:gridCol w:w="9360"/>
-      </w:tblGrid>
-      <w:tr>
-        <w:tc>
-          <w:tcPr>
-            <w:tcW w:type="dxa" w:w="9360"/>
-            <w:tcBorders>
-              <w:top w:val="none" w:color="FFFFFF" w:sz="0"/>
-              <w:left w:val="single" w:color="2F6FDE" w:sz="24"/>
-              <w:bottom w:val="none" w:color="FFFFFF" w:sz="0"/>
-              <w:right w:val="none" w:color="FFFFFF" w:sz="0"/>
-            </w:tcBorders>
-            <w:shd w:fill="E3ECFB" w:color="auto" w:val="clear"/>
-            <w:tcMar>
-              <w:top w:type="dxa" w:w="120"/>
-              <w:left w:type="dxa" w:w="200"/>
-              <w:bottom w:type="dxa" w:w="120"/>
-              <w:right w:type="dxa" w:w="200"/>
-            </w:tcMar>
-          </w:tcPr>
-          <w:p>
-            <w:pPr>
-              <w:spacing w:after="60"/>
-            </w:pPr>
-            <w:r>
-              <w:rPr>
-                <w:b/>
-                <w:bCs/>
-                <w:color w:val="2F6FDE"/>
-              </w:rPr>
-              <w:t xml:space="preserve">ℹ️ Bueno saber</w:t>
-            </w:r>
-          </w:p>
-          <w:p>
-            <w:pPr>
-              <w:spacing w:after="40" w:line="264"/>
-            </w:pPr>
-            <w:r>
-              <w:t xml:space="preserve">BrainOrder empezó llamándose </w:t>
-            </w:r>
-            <w:r>
-              <w:rPr>
-                <w:b/>
-                <w:bCs/>
-              </w:rPr>
-              <w:t xml:space="preserve">SpotiSync</w:t>
-            </w:r>
-            <w:r>
-              <w:t xml:space="preserve">. Desde la versión 2.0 se llama BrainOrder; si tenías la versión vieja, se actualizó sola y conservó tu configuración e historial.</w:t>
-            </w:r>
-          </w:p>
-        </w:tc>
-      </w:tr>
-    </w:tbl>
-    <w:p>
-      <w:pPr>
-        <w:spacing w:after="120"/>
-      </w:pPr>
-    </w:p>
     <w:p>
       <w:pPr>
         <w:pStyle w:val="Heading1"/>
@@ -2203,7 +2131,7 @@
               <w:spacing w:after="40" w:line="264"/>
             </w:pPr>
             <w:r>
-              <w:t xml:space="preserve">Si ya tenías BrainOrder (o SpotiSync), el instalador conserva tu configuración, historial y cachés, y no vuelve a preguntar.</w:t>
+              <w:t xml:space="preserve">Si ya tenías BrainOrder, el instalador conserva tu configuración, historial y cachés, y no vuelve a preguntar.</w:t>
             </w:r>
           </w:p>
           <w:p>
@@ -8875,7 +8803,40 @@
         <w:spacing w:after="60" w:line="276"/>
       </w:pPr>
       <w:r>
-        <w:t xml:space="preserve">Si no encuentra Mixed In Key en Aplicaciones, te abre las carpetas en Finder para que arrastres los archivos.</w:t>
+        <w:t xml:space="preserve">Busca Mixed In Key solo: en Mac en Aplicaciones; en Windows en los programas instalados, sus carpetas y el Menú Inicio.</w:t>
+      </w:r>
+    </w:p>
+    <w:p>
+      <w:pPr>
+        <w:pStyle w:val="ListParagraph"/>
+        <w:numPr>
+          <w:ilvl w:val="0"/>
+          <w:numId w:val="2"/>
+        </w:numPr>
+        <w:spacing w:after="60" w:line="276"/>
+      </w:pPr>
+      <w:r>
+        <w:t xml:space="preserve">Si no lo encuentra, toca </w:t>
+      </w:r>
+      <w:r>
+        <w:rPr>
+          <w:b/>
+          <w:bCs/>
+        </w:rPr>
+        <w:t xml:space="preserve">Buscar Mixed In Key…</w:t>
+      </w:r>
+      <w:r>
+        <w:t xml:space="preserve"> y elige su programa (queda guardado; </w:t>
+      </w:r>
+      <w:r>
+        <w:rPr>
+          <w:b/>
+          <w:bCs/>
+        </w:rPr>
+        <w:t xml:space="preserve">Cambiar</w:t>
+      </w:r>
+      <w:r>
+        <w:t xml:space="preserve"> para elegir otro). Mientras tanto te abre las carpetas en Finder o el Explorador para que arrastres los archivos.</w:t>
       </w:r>
     </w:p>
     <w:p>
@@ -12127,7 +12088,7 @@
                 <w:sz w:val="24"/>
                 <w:szCs w:val="24"/>
               </w:rPr>
-              <w:t xml:space="preserve">v2.17.1</w:t>
+              <w:t xml:space="preserve">v2.17.2</w:t>
             </w:r>
           </w:p>
           <w:p>
@@ -12140,7 +12101,7 @@
                 <w:sz w:val="17"/>
                 <w:szCs w:val="17"/>
               </w:rPr>
-              <w:t xml:space="preserve">21 oct 2026</w:t>
+              <w:t xml:space="preserve">22 oct 2026</w:t>
             </w:r>
           </w:p>
         </w:tc>
@@ -12174,7 +12135,7 @@
                 <w:sz w:val="23"/>
                 <w:szCs w:val="23"/>
               </w:rPr>
-              <w:t xml:space="preserve">Windows abre</w:t>
+              <w:t xml:space="preserve">Mixed In Key en Windows</w:t>
             </w:r>
             <w:r>
               <w:rPr>
@@ -12209,7 +12170,7 @@
         <w:t xml:space="preserve">Arreglado:</w:t>
       </w:r>
       <w:r>
-        <w:t xml:space="preserve"> en Windows, BrainOrder instalada con el .exe no abría (se cerraba al mostrar la ventana).</w:t>
+        <w:t xml:space="preserve"> en Windows no se encontraba Mixed In Key si no estaba en «Program Files\Mixed In Key». Ahora se busca en los programas instalados, sus carpetas y el Menú Inicio.</w:t>
       </w:r>
     </w:p>
     <w:p>
@@ -12224,7 +12185,17 @@
         <w:spacing w:after="60" w:line="276"/>
       </w:pPr>
       <w:r>
-        <w:t xml:space="preserve">Cada instalador de Windows ahora se prueba solo (se instala y se abre) antes de publicarse.</w:t>
+        <w:t xml:space="preserve">Botón </w:t>
+      </w:r>
+      <w:r>
+        <w:rPr>
+          <w:b/>
+          <w:bCs/>
+        </w:rPr>
+        <w:t xml:space="preserve">Buscar Mixed In Key…</w:t>
+      </w:r>
+      <w:r>
+        <w:t xml:space="preserve"> para elegirlo a mano si hiciera falta.</w:t>
       </w:r>
     </w:p>
     <w:p>
@@ -12280,7 +12251,7 @@
                 <w:sz w:val="24"/>
                 <w:szCs w:val="24"/>
               </w:rPr>
-              <w:t xml:space="preserve">v2.17.0</w:t>
+              <w:t xml:space="preserve">v2.17.1</w:t>
             </w:r>
           </w:p>
           <w:p>
@@ -12327,7 +12298,7 @@
                 <w:sz w:val="23"/>
                 <w:szCs w:val="23"/>
               </w:rPr>
-              <w:t xml:space="preserve">Instaladores .dmg y .exe</w:t>
+              <w:t xml:space="preserve">Windows abre</w:t>
             </w:r>
           </w:p>
         </w:tc>
@@ -12349,77 +12320,10 @@
           <w:b/>
           <w:bCs/>
         </w:rPr>
-        <w:t xml:space="preserve">Instaladores para Mac (.dmg) y Windows (.exe)</w:t>
-      </w:r>
-      <w:r>
-        <w:t xml:space="preserve"> con su propio Python: no hace falta instalar nada más.</w:t>
-      </w:r>
-    </w:p>
-    <w:p>
-      <w:pPr>
-        <w:pStyle w:val="ListParagraph"/>
-        <w:keepNext/>
-        <w:keepLines/>
-        <w:numPr>
-          <w:ilvl w:val="0"/>
-          <w:numId w:val="2"/>
-        </w:numPr>
-        <w:spacing w:after="60" w:line="276"/>
-      </w:pPr>
-      <w:r>
-        <w:t xml:space="preserve">Durante la instalación eliges </w:t>
-      </w:r>
-      <w:r>
-        <w:rPr>
-          <w:b/>
-          <w:bCs/>
-        </w:rPr>
-        <w:t xml:space="preserve">tus carpetas</w:t>
-      </w:r>
-      <w:r>
-        <w:t xml:space="preserve"> y te guía con la </w:t>
-      </w:r>
-      <w:r>
-        <w:rPr>
-          <w:b/>
-          <w:bCs/>
-        </w:rPr>
-        <w:t xml:space="preserve">app de Spotify</w:t>
-      </w:r>
-      <w:r>
-        <w:t xml:space="preserve"> (Redirect URI para copiar, Client ID revisado).</w:t>
-      </w:r>
-    </w:p>
-    <w:p>
-      <w:pPr>
-        <w:pStyle w:val="ListParagraph"/>
-        <w:keepNext/>
-        <w:keepLines/>
-        <w:numPr>
-          <w:ilvl w:val="0"/>
-          <w:numId w:val="2"/>
-        </w:numPr>
-        <w:spacing w:after="60" w:line="276"/>
-      </w:pPr>
-      <w:r>
-        <w:rPr>
-          <w:b/>
-          <w:bCs/>
-        </w:rPr>
-        <w:t xml:space="preserve">Asistente de instalación</w:t>
-      </w:r>
-      <w:r>
-        <w:t xml:space="preserve"> renovado: paso propio para Spotify con </w:t>
-      </w:r>
-      <w:r>
-        <w:rPr>
-          <w:b/>
-          <w:bCs/>
-        </w:rPr>
-        <w:t xml:space="preserve">Conectar y probar</w:t>
-      </w:r>
-      <w:r>
-        <w:t xml:space="preserve">; al terminar trae tus playlists solo.</w:t>
+        <w:t xml:space="preserve">Arreglado:</w:t>
+      </w:r>
+      <w:r>
+        <w:t xml:space="preserve"> en Windows, BrainOrder instalada con el .exe no abría (se cerraba al mostrar la ventana).</w:t>
       </w:r>
     </w:p>
     <w:p>
@@ -12434,7 +12338,7 @@
         <w:spacing w:after="60" w:line="276"/>
       </w:pPr>
       <w:r>
-        <w:t xml:space="preserve">Los instaladores se arman solos en GitHub con cada versión y quedan en Releases.</w:t>
+        <w:t xml:space="preserve">Cada instalador de Windows ahora se prueba solo (se instala y se abre) antes de publicarse.</w:t>
       </w:r>
     </w:p>
     <w:p>
@@ -12490,7 +12394,7 @@
                 <w:sz w:val="24"/>
                 <w:szCs w:val="24"/>
               </w:rPr>
-              <w:t xml:space="preserve">v2.16.2</w:t>
+              <w:t xml:space="preserve">v2.17.0</w:t>
             </w:r>
           </w:p>
           <w:p>
@@ -12537,7 +12441,7 @@
                 <w:sz w:val="23"/>
                 <w:szCs w:val="23"/>
               </w:rPr>
-              <w:t xml:space="preserve">Sin playlists fantasma</w:t>
+              <w:t xml:space="preserve">Instaladores .dmg y .exe</w:t>
             </w:r>
           </w:p>
         </w:tc>
@@ -12559,10 +12463,77 @@
           <w:b/>
           <w:bCs/>
         </w:rPr>
-        <w:t xml:space="preserve">Arreglado:</w:t>
-      </w:r>
-      <w:r>
-        <w:t xml:space="preserve"> si la carpeta de «Archivos exportados» incluía tu carpeta de playlists, los informes «_FALTAN EN ESTA CARPETA» aparecían como playlists «(no se pudo leer)» en Reglas y en la lista. Ya no se leen, y las que habían quedado se quitan solas.</w:t>
+        <w:t xml:space="preserve">Instaladores para Mac (.dmg) y Windows (.exe)</w:t>
+      </w:r>
+      <w:r>
+        <w:t xml:space="preserve"> con su propio Python: no hace falta instalar nada más.</w:t>
+      </w:r>
+    </w:p>
+    <w:p>
+      <w:pPr>
+        <w:pStyle w:val="ListParagraph"/>
+        <w:keepNext/>
+        <w:keepLines/>
+        <w:numPr>
+          <w:ilvl w:val="0"/>
+          <w:numId w:val="2"/>
+        </w:numPr>
+        <w:spacing w:after="60" w:line="276"/>
+      </w:pPr>
+      <w:r>
+        <w:t xml:space="preserve">Durante la instalación eliges </w:t>
+      </w:r>
+      <w:r>
+        <w:rPr>
+          <w:b/>
+          <w:bCs/>
+        </w:rPr>
+        <w:t xml:space="preserve">tus carpetas</w:t>
+      </w:r>
+      <w:r>
+        <w:t xml:space="preserve"> y te guía con la </w:t>
+      </w:r>
+      <w:r>
+        <w:rPr>
+          <w:b/>
+          <w:bCs/>
+        </w:rPr>
+        <w:t xml:space="preserve">app de Spotify</w:t>
+      </w:r>
+      <w:r>
+        <w:t xml:space="preserve"> (Redirect URI para copiar, Client ID revisado).</w:t>
+      </w:r>
+    </w:p>
+    <w:p>
+      <w:pPr>
+        <w:pStyle w:val="ListParagraph"/>
+        <w:keepNext/>
+        <w:keepLines/>
+        <w:numPr>
+          <w:ilvl w:val="0"/>
+          <w:numId w:val="2"/>
+        </w:numPr>
+        <w:spacing w:after="60" w:line="276"/>
+      </w:pPr>
+      <w:r>
+        <w:rPr>
+          <w:b/>
+          <w:bCs/>
+        </w:rPr>
+        <w:t xml:space="preserve">Asistente de instalación</w:t>
+      </w:r>
+      <w:r>
+        <w:t xml:space="preserve"> renovado: paso propio para Spotify con </w:t>
+      </w:r>
+      <w:r>
+        <w:rPr>
+          <w:b/>
+          <w:bCs/>
+        </w:rPr>
+        <w:t xml:space="preserve">Conectar y probar</w:t>
+      </w:r>
+      <w:r>
+        <w:t xml:space="preserve">; al terminar trae tus playlists solo.</w:t>
       </w:r>
     </w:p>
     <w:p>
@@ -12577,7 +12548,7 @@
         <w:spacing w:after="60" w:line="276"/>
       </w:pPr>
       <w:r>
-        <w:t xml:space="preserve">Los .txt que no son playlists exportadas se ignoran en vez de aparecer como playlists con error.</w:t>
+        <w:t xml:space="preserve">Los instaladores se arman solos en GitHub con cada versión y quedan en Releases.</w:t>
       </w:r>
     </w:p>
     <w:p>
@@ -12633,7 +12604,7 @@
                 <w:sz w:val="24"/>
                 <w:szCs w:val="24"/>
               </w:rPr>
-              <w:t xml:space="preserve">v2.16.1</w:t>
+              <w:t xml:space="preserve">v2.16.2</w:t>
             </w:r>
           </w:p>
           <w:p>
@@ -12680,7 +12651,7 @@
                 <w:sz w:val="23"/>
                 <w:szCs w:val="23"/>
               </w:rPr>
-              <w:t xml:space="preserve">Descargas que ya usas en Rekordbox</w:t>
+              <w:t xml:space="preserve">Sin playlists fantasma</w:t>
             </w:r>
           </w:p>
         </w:tc>
@@ -12698,31 +12669,6 @@
         <w:spacing w:after="60" w:line="276"/>
       </w:pPr>
       <w:r>
-        <w:t xml:space="preserve">Las descargas que pusiste en una playlist de Rekordbox (como «50 dance» o «Faltantes») ya no salen como «sin playlist» sin explicación: al organizar ves en qué playlist están y la puedes </w:t>
-      </w:r>
-      <w:r>
-        <w:rPr>
-          <w:b/>
-          <w:bCs/>
-        </w:rPr>
-        <w:t xml:space="preserve">importar</w:t>
-      </w:r>
-      <w:r>
-        <w:t xml:space="preserve">.</w:t>
-      </w:r>
-    </w:p>
-    <w:p>
-      <w:pPr>
-        <w:pStyle w:val="ListParagraph"/>
-        <w:keepNext/>
-        <w:keepLines/>
-        <w:numPr>
-          <w:ilvl w:val="0"/>
-          <w:numId w:val="2"/>
-        </w:numPr>
-        <w:spacing w:after="60" w:line="276"/>
-      </w:pPr>
-      <w:r>
         <w:rPr>
           <w:b/>
           <w:bCs/>
@@ -12730,7 +12676,7 @@
         <w:t xml:space="preserve">Arreglado:</w:t>
       </w:r>
       <w:r>
-        <w:t xml:space="preserve"> Organizar movía descargas que ya estaban en tu librería de Rekordbox sin corregir su ruta allá (quedaban perdidas). Ahora la corrige, y en Traktor, Serato y Engine también.</w:t>
+        <w:t xml:space="preserve"> si la carpeta de «Archivos exportados» incluía tu carpeta de playlists, los informes «_FALTAN EN ESTA CARPETA» aparecían como playlists «(no se pudo leer)» en Reglas y en la lista. Ya no se leen, y las que habían quedado se quitan solas.</w:t>
       </w:r>
     </w:p>
     <w:p>
@@ -12745,7 +12691,7 @@
         <w:spacing w:after="60" w:line="276"/>
       </w:pPr>
       <w:r>
-        <w:t xml:space="preserve">Importar una playlist de DJ ya no le quita archivos a tus otras playlists. Revisar Rekordbox antes de mover es mucho más rápido.</w:t>
+        <w:t xml:space="preserve">Los .txt que no son playlists exportadas se ignoran en vez de aparecer como playlists con error.</w:t>
       </w:r>
     </w:p>
     <w:p>
@@ -12801,7 +12747,7 @@
                 <w:sz w:val="24"/>
                 <w:szCs w:val="24"/>
               </w:rPr>
-              <w:t xml:space="preserve">v2.16.0</w:t>
+              <w:t xml:space="preserve">v2.16.1</w:t>
             </w:r>
           </w:p>
           <w:p>
@@ -12814,7 +12760,7 @@
                 <w:sz w:val="17"/>
                 <w:szCs w:val="17"/>
               </w:rPr>
-              <w:t xml:space="preserve">20 oct 2026</w:t>
+              <w:t xml:space="preserve">21 oct 2026</w:t>
             </w:r>
           </w:p>
         </w:tc>
@@ -12848,7 +12794,7 @@
                 <w:sz w:val="23"/>
                 <w:szCs w:val="23"/>
               </w:rPr>
-              <w:t xml:space="preserve">Ocultar playlists de tus estadísticas</w:t>
+              <w:t xml:space="preserve">Descargas que ya usas en Rekordbox</w:t>
             </w:r>
           </w:p>
         </w:tc>
@@ -12866,17 +12812,39 @@
         <w:spacing w:after="60" w:line="276"/>
       </w:pPr>
       <w:r>
-        <w:t xml:space="preserve">Clic derecho en una playlist → </w:t>
-      </w:r>
-      <w:r>
-        <w:rPr>
-          <w:b/>
-          <w:bCs/>
-        </w:rPr>
-        <w:t xml:space="preserve">Ocultar de mis estadísticas</w:t>
-      </w:r>
-      <w:r>
-        <w:t xml:space="preserve">: no cuenta en tus números ni en «Faltan por descargar», pero se sigue organizando.</w:t>
+        <w:t xml:space="preserve">Las descargas que pusiste en una playlist de Rekordbox (como «50 dance» o «Faltantes») ya no salen como «sin playlist» sin explicación: al organizar ves en qué playlist están y la puedes </w:t>
+      </w:r>
+      <w:r>
+        <w:rPr>
+          <w:b/>
+          <w:bCs/>
+        </w:rPr>
+        <w:t xml:space="preserve">importar</w:t>
+      </w:r>
+      <w:r>
+        <w:t xml:space="preserve">.</w:t>
+      </w:r>
+    </w:p>
+    <w:p>
+      <w:pPr>
+        <w:pStyle w:val="ListParagraph"/>
+        <w:keepNext/>
+        <w:keepLines/>
+        <w:numPr>
+          <w:ilvl w:val="0"/>
+          <w:numId w:val="2"/>
+        </w:numPr>
+        <w:spacing w:after="60" w:line="276"/>
+      </w:pPr>
+      <w:r>
+        <w:rPr>
+          <w:b/>
+          <w:bCs/>
+        </w:rPr>
+        <w:t xml:space="preserve">Arreglado:</w:t>
+      </w:r>
+      <w:r>
+        <w:t xml:space="preserve"> Organizar movía descargas que ya estaban en tu librería de Rekordbox sin corregir su ruta allá (quedaban perdidas). Ahora la corrige, y en Traktor, Serato y Engine también.</w:t>
       </w:r>
     </w:p>
     <w:p>
@@ -12891,7 +12859,7 @@
         <w:spacing w:after="60" w:line="276"/>
       </w:pPr>
       <w:r>
-        <w:t xml:space="preserve">Se vuelve a mostrar con clic derecho → «Volver a contarla» o desde Estadísticas.</w:t>
+        <w:t xml:space="preserve">Importar una playlist de DJ ya no le quita archivos a tus otras playlists. Revisar Rekordbox antes de mover es mucho más rápido.</w:t>
       </w:r>
     </w:p>
     <w:p>
@@ -12947,7 +12915,7 @@
                 <w:sz w:val="24"/>
                 <w:szCs w:val="24"/>
               </w:rPr>
-              <w:t xml:space="preserve">v2.15.0</w:t>
+              <w:t xml:space="preserve">v2.16.0</w:t>
             </w:r>
           </w:p>
           <w:p>
@@ -12994,7 +12962,7 @@
                 <w:sz w:val="23"/>
                 <w:szCs w:val="23"/>
               </w:rPr>
-              <w:t xml:space="preserve">Sin Mixed In Key</w:t>
+              <w:t xml:space="preserve">Ocultar playlists de tus estadísticas</w:t>
             </w:r>
           </w:p>
         </w:tc>
@@ -13012,39 +12980,17 @@
         <w:spacing w:after="60" w:line="276"/>
       </w:pPr>
       <w:r>
-        <w:t xml:space="preserve">Sección </w:t>
-      </w:r>
-      <w:r>
-        <w:rPr>
-          <w:b/>
-          <w:bCs/>
-        </w:rPr>
-        <w:t xml:space="preserve">Sin Mixed In Key</w:t>
-      </w:r>
-      <w:r>
-        <w:t xml:space="preserve">: las canciones que te faltan por analizar, con filtro por playlist y búsqueda.</w:t>
-      </w:r>
-    </w:p>
-    <w:p>
-      <w:pPr>
-        <w:pStyle w:val="ListParagraph"/>
-        <w:keepNext/>
-        <w:keepLines/>
-        <w:numPr>
-          <w:ilvl w:val="0"/>
-          <w:numId w:val="2"/>
-        </w:numPr>
-        <w:spacing w:after="60" w:line="276"/>
-      </w:pPr>
-      <w:r>
-        <w:rPr>
-          <w:b/>
-          <w:bCs/>
-        </w:rPr>
-        <w:t xml:space="preserve">Mandar a Mixed In Key</w:t>
-      </w:r>
-      <w:r>
-        <w:t xml:space="preserve"> las abre en tu Mixed In Key; cuando termina, salen solas de la lista.</w:t>
+        <w:t xml:space="preserve">Clic derecho en una playlist → </w:t>
+      </w:r>
+      <w:r>
+        <w:rPr>
+          <w:b/>
+          <w:bCs/>
+        </w:rPr>
+        <w:t xml:space="preserve">Ocultar de mis estadísticas</w:t>
+      </w:r>
+      <w:r>
+        <w:t xml:space="preserve">: no cuenta en tus números ni en «Faltan por descargar», pero se sigue organizando.</w:t>
       </w:r>
     </w:p>
     <w:p>
@@ -13059,7 +13005,7 @@
         <w:spacing w:after="60" w:line="276"/>
       </w:pPr>
       <w:r>
-        <w:t xml:space="preserve">También con clic derecho en una canción. En Ajustes se ve qué programas de DJ están activos (botón a Conexiones).</w:t>
+        <w:t xml:space="preserve">Se vuelve a mostrar con clic derecho → «Volver a contarla» o desde Estadísticas.</w:t>
       </w:r>
     </w:p>
     <w:p>
@@ -13115,7 +13061,7 @@
                 <w:sz w:val="24"/>
                 <w:szCs w:val="24"/>
               </w:rPr>
-              <w:t xml:space="preserve">v2.14.2</w:t>
+              <w:t xml:space="preserve">v2.15.0</w:t>
             </w:r>
           </w:p>
           <w:p>
@@ -13162,7 +13108,7 @@
                 <w:sz w:val="23"/>
                 <w:szCs w:val="23"/>
               </w:rPr>
-              <w:t xml:space="preserve">Detalles visuales</w:t>
+              <w:t xml:space="preserve">Sin Mixed In Key</w:t>
             </w:r>
           </w:p>
         </w:tc>
@@ -13180,17 +13126,17 @@
         <w:spacing w:after="60" w:line="276"/>
       </w:pPr>
       <w:r>
-        <w:t xml:space="preserve">Los íconos (▶ / pausa, ✕, flechas, recargar, intercambiar) quedan </w:t>
-      </w:r>
-      <w:r>
-        <w:rPr>
-          <w:b/>
-          <w:bCs/>
-        </w:rPr>
-        <w:t xml:space="preserve">centrados</w:t>
-      </w:r>
-      <w:r>
-        <w:t xml:space="preserve"> en sus botones en cualquier pantalla.</w:t>
+        <w:t xml:space="preserve">Sección </w:t>
+      </w:r>
+      <w:r>
+        <w:rPr>
+          <w:b/>
+          <w:bCs/>
+        </w:rPr>
+        <w:t xml:space="preserve">Sin Mixed In Key</w:t>
+      </w:r>
+      <w:r>
+        <w:t xml:space="preserve">: las canciones que te faltan por analizar, con filtro por playlist y búsqueda.</w:t>
       </w:r>
     </w:p>
     <w:p>
@@ -13205,7 +13151,14 @@
         <w:spacing w:after="60" w:line="276"/>
       </w:pPr>
       <w:r>
-        <w:t xml:space="preserve">Los números de los botones y filtros quedan alineados con su texto.</w:t>
+        <w:rPr>
+          <w:b/>
+          <w:bCs/>
+        </w:rPr>
+        <w:t xml:space="preserve">Mandar a Mixed In Key</w:t>
+      </w:r>
+      <w:r>
+        <w:t xml:space="preserve"> las abre en tu Mixed In Key; cuando termina, salen solas de la lista.</w:t>
       </w:r>
     </w:p>
     <w:p>
@@ -13220,7 +13173,7 @@
         <w:spacing w:after="60" w:line="276"/>
       </w:pPr>
       <w:r>
-        <w:t xml:space="preserve">Arreglado: el círculo de «cargando» de la barra de estado ya no aparece cuando no hay nada en curso.</w:t>
+        <w:t xml:space="preserve">También con clic derecho en una canción. En Ajustes se ve qué programas de DJ están activos (botón a Conexiones).</w:t>
       </w:r>
     </w:p>
     <w:p>
@@ -13276,7 +13229,7 @@
                 <w:sz w:val="24"/>
                 <w:szCs w:val="24"/>
               </w:rPr>
-              <w:t xml:space="preserve">v2.14.1</w:t>
+              <w:t xml:space="preserve">v2.14.2</w:t>
             </w:r>
           </w:p>
           <w:p>
@@ -13323,7 +13276,7 @@
                 <w:sz w:val="23"/>
                 <w:szCs w:val="23"/>
               </w:rPr>
-              <w:t xml:space="preserve">Descargas en otra versión</w:t>
+              <w:t xml:space="preserve">Detalles visuales</w:t>
             </w:r>
           </w:p>
         </w:tc>
@@ -13341,17 +13294,17 @@
         <w:spacing w:after="60" w:line="276"/>
       </w:pPr>
       <w:r>
-        <w:t xml:space="preserve">Los links de Deezer buscan la </w:t>
-      </w:r>
-      <w:r>
-        <w:rPr>
-          <w:b/>
-          <w:bCs/>
-        </w:rPr>
-        <w:t xml:space="preserve">misma versión</w:t>
-      </w:r>
-      <w:r>
-        <w:t xml:space="preserve"> que tu playlist (antes podían llevar a un remix o a la versión larga, y esa descarga quedaba «sin playlist»).</w:t>
+        <w:t xml:space="preserve">Los íconos (▶ / pausa, ✕, flechas, recargar, intercambiar) quedan </w:t>
+      </w:r>
+      <w:r>
+        <w:rPr>
+          <w:b/>
+          <w:bCs/>
+        </w:rPr>
+        <w:t xml:space="preserve">centrados</w:t>
+      </w:r>
+      <w:r>
+        <w:t xml:space="preserve"> en sus botones en cualquier pantalla.</w:t>
       </w:r>
     </w:p>
     <w:p>
@@ -13366,7 +13319,7 @@
         <w:spacing w:after="60" w:line="276"/>
       </w:pPr>
       <w:r>
-        <w:t xml:space="preserve">Si Deezer no tiene esa versión, el link lo dice: «Deezer (otra versión)».</w:t>
+        <w:t xml:space="preserve">Los números de los botones y filtros quedan alineados con su texto.</w:t>
       </w:r>
     </w:p>
     <w:p>
@@ -13381,17 +13334,7 @@
         <w:spacing w:after="60" w:line="276"/>
       </w:pPr>
       <w:r>
-        <w:t xml:space="preserve">Al organizar, las descargas que son la misma canción en otra versión aparecen en «Parecen de tus playlists» con </w:t>
-      </w:r>
-      <w:r>
-        <w:rPr>
-          <w:b/>
-          <w:bCs/>
-        </w:rPr>
-        <w:t xml:space="preserve">Usar esta versión</w:t>
-      </w:r>
-      <w:r>
-        <w:t xml:space="preserve">.</w:t>
+        <w:t xml:space="preserve">Arreglado: el círculo de «cargando» de la barra de estado ya no aparece cuando no hay nada en curso.</w:t>
       </w:r>
     </w:p>
     <w:p>
@@ -13447,7 +13390,7 @@
                 <w:sz w:val="24"/>
                 <w:szCs w:val="24"/>
               </w:rPr>
-              <w:t xml:space="preserve">v2.14.0</w:t>
+              <w:t xml:space="preserve">v2.14.1</w:t>
             </w:r>
           </w:p>
           <w:p>
@@ -13494,7 +13437,7 @@
                 <w:sz w:val="23"/>
                 <w:szCs w:val="23"/>
               </w:rPr>
-              <w:t xml:space="preserve">Vista previa de canciones</w:t>
+              <w:t xml:space="preserve">Descargas en otra versión</w:t>
             </w:r>
           </w:p>
         </w:tc>
@@ -13512,17 +13455,17 @@
         <w:spacing w:after="60" w:line="276"/>
       </w:pPr>
       <w:r>
-        <w:t xml:space="preserve">Botón </w:t>
-      </w:r>
-      <w:r>
-        <w:rPr>
-          <w:b/>
-          <w:bCs/>
-        </w:rPr>
-        <w:t xml:space="preserve">▶</w:t>
-      </w:r>
-      <w:r>
-        <w:t xml:space="preserve"> en cada canción (playlists, faltantes y Comparar) y clic derecho → «Escuchar».</w:t>
+        <w:t xml:space="preserve">Los links de Deezer buscan la </w:t>
+      </w:r>
+      <w:r>
+        <w:rPr>
+          <w:b/>
+          <w:bCs/>
+        </w:rPr>
+        <w:t xml:space="preserve">misma versión</w:t>
+      </w:r>
+      <w:r>
+        <w:t xml:space="preserve"> que tu playlist (antes podían llevar a un remix o a la versión larga, y esa descarga quedaba «sin playlist»).</w:t>
       </w:r>
     </w:p>
     <w:p>
@@ -13537,7 +13480,7 @@
         <w:spacing w:after="60" w:line="276"/>
       </w:pPr>
       <w:r>
-        <w:t xml:space="preserve">Suena tu archivo (desde el 25 %, sin la intro) o, si te falta, 30 s de Deezer.</w:t>
+        <w:t xml:space="preserve">Si Deezer no tiene esa versión, el link lo dice: «Deezer (otra versión)».</w:t>
       </w:r>
     </w:p>
     <w:p>
@@ -13552,7 +13495,17 @@
         <w:spacing w:after="60" w:line="276"/>
       </w:pPr>
       <w:r>
-        <w:t xml:space="preserve">Reproductor abajo: pausa con la barra espaciadora, adelantar, −15 / +15 s y saltar a la mitad.</w:t>
+        <w:t xml:space="preserve">Al organizar, las descargas que son la misma canción en otra versión aparecen en «Parecen de tus playlists» con </w:t>
+      </w:r>
+      <w:r>
+        <w:rPr>
+          <w:b/>
+          <w:bCs/>
+        </w:rPr>
+        <w:t xml:space="preserve">Usar esta versión</w:t>
+      </w:r>
+      <w:r>
+        <w:t xml:space="preserve">.</w:t>
       </w:r>
     </w:p>
     <w:p>
@@ -13608,7 +13561,7 @@
                 <w:sz w:val="24"/>
                 <w:szCs w:val="24"/>
               </w:rPr>
-              <w:t xml:space="preserve">v2.13.2</w:t>
+              <w:t xml:space="preserve">v2.14.0</w:t>
             </w:r>
           </w:p>
           <w:p>
@@ -13655,7 +13608,7 @@
                 <w:sz w:val="23"/>
                 <w:szCs w:val="23"/>
               </w:rPr>
-              <w:t xml:space="preserve">Fusionar sin dejar carpetas atrás</w:t>
+              <w:t xml:space="preserve">Vista previa de canciones</w:t>
             </w:r>
           </w:p>
         </w:tc>
@@ -13673,19 +13626,32 @@
         <w:spacing w:after="60" w:line="276"/>
       </w:pPr>
       <w:r>
-        <w:t xml:space="preserve">Al fusionar o eliminar una playlist su carpeta ya no queda rezagada: los archivos que chocan por nombre van a </w:t>
-      </w:r>
-      <w:r>
-        <w:rPr>
-          <w:rFonts w:ascii="Courier New" w:cs="Courier New" w:eastAsia="Courier New" w:hAnsi="Courier New"/>
-          <w:color w:val="1F2A44"/>
-          <w:sz w:val="19"/>
-          <w:szCs w:val="19"/>
-        </w:rPr>
-        <w:t xml:space="preserve">_duplicados</w:t>
-      </w:r>
-      <w:r>
-        <w:t xml:space="preserve"> y se limpia la basura de macOS.</w:t>
+        <w:t xml:space="preserve">Botón </w:t>
+      </w:r>
+      <w:r>
+        <w:rPr>
+          <w:b/>
+          <w:bCs/>
+        </w:rPr>
+        <w:t xml:space="preserve">▶</w:t>
+      </w:r>
+      <w:r>
+        <w:t xml:space="preserve"> en cada canción (playlists, faltantes y Comparar) y clic derecho → «Escuchar».</w:t>
+      </w:r>
+    </w:p>
+    <w:p>
+      <w:pPr>
+        <w:pStyle w:val="ListParagraph"/>
+        <w:keepNext/>
+        <w:keepLines/>
+        <w:numPr>
+          <w:ilvl w:val="0"/>
+          <w:numId w:val="2"/>
+        </w:numPr>
+        <w:spacing w:after="60" w:line="276"/>
+      </w:pPr>
+      <w:r>
+        <w:t xml:space="preserve">Suena tu archivo (desde el 25 %, sin la intro) o, si te falta, 30 s de Deezer.</w:t>
       </w:r>
     </w:p>
     <w:p>
@@ -13700,7 +13666,7 @@
         <w:spacing w:after="60" w:line="276"/>
       </w:pPr>
       <w:r>
-        <w:t xml:space="preserve">Si algo no se puede mover, te avisa y la carpeta no se toma como «playlist nueva». Las que quedaron de fusiones anteriores también se reconocen.</w:t>
+        <w:t xml:space="preserve">Reproductor abajo: pausa con la barra espaciadora, adelantar, −15 / +15 s y saltar a la mitad.</w:t>
       </w:r>
     </w:p>
     <w:p>
@@ -13756,7 +13722,7 @@
                 <w:sz w:val="24"/>
                 <w:szCs w:val="24"/>
               </w:rPr>
-              <w:t xml:space="preserve">v2.13.1</w:t>
+              <w:t xml:space="preserve">v2.13.2</w:t>
             </w:r>
           </w:p>
           <w:p>
@@ -13803,7 +13769,7 @@
                 <w:sz w:val="23"/>
                 <w:szCs w:val="23"/>
               </w:rPr>
-              <w:t xml:space="preserve">Ordenar al comparar</w:t>
+              <w:t xml:space="preserve">Fusionar sin dejar carpetas atrás</w:t>
             </w:r>
           </w:p>
         </w:tc>
@@ -13821,32 +13787,19 @@
         <w:spacing w:after="60" w:line="276"/>
       </w:pPr>
       <w:r>
-        <w:t xml:space="preserve">Al comparar, las playlists para elegir se ordenan por nombre, fecha de creación, canciones agregadas hace poco, cantidad o </w:t>
-      </w:r>
-      <w:r>
-        <w:rPr>
-          <w:b/>
-          <w:bCs/>
-        </w:rPr>
-        <w:t xml:space="preserve">más en común</w:t>
-      </w:r>
-      <w:r>
-        <w:t xml:space="preserve">.</w:t>
-      </w:r>
-    </w:p>
-    <w:p>
-      <w:pPr>
-        <w:pStyle w:val="ListParagraph"/>
-        <w:keepNext/>
-        <w:keepLines/>
-        <w:numPr>
-          <w:ilvl w:val="0"/>
-          <w:numId w:val="2"/>
-        </w:numPr>
-        <w:spacing w:after="60" w:line="276"/>
-      </w:pPr>
-      <w:r>
-        <w:t xml:space="preserve">La lista de la izquierda también se puede ordenar por fecha de creación.</w:t>
+        <w:t xml:space="preserve">Al fusionar o eliminar una playlist su carpeta ya no queda rezagada: los archivos que chocan por nombre van a </w:t>
+      </w:r>
+      <w:r>
+        <w:rPr>
+          <w:rFonts w:ascii="Courier New" w:cs="Courier New" w:eastAsia="Courier New" w:hAnsi="Courier New"/>
+          <w:color w:val="1F2A44"/>
+          <w:sz w:val="19"/>
+          <w:szCs w:val="19"/>
+        </w:rPr>
+        <w:t xml:space="preserve">_duplicados</w:t>
+      </w:r>
+      <w:r>
+        <w:t xml:space="preserve"> y se limpia la basura de macOS.</w:t>
       </w:r>
     </w:p>
     <w:p>
@@ -13861,7 +13814,7 @@
         <w:spacing w:after="60" w:line="276"/>
       </w:pPr>
       <w:r>
-        <w:t xml:space="preserve">Spotify no da la fecha de creación de una playlist: se usa cuándo se agregó su primera canción (o, si aún no se sabe, cuándo se creó su carpeta, marcada «aprox.»).</w:t>
+        <w:t xml:space="preserve">Si algo no se puede mover, te avisa y la carpeta no se toma como «playlist nueva». Las que quedaron de fusiones anteriores también se reconocen.</w:t>
       </w:r>
     </w:p>
     <w:p>
@@ -13917,7 +13870,7 @@
                 <w:sz w:val="24"/>
                 <w:szCs w:val="24"/>
               </w:rPr>
-              <w:t xml:space="preserve">v2.13.0</w:t>
+              <w:t xml:space="preserve">v2.13.1</w:t>
             </w:r>
           </w:p>
           <w:p>
@@ -13964,7 +13917,7 @@
                 <w:sz w:val="23"/>
                 <w:szCs w:val="23"/>
               </w:rPr>
-              <w:t xml:space="preserve">Renombrar la carpeta de BrainOrder y cancelar</w:t>
+              <w:t xml:space="preserve">Ordenar al comparar</w:t>
             </w:r>
           </w:p>
         </w:tc>
@@ -13982,17 +13935,17 @@
         <w:spacing w:after="60" w:line="276"/>
       </w:pPr>
       <w:r>
-        <w:t xml:space="preserve">Cambiar el nombre de la carpeta de BrainOrder en tus programas </w:t>
-      </w:r>
-      <w:r>
-        <w:rPr>
-          <w:b/>
-          <w:bCs/>
-        </w:rPr>
-        <w:t xml:space="preserve">la renombra</w:t>
-      </w:r>
-      <w:r>
-        <w:t xml:space="preserve"> en Rekordbox, Traktor, Serato, Engine DJ y M3U: no se duplica, no aparece en «Playlists nuevas» ni como borrada en «Cambios en Rekordbox».</w:t>
+        <w:t xml:space="preserve">Al comparar, las playlists para elegir se ordenan por nombre, fecha de creación, canciones agregadas hace poco, cantidad o </w:t>
+      </w:r>
+      <w:r>
+        <w:rPr>
+          <w:b/>
+          <w:bCs/>
+        </w:rPr>
+        <w:t xml:space="preserve">más en común</w:t>
+      </w:r>
+      <w:r>
+        <w:t xml:space="preserve">.</w:t>
       </w:r>
     </w:p>
     <w:p>
@@ -14007,7 +13960,7 @@
         <w:spacing w:after="60" w:line="276"/>
       </w:pPr>
       <w:r>
-        <w:t xml:space="preserve">Si la renombras dentro de Rekordbox, BrainOrder la reconoce y la renombra también en tus otros programas. Si ya la habías cambiado antes, la encuentra y la arregla.</w:t>
+        <w:t xml:space="preserve">La lista de la izquierda también se puede ordenar por fecha de creación.</w:t>
       </w:r>
     </w:p>
     <w:p>
@@ -14022,14 +13975,7 @@
         <w:spacing w:after="60" w:line="276"/>
       </w:pPr>
       <w:r>
-        <w:rPr>
-          <w:b/>
-          <w:bCs/>
-        </w:rPr>
-        <w:t xml:space="preserve">Cancelar</w:t>
-      </w:r>
-      <w:r>
-        <w:t xml:space="preserve">: lo que está en cola (esperando su turno) se cancela con ✕ o clic derecho; también cada pendiente para Spotify.</w:t>
+        <w:t xml:space="preserve">Spotify no da la fecha de creación de una playlist: se usa cuándo se agregó su primera canción (o, si aún no se sabe, cuándo se creó su carpeta, marcada «aprox.»).</w:t>
       </w:r>
     </w:p>
     <w:p>
@@ -14085,7 +14031,7 @@
                 <w:sz w:val="24"/>
                 <w:szCs w:val="24"/>
               </w:rPr>
-              <w:t xml:space="preserve">v2.12.0</w:t>
+              <w:t xml:space="preserve">v2.13.0</w:t>
             </w:r>
           </w:p>
           <w:p>
@@ -14132,7 +14078,7 @@
                 <w:sz w:val="23"/>
                 <w:szCs w:val="23"/>
               </w:rPr>
-              <w:t xml:space="preserve">Comparar playlists</w:t>
+              <w:t xml:space="preserve">Renombrar la carpeta de BrainOrder y cancelar</w:t>
             </w:r>
           </w:p>
         </w:tc>
@@ -14150,17 +14096,17 @@
         <w:spacing w:after="60" w:line="276"/>
       </w:pPr>
       <w:r>
-        <w:t xml:space="preserve">Clic derecho en una playlist → </w:t>
-      </w:r>
-      <w:r>
-        <w:rPr>
-          <w:b/>
-          <w:bCs/>
-        </w:rPr>
-        <w:t xml:space="preserve">⚖️ Comparar con…</w:t>
-      </w:r>
-      <w:r>
-        <w:t xml:space="preserve">: canciones en común, solo en cada una y % de parecido.</w:t>
+        <w:t xml:space="preserve">Cambiar el nombre de la carpeta de BrainOrder en tus programas </w:t>
+      </w:r>
+      <w:r>
+        <w:rPr>
+          <w:b/>
+          <w:bCs/>
+        </w:rPr>
+        <w:t xml:space="preserve">la renombra</w:t>
+      </w:r>
+      <w:r>
+        <w:t xml:space="preserve"> en Rekordbox, Traktor, Serato, Engine DJ y M3U: no se duplica, no aparece en «Playlists nuevas» ni como borrada en «Cambios en Rekordbox».</w:t>
       </w:r>
     </w:p>
     <w:p>
@@ -14175,7 +14121,7 @@
         <w:spacing w:after="60" w:line="276"/>
       </w:pPr>
       <w:r>
-        <w:t xml:space="preserve">Qué parte de cada una está en la otra, cuántas en común ya tienes, artistas compartidos, BPM y keys.</w:t>
+        <w:t xml:space="preserve">Si la renombras dentro de Rekordbox, BrainOrder la reconoce y la renombra también en tus otros programas. Si ya la habías cambiado antes, la encuentra y la arregla.</w:t>
       </w:r>
     </w:p>
     <w:p>
@@ -14190,7 +14136,14 @@
         <w:spacing w:after="60" w:line="276"/>
       </w:pPr>
       <w:r>
-        <w:t xml:space="preserve">Pestañas con cada lista, buscador, Copiar y atajo para fusionar.</w:t>
+        <w:rPr>
+          <w:b/>
+          <w:bCs/>
+        </w:rPr>
+        <w:t xml:space="preserve">Cancelar</w:t>
+      </w:r>
+      <w:r>
+        <w:t xml:space="preserve">: lo que está en cola (esperando su turno) se cancela con ✕ o clic derecho; también cada pendiente para Spotify.</w:t>
       </w:r>
     </w:p>
     <w:p>
@@ -14246,7 +14199,7 @@
                 <w:sz w:val="24"/>
                 <w:szCs w:val="24"/>
               </w:rPr>
-              <w:t xml:space="preserve">v2.11.0</w:t>
+              <w:t xml:space="preserve">v2.12.0</w:t>
             </w:r>
           </w:p>
           <w:p>
@@ -14293,7 +14246,7 @@
                 <w:sz w:val="23"/>
                 <w:szCs w:val="23"/>
               </w:rPr>
-              <w:t xml:space="preserve">Renombrar, fusionar y eliminar playlists</w:t>
+              <w:t xml:space="preserve">Comparar playlists</w:t>
             </w:r>
           </w:p>
         </w:tc>
@@ -14311,24 +14264,17 @@
         <w:spacing w:after="60" w:line="276"/>
       </w:pPr>
       <w:r>
-        <w:rPr>
-          <w:b/>
-          <w:bCs/>
-        </w:rPr>
-        <w:t xml:space="preserve">Clic derecho en una playlist</w:t>
-      </w:r>
-      <w:r>
-        <w:t xml:space="preserve">: Renombrar, Fusionar con otra o Eliminar, </w:t>
-      </w:r>
-      <w:r>
-        <w:rPr>
-          <w:b/>
-          <w:bCs/>
-        </w:rPr>
-        <w:t xml:space="preserve">en todas partes</w:t>
-      </w:r>
-      <w:r>
-        <w:t xml:space="preserve">: BrainOrder, su carpeta, Spotify, Rekordbox, Traktor, Serato, Engine DJ y M3U.</w:t>
+        <w:t xml:space="preserve">Clic derecho en una playlist → </w:t>
+      </w:r>
+      <w:r>
+        <w:rPr>
+          <w:b/>
+          <w:bCs/>
+        </w:rPr>
+        <w:t xml:space="preserve">⚖️ Comparar con…</w:t>
+      </w:r>
+      <w:r>
+        <w:t xml:space="preserve">: canciones en común, solo en cada una y % de parecido.</w:t>
       </w:r>
     </w:p>
     <w:p>
@@ -14343,32 +14289,7 @@
         <w:spacing w:after="60" w:line="276"/>
       </w:pPr>
       <w:r>
-        <w:t xml:space="preserve">Los archivos se mueven con rutas corregidas y </w:t>
-      </w:r>
-      <w:r>
-        <w:rPr>
-          <w:b/>
-          <w:bCs/>
-        </w:rPr>
-        <w:t xml:space="preserve">Deshacer</w:t>
-      </w:r>
-      <w:r>
-        <w:t xml:space="preserve"> en Historial; al eliminar se ordenan (o se dejan donde están), nunca se borran.</w:t>
-      </w:r>
-    </w:p>
-    <w:p>
-      <w:pPr>
-        <w:pStyle w:val="ListParagraph"/>
-        <w:keepNext/>
-        <w:keepLines/>
-        <w:numPr>
-          <w:ilvl w:val="0"/>
-          <w:numId w:val="2"/>
-        </w:numPr>
-        <w:spacing w:after="60" w:line="276"/>
-      </w:pPr>
-      <w:r>
-        <w:t xml:space="preserve">Si Spotify está en pausa, el cambio allá queda en la cola y se hace solo.</w:t>
+        <w:t xml:space="preserve">Qué parte de cada una está en la otra, cuántas en común ya tienes, artistas compartidos, BPM y keys.</w:t>
       </w:r>
     </w:p>
     <w:p>
@@ -14383,7 +14304,7 @@
         <w:spacing w:after="60" w:line="276"/>
       </w:pPr>
       <w:r>
-        <w:t xml:space="preserve">Las playlists importadas de una carpeta fuera de tu carpeta de playlists usan esa carpeta (ya no se crea otra vacía con el informe).</w:t>
+        <w:t xml:space="preserve">Pestañas con cada lista, buscador, Copiar y atajo para fusionar.</w:t>
       </w:r>
     </w:p>
     <w:p>
@@ -14439,7 +14360,7 @@
                 <w:sz w:val="24"/>
                 <w:szCs w:val="24"/>
               </w:rPr>
-              <w:t xml:space="preserve">v2.10.1</w:t>
+              <w:t xml:space="preserve">v2.11.0</w:t>
             </w:r>
           </w:p>
           <w:p>
@@ -14452,7 +14373,7 @@
                 <w:sz w:val="17"/>
                 <w:szCs w:val="17"/>
               </w:rPr>
-              <w:t xml:space="preserve">19 oct 2026</w:t>
+              <w:t xml:space="preserve">20 oct 2026</w:t>
             </w:r>
           </w:p>
         </w:tc>
@@ -14486,7 +14407,7 @@
                 <w:sz w:val="23"/>
                 <w:szCs w:val="23"/>
               </w:rPr>
-              <w:t xml:space="preserve">Playlists completas con un solo archivo</w:t>
+              <w:t xml:space="preserve">Renombrar, fusionar y eliminar playlists</w:t>
             </w:r>
           </w:p>
         </w:tc>
@@ -14504,17 +14425,24 @@
         <w:spacing w:after="60" w:line="276"/>
       </w:pPr>
       <w:r>
-        <w:t xml:space="preserve">Si borras un archivo repetido de una carpeta-playlist, la canción </w:t>
-      </w:r>
-      <w:r>
-        <w:rPr>
-          <w:b/>
-          <w:bCs/>
-        </w:rPr>
-        <w:t xml:space="preserve">sigue en la playlist</w:t>
-      </w:r>
-      <w:r>
-        <w:t xml:space="preserve"> usando la otra copia (como en Rekordbox) y Spotify no se toca.</w:t>
+        <w:rPr>
+          <w:b/>
+          <w:bCs/>
+        </w:rPr>
+        <w:t xml:space="preserve">Clic derecho en una playlist</w:t>
+      </w:r>
+      <w:r>
+        <w:t xml:space="preserve">: Renombrar, Fusionar con otra o Eliminar, </w:t>
+      </w:r>
+      <w:r>
+        <w:rPr>
+          <w:b/>
+          <w:bCs/>
+        </w:rPr>
+        <w:t xml:space="preserve">en todas partes</w:t>
+      </w:r>
+      <w:r>
+        <w:t xml:space="preserve">: BrainOrder, su carpeta, Spotify, Rekordbox, Traktor, Serato, Engine DJ y M3U.</w:t>
       </w:r>
     </w:p>
     <w:p>
@@ -14529,17 +14457,32 @@
         <w:spacing w:after="60" w:line="276"/>
       </w:pPr>
       <w:r>
-        <w:t xml:space="preserve">Solo sale si borras la única copia, o con clic derecho → </w:t>
-      </w:r>
-      <w:r>
-        <w:rPr>
-          <w:b/>
-          <w:bCs/>
-        </w:rPr>
-        <w:t xml:space="preserve">Quitar de esta playlist</w:t>
-      </w:r>
-      <w:r>
-        <w:t xml:space="preserve">.</w:t>
+        <w:t xml:space="preserve">Los archivos se mueven con rutas corregidas y </w:t>
+      </w:r>
+      <w:r>
+        <w:rPr>
+          <w:b/>
+          <w:bCs/>
+        </w:rPr>
+        <w:t xml:space="preserve">Deshacer</w:t>
+      </w:r>
+      <w:r>
+        <w:t xml:space="preserve"> en Historial; al eliminar se ordenan (o se dejan donde están), nunca se borran.</w:t>
+      </w:r>
+    </w:p>
+    <w:p>
+      <w:pPr>
+        <w:pStyle w:val="ListParagraph"/>
+        <w:keepNext/>
+        <w:keepLines/>
+        <w:numPr>
+          <w:ilvl w:val="0"/>
+          <w:numId w:val="2"/>
+        </w:numPr>
+        <w:spacing w:after="60" w:line="276"/>
+      </w:pPr>
+      <w:r>
+        <w:t xml:space="preserve">Si Spotify está en pausa, el cambio allá queda en la cola y se hace solo.</w:t>
       </w:r>
     </w:p>
     <w:p>
@@ -14554,7 +14497,7 @@
         <w:spacing w:after="60" w:line="276"/>
       </w:pPr>
       <w:r>
-        <w:t xml:space="preserve">Al pasar una carpeta a Spotify (también desde la cola) van todas sus canciones, incluidas las que borraste por repetidas.</w:t>
+        <w:t xml:space="preserve">Las playlists importadas de una carpeta fuera de tu carpeta de playlists usan esa carpeta (ya no se crea otra vacía con el informe).</w:t>
       </w:r>
     </w:p>
     <w:p>
@@ -14610,7 +14553,7 @@
                 <w:sz w:val="24"/>
                 <w:szCs w:val="24"/>
               </w:rPr>
-              <w:t xml:space="preserve">v2.10.0</w:t>
+              <w:t xml:space="preserve">v2.10.1</w:t>
             </w:r>
           </w:p>
           <w:p>
@@ -14657,7 +14600,7 @@
                 <w:sz w:val="23"/>
                 <w:szCs w:val="23"/>
               </w:rPr>
-              <w:t xml:space="preserve">Cola para Spotify</w:t>
+              <w:t xml:space="preserve">Playlists completas con un solo archivo</w:t>
             </w:r>
           </w:p>
         </w:tc>
@@ -14675,17 +14618,17 @@
         <w:spacing w:after="60" w:line="276"/>
       </w:pPr>
       <w:r>
-        <w:t xml:space="preserve">Puedes elegir </w:t>
-      </w:r>
-      <w:r>
-        <w:rPr>
-          <w:b/>
-          <w:bCs/>
-        </w:rPr>
-        <w:t xml:space="preserve">Spotify</w:t>
-      </w:r>
-      <w:r>
-        <w:t xml:space="preserve"> al importar aunque Spotify esté en pausa por exceso de consultas.</w:t>
+        <w:t xml:space="preserve">Si borras un archivo repetido de una carpeta-playlist, la canción </w:t>
+      </w:r>
+      <w:r>
+        <w:rPr>
+          <w:b/>
+          <w:bCs/>
+        </w:rPr>
+        <w:t xml:space="preserve">sigue en la playlist</w:t>
+      </w:r>
+      <w:r>
+        <w:t xml:space="preserve"> usando la otra copia (como en Rekordbox) y Spotify no se toca.</w:t>
       </w:r>
     </w:p>
     <w:p>
@@ -14700,32 +14643,17 @@
         <w:spacing w:after="60" w:line="276"/>
       </w:pPr>
       <w:r>
-        <w:t xml:space="preserve">La playlist queda lista de una vez en BrainOrder y tus programas de DJ, y </w:t>
-      </w:r>
-      <w:r>
-        <w:rPr>
-          <w:b/>
-          <w:bCs/>
-        </w:rPr>
-        <w:t xml:space="preserve">BrainOrder la crea en Spotify sola</w:t>
-      </w:r>
-      <w:r>
-        <w:t xml:space="preserve"> en cuanto Spotify lo permite.</w:t>
-      </w:r>
-    </w:p>
-    <w:p>
-      <w:pPr>
-        <w:pStyle w:val="ListParagraph"/>
-        <w:keepNext/>
-        <w:keepLines/>
-        <w:numPr>
-          <w:ilvl w:val="0"/>
-          <w:numId w:val="2"/>
-        </w:numPr>
-        <w:spacing w:after="60" w:line="276"/>
-      </w:pPr>
-      <w:r>
-        <w:t xml:space="preserve">Lo mismo con las canciones nuevas de una carpeta vinculada: se agregan solas a la misma playlist.</w:t>
+        <w:t xml:space="preserve">Solo sale si borras la única copia, o con clic derecho → </w:t>
+      </w:r>
+      <w:r>
+        <w:rPr>
+          <w:b/>
+          <w:bCs/>
+        </w:rPr>
+        <w:t xml:space="preserve">Quitar de esta playlist</w:t>
+      </w:r>
+      <w:r>
+        <w:t xml:space="preserve">.</w:t>
       </w:r>
     </w:p>
     <w:p>
@@ -14740,7 +14668,7 @@
         <w:spacing w:after="60" w:line="276"/>
       </w:pPr>
       <w:r>
-        <w:t xml:space="preserve">Los pendientes se ven en «Playlists nuevas» (con «Pasar ya» y «Cancelar») y arriba dice cuántos hay.</w:t>
+        <w:t xml:space="preserve">Al pasar una carpeta a Spotify (también desde la cola) van todas sus canciones, incluidas las que borraste por repetidas.</w:t>
       </w:r>
     </w:p>
     <w:p>
@@ -14796,7 +14724,7 @@
                 <w:sz w:val="24"/>
                 <w:szCs w:val="24"/>
               </w:rPr>
-              <w:t xml:space="preserve">v2.9.1</w:t>
+              <w:t xml:space="preserve">v2.10.0</w:t>
             </w:r>
           </w:p>
           <w:p>
@@ -14843,7 +14771,7 @@
                 <w:sz w:val="23"/>
                 <w:szCs w:val="23"/>
               </w:rPr>
-              <w:t xml:space="preserve">Sin duplicados en Spotify</w:t>
+              <w:t xml:space="preserve">Cola para Spotify</w:t>
             </w:r>
           </w:p>
         </w:tc>
@@ -14861,7 +14789,17 @@
         <w:spacing w:after="60" w:line="276"/>
       </w:pPr>
       <w:r>
-        <w:t xml:space="preserve">La carpeta que crea BrainOrder al importar ya no aparece como «nueva».</w:t>
+        <w:t xml:space="preserve">Puedes elegir </w:t>
+      </w:r>
+      <w:r>
+        <w:rPr>
+          <w:b/>
+          <w:bCs/>
+        </w:rPr>
+        <w:t xml:space="preserve">Spotify</w:t>
+      </w:r>
+      <w:r>
+        <w:t xml:space="preserve"> al importar aunque Spotify esté en pausa por exceso de consultas.</w:t>
       </w:r>
     </w:p>
     <w:p>
@@ -14876,7 +14814,32 @@
         <w:spacing w:after="60" w:line="276"/>
       </w:pPr>
       <w:r>
-        <w:t xml:space="preserve">En Spotify nunca se duplica una playlist: si ya existe con ese nombre se usa esa.</w:t>
+        <w:t xml:space="preserve">La playlist queda lista de una vez en BrainOrder y tus programas de DJ, y </w:t>
+      </w:r>
+      <w:r>
+        <w:rPr>
+          <w:b/>
+          <w:bCs/>
+        </w:rPr>
+        <w:t xml:space="preserve">BrainOrder la crea en Spotify sola</w:t>
+      </w:r>
+      <w:r>
+        <w:t xml:space="preserve"> en cuanto Spotify lo permite.</w:t>
+      </w:r>
+    </w:p>
+    <w:p>
+      <w:pPr>
+        <w:pStyle w:val="ListParagraph"/>
+        <w:keepNext/>
+        <w:keepLines/>
+        <w:numPr>
+          <w:ilvl w:val="0"/>
+          <w:numId w:val="2"/>
+        </w:numPr>
+        <w:spacing w:after="60" w:line="276"/>
+      </w:pPr>
+      <w:r>
+        <w:t xml:space="preserve">Lo mismo con las canciones nuevas de una carpeta vinculada: se agregan solas a la misma playlist.</w:t>
       </w:r>
     </w:p>
     <w:p>
@@ -14891,7 +14854,7 @@
         <w:spacing w:after="60" w:line="276"/>
       </w:pPr>
       <w:r>
-        <w:t xml:space="preserve">Si agregas canciones a una carpeta importada a Spotify, te pregunta si van a esa misma playlist.</w:t>
+        <w:t xml:space="preserve">Los pendientes se ven en «Playlists nuevas» (con «Pasar ya» y «Cancelar») y arriba dice cuántos hay.</w:t>
       </w:r>
     </w:p>
     <w:p>
@@ -14947,7 +14910,7 @@
                 <w:sz w:val="24"/>
                 <w:szCs w:val="24"/>
               </w:rPr>
-              <w:t xml:space="preserve">v2.9.0</w:t>
+              <w:t xml:space="preserve">v2.9.1</w:t>
             </w:r>
           </w:p>
           <w:p>
@@ -14994,7 +14957,7 @@
                 <w:sz w:val="23"/>
                 <w:szCs w:val="23"/>
               </w:rPr>
-              <w:t xml:space="preserve">Importar y ordenar de una vez</w:t>
+              <w:t xml:space="preserve">Sin duplicados en Spotify</w:t>
             </w:r>
           </w:p>
         </w:tc>
@@ -15012,17 +14975,7 @@
         <w:spacing w:after="60" w:line="276"/>
       </w:pPr>
       <w:r>
-        <w:t xml:space="preserve">Al importar una carpeta o playlist nueva te pregunta si </w:t>
-      </w:r>
-      <w:r>
-        <w:rPr>
-          <w:b/>
-          <w:bCs/>
-        </w:rPr>
-        <w:t xml:space="preserve">pasa sus archivos a tu carpeta de playlists</w:t>
-      </w:r>
-      <w:r>
-        <w:t xml:space="preserve">, junto a las demás.</w:t>
+        <w:t xml:space="preserve">La carpeta que crea BrainOrder al importar ya no aparece como «nueva».</w:t>
       </w:r>
     </w:p>
     <w:p>
@@ -15037,17 +14990,7 @@
         <w:spacing w:after="60" w:line="276"/>
       </w:pPr>
       <w:r>
-        <w:t xml:space="preserve">Rutas corregidas en Rekordbox y tus otros programas, con </w:t>
-      </w:r>
-      <w:r>
-        <w:rPr>
-          <w:b/>
-          <w:bCs/>
-        </w:rPr>
-        <w:t xml:space="preserve">Deshacer</w:t>
-      </w:r>
-      <w:r>
-        <w:t xml:space="preserve"> en Historial; la carpeta vieja se elimina si queda vacía.</w:t>
+        <w:t xml:space="preserve">En Spotify nunca se duplica una playlist: si ya existe con ese nombre se usa esa.</w:t>
       </w:r>
     </w:p>
     <w:p>
@@ -15062,17 +15005,7 @@
         <w:spacing w:after="60" w:line="276"/>
       </w:pPr>
       <w:r>
-        <w:t xml:space="preserve">Lo que importas </w:t>
-      </w:r>
-      <w:r>
-        <w:rPr>
-          <w:b/>
-          <w:bCs/>
-        </w:rPr>
-        <w:t xml:space="preserve">sale de «Playlists nuevas»</w:t>
-      </w:r>
-      <w:r>
-        <w:t xml:space="preserve">, también si lo creaste en Spotify.</w:t>
+        <w:t xml:space="preserve">Si agregas canciones a una carpeta importada a Spotify, te pregunta si van a esa misma playlist.</w:t>
       </w:r>
     </w:p>
     <w:p>
@@ -15128,7 +15061,7 @@
                 <w:sz w:val="24"/>
                 <w:szCs w:val="24"/>
               </w:rPr>
-              <w:t xml:space="preserve">v2.8.0</w:t>
+              <w:t xml:space="preserve">v2.9.0</w:t>
             </w:r>
           </w:p>
           <w:p>
@@ -15141,7 +15074,7 @@
                 <w:sz w:val="17"/>
                 <w:szCs w:val="17"/>
               </w:rPr>
-              <w:t xml:space="preserve">18 oct 2026</w:t>
+              <w:t xml:space="preserve">19 oct 2026</w:t>
             </w:r>
           </w:p>
         </w:tc>
@@ -15175,7 +15108,7 @@
                 <w:sz w:val="23"/>
                 <w:szCs w:val="23"/>
               </w:rPr>
-              <w:t xml:space="preserve">Playlists nuevas en todas partes</w:t>
+              <w:t xml:space="preserve">Importar y ordenar de una vez</w:t>
             </w:r>
           </w:p>
         </w:tc>
@@ -15193,39 +15126,17 @@
         <w:spacing w:after="60" w:line="276"/>
       </w:pPr>
       <w:r>
-        <w:t xml:space="preserve">Pregunta por carpetas nuevas en </w:t>
-      </w:r>
-      <w:r>
-        <w:rPr>
-          <w:b/>
-          <w:bCs/>
-        </w:rPr>
-        <w:t xml:space="preserve">todas tus carpetas de música</w:t>
-      </w:r>
-      <w:r>
-        <w:t xml:space="preserve"> (por ejemplo </w:t>
-      </w:r>
-      <w:r>
-        <w:rPr>
-          <w:rFonts w:ascii="Courier New" w:cs="Courier New" w:eastAsia="Courier New" w:hAnsi="Courier New"/>
-          <w:color w:val="1F2A44"/>
-          <w:sz w:val="19"/>
-          <w:szCs w:val="19"/>
-        </w:rPr>
-        <w:t xml:space="preserve">DJ Library</w:t>
-      </w:r>
-      <w:r>
-        <w:t xml:space="preserve">), no solo en la de playlists, </w:t>
-      </w:r>
-      <w:r>
-        <w:rPr>
-          <w:b/>
-          <w:bCs/>
-        </w:rPr>
-        <w:t xml:space="preserve">aunque estén vacías</w:t>
-      </w:r>
-      <w:r>
-        <w:t xml:space="preserve">.</w:t>
+        <w:t xml:space="preserve">Al importar una carpeta o playlist nueva te pregunta si </w:t>
+      </w:r>
+      <w:r>
+        <w:rPr>
+          <w:b/>
+          <w:bCs/>
+        </w:rPr>
+        <w:t xml:space="preserve">pasa sus archivos a tu carpeta de playlists</w:t>
+      </w:r>
+      <w:r>
+        <w:t xml:space="preserve">, junto a las demás.</w:t>
       </w:r>
     </w:p>
     <w:p>
@@ -15240,32 +15151,17 @@
         <w:spacing w:after="60" w:line="276"/>
       </w:pPr>
       <w:r>
-        <w:t xml:space="preserve">Pregunta cuando creas una playlist en </w:t>
-      </w:r>
-      <w:r>
-        <w:rPr>
-          <w:b/>
-          <w:bCs/>
-        </w:rPr>
-        <w:t xml:space="preserve">Rekordbox, Traktor, Serato o Engine DJ</w:t>
-      </w:r>
-      <w:r>
-        <w:t xml:space="preserve">, y la importa como playlist de BrainOrder (en Spotify, en otra plataforma o sin plataforma).</w:t>
-      </w:r>
-    </w:p>
-    <w:p>
-      <w:pPr>
-        <w:pStyle w:val="ListParagraph"/>
-        <w:keepNext/>
-        <w:keepLines/>
-        <w:numPr>
-          <w:ilvl w:val="0"/>
-          <w:numId w:val="2"/>
-        </w:numPr>
-        <w:spacing w:after="60" w:line="276"/>
-      </w:pPr>
-      <w:r>
-        <w:t xml:space="preserve">Una playlist que nació en un programa de DJ no se vuelve a copiar a ese mismo programa.</w:t>
+        <w:t xml:space="preserve">Rutas corregidas en Rekordbox y tus otros programas, con </w:t>
+      </w:r>
+      <w:r>
+        <w:rPr>
+          <w:b/>
+          <w:bCs/>
+        </w:rPr>
+        <w:t xml:space="preserve">Deshacer</w:t>
+      </w:r>
+      <w:r>
+        <w:t xml:space="preserve"> en Historial; la carpeta vieja se elimina si queda vacía.</w:t>
       </w:r>
     </w:p>
     <w:p>
@@ -15280,17 +15176,17 @@
         <w:spacing w:after="60" w:line="276"/>
       </w:pPr>
       <w:r>
-        <w:t xml:space="preserve">La sección pasa a llamarse </w:t>
-      </w:r>
-      <w:r>
-        <w:rPr>
-          <w:b/>
-          <w:bCs/>
-        </w:rPr>
-        <w:t xml:space="preserve">Playlists nuevas</w:t>
-      </w:r>
-      <w:r>
-        <w:t xml:space="preserve">.</w:t>
+        <w:t xml:space="preserve">Lo que importas </w:t>
+      </w:r>
+      <w:r>
+        <w:rPr>
+          <w:b/>
+          <w:bCs/>
+        </w:rPr>
+        <w:t xml:space="preserve">sale de «Playlists nuevas»</w:t>
+      </w:r>
+      <w:r>
+        <w:t xml:space="preserve">, también si lo creaste en Spotify.</w:t>
       </w:r>
     </w:p>
     <w:p>
@@ -15346,7 +15242,7 @@
                 <w:sz w:val="24"/>
                 <w:szCs w:val="24"/>
               </w:rPr>
-              <w:t xml:space="preserve">v2.7.0</w:t>
+              <w:t xml:space="preserve">v2.8.0</w:t>
             </w:r>
           </w:p>
           <w:p>
@@ -15393,7 +15289,7 @@
                 <w:sz w:val="23"/>
                 <w:szCs w:val="23"/>
               </w:rPr>
-              <w:t xml:space="preserve">Carpetas nuevas → playlist</w:t>
+              <w:t xml:space="preserve">Playlists nuevas en todas partes</w:t>
             </w:r>
           </w:p>
         </w:tc>
@@ -15411,7 +15307,39 @@
         <w:spacing w:after="60" w:line="276"/>
       </w:pPr>
       <w:r>
-        <w:t xml:space="preserve">Detecta carpetas nuevas con música en tu carpeta de playlists y pregunta si las importa como playlist.</w:t>
+        <w:t xml:space="preserve">Pregunta por carpetas nuevas en </w:t>
+      </w:r>
+      <w:r>
+        <w:rPr>
+          <w:b/>
+          <w:bCs/>
+        </w:rPr>
+        <w:t xml:space="preserve">todas tus carpetas de música</w:t>
+      </w:r>
+      <w:r>
+        <w:t xml:space="preserve"> (por ejemplo </w:t>
+      </w:r>
+      <w:r>
+        <w:rPr>
+          <w:rFonts w:ascii="Courier New" w:cs="Courier New" w:eastAsia="Courier New" w:hAnsi="Courier New"/>
+          <w:color w:val="1F2A44"/>
+          <w:sz w:val="19"/>
+          <w:szCs w:val="19"/>
+        </w:rPr>
+        <w:t xml:space="preserve">DJ Library</w:t>
+      </w:r>
+      <w:r>
+        <w:t xml:space="preserve">), no solo en la de playlists, </w:t>
+      </w:r>
+      <w:r>
+        <w:rPr>
+          <w:b/>
+          <w:bCs/>
+        </w:rPr>
+        <w:t xml:space="preserve">aunque estén vacías</w:t>
+      </w:r>
+      <w:r>
+        <w:t xml:space="preserve">.</w:t>
       </w:r>
     </w:p>
     <w:p>
@@ -15426,37 +15354,32 @@
         <w:spacing w:after="60" w:line="276"/>
       </w:pPr>
       <w:r>
-        <w:t xml:space="preserve">Opciones: </w:t>
-      </w:r>
-      <w:r>
-        <w:rPr>
-          <w:b/>
-          <w:bCs/>
-        </w:rPr>
-        <w:t xml:space="preserve">Spotify</w:t>
-      </w:r>
-      <w:r>
-        <w:t xml:space="preserve"> (busca cada canción), </w:t>
-      </w:r>
-      <w:r>
-        <w:rPr>
-          <w:b/>
-          <w:bCs/>
-        </w:rPr>
-        <w:t xml:space="preserve">otra plataforma</w:t>
-      </w:r>
-      <w:r>
-        <w:t xml:space="preserve"> (archivo para TuneMyMusic/Soundiiz) o </w:t>
-      </w:r>
-      <w:r>
-        <w:rPr>
-          <w:b/>
-          <w:bCs/>
-        </w:rPr>
-        <w:t xml:space="preserve">ninguna</w:t>
-      </w:r>
-      <w:r>
-        <w:t xml:space="preserve">.</w:t>
+        <w:t xml:space="preserve">Pregunta cuando creas una playlist en </w:t>
+      </w:r>
+      <w:r>
+        <w:rPr>
+          <w:b/>
+          <w:bCs/>
+        </w:rPr>
+        <w:t xml:space="preserve">Rekordbox, Traktor, Serato o Engine DJ</w:t>
+      </w:r>
+      <w:r>
+        <w:t xml:space="preserve">, y la importa como playlist de BrainOrder (en Spotify, en otra plataforma o sin plataforma).</w:t>
+      </w:r>
+    </w:p>
+    <w:p>
+      <w:pPr>
+        <w:pStyle w:val="ListParagraph"/>
+        <w:keepNext/>
+        <w:keepLines/>
+        <w:numPr>
+          <w:ilvl w:val="0"/>
+          <w:numId w:val="2"/>
+        </w:numPr>
+        <w:spacing w:after="60" w:line="276"/>
+      </w:pPr>
+      <w:r>
+        <w:t xml:space="preserve">Una playlist que nació en un programa de DJ no se vuelve a copiar a ese mismo programa.</w:t>
       </w:r>
     </w:p>
     <w:p>
@@ -15471,7 +15394,17 @@
         <w:spacing w:after="60" w:line="276"/>
       </w:pPr>
       <w:r>
-        <w:t xml:space="preserve">Opción de pasarla enseguida a tus programas de DJ.</w:t>
+        <w:t xml:space="preserve">La sección pasa a llamarse </w:t>
+      </w:r>
+      <w:r>
+        <w:rPr>
+          <w:b/>
+          <w:bCs/>
+        </w:rPr>
+        <w:t xml:space="preserve">Playlists nuevas</w:t>
+      </w:r>
+      <w:r>
+        <w:t xml:space="preserve">.</w:t>
       </w:r>
     </w:p>
     <w:p>
@@ -15527,7 +15460,7 @@
                 <w:sz w:val="24"/>
                 <w:szCs w:val="24"/>
               </w:rPr>
-              <w:t xml:space="preserve">v2.6.0</w:t>
+              <w:t xml:space="preserve">v2.7.0</w:t>
             </w:r>
           </w:p>
           <w:p>
@@ -15574,7 +15507,7 @@
                 <w:sz w:val="23"/>
                 <w:szCs w:val="23"/>
               </w:rPr>
-              <w:t xml:space="preserve">Orden, clic derecho y Reorganizar a tu manera</w:t>
+              <w:t xml:space="preserve">Carpetas nuevas → playlist</w:t>
             </w:r>
           </w:p>
         </w:tc>
@@ -15592,17 +15525,7 @@
         <w:spacing w:after="60" w:line="276"/>
       </w:pPr>
       <w:r>
-        <w:t xml:space="preserve">Selector para </w:t>
-      </w:r>
-      <w:r>
-        <w:rPr>
-          <w:b/>
-          <w:bCs/>
-        </w:rPr>
-        <w:t xml:space="preserve">ordenar tus playlists</w:t>
-      </w:r>
-      <w:r>
-        <w:t xml:space="preserve"> (más/menos faltantes, completas, nombre, tamaño…), que se recuerda.</w:t>
+        <w:t xml:space="preserve">Detecta carpetas nuevas con música en tu carpeta de playlists y pregunta si las importa como playlist.</w:t>
       </w:r>
     </w:p>
     <w:p>
@@ -15617,14 +15540,37 @@
         <w:spacing w:after="60" w:line="276"/>
       </w:pPr>
       <w:r>
-        <w:rPr>
-          <w:b/>
-          <w:bCs/>
-        </w:rPr>
-        <w:t xml:space="preserve">Menú de clic derecho</w:t>
-      </w:r>
-      <w:r>
-        <w:t xml:space="preserve"> en cada canción: moverla, fijarla, mostrarla, abrir sus links o copiar su nombre.</w:t>
+        <w:t xml:space="preserve">Opciones: </w:t>
+      </w:r>
+      <w:r>
+        <w:rPr>
+          <w:b/>
+          <w:bCs/>
+        </w:rPr>
+        <w:t xml:space="preserve">Spotify</w:t>
+      </w:r>
+      <w:r>
+        <w:t xml:space="preserve"> (busca cada canción), </w:t>
+      </w:r>
+      <w:r>
+        <w:rPr>
+          <w:b/>
+          <w:bCs/>
+        </w:rPr>
+        <w:t xml:space="preserve">otra plataforma</w:t>
+      </w:r>
+      <w:r>
+        <w:t xml:space="preserve"> (archivo para TuneMyMusic/Soundiiz) o </w:t>
+      </w:r>
+      <w:r>
+        <w:rPr>
+          <w:b/>
+          <w:bCs/>
+        </w:rPr>
+        <w:t xml:space="preserve">ninguna</w:t>
+      </w:r>
+      <w:r>
+        <w:t xml:space="preserve">.</w:t>
       </w:r>
     </w:p>
     <w:p>
@@ -15639,7 +15585,7 @@
         <w:spacing w:after="60" w:line="276"/>
       </w:pPr>
       <w:r>
-        <w:t xml:space="preserve">Reorganizar propone las canciones siempre; recordar las que dejas es opcional.</w:t>
+        <w:t xml:space="preserve">Opción de pasarla enseguida a tus programas de DJ.</w:t>
       </w:r>
     </w:p>
     <w:p>
@@ -15695,7 +15641,7 @@
                 <w:sz w:val="24"/>
                 <w:szCs w:val="24"/>
               </w:rPr>
-              <w:t xml:space="preserve">v2.5.1</w:t>
+              <w:t xml:space="preserve">v2.6.0</w:t>
             </w:r>
           </w:p>
           <w:p>
@@ -15742,7 +15688,7 @@
                 <w:sz w:val="23"/>
                 <w:szCs w:val="23"/>
               </w:rPr>
-              <w:t xml:space="preserve">Spotify sin bloqueos</w:t>
+              <w:t xml:space="preserve">Orden, clic derecho y Reorganizar a tu manera</w:t>
             </w:r>
           </w:p>
         </w:tc>
@@ -15760,7 +15706,39 @@
         <w:spacing w:after="60" w:line="276"/>
       </w:pPr>
       <w:r>
-        <w:t xml:space="preserve">Si Spotify pone la app en pausa por exceso de consultas, BrainOrder la respeta, lo muestra arriba y sigue trabajando con lo último leído.</w:t>
+        <w:t xml:space="preserve">Selector para </w:t>
+      </w:r>
+      <w:r>
+        <w:rPr>
+          <w:b/>
+          <w:bCs/>
+        </w:rPr>
+        <w:t xml:space="preserve">ordenar tus playlists</w:t>
+      </w:r>
+      <w:r>
+        <w:t xml:space="preserve"> (más/menos faltantes, completas, nombre, tamaño…), que se recuerda.</w:t>
+      </w:r>
+    </w:p>
+    <w:p>
+      <w:pPr>
+        <w:pStyle w:val="ListParagraph"/>
+        <w:keepNext/>
+        <w:keepLines/>
+        <w:numPr>
+          <w:ilvl w:val="0"/>
+          <w:numId w:val="2"/>
+        </w:numPr>
+        <w:spacing w:after="60" w:line="276"/>
+      </w:pPr>
+      <w:r>
+        <w:rPr>
+          <w:b/>
+          <w:bCs/>
+        </w:rPr>
+        <w:t xml:space="preserve">Menú de clic derecho</w:t>
+      </w:r>
+      <w:r>
+        <w:t xml:space="preserve"> en cada canción: moverla, fijarla, mostrarla, abrir sus links o copiar su nombre.</w:t>
       </w:r>
     </w:p>
     <w:p>
@@ -15775,7 +15753,7 @@
         <w:spacing w:after="60" w:line="276"/>
       </w:pPr>
       <w:r>
-        <w:t xml:space="preserve">«Analizar todo» ya no relee las playlists que no cambiaron (muchas menos consultas).</w:t>
+        <w:t xml:space="preserve">Reorganizar propone las canciones siempre; recordar las que dejas es opcional.</w:t>
       </w:r>
     </w:p>
     <w:p>
@@ -15831,7 +15809,7 @@
                 <w:sz w:val="24"/>
                 <w:szCs w:val="24"/>
               </w:rPr>
-              <w:t xml:space="preserve">v2.5.0</w:t>
+              <w:t xml:space="preserve">v2.5.1</w:t>
             </w:r>
           </w:p>
           <w:p>
@@ -15878,7 +15856,7 @@
                 <w:sz w:val="23"/>
                 <w:szCs w:val="23"/>
               </w:rPr>
-              <w:t xml:space="preserve">Más rápido y más seguro</w:t>
+              <w:t xml:space="preserve">Spotify sin bloqueos</w:t>
             </w:r>
           </w:p>
         </w:tc>
@@ -15896,77 +15874,7 @@
         <w:spacing w:after="60" w:line="276"/>
       </w:pPr>
       <w:r>
-        <w:t xml:space="preserve">Análisis hasta </w:t>
-      </w:r>
-      <w:r>
-        <w:rPr>
-          <w:b/>
-          <w:bCs/>
-        </w:rPr>
-        <w:t xml:space="preserve">3 veces más rápido</w:t>
-      </w:r>
-      <w:r>
-        <w:t xml:space="preserve"> (y re-análisis hasta 14 veces más rápido).</w:t>
-      </w:r>
-    </w:p>
-    <w:p>
-      <w:pPr>
-        <w:pStyle w:val="ListParagraph"/>
-        <w:keepNext/>
-        <w:keepLines/>
-        <w:numPr>
-          <w:ilvl w:val="0"/>
-          <w:numId w:val="2"/>
-        </w:numPr>
-        <w:spacing w:after="60" w:line="276"/>
-      </w:pPr>
-      <w:r>
-        <w:t xml:space="preserve">La ventana ya no se traba con playlists grandes (listas por partes).</w:t>
-      </w:r>
-    </w:p>
-    <w:p>
-      <w:pPr>
-        <w:pStyle w:val="ListParagraph"/>
-        <w:keepNext/>
-        <w:keepLines/>
-        <w:numPr>
-          <w:ilvl w:val="0"/>
-          <w:numId w:val="2"/>
-        </w:numPr>
-        <w:spacing w:after="60" w:line="276"/>
-      </w:pPr>
-      <w:r>
-        <w:t xml:space="preserve">Rekordbox se lee sin copiar la librería; respaldos completos y chequeo de espacio.</w:t>
-      </w:r>
-    </w:p>
-    <w:p>
-      <w:pPr>
-        <w:pStyle w:val="ListParagraph"/>
-        <w:keepNext/>
-        <w:keepLines/>
-        <w:numPr>
-          <w:ilvl w:val="0"/>
-          <w:numId w:val="2"/>
-        </w:numPr>
-        <w:spacing w:after="60" w:line="276"/>
-      </w:pPr>
-      <w:r>
-        <w:t xml:space="preserve">Mover entre discos a prueba de cortes; sesión de Spotify más estable; ajustes que se recuperan solos.</w:t>
-      </w:r>
-    </w:p>
-    <w:p>
-      <w:pPr>
-        <w:pStyle w:val="ListParagraph"/>
-        <w:keepNext/>
-        <w:keepLines/>
-        <w:numPr>
-          <w:ilvl w:val="0"/>
-          <w:numId w:val="2"/>
-        </w:numPr>
-        <w:spacing w:after="60" w:line="276"/>
-      </w:pPr>
-      <w:r>
-        <w:t xml:space="preserve">Si una actualización no arranca, vuelve sola a la anterior.</w:t>
+        <w:t xml:space="preserve">Si Spotify pone la app en pausa por exceso de consultas, BrainOrder la respeta, lo muestra arriba y sigue trabajando con lo último leído.</w:t>
       </w:r>
     </w:p>
     <w:p>
@@ -15981,17 +15889,7 @@
         <w:spacing w:after="60" w:line="276"/>
       </w:pPr>
       <w:r>
-        <w:t xml:space="preserve">En macOS aparece </w:t>
-      </w:r>
-      <w:r>
-        <w:rPr>
-          <w:b/>
-          <w:bCs/>
-        </w:rPr>
-        <w:t xml:space="preserve">«BrainOrder»</w:t>
-      </w:r>
-      <w:r>
-        <w:t xml:space="preserve"> en el menú, el Dock y ⌘-Tab (antes «Python»).</w:t>
+        <w:t xml:space="preserve">«Analizar todo» ya no relee las playlists que no cambiaron (muchas menos consultas).</w:t>
       </w:r>
     </w:p>
     <w:p>
@@ -16047,7 +15945,7 @@
                 <w:sz w:val="24"/>
                 <w:szCs w:val="24"/>
               </w:rPr>
-              <w:t xml:space="preserve">v2.4.0</w:t>
+              <w:t xml:space="preserve">v2.5.0</w:t>
             </w:r>
           </w:p>
           <w:p>
@@ -16094,7 +15992,7 @@
                 <w:sz w:val="23"/>
                 <w:szCs w:val="23"/>
               </w:rPr>
-              <w:t xml:space="preserve">Mixed In Key en todos tus programas</w:t>
+              <w:t xml:space="preserve">Más rápido y más seguro</w:t>
             </w:r>
           </w:p>
         </w:tc>
@@ -16112,27 +16010,77 @@
         <w:spacing w:after="60" w:line="276"/>
       </w:pPr>
       <w:r>
-        <w:t xml:space="preserve">Key, energía y </w:t>
-      </w:r>
-      <w:r>
-        <w:rPr>
-          <w:b/>
-          <w:bCs/>
-        </w:rPr>
-        <w:t xml:space="preserve">hot cues</w:t>
-      </w:r>
-      <w:r>
-        <w:t xml:space="preserve"> de Mixed In Key llegan a </w:t>
-      </w:r>
-      <w:r>
-        <w:rPr>
-          <w:b/>
-          <w:bCs/>
-        </w:rPr>
-        <w:t xml:space="preserve">Rekordbox, Traktor, Serato y Engine DJ</w:t>
-      </w:r>
-      <w:r>
-        <w:t xml:space="preserve">.</w:t>
+        <w:t xml:space="preserve">Análisis hasta </w:t>
+      </w:r>
+      <w:r>
+        <w:rPr>
+          <w:b/>
+          <w:bCs/>
+        </w:rPr>
+        <w:t xml:space="preserve">3 veces más rápido</w:t>
+      </w:r>
+      <w:r>
+        <w:t xml:space="preserve"> (y re-análisis hasta 14 veces más rápido).</w:t>
+      </w:r>
+    </w:p>
+    <w:p>
+      <w:pPr>
+        <w:pStyle w:val="ListParagraph"/>
+        <w:keepNext/>
+        <w:keepLines/>
+        <w:numPr>
+          <w:ilvl w:val="0"/>
+          <w:numId w:val="2"/>
+        </w:numPr>
+        <w:spacing w:after="60" w:line="276"/>
+      </w:pPr>
+      <w:r>
+        <w:t xml:space="preserve">La ventana ya no se traba con playlists grandes (listas por partes).</w:t>
+      </w:r>
+    </w:p>
+    <w:p>
+      <w:pPr>
+        <w:pStyle w:val="ListParagraph"/>
+        <w:keepNext/>
+        <w:keepLines/>
+        <w:numPr>
+          <w:ilvl w:val="0"/>
+          <w:numId w:val="2"/>
+        </w:numPr>
+        <w:spacing w:after="60" w:line="276"/>
+      </w:pPr>
+      <w:r>
+        <w:t xml:space="preserve">Rekordbox se lee sin copiar la librería; respaldos completos y chequeo de espacio.</w:t>
+      </w:r>
+    </w:p>
+    <w:p>
+      <w:pPr>
+        <w:pStyle w:val="ListParagraph"/>
+        <w:keepNext/>
+        <w:keepLines/>
+        <w:numPr>
+          <w:ilvl w:val="0"/>
+          <w:numId w:val="2"/>
+        </w:numPr>
+        <w:spacing w:after="60" w:line="276"/>
+      </w:pPr>
+      <w:r>
+        <w:t xml:space="preserve">Mover entre discos a prueba de cortes; sesión de Spotify más estable; ajustes que se recuperan solos.</w:t>
+      </w:r>
+    </w:p>
+    <w:p>
+      <w:pPr>
+        <w:pStyle w:val="ListParagraph"/>
+        <w:keepNext/>
+        <w:keepLines/>
+        <w:numPr>
+          <w:ilvl w:val="0"/>
+          <w:numId w:val="2"/>
+        </w:numPr>
+        <w:spacing w:after="60" w:line="276"/>
+      </w:pPr>
+      <w:r>
+        <w:t xml:space="preserve">Si una actualización no arranca, vuelve sola a la anterior.</w:t>
       </w:r>
     </w:p>
     <w:p>
@@ -16147,7 +16095,17 @@
         <w:spacing w:after="60" w:line="276"/>
       </w:pPr>
       <w:r>
-        <w:t xml:space="preserve">Los hot cues solo se ponen en canciones que todavía no tienen; los tuyos nunca se pisan.</w:t>
+        <w:t xml:space="preserve">En macOS aparece </w:t>
+      </w:r>
+      <w:r>
+        <w:rPr>
+          <w:b/>
+          <w:bCs/>
+        </w:rPr>
+        <w:t xml:space="preserve">«BrainOrder»</w:t>
+      </w:r>
+      <w:r>
+        <w:t xml:space="preserve"> en el menú, el Dock y ⌘-Tab (antes «Python»).</w:t>
       </w:r>
     </w:p>
     <w:p>
@@ -16203,7 +16161,7 @@
                 <w:sz w:val="24"/>
                 <w:szCs w:val="24"/>
               </w:rPr>
-              <w:t xml:space="preserve">v2.3.0</w:t>
+              <w:t xml:space="preserve">v2.4.0</w:t>
             </w:r>
           </w:p>
           <w:p>
@@ -16250,7 +16208,7 @@
                 <w:sz w:val="23"/>
                 <w:szCs w:val="23"/>
               </w:rPr>
-              <w:t xml:space="preserve">Mixed In Key → Rekordbox automático</w:t>
+              <w:t xml:space="preserve">Mixed In Key en todos tus programas</w:t>
             </w:r>
           </w:p>
         </w:tc>
@@ -16259,6 +16217,41 @@
     <w:p>
       <w:pPr>
         <w:pStyle w:val="ListParagraph"/>
+        <w:keepNext/>
+        <w:keepLines/>
+        <w:numPr>
+          <w:ilvl w:val="0"/>
+          <w:numId w:val="2"/>
+        </w:numPr>
+        <w:spacing w:after="60" w:line="276"/>
+      </w:pPr>
+      <w:r>
+        <w:t xml:space="preserve">Key, energía y </w:t>
+      </w:r>
+      <w:r>
+        <w:rPr>
+          <w:b/>
+          <w:bCs/>
+        </w:rPr>
+        <w:t xml:space="preserve">hot cues</w:t>
+      </w:r>
+      <w:r>
+        <w:t xml:space="preserve"> de Mixed In Key llegan a </w:t>
+      </w:r>
+      <w:r>
+        <w:rPr>
+          <w:b/>
+          <w:bCs/>
+        </w:rPr>
+        <w:t xml:space="preserve">Rekordbox, Traktor, Serato y Engine DJ</w:t>
+      </w:r>
+      <w:r>
+        <w:t xml:space="preserve">.</w:t>
+      </w:r>
+    </w:p>
+    <w:p>
+      <w:pPr>
+        <w:pStyle w:val="ListParagraph"/>
         <w:keepNext w:val="false"/>
         <w:keepLines/>
         <w:numPr>
@@ -16268,7 +16261,7 @@
         <w:spacing w:after="60" w:line="276"/>
       </w:pPr>
       <w:r>
-        <w:t xml:space="preserve">La key y la energía de Mixed In Key pasan solas a Rekordbox al Organizar y cada 5 minutos con Rekordbox cerrado.</w:t>
+        <w:t xml:space="preserve">Los hot cues solo se ponen en canciones que todavía no tienen; los tuyos nunca se pisan.</w:t>
       </w:r>
     </w:p>
     <w:p>
@@ -16324,7 +16317,7 @@
                 <w:sz w:val="24"/>
                 <w:szCs w:val="24"/>
               </w:rPr>
-              <w:t xml:space="preserve">v2.2.0</w:t>
+              <w:t xml:space="preserve">v2.3.0</w:t>
             </w:r>
           </w:p>
           <w:p>
@@ -16371,7 +16364,7 @@
                 <w:sz w:val="23"/>
                 <w:szCs w:val="23"/>
               </w:rPr>
-              <w:t xml:space="preserve">Rekordbox → Spotify y Duplicados</w:t>
+              <w:t xml:space="preserve">Mixed In Key → Rekordbox automático</w:t>
             </w:r>
           </w:p>
         </w:tc>
@@ -16380,21 +16373,6 @@
     <w:p>
       <w:pPr>
         <w:pStyle w:val="ListParagraph"/>
-        <w:keepNext/>
-        <w:keepLines/>
-        <w:numPr>
-          <w:ilvl w:val="0"/>
-          <w:numId w:val="2"/>
-        </w:numPr>
-        <w:spacing w:after="60" w:line="276"/>
-      </w:pPr>
-      <w:r>
-        <w:t xml:space="preserve">Lo que cambias a mano en Rekordbox (crear, borrar, renombrar, agregar o quitar canciones) puede pasar a Spotify, preguntando antes.</w:t>
-      </w:r>
-    </w:p>
-    <w:p>
-      <w:pPr>
-        <w:pStyle w:val="ListParagraph"/>
         <w:keepNext w:val="false"/>
         <w:keepLines/>
         <w:numPr>
@@ -16404,17 +16382,7 @@
         <w:spacing w:after="60" w:line="276"/>
       </w:pPr>
       <w:r>
-        <w:t xml:space="preserve">Nueva sección </w:t>
-      </w:r>
-      <w:r>
-        <w:rPr>
-          <w:b/>
-          <w:bCs/>
-        </w:rPr>
-        <w:t xml:space="preserve">Duplicados</w:t>
-      </w:r>
-      <w:r>
-        <w:t xml:space="preserve">: busca archivos repetidos en toda tu música y sugiere cuál conservar.</w:t>
+        <w:t xml:space="preserve">La key y la energía de Mixed In Key pasan solas a Rekordbox al Organizar y cada 5 minutos con Rekordbox cerrado.</w:t>
       </w:r>
     </w:p>
     <w:p>
@@ -16470,7 +16438,7 @@
                 <w:sz w:val="24"/>
                 <w:szCs w:val="24"/>
               </w:rPr>
-              <w:t xml:space="preserve">v2.1.1</w:t>
+              <w:t xml:space="preserve">v2.2.0</w:t>
             </w:r>
           </w:p>
           <w:p>
@@ -16483,7 +16451,7 @@
                 <w:sz w:val="17"/>
                 <w:szCs w:val="17"/>
               </w:rPr>
-              <w:t xml:space="preserve">17 oct 2026</w:t>
+              <w:t xml:space="preserve">18 oct 2026</w:t>
             </w:r>
           </w:p>
         </w:tc>
@@ -16517,7 +16485,7 @@
                 <w:sz w:val="23"/>
                 <w:szCs w:val="23"/>
               </w:rPr>
-              <w:t xml:space="preserve">Mixed In Key manda</w:t>
+              <w:t xml:space="preserve">Rekordbox → Spotify y Duplicados</w:t>
             </w:r>
           </w:p>
         </w:tc>
@@ -16526,6 +16494,21 @@
     <w:p>
       <w:pPr>
         <w:pStyle w:val="ListParagraph"/>
+        <w:keepNext/>
+        <w:keepLines/>
+        <w:numPr>
+          <w:ilvl w:val="0"/>
+          <w:numId w:val="2"/>
+        </w:numPr>
+        <w:spacing w:after="60" w:line="276"/>
+      </w:pPr>
+      <w:r>
+        <w:t xml:space="preserve">Lo que cambias a mano en Rekordbox (crear, borrar, renombrar, agregar o quitar canciones) puede pasar a Spotify, preguntando antes.</w:t>
+      </w:r>
+    </w:p>
+    <w:p>
+      <w:pPr>
+        <w:pStyle w:val="ListParagraph"/>
         <w:keepNext w:val="false"/>
         <w:keepLines/>
         <w:numPr>
@@ -16535,7 +16518,17 @@
         <w:spacing w:after="60" w:line="276"/>
       </w:pPr>
       <w:r>
-        <w:t xml:space="preserve">Los datos de Mixed In Key siempre tienen prioridad sobre los de cualquier otro programa.</w:t>
+        <w:t xml:space="preserve">Nueva sección </w:t>
+      </w:r>
+      <w:r>
+        <w:rPr>
+          <w:b/>
+          <w:bCs/>
+        </w:rPr>
+        <w:t xml:space="preserve">Duplicados</w:t>
+      </w:r>
+      <w:r>
+        <w:t xml:space="preserve">: busca archivos repetidos en toda tu música y sugiere cuál conservar.</w:t>
       </w:r>
     </w:p>
     <w:p>
@@ -16591,7 +16584,7 @@
                 <w:sz w:val="24"/>
                 <w:szCs w:val="24"/>
               </w:rPr>
-              <w:t xml:space="preserve">v2.1.0</w:t>
+              <w:t xml:space="preserve">v2.1.1</w:t>
             </w:r>
           </w:p>
           <w:p>
@@ -16638,7 +16631,7 @@
                 <w:sz w:val="23"/>
                 <w:szCs w:val="23"/>
               </w:rPr>
-              <w:t xml:space="preserve">Key, energía y BPM</w:t>
+              <w:t xml:space="preserve">Mixed In Key manda</w:t>
             </w:r>
           </w:p>
         </w:tc>
@@ -16647,51 +16640,6 @@
     <w:p>
       <w:pPr>
         <w:pStyle w:val="ListParagraph"/>
-        <w:keepNext/>
-        <w:keepLines/>
-        <w:numPr>
-          <w:ilvl w:val="0"/>
-          <w:numId w:val="2"/>
-        </w:numPr>
-        <w:spacing w:after="60" w:line="276"/>
-      </w:pPr>
-      <w:r>
-        <w:t xml:space="preserve">Columnas </w:t>
-      </w:r>
-      <w:r>
-        <w:rPr>
-          <w:b/>
-          <w:bCs/>
-        </w:rPr>
-        <w:t xml:space="preserve">Key</w:t>
-      </w:r>
-      <w:r>
-        <w:t xml:space="preserve"> (Camelot), </w:t>
-      </w:r>
-      <w:r>
-        <w:rPr>
-          <w:b/>
-          <w:bCs/>
-        </w:rPr>
-        <w:t xml:space="preserve">Energía</w:t>
-      </w:r>
-      <w:r>
-        <w:t xml:space="preserve"> y </w:t>
-      </w:r>
-      <w:r>
-        <w:rPr>
-          <w:b/>
-          <w:bCs/>
-        </w:rPr>
-        <w:t xml:space="preserve">BPM</w:t>
-      </w:r>
-      <w:r>
-        <w:t xml:space="preserve"> en cada playlist, con orden, filtro «Sin Mixed In Key» y búsqueda por key.</w:t>
-      </w:r>
-    </w:p>
-    <w:p>
-      <w:pPr>
-        <w:pStyle w:val="ListParagraph"/>
         <w:keepNext w:val="false"/>
         <w:keepLines/>
         <w:numPr>
@@ -16701,7 +16649,7 @@
         <w:spacing w:after="60" w:line="276"/>
       </w:pPr>
       <w:r>
-        <w:t xml:space="preserve">Tarjeta de Mixed In Key en Estadísticas.</w:t>
+        <w:t xml:space="preserve">Los datos de Mixed In Key siempre tienen prioridad sobre los de cualquier otro programa.</w:t>
       </w:r>
     </w:p>
     <w:p>
@@ -16757,7 +16705,7 @@
                 <w:sz w:val="24"/>
                 <w:szCs w:val="24"/>
               </w:rPr>
-              <w:t xml:space="preserve">v2.0.0 – 2.0.1</w:t>
+              <w:t xml:space="preserve">v2.1.0</w:t>
             </w:r>
           </w:p>
           <w:p>
@@ -16770,7 +16718,7 @@
                 <w:sz w:val="17"/>
                 <w:szCs w:val="17"/>
               </w:rPr>
-              <w:t xml:space="preserve">16 oct 2026</w:t>
+              <w:t xml:space="preserve">17 oct 2026</w:t>
             </w:r>
           </w:p>
         </w:tc>
@@ -16804,7 +16752,7 @@
                 <w:sz w:val="23"/>
                 <w:szCs w:val="23"/>
               </w:rPr>
-              <w:t xml:space="preserve">SpotiSync ahora es BrainOrder</w:t>
+              <w:t xml:space="preserve">Key, energía y BPM</w:t>
             </w:r>
           </w:p>
         </w:tc>
@@ -16813,6 +16761,51 @@
     <w:p>
       <w:pPr>
         <w:pStyle w:val="ListParagraph"/>
+        <w:keepNext/>
+        <w:keepLines/>
+        <w:numPr>
+          <w:ilvl w:val="0"/>
+          <w:numId w:val="2"/>
+        </w:numPr>
+        <w:spacing w:after="60" w:line="276"/>
+      </w:pPr>
+      <w:r>
+        <w:t xml:space="preserve">Columnas </w:t>
+      </w:r>
+      <w:r>
+        <w:rPr>
+          <w:b/>
+          <w:bCs/>
+        </w:rPr>
+        <w:t xml:space="preserve">Key</w:t>
+      </w:r>
+      <w:r>
+        <w:t xml:space="preserve"> (Camelot), </w:t>
+      </w:r>
+      <w:r>
+        <w:rPr>
+          <w:b/>
+          <w:bCs/>
+        </w:rPr>
+        <w:t xml:space="preserve">Energía</w:t>
+      </w:r>
+      <w:r>
+        <w:t xml:space="preserve"> y </w:t>
+      </w:r>
+      <w:r>
+        <w:rPr>
+          <w:b/>
+          <w:bCs/>
+        </w:rPr>
+        <w:t xml:space="preserve">BPM</w:t>
+      </w:r>
+      <w:r>
+        <w:t xml:space="preserve"> en cada playlist, con orden, filtro «Sin Mixed In Key» y búsqueda por key.</w:t>
+      </w:r>
+    </w:p>
+    <w:p>
+      <w:pPr>
+        <w:pStyle w:val="ListParagraph"/>
         <w:keepNext w:val="false"/>
         <w:keepLines/>
         <w:numPr>
@@ -16822,7 +16815,7 @@
         <w:spacing w:after="60" w:line="276"/>
       </w:pPr>
       <w:r>
-        <w:t xml:space="preserve">Nuevo nombre. Conserva tu configuración, historial y conexiones; la app y sus accesos se renombran solos.</w:t>
+        <w:t xml:space="preserve">Tarjeta de Mixed In Key en Estadísticas.</w:t>
       </w:r>
     </w:p>
     <w:p>
@@ -16878,7 +16871,7 @@
                 <w:sz w:val="24"/>
                 <w:szCs w:val="24"/>
               </w:rPr>
-              <w:t xml:space="preserve">v1.11.0</w:t>
+              <w:t xml:space="preserve">v2.0.0 – 2.0.1</w:t>
             </w:r>
           </w:p>
           <w:p>
@@ -16925,7 +16918,7 @@
                 <w:sz w:val="23"/>
                 <w:szCs w:val="23"/>
               </w:rPr>
-              <w:t xml:space="preserve">Historial y asistente</w:t>
+              <w:t xml:space="preserve">BrainOrder</w:t>
             </w:r>
           </w:p>
         </w:tc>
@@ -16934,28 +16927,6 @@
     <w:p>
       <w:pPr>
         <w:pStyle w:val="ListParagraph"/>
-        <w:keepNext/>
-        <w:keepLines/>
-        <w:numPr>
-          <w:ilvl w:val="0"/>
-          <w:numId w:val="2"/>
-        </w:numPr>
-        <w:spacing w:after="60" w:line="276"/>
-      </w:pPr>
-      <w:r>
-        <w:rPr>
-          <w:b/>
-          <w:bCs/>
-        </w:rPr>
-        <w:t xml:space="preserve">Historial con Deshacer</w:t>
-      </w:r>
-      <w:r>
-        <w:t xml:space="preserve"> para todo lo que se mueve.</w:t>
-      </w:r>
-    </w:p>
-    <w:p>
-      <w:pPr>
-        <w:pStyle w:val="ListParagraph"/>
         <w:keepNext w:val="false"/>
         <w:keepLines/>
         <w:numPr>
@@ -16965,14 +16936,7 @@
         <w:spacing w:after="60" w:line="276"/>
       </w:pPr>
       <w:r>
-        <w:rPr>
-          <w:b/>
-          <w:bCs/>
-        </w:rPr>
-        <w:t xml:space="preserve">Asistente de primer uso</w:t>
-      </w:r>
-      <w:r>
-        <w:t xml:space="preserve"> para instalaciones nuevas.</w:t>
+        <w:t xml:space="preserve">Nombre e ícono de BrainOrder en la app, sus accesos y la carpeta de tus programas de DJ.</w:t>
       </w:r>
     </w:p>
     <w:p>
@@ -17028,7 +16992,7 @@
                 <w:sz w:val="24"/>
                 <w:szCs w:val="24"/>
               </w:rPr>
-              <w:t xml:space="preserve">v1.10.0</w:t>
+              <w:t xml:space="preserve">v1.11.0</w:t>
             </w:r>
           </w:p>
           <w:p>
@@ -17075,7 +17039,7 @@
                 <w:sz w:val="23"/>
                 <w:szCs w:val="23"/>
               </w:rPr>
-              <w:t xml:space="preserve">Serato y Engine DJ</w:t>
+              <w:t xml:space="preserve">Historial y asistente</w:t>
             </w:r>
           </w:p>
         </w:tc>
@@ -17084,6 +17048,28 @@
     <w:p>
       <w:pPr>
         <w:pStyle w:val="ListParagraph"/>
+        <w:keepNext/>
+        <w:keepLines/>
+        <w:numPr>
+          <w:ilvl w:val="0"/>
+          <w:numId w:val="2"/>
+        </w:numPr>
+        <w:spacing w:after="60" w:line="276"/>
+      </w:pPr>
+      <w:r>
+        <w:rPr>
+          <w:b/>
+          <w:bCs/>
+        </w:rPr>
+        <w:t xml:space="preserve">Historial con Deshacer</w:t>
+      </w:r>
+      <w:r>
+        <w:t xml:space="preserve"> para todo lo que se mueve.</w:t>
+      </w:r>
+    </w:p>
+    <w:p>
+      <w:pPr>
+        <w:pStyle w:val="ListParagraph"/>
         <w:keepNext w:val="false"/>
         <w:keepLines/>
         <w:numPr>
@@ -17093,7 +17079,14 @@
         <w:spacing w:after="60" w:line="276"/>
       </w:pPr>
       <w:r>
-        <w:t xml:space="preserve">Serato DJ (crates) y Engine DJ (playlists) como destinos, en el mismo orden, con respaldo y corrección de rutas.</w:t>
+        <w:rPr>
+          <w:b/>
+          <w:bCs/>
+        </w:rPr>
+        <w:t xml:space="preserve">Asistente de primer uso</w:t>
+      </w:r>
+      <w:r>
+        <w:t xml:space="preserve"> para instalaciones nuevas.</w:t>
       </w:r>
     </w:p>
     <w:p>
@@ -17149,7 +17142,7 @@
                 <w:sz w:val="24"/>
                 <w:szCs w:val="24"/>
               </w:rPr>
-              <w:t xml:space="preserve">v1.9.0</w:t>
+              <w:t xml:space="preserve">v1.10.0</w:t>
             </w:r>
           </w:p>
           <w:p>
@@ -17196,7 +17189,7 @@
                 <w:sz w:val="23"/>
                 <w:szCs w:val="23"/>
               </w:rPr>
-              <w:t xml:space="preserve">Conexiones</w:t>
+              <w:t xml:space="preserve">Serato y Engine DJ</w:t>
             </w:r>
           </w:p>
         </w:tc>
@@ -17205,38 +17198,6 @@
     <w:p>
       <w:pPr>
         <w:pStyle w:val="ListParagraph"/>
-        <w:keepNext/>
-        <w:keepLines/>
-        <w:numPr>
-          <w:ilvl w:val="0"/>
-          <w:numId w:val="2"/>
-        </w:numPr>
-        <w:spacing w:after="60" w:line="276"/>
-      </w:pPr>
-      <w:r>
-        <w:rPr>
-          <w:b/>
-          <w:bCs/>
-        </w:rPr>
-        <w:t xml:space="preserve">Deezer</w:t>
-      </w:r>
-      <w:r>
-        <w:t xml:space="preserve"> y </w:t>
-      </w:r>
-      <w:r>
-        <w:rPr>
-          <w:b/>
-          <w:bCs/>
-        </w:rPr>
-        <w:t xml:space="preserve">archivos exportados</w:t>
-      </w:r>
-      <w:r>
-        <w:t xml:space="preserve"> (Apple Music, SoundCloud, Tidal…) como fuentes.</w:t>
-      </w:r>
-    </w:p>
-    <w:p>
-      <w:pPr>
-        <w:pStyle w:val="ListParagraph"/>
         <w:keepNext w:val="false"/>
         <w:keepLines/>
         <w:numPr>
@@ -17246,24 +17207,7 @@
         <w:spacing w:after="60" w:line="276"/>
       </w:pPr>
       <w:r>
-        <w:rPr>
-          <w:b/>
-          <w:bCs/>
-        </w:rPr>
-        <w:t xml:space="preserve">Traktor</w:t>
-      </w:r>
-      <w:r>
-        <w:t xml:space="preserve"> y </w:t>
-      </w:r>
-      <w:r>
-        <w:rPr>
-          <w:b/>
-          <w:bCs/>
-        </w:rPr>
-        <w:t xml:space="preserve">M3U</w:t>
-      </w:r>
-      <w:r>
-        <w:t xml:space="preserve"> como destinos.</w:t>
+        <w:t xml:space="preserve">Serato DJ (crates) y Engine DJ (playlists) como destinos, en el mismo orden, con respaldo y corrección de rutas.</w:t>
       </w:r>
     </w:p>
     <w:p>
@@ -17319,7 +17263,7 @@
                 <w:sz w:val="24"/>
                 <w:szCs w:val="24"/>
               </w:rPr>
-              <w:t xml:space="preserve">v1.8.0</w:t>
+              <w:t xml:space="preserve">v1.9.0</w:t>
             </w:r>
           </w:p>
           <w:p>
@@ -17366,7 +17310,7 @@
                 <w:sz w:val="23"/>
                 <w:szCs w:val="23"/>
               </w:rPr>
-              <w:t xml:space="preserve">Reglas</w:t>
+              <w:t xml:space="preserve">Conexiones</w:t>
             </w:r>
           </w:p>
         </w:tc>
@@ -17375,6 +17319,38 @@
     <w:p>
       <w:pPr>
         <w:pStyle w:val="ListParagraph"/>
+        <w:keepNext/>
+        <w:keepLines/>
+        <w:numPr>
+          <w:ilvl w:val="0"/>
+          <w:numId w:val="2"/>
+        </w:numPr>
+        <w:spacing w:after="60" w:line="276"/>
+      </w:pPr>
+      <w:r>
+        <w:rPr>
+          <w:b/>
+          <w:bCs/>
+        </w:rPr>
+        <w:t xml:space="preserve">Deezer</w:t>
+      </w:r>
+      <w:r>
+        <w:t xml:space="preserve"> y </w:t>
+      </w:r>
+      <w:r>
+        <w:rPr>
+          <w:b/>
+          <w:bCs/>
+        </w:rPr>
+        <w:t xml:space="preserve">archivos exportados</w:t>
+      </w:r>
+      <w:r>
+        <w:t xml:space="preserve"> (Apple Music, SoundCloud, Tidal…) como fuentes.</w:t>
+      </w:r>
+    </w:p>
+    <w:p>
+      <w:pPr>
+        <w:pStyle w:val="ListParagraph"/>
         <w:keepNext w:val="false"/>
         <w:keepLines/>
         <w:numPr>
@@ -17384,7 +17360,24 @@
         <w:spacing w:after="60" w:line="276"/>
       </w:pPr>
       <w:r>
-        <w:t xml:space="preserve">Exclusiones, prioridad de playlists, ignorar playlists, tolerancia de duración y formato preferido.</w:t>
+        <w:rPr>
+          <w:b/>
+          <w:bCs/>
+        </w:rPr>
+        <w:t xml:space="preserve">Traktor</w:t>
+      </w:r>
+      <w:r>
+        <w:t xml:space="preserve"> y </w:t>
+      </w:r>
+      <w:r>
+        <w:rPr>
+          <w:b/>
+          <w:bCs/>
+        </w:rPr>
+        <w:t xml:space="preserve">M3U</w:t>
+      </w:r>
+      <w:r>
+        <w:t xml:space="preserve"> como destinos.</w:t>
       </w:r>
     </w:p>
     <w:p>
@@ -17440,7 +17433,7 @@
                 <w:sz w:val="24"/>
                 <w:szCs w:val="24"/>
               </w:rPr>
-              <w:t xml:space="preserve">v1.7.0</w:t>
+              <w:t xml:space="preserve">v1.8.0</w:t>
             </w:r>
           </w:p>
           <w:p>
@@ -17487,7 +17480,7 @@
                 <w:sz w:val="23"/>
                 <w:szCs w:val="23"/>
               </w:rPr>
-              <w:t xml:space="preserve">Multitarea</w:t>
+              <w:t xml:space="preserve">Reglas</w:t>
             </w:r>
           </w:p>
         </w:tc>
@@ -17505,7 +17498,7 @@
         <w:spacing w:after="60" w:line="276"/>
       </w:pPr>
       <w:r>
-        <w:t xml:space="preserve">Varias tareas a la vez (analizar, organizar, exportar…), cada una con su porcentaje; las que mueven archivos esperan su turno.</w:t>
+        <w:t xml:space="preserve">Exclusiones, prioridad de playlists, ignorar playlists, tolerancia de duración y formato preferido.</w:t>
       </w:r>
     </w:p>
     <w:p>
@@ -17561,7 +17554,7 @@
                 <w:sz w:val="24"/>
                 <w:szCs w:val="24"/>
               </w:rPr>
-              <w:t xml:space="preserve">v1.6.1</w:t>
+              <w:t xml:space="preserve">v1.7.0</w:t>
             </w:r>
           </w:p>
           <w:p>
@@ -17608,7 +17601,7 @@
                 <w:sz w:val="23"/>
                 <w:szCs w:val="23"/>
               </w:rPr>
-              <w:t xml:space="preserve">Descargas</w:t>
+              <w:t xml:space="preserve">Multitarea</w:t>
             </w:r>
           </w:p>
         </w:tc>
@@ -17626,7 +17619,7 @@
         <w:spacing w:after="60" w:line="276"/>
       </w:pPr>
       <w:r>
-        <w:t xml:space="preserve">Todo sigue al instante a la carpeta de descargas que elijas en Ajustes.</w:t>
+        <w:t xml:space="preserve">Varias tareas a la vez (analizar, organizar, exportar…), cada una con su porcentaje; las que mueven archivos esperan su turno.</w:t>
       </w:r>
     </w:p>
     <w:p>
@@ -17682,7 +17675,7 @@
                 <w:sz w:val="24"/>
                 <w:szCs w:val="24"/>
               </w:rPr>
-              <w:t xml:space="preserve">v1.6.0</w:t>
+              <w:t xml:space="preserve">v1.6.1</w:t>
             </w:r>
           </w:p>
           <w:p>
@@ -17729,7 +17722,7 @@
                 <w:sz w:val="23"/>
                 <w:szCs w:val="23"/>
               </w:rPr>
-              <w:t xml:space="preserve">Organizar mejorado</w:t>
+              <w:t xml:space="preserve">Descargas</w:t>
             </w:r>
           </w:p>
         </w:tc>
@@ -17747,7 +17740,7 @@
         <w:spacing w:after="60" w:line="276"/>
       </w:pPr>
       <w:r>
-        <w:t xml:space="preserve">Cuenta todo lo que hay en descargas y deja ubicar también lo que no coincide con ninguna playlist.</w:t>
+        <w:t xml:space="preserve">Todo sigue al instante a la carpeta de descargas que elijas en Ajustes.</w:t>
       </w:r>
     </w:p>
     <w:p>
@@ -17803,7 +17796,7 @@
                 <w:sz w:val="24"/>
                 <w:szCs w:val="24"/>
               </w:rPr>
-              <w:t xml:space="preserve">v1.5.0</w:t>
+              <w:t xml:space="preserve">v1.6.0</w:t>
             </w:r>
           </w:p>
           <w:p>
@@ -17850,7 +17843,7 @@
                 <w:sz w:val="23"/>
                 <w:szCs w:val="23"/>
               </w:rPr>
-              <w:t xml:space="preserve">Filtros</w:t>
+              <w:t xml:space="preserve">Organizar mejorado</w:t>
             </w:r>
           </w:p>
         </w:tc>
@@ -17868,7 +17861,7 @@
         <w:spacing w:after="60" w:line="276"/>
       </w:pPr>
       <w:r>
-        <w:t xml:space="preserve">Ordenar y filtrar cada playlist por estado (Falta, En descargas, En otra carpeta, Aquí).</w:t>
+        <w:t xml:space="preserve">Cuenta todo lo que hay en descargas y deja ubicar también lo que no coincide con ninguna playlist.</w:t>
       </w:r>
     </w:p>
     <w:p>
@@ -17924,7 +17917,7 @@
                 <w:sz w:val="24"/>
                 <w:szCs w:val="24"/>
               </w:rPr>
-              <w:t xml:space="preserve">v1.4.0</w:t>
+              <w:t xml:space="preserve">v1.5.0</w:t>
             </w:r>
           </w:p>
           <w:p>
@@ -17971,7 +17964,7 @@
                 <w:sz w:val="23"/>
                 <w:szCs w:val="23"/>
               </w:rPr>
-              <w:t xml:space="preserve">Reorganizar</w:t>
+              <w:t xml:space="preserve">Filtros</w:t>
             </w:r>
           </w:p>
         </w:tc>
@@ -17989,7 +17982,7 @@
         <w:spacing w:after="60" w:line="276"/>
       </w:pPr>
       <w:r>
-        <w:t xml:space="preserve">Eliges si mover cada canción que ya tienes a su carpeta o dejarla donde está.</w:t>
+        <w:t xml:space="preserve">Ordenar y filtrar cada playlist por estado (Falta, En descargas, En otra carpeta, Aquí).</w:t>
       </w:r>
     </w:p>
     <w:p>
@@ -18045,7 +18038,7 @@
                 <w:sz w:val="24"/>
                 <w:szCs w:val="24"/>
               </w:rPr>
-              <w:t xml:space="preserve">v1.3.0</w:t>
+              <w:t xml:space="preserve">v1.4.0</w:t>
             </w:r>
           </w:p>
           <w:p>
@@ -18092,7 +18085,7 @@
                 <w:sz w:val="23"/>
                 <w:szCs w:val="23"/>
               </w:rPr>
-              <w:t xml:space="preserve">Progreso en vivo</w:t>
+              <w:t xml:space="preserve">Reorganizar</w:t>
             </w:r>
           </w:p>
         </w:tc>
@@ -18110,7 +18103,7 @@
         <w:spacing w:after="60" w:line="276"/>
       </w:pPr>
       <w:r>
-        <w:t xml:space="preserve">Porcentaje de avance al analizar una playlist o todo.</w:t>
+        <w:t xml:space="preserve">Eliges si mover cada canción que ya tienes a su carpeta o dejarla donde está.</w:t>
       </w:r>
     </w:p>
     <w:p>
@@ -18166,7 +18159,7 @@
                 <w:sz w:val="24"/>
                 <w:szCs w:val="24"/>
               </w:rPr>
-              <w:t xml:space="preserve">v1.2.0</w:t>
+              <w:t xml:space="preserve">v1.3.0</w:t>
             </w:r>
           </w:p>
           <w:p>
@@ -18213,7 +18206,7 @@
                 <w:sz w:val="23"/>
                 <w:szCs w:val="23"/>
               </w:rPr>
-              <w:t xml:space="preserve">Por playlist</w:t>
+              <w:t xml:space="preserve">Progreso en vivo</w:t>
             </w:r>
           </w:p>
         </w:tc>
@@ -18222,36 +18215,6 @@
     <w:p>
       <w:pPr>
         <w:pStyle w:val="ListParagraph"/>
-        <w:keepNext/>
-        <w:keepLines/>
-        <w:numPr>
-          <w:ilvl w:val="0"/>
-          <w:numId w:val="2"/>
-        </w:numPr>
-        <w:spacing w:after="60" w:line="276"/>
-      </w:pPr>
-      <w:r>
-        <w:t xml:space="preserve">Analizar y Organizar por playlist.</w:t>
-      </w:r>
-    </w:p>
-    <w:p>
-      <w:pPr>
-        <w:pStyle w:val="ListParagraph"/>
-        <w:keepNext/>
-        <w:keepLines/>
-        <w:numPr>
-          <w:ilvl w:val="0"/>
-          <w:numId w:val="2"/>
-        </w:numPr>
-        <w:spacing w:after="60" w:line="276"/>
-      </w:pPr>
-      <w:r>
-        <w:t xml:space="preserve">Aviso al instante cuando llega una descarga.</w:t>
-      </w:r>
-    </w:p>
-    <w:p>
-      <w:pPr>
-        <w:pStyle w:val="ListParagraph"/>
         <w:keepNext w:val="false"/>
         <w:keepLines/>
         <w:numPr>
@@ -18261,7 +18224,7 @@
         <w:spacing w:after="60" w:line="276"/>
       </w:pPr>
       <w:r>
-        <w:t xml:space="preserve">⟳ para traer solo la lista de playlists, con ● en las que cambiaron.</w:t>
+        <w:t xml:space="preserve">Porcentaje de avance al analizar una playlist o todo.</w:t>
       </w:r>
     </w:p>
     <w:p>
@@ -18317,7 +18280,7 @@
                 <w:sz w:val="24"/>
                 <w:szCs w:val="24"/>
               </w:rPr>
-              <w:t xml:space="preserve">v1.1.0</w:t>
+              <w:t xml:space="preserve">v1.2.0</w:t>
             </w:r>
           </w:p>
           <w:p>
@@ -18364,7 +18327,7 @@
                 <w:sz w:val="23"/>
                 <w:szCs w:val="23"/>
               </w:rPr>
-              <w:t xml:space="preserve">Se cuida sola</w:t>
+              <w:t xml:space="preserve">Por playlist</w:t>
             </w:r>
           </w:p>
         </w:tc>
@@ -18382,7 +18345,7 @@
         <w:spacing w:after="60" w:line="276"/>
       </w:pPr>
       <w:r>
-        <w:t xml:space="preserve">Actualizaciones automáticas.</w:t>
+        <w:t xml:space="preserve">Analizar y Organizar por playlist.</w:t>
       </w:r>
     </w:p>
     <w:p>
@@ -18397,22 +18360,7 @@
         <w:spacing w:after="60" w:line="276"/>
       </w:pPr>
       <w:r>
-        <w:t xml:space="preserve">Se repara sola si cambia Python.</w:t>
-      </w:r>
-    </w:p>
-    <w:p>
-      <w:pPr>
-        <w:pStyle w:val="ListParagraph"/>
-        <w:keepNext/>
-        <w:keepLines/>
-        <w:numPr>
-          <w:ilvl w:val="0"/>
-          <w:numId w:val="2"/>
-        </w:numPr>
-        <w:spacing w:after="60" w:line="276"/>
-      </w:pPr>
-      <w:r>
-        <w:t xml:space="preserve">Botones para copiar links.</w:t>
+        <w:t xml:space="preserve">Aviso al instante cuando llega una descarga.</w:t>
       </w:r>
     </w:p>
     <w:p>
@@ -18427,7 +18375,7 @@
         <w:spacing w:after="60" w:line="276"/>
       </w:pPr>
       <w:r>
-        <w:t xml:space="preserve">Compatible con Windows.</w:t>
+        <w:t xml:space="preserve">⟳ para traer solo la lista de playlists, con ● en las que cambiaron.</w:t>
       </w:r>
     </w:p>
     <w:p>
@@ -18483,7 +18431,7 @@
                 <w:sz w:val="24"/>
                 <w:szCs w:val="24"/>
               </w:rPr>
-              <w:t xml:space="preserve">v1.0.0</w:t>
+              <w:t xml:space="preserve">v1.1.0</w:t>
             </w:r>
           </w:p>
           <w:p>
@@ -18530,7 +18478,173 @@
                 <w:sz w:val="23"/>
                 <w:szCs w:val="23"/>
               </w:rPr>
-              <w:t xml:space="preserve">Primera versión (SpotiSync)</w:t>
+              <w:t xml:space="preserve">Se cuida sola</w:t>
+            </w:r>
+          </w:p>
+        </w:tc>
+      </w:tr>
+    </w:tbl>
+    <w:p>
+      <w:pPr>
+        <w:pStyle w:val="ListParagraph"/>
+        <w:keepNext/>
+        <w:keepLines/>
+        <w:numPr>
+          <w:ilvl w:val="0"/>
+          <w:numId w:val="2"/>
+        </w:numPr>
+        <w:spacing w:after="60" w:line="276"/>
+      </w:pPr>
+      <w:r>
+        <w:t xml:space="preserve">Actualizaciones automáticas.</w:t>
+      </w:r>
+    </w:p>
+    <w:p>
+      <w:pPr>
+        <w:pStyle w:val="ListParagraph"/>
+        <w:keepNext/>
+        <w:keepLines/>
+        <w:numPr>
+          <w:ilvl w:val="0"/>
+          <w:numId w:val="2"/>
+        </w:numPr>
+        <w:spacing w:after="60" w:line="276"/>
+      </w:pPr>
+      <w:r>
+        <w:t xml:space="preserve">Se repara sola si cambia Python.</w:t>
+      </w:r>
+    </w:p>
+    <w:p>
+      <w:pPr>
+        <w:pStyle w:val="ListParagraph"/>
+        <w:keepNext/>
+        <w:keepLines/>
+        <w:numPr>
+          <w:ilvl w:val="0"/>
+          <w:numId w:val="2"/>
+        </w:numPr>
+        <w:spacing w:after="60" w:line="276"/>
+      </w:pPr>
+      <w:r>
+        <w:t xml:space="preserve">Botones para copiar links.</w:t>
+      </w:r>
+    </w:p>
+    <w:p>
+      <w:pPr>
+        <w:pStyle w:val="ListParagraph"/>
+        <w:keepNext w:val="false"/>
+        <w:keepLines/>
+        <w:numPr>
+          <w:ilvl w:val="0"/>
+          <w:numId w:val="2"/>
+        </w:numPr>
+        <w:spacing w:after="60" w:line="276"/>
+      </w:pPr>
+      <w:r>
+        <w:t xml:space="preserve">Compatible con Windows.</w:t>
+      </w:r>
+    </w:p>
+    <w:p>
+      <w:pPr>
+        <w:spacing w:after="80"/>
+      </w:pPr>
+    </w:p>
+    <w:tbl>
+      <w:tblPr>
+        <w:tblW w:type="dxa" w:w="9360"/>
+        <w:tblBorders>
+          <w:top w:val="single" w:color="auto" w:sz="4"/>
+          <w:left w:val="single" w:color="auto" w:sz="4"/>
+          <w:bottom w:val="single" w:color="auto" w:sz="4"/>
+          <w:right w:val="single" w:color="auto" w:sz="4"/>
+          <w:insideH w:val="single" w:color="auto" w:sz="4"/>
+          <w:insideV w:val="single" w:color="auto" w:sz="4"/>
+        </w:tblBorders>
+      </w:tblPr>
+      <w:tblGrid>
+        <w:gridCol w:w="1900"/>
+        <w:gridCol w:w="7460"/>
+      </w:tblGrid>
+      <w:tr>
+        <w:tc>
+          <w:tcPr>
+            <w:tcW w:type="dxa" w:w="1900"/>
+            <w:tcBorders>
+              <w:top w:val="single" w:color="D5D9E0" w:sz="4"/>
+              <w:left w:val="single" w:color="D5D9E0" w:sz="4"/>
+              <w:bottom w:val="single" w:color="D5D9E0" w:sz="4"/>
+              <w:right w:val="single" w:color="D5D9E0" w:sz="4"/>
+            </w:tcBorders>
+            <w:shd w:fill="1F2A44" w:color="auto" w:val="clear"/>
+            <w:tcMar>
+              <w:top w:type="dxa" w:w="80"/>
+              <w:left w:type="dxa" w:w="140"/>
+              <w:bottom w:type="dxa" w:w="80"/>
+              <w:right w:type="dxa" w:w="140"/>
+            </w:tcMar>
+            <w:vAlign w:val="center"/>
+          </w:tcPr>
+          <w:p>
+            <w:pPr>
+              <w:keepNext/>
+              <w:keepLines/>
+            </w:pPr>
+            <w:r>
+              <w:rPr>
+                <w:b/>
+                <w:bCs/>
+                <w:color w:val="FFFFFF"/>
+                <w:sz w:val="24"/>
+                <w:szCs w:val="24"/>
+              </w:rPr>
+              <w:t xml:space="preserve">v1.0.0</w:t>
+            </w:r>
+          </w:p>
+          <w:p>
+            <w:pPr>
+              <w:keepNext/>
+            </w:pPr>
+            <w:r>
+              <w:rPr>
+                <w:color w:val="FFFFFF"/>
+                <w:sz w:val="17"/>
+                <w:szCs w:val="17"/>
+              </w:rPr>
+              <w:t xml:space="preserve">16 oct 2026</w:t>
+            </w:r>
+          </w:p>
+        </w:tc>
+        <w:tc>
+          <w:tcPr>
+            <w:tcW w:type="dxa" w:w="7460"/>
+            <w:tcBorders>
+              <w:top w:val="single" w:color="D5D9E0" w:sz="4"/>
+              <w:left w:val="single" w:color="D5D9E0" w:sz="4"/>
+              <w:bottom w:val="single" w:color="D5D9E0" w:sz="4"/>
+              <w:right w:val="single" w:color="D5D9E0" w:sz="4"/>
+            </w:tcBorders>
+            <w:shd w:fill="F5F7FA" w:color="auto" w:val="clear"/>
+            <w:tcMar>
+              <w:top w:type="dxa" w:w="80"/>
+              <w:left w:type="dxa" w:w="160"/>
+              <w:bottom w:type="dxa" w:w="80"/>
+              <w:right w:type="dxa" w:w="140"/>
+            </w:tcMar>
+            <w:vAlign w:val="center"/>
+          </w:tcPr>
+          <w:p>
+            <w:pPr>
+              <w:keepNext/>
+            </w:pPr>
+            <w:r>
+              <w:rPr>
+                <w:b/>
+                <w:bCs/>
+                <w:color w:val="1F2A44"/>
+                <w:sz w:val="23"/>
+                <w:szCs w:val="23"/>
+              </w:rPr>
+              <w:t xml:space="preserve">Primera versión</w:t>
             </w:r>
           </w:p>
         </w:tc>

</xml_diff>

<commit_message>
v2.18.0: música nueva de Rekordbox sin duplicados; playlists de otros sin ventana; BrainOrder by @BRAINWASHERDJ
- Playlists nuevas de Rekordbox (y otros programas de DJ): solo pregunta si traen música nueva.
  Revisa archivo por archivo (ya en BrainOrder, copia exacta o misma canción) y nunca copia dos veces.
  Si ya existe una playlist con ese nombre, le suma lo nuevo en vez de crear otra.
- Playlists de otros: ya no salen en una ventana al abrir/analizar; quedan en su sección.
- Autoría @BRAINWASHERDJ: LICENSE, interfaz y marca de agua, informes Excel/.txt, M3U,
  descripción de playlists en Spotify, instaladores, README y manual.

Co-Authored-By: Claude Opus 5.5 <noreply@anthropic.com>
Claude-Session: https://claude.ai/code/session_013XWL8ZEgfzfbr29rvvM38F
</commit_message>
<xml_diff>
--- a/docs/BrainOrder - Manual de usuario.docx
+++ b/docs/BrainOrder - Manual de usuario.docx
@@ -73,7 +73,7 @@
           <w:sz w:val="26"/>
           <w:szCs w:val="26"/>
         </w:rPr>
-        <w:t xml:space="preserve">Versión 2.17.2</w:t>
+        <w:t xml:space="preserve">Versión 2.18.0</w:t>
       </w:r>
     </w:p>
     <w:p>
@@ -83,7 +83,17 @@
           <w:sz w:val="22"/>
           <w:szCs w:val="22"/>
         </w:rPr>
-        <w:t xml:space="preserve">Actualizado: 19 de octubre de 2026 · macOS y Windows</w:t>
+        <w:t xml:space="preserve">Actualizado: 22 de octubre de 2026 · macOS y Windows</w:t>
+      </w:r>
+    </w:p>
+    <w:p>
+      <w:r>
+        <w:rPr>
+          <w:color w:val="6B7280"/>
+          <w:sz w:val="22"/>
+          <w:szCs w:val="22"/>
+        </w:rPr>
+        <w:t xml:space="preserve">BrainOrder by @BRAINWASHERDJ · © 2026 @BRAINWASHERDJ. Todos los derechos reservados.</w:t>
       </w:r>
     </w:p>
     <w:p>
@@ -356,7 +366,7 @@
           <w:sz w:val="22"/>
           <w:szCs w:val="22"/>
         </w:rPr>
-        <w:t xml:space="preserve">	14</w:t>
+        <w:t xml:space="preserve">	15</w:t>
       </w:r>
     </w:p>
     <w:p>
@@ -5980,7 +5990,7 @@
         <w:spacing w:after="120" w:line="276"/>
       </w:pPr>
       <w:r>
-        <w:t xml:space="preserve">Spotify no deja que una app personal lea canciones de playlists que no son tuyas. BrainOrder te pregunta qué hacer con ellas; para integrarlas, cópialas en Spotify a una playlist tuya (Seleccionar todo → Añadir a playlist → Nueva playlist).</w:t>
+        <w:t xml:space="preserve">Spotify no deja que una app personal lea canciones de playlists que no son tuyas. Desde la 2.18.0 BrainOrder ya no te las pregunta en una ventana al abrir: quedan en la sección Playlists de otros, donde decides qué hacer con ellas. Para integrarlas, cópialas en Spotify a una playlist tuya (Seleccionar todo → Añadir a playlist → Nueva playlist).</w:t>
       </w:r>
     </w:p>
     <w:p>
@@ -6727,6 +6737,130 @@
       </w:r>
       <w:r>
         <w:t xml:space="preserve"> (cuando lo cierras, que es cuando Traktor guarda), en cuanto tiene canciones.</w:t>
+      </w:r>
+    </w:p>
+    <w:p>
+      <w:pPr>
+        <w:pStyle w:val="Heading2"/>
+      </w:pPr>
+      <w:r>
+        <w:t xml:space="preserve">Solo la música nueva, sin duplicar nada</w:t>
+      </w:r>
+    </w:p>
+    <w:p>
+      <w:pPr>
+        <w:spacing w:after="120" w:line="276"/>
+      </w:pPr>
+      <w:r>
+        <w:t xml:space="preserve">Antes de preguntarte por una playlist nueva de Rekordbox (o de tus otros programas de DJ), BrainOrder revisa canción por canción si ya la tienes:</w:t>
+      </w:r>
+    </w:p>
+    <w:p>
+      <w:pPr>
+        <w:pStyle w:val="ListParagraph"/>
+        <w:numPr>
+          <w:ilvl w:val="0"/>
+          <w:numId w:val="2"/>
+        </w:numPr>
+        <w:spacing w:after="60" w:line="276"/>
+      </w:pPr>
+      <w:r>
+        <w:rPr>
+          <w:b/>
+          <w:bCs/>
+        </w:rPr>
+        <w:t xml:space="preserve">Ya está en tus playlists: </w:t>
+      </w:r>
+      <w:r>
+        <w:t xml:space="preserve">el mismo archivo ya es de una playlist de BrainOrder.</w:t>
+      </w:r>
+    </w:p>
+    <w:p>
+      <w:pPr>
+        <w:pStyle w:val="ListParagraph"/>
+        <w:numPr>
+          <w:ilvl w:val="0"/>
+          <w:numId w:val="2"/>
+        </w:numPr>
+        <w:spacing w:after="60" w:line="276"/>
+      </w:pPr>
+      <w:r>
+        <w:rPr>
+          <w:b/>
+          <w:bCs/>
+        </w:rPr>
+        <w:t xml:space="preserve">Copia exacta: </w:t>
+      </w:r>
+      <w:r>
+        <w:t xml:space="preserve">el archivo tiene el mismo contenido que uno que ya tienes, aunque se llame distinto.</w:t>
+      </w:r>
+    </w:p>
+    <w:p>
+      <w:pPr>
+        <w:pStyle w:val="ListParagraph"/>
+        <w:numPr>
+          <w:ilvl w:val="0"/>
+          <w:numId w:val="2"/>
+        </w:numPr>
+        <w:spacing w:after="60" w:line="276"/>
+      </w:pPr>
+      <w:r>
+        <w:rPr>
+          <w:b/>
+          <w:bCs/>
+        </w:rPr>
+        <w:t xml:space="preserve">Misma canción: </w:t>
+      </w:r>
+      <w:r>
+        <w:t xml:space="preserve">mismo artista, título, versión y duración que una que ya tienes.</w:t>
+      </w:r>
+    </w:p>
+    <w:p>
+      <w:pPr>
+        <w:spacing w:after="120" w:line="276"/>
+      </w:pPr>
+      <w:r>
+        <w:t xml:space="preserve">Solo te pregunta cuando hay música nueva, y te dice cuántas canciones son nuevas y cuántas ya tienes. Lo que ya tienes no se copia otra vez: la playlist usa tu archivo de siempre. La copia repetida no se borra ni se mueve (si quieres limpiarla, usa Duplicados).</w:t>
+      </w:r>
+    </w:p>
+    <w:p>
+      <w:pPr>
+        <w:pStyle w:val="ListParagraph"/>
+        <w:numPr>
+          <w:ilvl w:val="0"/>
+          <w:numId w:val="2"/>
+        </w:numPr>
+        <w:spacing w:after="60" w:line="276"/>
+      </w:pPr>
+      <w:r>
+        <w:rPr>
+          <w:b/>
+          <w:bCs/>
+        </w:rPr>
+        <w:t xml:space="preserve">Si ya existe una playlist con ese nombre </w:t>
+      </w:r>
+      <w:r>
+        <w:t xml:space="preserve">(aunque cambien tildes, emojis o mayúsculas) no se crea otra: el botón dice Sumar lo nuevo y solo agrega las canciones nuevas a esa playlist, también en Spotify si es de Spotify.</w:t>
+      </w:r>
+    </w:p>
+    <w:p>
+      <w:pPr>
+        <w:pStyle w:val="ListParagraph"/>
+        <w:numPr>
+          <w:ilvl w:val="0"/>
+          <w:numId w:val="2"/>
+        </w:numPr>
+        <w:spacing w:after="60" w:line="276"/>
+      </w:pPr>
+      <w:r>
+        <w:rPr>
+          <w:b/>
+          <w:bCs/>
+        </w:rPr>
+        <w:t xml:space="preserve">Si no trae nada nuevo, </w:t>
+      </w:r>
+      <w:r>
+        <w:t xml:space="preserve">no te pregunta; igual la ves en Playlists nuevas por si quieres importarla.</w:t>
       </w:r>
     </w:p>
     <w:p>
@@ -12088,7 +12222,7 @@
                 <w:sz w:val="24"/>
                 <w:szCs w:val="24"/>
               </w:rPr>
-              <w:t xml:space="preserve">v2.17.2</w:t>
+              <w:t xml:space="preserve">v2.18.0</w:t>
             </w:r>
           </w:p>
           <w:p>
@@ -12135,7 +12269,7 @@
                 <w:sz w:val="23"/>
                 <w:szCs w:val="23"/>
               </w:rPr>
-              <w:t xml:space="preserve">Mixed In Key en Windows</w:t>
+              <w:t xml:space="preserve">Música nueva de Rekordbox · @BRAINWASHERDJ</w:t>
             </w:r>
             <w:r>
               <w:rPr>
@@ -12146,6 +12280,205 @@
                 <w:szCs w:val="18"/>
               </w:rPr>
               <w:t xml:space="preserve">   · versión actual</w:t>
+            </w:r>
+          </w:p>
+        </w:tc>
+      </w:tr>
+    </w:tbl>
+    <w:p>
+      <w:pPr>
+        <w:pStyle w:val="ListParagraph"/>
+        <w:keepNext/>
+        <w:keepLines/>
+        <w:numPr>
+          <w:ilvl w:val="0"/>
+          <w:numId w:val="2"/>
+        </w:numPr>
+        <w:spacing w:after="60" w:line="276"/>
+      </w:pPr>
+      <w:r>
+        <w:rPr>
+          <w:b/>
+          <w:bCs/>
+        </w:rPr>
+        <w:t xml:space="preserve">Nuevo: </w:t>
+      </w:r>
+      <w:r>
+        <w:t xml:space="preserve">cuando creas una playlist en Rekordbox, BrainOrder te pregunta si importas su música nueva. Antes revisa que no se dupliquen archivos (mismo archivo, copia exacta o misma canción) ni playlists.</w:t>
+      </w:r>
+    </w:p>
+    <w:p>
+      <w:pPr>
+        <w:pStyle w:val="ListParagraph"/>
+        <w:keepNext/>
+        <w:keepLines/>
+        <w:numPr>
+          <w:ilvl w:val="0"/>
+          <w:numId w:val="2"/>
+        </w:numPr>
+        <w:spacing w:after="60" w:line="276"/>
+      </w:pPr>
+      <w:r>
+        <w:rPr>
+          <w:b/>
+          <w:bCs/>
+        </w:rPr>
+        <w:t xml:space="preserve">Sin playlists repetidas: </w:t>
+      </w:r>
+      <w:r>
+        <w:t xml:space="preserve">si ya tienes una playlist con ese nombre, se le suma lo nuevo (botón Sumar lo nuevo) en vez de crear otra.</w:t>
+      </w:r>
+    </w:p>
+    <w:p>
+      <w:pPr>
+        <w:pStyle w:val="ListParagraph"/>
+        <w:keepNext/>
+        <w:keepLines/>
+        <w:numPr>
+          <w:ilvl w:val="0"/>
+          <w:numId w:val="2"/>
+        </w:numPr>
+        <w:spacing w:after="60" w:line="276"/>
+      </w:pPr>
+      <w:r>
+        <w:rPr>
+          <w:b/>
+          <w:bCs/>
+        </w:rPr>
+        <w:t xml:space="preserve">Playlists de otros: </w:t>
+      </w:r>
+      <w:r>
+        <w:t xml:space="preserve">ya no salen en una ventana al abrir; quedan en su sección.</w:t>
+      </w:r>
+    </w:p>
+    <w:p>
+      <w:pPr>
+        <w:pStyle w:val="ListParagraph"/>
+        <w:keepNext/>
+        <w:keepLines/>
+        <w:numPr>
+          <w:ilvl w:val="0"/>
+          <w:numId w:val="2"/>
+        </w:numPr>
+        <w:spacing w:after="60" w:line="276"/>
+      </w:pPr>
+      <w:r>
+        <w:rPr>
+          <w:b/>
+          <w:bCs/>
+        </w:rPr>
+        <w:t xml:space="preserve">BrainOrder by @BRAINWASHERDJ: </w:t>
+      </w:r>
+      <w:r>
+        <w:t xml:space="preserve">la app queda registrada a nombre de @BRAINWASHERDJ (licencia en el repositorio). La firma aparece en la ventana, los informes Excel y .txt, las listas M3U, la descripción de las playlists creadas en Spotify y los instaladores. Nunca se escribe nada dentro de tus archivos de música.</w:t>
+      </w:r>
+    </w:p>
+    <w:tbl>
+      <w:tblPr>
+        <w:tblW w:type="dxa" w:w="9360"/>
+        <w:tblBorders>
+          <w:top w:val="single" w:color="auto" w:sz="4"/>
+          <w:left w:val="single" w:color="auto" w:sz="4"/>
+          <w:bottom w:val="single" w:color="auto" w:sz="4"/>
+          <w:right w:val="single" w:color="auto" w:sz="4"/>
+          <w:insideH w:val="single" w:color="auto" w:sz="4"/>
+          <w:insideV w:val="single" w:color="auto" w:sz="4"/>
+        </w:tblBorders>
+      </w:tblPr>
+      <w:tblGrid>
+        <w:gridCol w:w="1900"/>
+        <w:gridCol w:w="7460"/>
+      </w:tblGrid>
+      <w:tr>
+        <w:tc>
+          <w:tcPr>
+            <w:tcW w:type="dxa" w:w="1900"/>
+            <w:tcBorders>
+              <w:top w:val="single" w:color="D5D9E0" w:sz="4"/>
+              <w:left w:val="single" w:color="D5D9E0" w:sz="4"/>
+              <w:bottom w:val="single" w:color="D5D9E0" w:sz="4"/>
+              <w:right w:val="single" w:color="D5D9E0" w:sz="4"/>
+            </w:tcBorders>
+            <w:shd w:fill="1F2A44" w:color="auto" w:val="clear"/>
+            <w:tcMar>
+              <w:top w:type="dxa" w:w="80"/>
+              <w:left w:type="dxa" w:w="140"/>
+              <w:bottom w:type="dxa" w:w="80"/>
+              <w:right w:type="dxa" w:w="140"/>
+            </w:tcMar>
+            <w:vAlign w:val="center"/>
+          </w:tcPr>
+          <w:p>
+            <w:pPr>
+              <w:keepNext/>
+              <w:keepLines/>
+            </w:pPr>
+            <w:r>
+              <w:rPr>
+                <w:b/>
+                <w:bCs/>
+                <w:color w:val="FFFFFF"/>
+                <w:sz w:val="24"/>
+                <w:szCs w:val="24"/>
+              </w:rPr>
+              <w:t xml:space="preserve">v2.17.2</w:t>
+            </w:r>
+          </w:p>
+          <w:p>
+            <w:pPr>
+              <w:keepNext/>
+            </w:pPr>
+            <w:r>
+              <w:rPr>
+                <w:color w:val="FFFFFF"/>
+                <w:sz w:val="17"/>
+                <w:szCs w:val="17"/>
+              </w:rPr>
+              <w:t xml:space="preserve">22 oct 2026</w:t>
+            </w:r>
+          </w:p>
+        </w:tc>
+        <w:tc>
+          <w:tcPr>
+            <w:tcW w:type="dxa" w:w="7460"/>
+            <w:tcBorders>
+              <w:top w:val="single" w:color="D5D9E0" w:sz="4"/>
+              <w:left w:val="single" w:color="D5D9E0" w:sz="4"/>
+              <w:bottom w:val="single" w:color="D5D9E0" w:sz="4"/>
+              <w:right w:val="single" w:color="D5D9E0" w:sz="4"/>
+            </w:tcBorders>
+            <w:shd w:fill="F5F7FA" w:color="auto" w:val="clear"/>
+            <w:tcMar>
+              <w:top w:type="dxa" w:w="80"/>
+              <w:left w:type="dxa" w:w="160"/>
+              <w:bottom w:type="dxa" w:w="80"/>
+              <w:right w:type="dxa" w:w="140"/>
+            </w:tcMar>
+            <w:vAlign w:val="center"/>
+          </w:tcPr>
+          <w:p>
+            <w:pPr>
+              <w:keepNext/>
+            </w:pPr>
+            <w:r>
+              <w:rPr>
+                <w:b/>
+                <w:bCs/>
+                <w:color w:val="1F2A44"/>
+                <w:sz w:val="23"/>
+                <w:szCs w:val="23"/>
+              </w:rPr>
+              <w:t xml:space="preserve">Mixed In Key en Windows</w:t>
+            </w:r>
+            <w:r>
+              <w:rPr>
+                <w:b/>
+                <w:bCs/>
+                <w:color w:val="7FB800"/>
+                <w:sz w:val="18"/>
+                <w:szCs w:val="18"/>
+              </w:rPr>
+              <w:t xml:space="preserve"/>
             </w:r>
           </w:p>
         </w:tc>
@@ -18847,7 +19180,7 @@
         <w:sz w:val="17"/>
         <w:szCs w:val="17"/>
       </w:rPr>
-      <w:t xml:space="preserve">Página </w:t>
+      <w:t xml:space="preserve">BrainOrder by @BRAINWASHERDJ  ·  © 2026  ·  Página </w:t>
     </w:r>
     <w:r>
       <w:rPr>
@@ -18933,7 +19266,7 @@
         <w:sz w:val="17"/>
         <w:szCs w:val="17"/>
       </w:rPr>
-      <w:t xml:space="preserve">  ·  Manual de usuario</w:t>
+      <w:t xml:space="preserve">  ·  Manual de usuario  ·  by @BRAINWASHERDJ</w:t>
     </w:r>
   </w:p>
 </w:hdr>

</xml_diff>

<commit_message>
v2.18.3: descargas reconocidas por ISRC aunque Deezer escriba el nombre distinto
- Las descargas se emparejan por el ISRC de sus etiquetas (95 de las 104 de Frank no se
  reconocían por diferencias de nombre entre Deezer y Spotify).
- Nombres más tolerantes: apóstrofos curvos, «y»/«&»/«x», Pt./Part y números romanos,
  letras sin forma ASCII (ı, ø, ł…), artistas pegados (Audio Jack / Audiojack).
- El resto de la biblioteca también se cruza por ISRC si una canción no aparece por nombre
  (una vez, con caché).

Co-Authored-By: Claude Opus 5.5 <noreply@anthropic.com>
Claude-Session: https://claude.ai/code/session_013XWL8ZEgfzfbr29rvvM38F
</commit_message>
<xml_diff>
--- a/docs/BrainOrder - Manual de usuario.docx
+++ b/docs/BrainOrder - Manual de usuario.docx
@@ -73,7 +73,7 @@
           <w:sz w:val="26"/>
           <w:szCs w:val="26"/>
         </w:rPr>
-        <w:t xml:space="preserve">Versión 2.18.0</w:t>
+        <w:t xml:space="preserve">Versión 2.18.3</w:t>
       </w:r>
     </w:p>
     <w:p>
@@ -12222,7 +12222,7 @@
                 <w:sz w:val="24"/>
                 <w:szCs w:val="24"/>
               </w:rPr>
-              <w:t xml:space="preserve">v2.18.0</w:t>
+              <w:t xml:space="preserve">v2.18.3</w:t>
             </w:r>
           </w:p>
           <w:p>
@@ -12269,7 +12269,7 @@
                 <w:sz w:val="23"/>
                 <w:szCs w:val="23"/>
               </w:rPr>
-              <w:t xml:space="preserve">Música nueva de Rekordbox · @BRAINWASHERDJ</w:t>
+              <w:t xml:space="preserve">Descargas reconocidas por ISRC</w:t>
             </w:r>
             <w:r>
               <w:rPr>
@@ -12280,6 +12280,183 @@
                 <w:szCs w:val="18"/>
               </w:rPr>
               <w:t xml:space="preserve">   · versión actual</w:t>
+            </w:r>
+          </w:p>
+        </w:tc>
+      </w:tr>
+    </w:tbl>
+    <w:p>
+      <w:pPr>
+        <w:pStyle w:val="ListParagraph"/>
+        <w:keepNext/>
+        <w:keepLines/>
+        <w:numPr>
+          <w:ilvl w:val="0"/>
+          <w:numId w:val="2"/>
+        </w:numPr>
+        <w:spacing w:after="60" w:line="276"/>
+      </w:pPr>
+      <w:r>
+        <w:rPr>
+          <w:b/>
+          <w:bCs/>
+        </w:rPr>
+        <w:t xml:space="preserve">Arreglado: </w:t>
+      </w:r>
+      <w:r>
+        <w:t xml:space="preserve">las canciones descargadas con los links de BrainOrder no se reconocían cuando Deezer escribe el nombre distinto que Spotify (apóstrofos, «y» / «&amp;», «Pt. I» / «Part 1», letras como ı o ø). Ahora se emparejan por su ISRC, el código de la grabación que traen dentro, y los nombres se comparan con más tolerancia.</w:t>
+      </w:r>
+    </w:p>
+    <w:p>
+      <w:pPr>
+        <w:pStyle w:val="ListParagraph"/>
+        <w:keepNext/>
+        <w:keepLines/>
+        <w:numPr>
+          <w:ilvl w:val="0"/>
+          <w:numId w:val="2"/>
+        </w:numPr>
+        <w:spacing w:after="60" w:line="276"/>
+      </w:pPr>
+      <w:r>
+        <w:rPr>
+          <w:b/>
+          <w:bCs/>
+        </w:rPr>
+        <w:t xml:space="preserve">También en tu música: </w:t>
+      </w:r>
+      <w:r>
+        <w:t xml:space="preserve">canciones que ya tenías con otro nombre dejan de salir como «por descargar». La primera vez el análisis tarda unos segundos más (lee los códigos una vez y quedan guardados).</w:t>
+      </w:r>
+    </w:p>
+    <w:p>
+      <w:pPr>
+        <w:pStyle w:val="ListParagraph"/>
+        <w:keepNext/>
+        <w:keepLines/>
+        <w:numPr>
+          <w:ilvl w:val="0"/>
+          <w:numId w:val="2"/>
+        </w:numPr>
+        <w:spacing w:after="60" w:line="276"/>
+      </w:pPr>
+      <w:r>
+        <w:rPr>
+          <w:b/>
+          <w:bCs/>
+        </w:rPr>
+        <w:t xml:space="preserve">Ajustes: </w:t>
+      </w:r>
+      <w:r>
+        <w:t xml:space="preserve">botón Buscar actualizaciones; «by @BRAINWASHERDJ» debajo del logo.</w:t>
+      </w:r>
+    </w:p>
+    <w:tbl>
+      <w:tblPr>
+        <w:tblW w:type="dxa" w:w="9360"/>
+        <w:tblBorders>
+          <w:top w:val="single" w:color="auto" w:sz="4"/>
+          <w:left w:val="single" w:color="auto" w:sz="4"/>
+          <w:bottom w:val="single" w:color="auto" w:sz="4"/>
+          <w:right w:val="single" w:color="auto" w:sz="4"/>
+          <w:insideH w:val="single" w:color="auto" w:sz="4"/>
+          <w:insideV w:val="single" w:color="auto" w:sz="4"/>
+        </w:tblBorders>
+      </w:tblPr>
+      <w:tblGrid>
+        <w:gridCol w:w="1900"/>
+        <w:gridCol w:w="7460"/>
+      </w:tblGrid>
+      <w:tr>
+        <w:tc>
+          <w:tcPr>
+            <w:tcW w:type="dxa" w:w="1900"/>
+            <w:tcBorders>
+              <w:top w:val="single" w:color="D5D9E0" w:sz="4"/>
+              <w:left w:val="single" w:color="D5D9E0" w:sz="4"/>
+              <w:bottom w:val="single" w:color="D5D9E0" w:sz="4"/>
+              <w:right w:val="single" w:color="D5D9E0" w:sz="4"/>
+            </w:tcBorders>
+            <w:shd w:fill="1F2A44" w:color="auto" w:val="clear"/>
+            <w:tcMar>
+              <w:top w:type="dxa" w:w="80"/>
+              <w:left w:type="dxa" w:w="140"/>
+              <w:bottom w:type="dxa" w:w="80"/>
+              <w:right w:type="dxa" w:w="140"/>
+            </w:tcMar>
+            <w:vAlign w:val="center"/>
+          </w:tcPr>
+          <w:p>
+            <w:pPr>
+              <w:keepNext/>
+              <w:keepLines/>
+            </w:pPr>
+            <w:r>
+              <w:rPr>
+                <w:b/>
+                <w:bCs/>
+                <w:color w:val="FFFFFF"/>
+                <w:sz w:val="24"/>
+                <w:szCs w:val="24"/>
+              </w:rPr>
+              <w:t xml:space="preserve">v2.18.0</w:t>
+            </w:r>
+          </w:p>
+          <w:p>
+            <w:pPr>
+              <w:keepNext/>
+            </w:pPr>
+            <w:r>
+              <w:rPr>
+                <w:color w:val="FFFFFF"/>
+                <w:sz w:val="17"/>
+                <w:szCs w:val="17"/>
+              </w:rPr>
+              <w:t xml:space="preserve">22 oct 2026</w:t>
+            </w:r>
+          </w:p>
+        </w:tc>
+        <w:tc>
+          <w:tcPr>
+            <w:tcW w:type="dxa" w:w="7460"/>
+            <w:tcBorders>
+              <w:top w:val="single" w:color="D5D9E0" w:sz="4"/>
+              <w:left w:val="single" w:color="D5D9E0" w:sz="4"/>
+              <w:bottom w:val="single" w:color="D5D9E0" w:sz="4"/>
+              <w:right w:val="single" w:color="D5D9E0" w:sz="4"/>
+            </w:tcBorders>
+            <w:shd w:fill="F5F7FA" w:color="auto" w:val="clear"/>
+            <w:tcMar>
+              <w:top w:type="dxa" w:w="80"/>
+              <w:left w:type="dxa" w:w="160"/>
+              <w:bottom w:type="dxa" w:w="80"/>
+              <w:right w:type="dxa" w:w="140"/>
+            </w:tcMar>
+            <w:vAlign w:val="center"/>
+          </w:tcPr>
+          <w:p>
+            <w:pPr>
+              <w:keepNext/>
+            </w:pPr>
+            <w:r>
+              <w:rPr>
+                <w:b/>
+                <w:bCs/>
+                <w:color w:val="1F2A44"/>
+                <w:sz w:val="23"/>
+                <w:szCs w:val="23"/>
+              </w:rPr>
+              <w:t xml:space="preserve">Música nueva de Rekordbox · @BRAINWASHERDJ</w:t>
+            </w:r>
+            <w:r>
+              <w:rPr>
+                <w:b/>
+                <w:bCs/>
+                <w:color w:val="7FB800"/>
+                <w:sz w:val="18"/>
+                <w:szCs w:val="18"/>
+              </w:rPr>
+              <w:t xml:space="preserve"/>
             </w:r>
           </w:p>
         </w:tc>

</xml_diff>

<commit_message>
v2.18.5: conservar y recuperar las copias analizadas con Mixed In Key
- Unificar repetidos no miraba Mixed In Key al elegir qué copia conservar; Duplicados lo ponía por
  debajo de «está en Rekordbox». Ahora la copia analizada se conserva (salvo cues en Rekordbox).
- «Sin Mixed In Key»: botón Recuperar para las canciones cuya copia analizada quedó en _duplicados
  (intercambio en el mismo nombre y carpeta; se deshace en Historial).
- Historial puede deshacer intercambios de archivos.
- Las etiquetas se leen aunque el audio del archivo esté dañado.

Co-Authored-By: Claude Opus 5.5 <noreply@anthropic.com>
Claude-Session: https://claude.ai/code/session_013XWL8ZEgfzfbr29rvvM38F
</commit_message>
<xml_diff>
--- a/docs/BrainOrder - Manual de usuario.docx
+++ b/docs/BrainOrder - Manual de usuario.docx
@@ -73,7 +73,7 @@
           <w:sz w:val="26"/>
           <w:szCs w:val="26"/>
         </w:rPr>
-        <w:t xml:space="preserve">Versión 2.18.3</w:t>
+        <w:t xml:space="preserve">Versión 2.18.5</w:t>
       </w:r>
     </w:p>
     <w:p>
@@ -12222,7 +12222,7 @@
                 <w:sz w:val="24"/>
                 <w:szCs w:val="24"/>
               </w:rPr>
-              <w:t xml:space="preserve">v2.18.3</w:t>
+              <w:t xml:space="preserve">v2.18.5</w:t>
             </w:r>
           </w:p>
           <w:p>
@@ -12269,7 +12269,7 @@
                 <w:sz w:val="23"/>
                 <w:szCs w:val="23"/>
               </w:rPr>
-              <w:t xml:space="preserve">Descargas reconocidas por ISRC</w:t>
+              <w:t xml:space="preserve">Copias analizadas con Mixed In Key</w:t>
             </w:r>
             <w:r>
               <w:rPr>
@@ -12280,6 +12280,183 @@
                 <w:szCs w:val="18"/>
               </w:rPr>
               <w:t xml:space="preserve">   · versión actual</w:t>
+            </w:r>
+          </w:p>
+        </w:tc>
+      </w:tr>
+    </w:tbl>
+    <w:p>
+      <w:pPr>
+        <w:pStyle w:val="ListParagraph"/>
+        <w:keepNext/>
+        <w:keepLines/>
+        <w:numPr>
+          <w:ilvl w:val="0"/>
+          <w:numId w:val="2"/>
+        </w:numPr>
+        <w:spacing w:after="60" w:line="276"/>
+      </w:pPr>
+      <w:r>
+        <w:rPr>
+          <w:b/>
+          <w:bCs/>
+        </w:rPr>
+        <w:t xml:space="preserve">Arreglado: </w:t>
+      </w:r>
+      <w:r>
+        <w:t xml:space="preserve">Unificar repetidos a veces conservaba la copia sin analizar y apartaba en _duplicados la que Mixed In Key ya había analizado. Mixed In Key reconoce la canción de su colección y no vuelve a escribir en la otra copia, así que se quedaba para siempre en «Sin Mixed In Key». Ahora Unificar y Duplicados conservan siempre la copia analizada.</w:t>
+      </w:r>
+    </w:p>
+    <w:p>
+      <w:pPr>
+        <w:pStyle w:val="ListParagraph"/>
+        <w:keepNext/>
+        <w:keepLines/>
+        <w:numPr>
+          <w:ilvl w:val="0"/>
+          <w:numId w:val="2"/>
+        </w:numPr>
+        <w:spacing w:after="60" w:line="276"/>
+      </w:pPr>
+      <w:r>
+        <w:rPr>
+          <w:b/>
+          <w:bCs/>
+        </w:rPr>
+        <w:t xml:space="preserve">Recuperar: </w:t>
+      </w:r>
+      <w:r>
+        <w:t xml:space="preserve">en «Sin Mixed In Key», si la copia analizada quedó en _duplicados, el botón Recuperar la pone en el lugar de la otra (mismo nombre y carpeta, tus programas de DJ no cambian). Se puede deshacer en Historial.</w:t>
+      </w:r>
+    </w:p>
+    <w:p>
+      <w:pPr>
+        <w:pStyle w:val="ListParagraph"/>
+        <w:keepNext/>
+        <w:keepLines/>
+        <w:numPr>
+          <w:ilvl w:val="0"/>
+          <w:numId w:val="2"/>
+        </w:numPr>
+        <w:spacing w:after="60" w:line="276"/>
+      </w:pPr>
+      <w:r>
+        <w:rPr>
+          <w:b/>
+          <w:bCs/>
+        </w:rPr>
+        <w:t xml:space="preserve">Avisos con el reproductor: </w:t>
+      </w:r>
+      <w:r>
+        <w:t xml:space="preserve">las ventanas y mensajes se ajustan para no quedar debajo del reproductor de vista previa.</w:t>
+      </w:r>
+    </w:p>
+    <w:tbl>
+      <w:tblPr>
+        <w:tblW w:type="dxa" w:w="9360"/>
+        <w:tblBorders>
+          <w:top w:val="single" w:color="auto" w:sz="4"/>
+          <w:left w:val="single" w:color="auto" w:sz="4"/>
+          <w:bottom w:val="single" w:color="auto" w:sz="4"/>
+          <w:right w:val="single" w:color="auto" w:sz="4"/>
+          <w:insideH w:val="single" w:color="auto" w:sz="4"/>
+          <w:insideV w:val="single" w:color="auto" w:sz="4"/>
+        </w:tblBorders>
+      </w:tblPr>
+      <w:tblGrid>
+        <w:gridCol w:w="1900"/>
+        <w:gridCol w:w="7460"/>
+      </w:tblGrid>
+      <w:tr>
+        <w:tc>
+          <w:tcPr>
+            <w:tcW w:type="dxa" w:w="1900"/>
+            <w:tcBorders>
+              <w:top w:val="single" w:color="D5D9E0" w:sz="4"/>
+              <w:left w:val="single" w:color="D5D9E0" w:sz="4"/>
+              <w:bottom w:val="single" w:color="D5D9E0" w:sz="4"/>
+              <w:right w:val="single" w:color="D5D9E0" w:sz="4"/>
+            </w:tcBorders>
+            <w:shd w:fill="1F2A44" w:color="auto" w:val="clear"/>
+            <w:tcMar>
+              <w:top w:type="dxa" w:w="80"/>
+              <w:left w:type="dxa" w:w="140"/>
+              <w:bottom w:type="dxa" w:w="80"/>
+              <w:right w:type="dxa" w:w="140"/>
+            </w:tcMar>
+            <w:vAlign w:val="center"/>
+          </w:tcPr>
+          <w:p>
+            <w:pPr>
+              <w:keepNext/>
+              <w:keepLines/>
+            </w:pPr>
+            <w:r>
+              <w:rPr>
+                <w:b/>
+                <w:bCs/>
+                <w:color w:val="FFFFFF"/>
+                <w:sz w:val="24"/>
+                <w:szCs w:val="24"/>
+              </w:rPr>
+              <w:t xml:space="preserve">v2.18.3</w:t>
+            </w:r>
+          </w:p>
+          <w:p>
+            <w:pPr>
+              <w:keepNext/>
+            </w:pPr>
+            <w:r>
+              <w:rPr>
+                <w:color w:val="FFFFFF"/>
+                <w:sz w:val="17"/>
+                <w:szCs w:val="17"/>
+              </w:rPr>
+              <w:t xml:space="preserve">22 oct 2026</w:t>
+            </w:r>
+          </w:p>
+        </w:tc>
+        <w:tc>
+          <w:tcPr>
+            <w:tcW w:type="dxa" w:w="7460"/>
+            <w:tcBorders>
+              <w:top w:val="single" w:color="D5D9E0" w:sz="4"/>
+              <w:left w:val="single" w:color="D5D9E0" w:sz="4"/>
+              <w:bottom w:val="single" w:color="D5D9E0" w:sz="4"/>
+              <w:right w:val="single" w:color="D5D9E0" w:sz="4"/>
+            </w:tcBorders>
+            <w:shd w:fill="F5F7FA" w:color="auto" w:val="clear"/>
+            <w:tcMar>
+              <w:top w:type="dxa" w:w="80"/>
+              <w:left w:type="dxa" w:w="160"/>
+              <w:bottom w:type="dxa" w:w="80"/>
+              <w:right w:type="dxa" w:w="140"/>
+            </w:tcMar>
+            <w:vAlign w:val="center"/>
+          </w:tcPr>
+          <w:p>
+            <w:pPr>
+              <w:keepNext/>
+            </w:pPr>
+            <w:r>
+              <w:rPr>
+                <w:b/>
+                <w:bCs/>
+                <w:color w:val="1F2A44"/>
+                <w:sz w:val="23"/>
+                <w:szCs w:val="23"/>
+              </w:rPr>
+              <w:t xml:space="preserve">Descargas reconocidas por ISRC</w:t>
+            </w:r>
+            <w:r>
+              <w:rPr>
+                <w:b/>
+                <w:bCs/>
+                <w:color w:val="7FB800"/>
+                <w:sz w:val="18"/>
+                <w:szCs w:val="18"/>
+              </w:rPr>
+              <w:t xml:space="preserve"/>
             </w:r>
           </w:p>
         </w:tc>

</xml_diff>

<commit_message>
v2.18.6: estadística de Mixed In Key sin undefined; usar la copia analizada con MIK
Co-Authored-By: Claude Opus 5.5 <noreply@anthropic.com>
Claude-Session: https://claude.ai/code/session_013XWL8ZEgfzfbr29rvvM38F
</commit_message>
<xml_diff>
--- a/docs/BrainOrder - Manual de usuario.docx
+++ b/docs/BrainOrder - Manual de usuario.docx
@@ -73,7 +73,7 @@
           <w:sz w:val="26"/>
           <w:szCs w:val="26"/>
         </w:rPr>
-        <w:t xml:space="preserve">Versión 2.18.5</w:t>
+        <w:t xml:space="preserve">Versión 2.18.6</w:t>
       </w:r>
     </w:p>
     <w:p>
@@ -12222,7 +12222,7 @@
                 <w:sz w:val="24"/>
                 <w:szCs w:val="24"/>
               </w:rPr>
-              <w:t xml:space="preserve">v2.18.5</w:t>
+              <w:t xml:space="preserve">v2.18.6</w:t>
             </w:r>
           </w:p>
           <w:p>
@@ -12269,7 +12269,7 @@
                 <w:sz w:val="23"/>
                 <w:szCs w:val="23"/>
               </w:rPr>
-              <w:t xml:space="preserve">Copias analizadas con Mixed In Key</w:t>
+              <w:t xml:space="preserve">Estadísticas de Mixed In Key</w:t>
             </w:r>
             <w:r>
               <w:rPr>
@@ -12280,6 +12280,161 @@
                 <w:szCs w:val="18"/>
               </w:rPr>
               <w:t xml:space="preserve">   · versión actual</w:t>
+            </w:r>
+          </w:p>
+        </w:tc>
+      </w:tr>
+    </w:tbl>
+    <w:p>
+      <w:pPr>
+        <w:pStyle w:val="ListParagraph"/>
+        <w:keepNext/>
+        <w:keepLines/>
+        <w:numPr>
+          <w:ilvl w:val="0"/>
+          <w:numId w:val="2"/>
+        </w:numPr>
+        <w:spacing w:after="60" w:line="276"/>
+      </w:pPr>
+      <w:r>
+        <w:rPr>
+          <w:b/>
+          <w:bCs/>
+        </w:rPr>
+        <w:t xml:space="preserve">Arreglado: </w:t>
+      </w:r>
+      <w:r>
+        <w:t xml:space="preserve">el recuadro «Con Mixed In Key» de Estadísticas mostraba «undefined».</w:t>
+      </w:r>
+    </w:p>
+    <w:p>
+      <w:pPr>
+        <w:pStyle w:val="ListParagraph"/>
+        <w:keepNext/>
+        <w:keepLines/>
+        <w:numPr>
+          <w:ilvl w:val="0"/>
+          <w:numId w:val="2"/>
+        </w:numPr>
+        <w:spacing w:after="60" w:line="276"/>
+      </w:pPr>
+      <w:r>
+        <w:rPr>
+          <w:b/>
+          <w:bCs/>
+        </w:rPr>
+        <w:t xml:space="preserve">Varias copias: </w:t>
+      </w:r>
+      <w:r>
+        <w:t xml:space="preserve">si tienes la misma canción en varios archivos, BrainOrder usa la copia que ya analizó Mixed In Key.</w:t>
+      </w:r>
+    </w:p>
+    <w:tbl>
+      <w:tblPr>
+        <w:tblW w:type="dxa" w:w="9360"/>
+        <w:tblBorders>
+          <w:top w:val="single" w:color="auto" w:sz="4"/>
+          <w:left w:val="single" w:color="auto" w:sz="4"/>
+          <w:bottom w:val="single" w:color="auto" w:sz="4"/>
+          <w:right w:val="single" w:color="auto" w:sz="4"/>
+          <w:insideH w:val="single" w:color="auto" w:sz="4"/>
+          <w:insideV w:val="single" w:color="auto" w:sz="4"/>
+        </w:tblBorders>
+      </w:tblPr>
+      <w:tblGrid>
+        <w:gridCol w:w="1900"/>
+        <w:gridCol w:w="7460"/>
+      </w:tblGrid>
+      <w:tr>
+        <w:tc>
+          <w:tcPr>
+            <w:tcW w:type="dxa" w:w="1900"/>
+            <w:tcBorders>
+              <w:top w:val="single" w:color="D5D9E0" w:sz="4"/>
+              <w:left w:val="single" w:color="D5D9E0" w:sz="4"/>
+              <w:bottom w:val="single" w:color="D5D9E0" w:sz="4"/>
+              <w:right w:val="single" w:color="D5D9E0" w:sz="4"/>
+            </w:tcBorders>
+            <w:shd w:fill="1F2A44" w:color="auto" w:val="clear"/>
+            <w:tcMar>
+              <w:top w:type="dxa" w:w="80"/>
+              <w:left w:type="dxa" w:w="140"/>
+              <w:bottom w:type="dxa" w:w="80"/>
+              <w:right w:type="dxa" w:w="140"/>
+            </w:tcMar>
+            <w:vAlign w:val="center"/>
+          </w:tcPr>
+          <w:p>
+            <w:pPr>
+              <w:keepNext/>
+              <w:keepLines/>
+            </w:pPr>
+            <w:r>
+              <w:rPr>
+                <w:b/>
+                <w:bCs/>
+                <w:color w:val="FFFFFF"/>
+                <w:sz w:val="24"/>
+                <w:szCs w:val="24"/>
+              </w:rPr>
+              <w:t xml:space="preserve">v2.18.5</w:t>
+            </w:r>
+          </w:p>
+          <w:p>
+            <w:pPr>
+              <w:keepNext/>
+            </w:pPr>
+            <w:r>
+              <w:rPr>
+                <w:color w:val="FFFFFF"/>
+                <w:sz w:val="17"/>
+                <w:szCs w:val="17"/>
+              </w:rPr>
+              <w:t xml:space="preserve">22 oct 2026</w:t>
+            </w:r>
+          </w:p>
+        </w:tc>
+        <w:tc>
+          <w:tcPr>
+            <w:tcW w:type="dxa" w:w="7460"/>
+            <w:tcBorders>
+              <w:top w:val="single" w:color="D5D9E0" w:sz="4"/>
+              <w:left w:val="single" w:color="D5D9E0" w:sz="4"/>
+              <w:bottom w:val="single" w:color="D5D9E0" w:sz="4"/>
+              <w:right w:val="single" w:color="D5D9E0" w:sz="4"/>
+            </w:tcBorders>
+            <w:shd w:fill="F5F7FA" w:color="auto" w:val="clear"/>
+            <w:tcMar>
+              <w:top w:type="dxa" w:w="80"/>
+              <w:left w:type="dxa" w:w="160"/>
+              <w:bottom w:type="dxa" w:w="80"/>
+              <w:right w:type="dxa" w:w="140"/>
+            </w:tcMar>
+            <w:vAlign w:val="center"/>
+          </w:tcPr>
+          <w:p>
+            <w:pPr>
+              <w:keepNext/>
+            </w:pPr>
+            <w:r>
+              <w:rPr>
+                <w:b/>
+                <w:bCs/>
+                <w:color w:val="1F2A44"/>
+                <w:sz w:val="23"/>
+                <w:szCs w:val="23"/>
+              </w:rPr>
+              <w:t xml:space="preserve">Copias analizadas con Mixed In Key</w:t>
+            </w:r>
+            <w:r>
+              <w:rPr>
+                <w:b/>
+                <w:bCs/>
+                <w:color w:val="7FB800"/>
+                <w:sz w:val="18"/>
+                <w:szCs w:val="18"/>
+              </w:rPr>
+              <w:t xml:space="preserve"/>
             </w:r>
           </w:p>
         </w:tc>

</xml_diff>

<commit_message>
v2.19.0: Perdidas en Rekordbox — reemplazar perdidas por su copia en playlists
Nueva sección que lista las canciones perdidas de la colección de Rekordbox
y busca otra copia (exacta, misma canción, otra versión, sin copia). Reemplazar
cambia cada perdida por su copia en todas sus playlists con respaldo y
Deshacer en Historial; luego se eliminan en Rekordbox sin vaciar playlists.

Co-Authored-By: Claude Opus 5.5 <noreply@anthropic.com>
Claude-Session: https://claude.ai/code/session_0178Q2opJQydcukphxsLu5ue
</commit_message>
<xml_diff>
--- a/docs/BrainOrder - Manual de usuario.docx
+++ b/docs/BrainOrder - Manual de usuario.docx
@@ -73,7 +73,7 @@
           <w:sz w:val="26"/>
           <w:szCs w:val="26"/>
         </w:rPr>
-        <w:t xml:space="preserve">Versión 2.18.6</w:t>
+        <w:t xml:space="preserve">Versión 2.19.0</w:t>
       </w:r>
     </w:p>
     <w:p>
@@ -444,7 +444,7 @@
           <w:sz w:val="22"/>
           <w:szCs w:val="22"/>
         </w:rPr>
-        <w:t xml:space="preserve">	18</w:t>
+        <w:t xml:space="preserve">	19</w:t>
       </w:r>
     </w:p>
     <w:p>
@@ -470,7 +470,7 @@
           <w:sz w:val="22"/>
           <w:szCs w:val="22"/>
         </w:rPr>
-        <w:t xml:space="preserve">	19</w:t>
+        <w:t xml:space="preserve">	20</w:t>
       </w:r>
     </w:p>
     <w:p>
@@ -496,7 +496,7 @@
           <w:sz w:val="22"/>
           <w:szCs w:val="22"/>
         </w:rPr>
-        <w:t xml:space="preserve">	19</w:t>
+        <w:t xml:space="preserve">	20</w:t>
       </w:r>
     </w:p>
     <w:p>
@@ -522,7 +522,7 @@
           <w:sz w:val="22"/>
           <w:szCs w:val="22"/>
         </w:rPr>
-        <w:t xml:space="preserve">	19</w:t>
+        <w:t xml:space="preserve">	20</w:t>
       </w:r>
     </w:p>
     <w:p>
@@ -548,7 +548,7 @@
           <w:sz w:val="22"/>
           <w:szCs w:val="22"/>
         </w:rPr>
-        <w:t xml:space="preserve">	20</w:t>
+        <w:t xml:space="preserve">	21</w:t>
       </w:r>
     </w:p>
     <w:p>
@@ -574,7 +574,7 @@
           <w:sz w:val="22"/>
           <w:szCs w:val="22"/>
         </w:rPr>
-        <w:t xml:space="preserve">	20</w:t>
+        <w:t xml:space="preserve">	21</w:t>
       </w:r>
     </w:p>
     <w:p>
@@ -600,7 +600,7 @@
           <w:sz w:val="22"/>
           <w:szCs w:val="22"/>
         </w:rPr>
-        <w:t xml:space="preserve">	21</w:t>
+        <w:t xml:space="preserve">	22</w:t>
       </w:r>
     </w:p>
     <w:p>
@@ -626,7 +626,7 @@
           <w:sz w:val="22"/>
           <w:szCs w:val="22"/>
         </w:rPr>
-        <w:t xml:space="preserve">	22</w:t>
+        <w:t xml:space="preserve">	23</w:t>
       </w:r>
     </w:p>
     <w:p>
@@ -10019,6 +10019,563 @@
     </w:p>
     <w:p>
       <w:pPr>
+        <w:pStyle w:val="Heading2"/>
+      </w:pPr>
+      <w:r>
+        <w:t xml:space="preserve">Perdidas en Rekordbox</w:t>
+      </w:r>
+    </w:p>
+    <w:p>
+      <w:pPr>
+        <w:spacing w:after="120" w:line="276"/>
+      </w:pPr>
+      <w:r>
+        <w:t xml:space="preserve">En el menú lateral, </w:t>
+      </w:r>
+      <w:r>
+        <w:rPr>
+          <w:b/>
+          <w:bCs/>
+        </w:rPr>
+        <w:t xml:space="preserve">Perdidas en Rekordbox</w:t>
+      </w:r>
+      <w:r>
+        <w:t xml:space="preserve"> muestra las canciones de tu colección de Rekordbox cuyo archivo ya no está donde Rekordbox lo busca (por ejemplo, porque el archivo se movió a otra carpeta). Para cada una, BrainOrder busca </w:t>
+      </w:r>
+      <w:r>
+        <w:rPr>
+          <w:b/>
+          <w:bCs/>
+        </w:rPr>
+        <w:t xml:space="preserve">otra copia en tu colección</w:t>
+      </w:r>
+      <w:r>
+        <w:t xml:space="preserve"> y te dice qué tan segura es:</w:t>
+      </w:r>
+    </w:p>
+    <w:tbl>
+      <w:tblPr>
+        <w:tblW w:type="dxa" w:w="9360"/>
+        <w:tblBorders>
+          <w:top w:val="single" w:color="auto" w:sz="4"/>
+          <w:left w:val="single" w:color="auto" w:sz="4"/>
+          <w:bottom w:val="single" w:color="auto" w:sz="4"/>
+          <w:right w:val="single" w:color="auto" w:sz="4"/>
+          <w:insideH w:val="single" w:color="auto" w:sz="4"/>
+          <w:insideV w:val="single" w:color="auto" w:sz="4"/>
+        </w:tblBorders>
+      </w:tblPr>
+      <w:tblGrid>
+        <w:gridCol w:w="3000"/>
+        <w:gridCol w:w="6360"/>
+      </w:tblGrid>
+      <w:tr>
+        <w:trPr>
+          <w:tblHeader/>
+        </w:trPr>
+        <w:tc>
+          <w:tcPr>
+            <w:tcW w:type="dxa" w:w="3000"/>
+            <w:tcBorders>
+              <w:top w:val="single" w:color="D5D9E0" w:sz="4"/>
+              <w:left w:val="single" w:color="D5D9E0" w:sz="4"/>
+              <w:bottom w:val="single" w:color="D5D9E0" w:sz="4"/>
+              <w:right w:val="single" w:color="D5D9E0" w:sz="4"/>
+            </w:tcBorders>
+            <w:shd w:fill="1F2A44" w:color="auto" w:val="clear"/>
+            <w:tcMar>
+              <w:top w:type="dxa" w:w="90"/>
+              <w:left w:type="dxa" w:w="120"/>
+              <w:bottom w:type="dxa" w:w="90"/>
+              <w:right w:type="dxa" w:w="120"/>
+            </w:tcMar>
+            <w:vAlign w:val="center"/>
+          </w:tcPr>
+          <w:p>
+            <w:pPr>
+              <w:spacing w:after="40"/>
+            </w:pPr>
+            <w:r>
+              <w:rPr>
+                <w:b/>
+                <w:bCs/>
+                <w:color w:val="FFFFFF"/>
+                <w:sz w:val="19"/>
+                <w:szCs w:val="19"/>
+              </w:rPr>
+              <w:t xml:space="preserve">Tipo</w:t>
+            </w:r>
+          </w:p>
+        </w:tc>
+        <w:tc>
+          <w:tcPr>
+            <w:tcW w:type="dxa" w:w="6360"/>
+            <w:tcBorders>
+              <w:top w:val="single" w:color="D5D9E0" w:sz="4"/>
+              <w:left w:val="single" w:color="D5D9E0" w:sz="4"/>
+              <w:bottom w:val="single" w:color="D5D9E0" w:sz="4"/>
+              <w:right w:val="single" w:color="D5D9E0" w:sz="4"/>
+            </w:tcBorders>
+            <w:shd w:fill="1F2A44" w:color="auto" w:val="clear"/>
+            <w:tcMar>
+              <w:top w:type="dxa" w:w="90"/>
+              <w:left w:type="dxa" w:w="120"/>
+              <w:bottom w:type="dxa" w:w="90"/>
+              <w:right w:type="dxa" w:w="120"/>
+            </w:tcMar>
+            <w:vAlign w:val="center"/>
+          </w:tcPr>
+          <w:p>
+            <w:pPr>
+              <w:spacing w:after="40"/>
+            </w:pPr>
+            <w:r>
+              <w:rPr>
+                <w:b/>
+                <w:bCs/>
+                <w:color w:val="FFFFFF"/>
+                <w:sz w:val="19"/>
+                <w:szCs w:val="19"/>
+              </w:rPr>
+              <w:t xml:space="preserve">Qué significa</w:t>
+            </w:r>
+          </w:p>
+        </w:tc>
+      </w:tr>
+      <w:tr>
+        <w:trPr>
+          <w:cantSplit/>
+        </w:trPr>
+        <w:tc>
+          <w:tcPr>
+            <w:tcW w:type="dxa" w:w="3000"/>
+            <w:tcBorders>
+              <w:top w:val="single" w:color="D5D9E0" w:sz="4"/>
+              <w:left w:val="single" w:color="D5D9E0" w:sz="4"/>
+              <w:bottom w:val="single" w:color="D5D9E0" w:sz="4"/>
+              <w:right w:val="single" w:color="D5D9E0" w:sz="4"/>
+            </w:tcBorders>
+            <w:shd w:fill="EEF7D6" w:color="auto" w:val="clear"/>
+            <w:tcMar>
+              <w:top w:type="dxa" w:w="90"/>
+              <w:left w:type="dxa" w:w="120"/>
+              <w:bottom w:type="dxa" w:w="90"/>
+              <w:right w:type="dxa" w:w="120"/>
+            </w:tcMar>
+            <w:vAlign w:val="center"/>
+          </w:tcPr>
+          <w:p>
+            <w:pPr>
+              <w:spacing w:after="40"/>
+            </w:pPr>
+            <w:r>
+              <w:rPr>
+                <w:b/>
+                <w:bCs/>
+                <w:color w:val="3C8A00"/>
+                <w:sz w:val="19"/>
+                <w:szCs w:val="19"/>
+              </w:rPr>
+              <w:t xml:space="preserve">Copia exacta</w:t>
+            </w:r>
+          </w:p>
+        </w:tc>
+        <w:tc>
+          <w:tcPr>
+            <w:tcW w:type="dxa" w:w="6360"/>
+            <w:tcBorders>
+              <w:top w:val="single" w:color="D5D9E0" w:sz="4"/>
+              <w:left w:val="single" w:color="D5D9E0" w:sz="4"/>
+              <w:bottom w:val="single" w:color="D5D9E0" w:sz="4"/>
+              <w:right w:val="single" w:color="D5D9E0" w:sz="4"/>
+            </w:tcBorders>
+            <w:tcMar>
+              <w:top w:type="dxa" w:w="90"/>
+              <w:left w:type="dxa" w:w="120"/>
+              <w:bottom w:type="dxa" w:w="90"/>
+              <w:right w:type="dxa" w:w="120"/>
+            </w:tcMar>
+            <w:vAlign w:val="center"/>
+          </w:tcPr>
+          <w:p>
+            <w:pPr>
+              <w:spacing w:after="40"/>
+            </w:pPr>
+            <w:r>
+              <w:rPr>
+                <w:sz w:val="19"/>
+                <w:szCs w:val="19"/>
+              </w:rPr>
+              <w:t xml:space="preserve">El mismo archivo (mismo tamaño) está en otra carpeta de tu colección.</w:t>
+            </w:r>
+          </w:p>
+        </w:tc>
+      </w:tr>
+      <w:tr>
+        <w:trPr>
+          <w:cantSplit/>
+        </w:trPr>
+        <w:tc>
+          <w:tcPr>
+            <w:tcW w:type="dxa" w:w="3000"/>
+            <w:tcBorders>
+              <w:top w:val="single" w:color="D5D9E0" w:sz="4"/>
+              <w:left w:val="single" w:color="D5D9E0" w:sz="4"/>
+              <w:bottom w:val="single" w:color="D5D9E0" w:sz="4"/>
+              <w:right w:val="single" w:color="D5D9E0" w:sz="4"/>
+            </w:tcBorders>
+            <w:shd w:fill="EEF7D6" w:color="auto" w:val="clear"/>
+            <w:tcMar>
+              <w:top w:type="dxa" w:w="90"/>
+              <w:left w:type="dxa" w:w="120"/>
+              <w:bottom w:type="dxa" w:w="90"/>
+              <w:right w:type="dxa" w:w="120"/>
+            </w:tcMar>
+            <w:vAlign w:val="center"/>
+          </w:tcPr>
+          <w:p>
+            <w:pPr>
+              <w:spacing w:after="40"/>
+            </w:pPr>
+            <w:r>
+              <w:rPr>
+                <w:b/>
+                <w:bCs/>
+                <w:color w:val="3C8A00"/>
+                <w:sz w:val="19"/>
+                <w:szCs w:val="19"/>
+              </w:rPr>
+              <w:t xml:space="preserve">Misma canción</w:t>
+            </w:r>
+          </w:p>
+        </w:tc>
+        <w:tc>
+          <w:tcPr>
+            <w:tcW w:type="dxa" w:w="6360"/>
+            <w:tcBorders>
+              <w:top w:val="single" w:color="D5D9E0" w:sz="4"/>
+              <w:left w:val="single" w:color="D5D9E0" w:sz="4"/>
+              <w:bottom w:val="single" w:color="D5D9E0" w:sz="4"/>
+              <w:right w:val="single" w:color="D5D9E0" w:sz="4"/>
+            </w:tcBorders>
+            <w:tcMar>
+              <w:top w:type="dxa" w:w="90"/>
+              <w:left w:type="dxa" w:w="120"/>
+              <w:bottom w:type="dxa" w:w="90"/>
+              <w:right w:type="dxa" w:w="120"/>
+            </w:tcMar>
+            <w:vAlign w:val="center"/>
+          </w:tcPr>
+          <w:p>
+            <w:pPr>
+              <w:spacing w:after="40"/>
+            </w:pPr>
+            <w:r>
+              <w:rPr>
+                <w:sz w:val="19"/>
+                <w:szCs w:val="19"/>
+              </w:rPr>
+              <w:t xml:space="preserve">Mismo ISRC, o mismo título y artista con la misma duración (±4 segundos).</w:t>
+            </w:r>
+          </w:p>
+        </w:tc>
+      </w:tr>
+      <w:tr>
+        <w:trPr>
+          <w:cantSplit/>
+        </w:trPr>
+        <w:tc>
+          <w:tcPr>
+            <w:tcW w:type="dxa" w:w="3000"/>
+            <w:tcBorders>
+              <w:top w:val="single" w:color="D5D9E0" w:sz="4"/>
+              <w:left w:val="single" w:color="D5D9E0" w:sz="4"/>
+              <w:bottom w:val="single" w:color="D5D9E0" w:sz="4"/>
+              <w:right w:val="single" w:color="D5D9E0" w:sz="4"/>
+            </w:tcBorders>
+            <w:shd w:fill="FFF4E0" w:color="auto" w:val="clear"/>
+            <w:tcMar>
+              <w:top w:type="dxa" w:w="90"/>
+              <w:left w:type="dxa" w:w="120"/>
+              <w:bottom w:type="dxa" w:w="90"/>
+              <w:right w:type="dxa" w:w="120"/>
+            </w:tcMar>
+            <w:vAlign w:val="center"/>
+          </w:tcPr>
+          <w:p>
+            <w:pPr>
+              <w:spacing w:after="40"/>
+            </w:pPr>
+            <w:r>
+              <w:rPr>
+                <w:b/>
+                <w:bCs/>
+                <w:color w:val="B26A00"/>
+                <w:sz w:val="19"/>
+                <w:szCs w:val="19"/>
+              </w:rPr>
+              <w:t xml:space="preserve">Otra versión</w:t>
+            </w:r>
+          </w:p>
+        </w:tc>
+        <w:tc>
+          <w:tcPr>
+            <w:tcW w:type="dxa" w:w="6360"/>
+            <w:tcBorders>
+              <w:top w:val="single" w:color="D5D9E0" w:sz="4"/>
+              <w:left w:val="single" w:color="D5D9E0" w:sz="4"/>
+              <w:bottom w:val="single" w:color="D5D9E0" w:sz="4"/>
+              <w:right w:val="single" w:color="D5D9E0" w:sz="4"/>
+            </w:tcBorders>
+            <w:tcMar>
+              <w:top w:type="dxa" w:w="90"/>
+              <w:left w:type="dxa" w:w="120"/>
+              <w:bottom w:type="dxa" w:w="90"/>
+              <w:right w:type="dxa" w:w="120"/>
+            </w:tcMar>
+            <w:vAlign w:val="center"/>
+          </w:tcPr>
+          <w:p>
+            <w:pPr>
+              <w:spacing w:after="40"/>
+            </w:pPr>
+            <w:r>
+              <w:rPr>
+                <w:sz w:val="19"/>
+                <w:szCs w:val="19"/>
+              </w:rPr>
+              <w:t xml:space="preserve">Mismo título y artista pero otra duración: puede ser otro mix. Decides tú; no viene marcada.</w:t>
+            </w:r>
+          </w:p>
+        </w:tc>
+      </w:tr>
+      <w:tr>
+        <w:trPr>
+          <w:cantSplit/>
+        </w:trPr>
+        <w:tc>
+          <w:tcPr>
+            <w:tcW w:type="dxa" w:w="3000"/>
+            <w:tcBorders>
+              <w:top w:val="single" w:color="D5D9E0" w:sz="4"/>
+              <w:left w:val="single" w:color="D5D9E0" w:sz="4"/>
+              <w:bottom w:val="single" w:color="D5D9E0" w:sz="4"/>
+              <w:right w:val="single" w:color="D5D9E0" w:sz="4"/>
+            </w:tcBorders>
+            <w:shd w:fill="FDECEC" w:color="auto" w:val="clear"/>
+            <w:tcMar>
+              <w:top w:type="dxa" w:w="90"/>
+              <w:left w:type="dxa" w:w="120"/>
+              <w:bottom w:type="dxa" w:w="90"/>
+              <w:right w:type="dxa" w:w="120"/>
+            </w:tcMar>
+            <w:vAlign w:val="center"/>
+          </w:tcPr>
+          <w:p>
+            <w:pPr>
+              <w:spacing w:after="40"/>
+            </w:pPr>
+            <w:r>
+              <w:rPr>
+                <w:b/>
+                <w:bCs/>
+                <w:color w:val="C62828"/>
+                <w:sz w:val="19"/>
+                <w:szCs w:val="19"/>
+              </w:rPr>
+              <w:t xml:space="preserve">Sin copia</w:t>
+            </w:r>
+          </w:p>
+        </w:tc>
+        <w:tc>
+          <w:tcPr>
+            <w:tcW w:type="dxa" w:w="6360"/>
+            <w:tcBorders>
+              <w:top w:val="single" w:color="D5D9E0" w:sz="4"/>
+              <w:left w:val="single" w:color="D5D9E0" w:sz="4"/>
+              <w:bottom w:val="single" w:color="D5D9E0" w:sz="4"/>
+              <w:right w:val="single" w:color="D5D9E0" w:sz="4"/>
+            </w:tcBorders>
+            <w:tcMar>
+              <w:top w:type="dxa" w:w="90"/>
+              <w:left w:type="dxa" w:w="120"/>
+              <w:bottom w:type="dxa" w:w="90"/>
+              <w:right w:type="dxa" w:w="120"/>
+            </w:tcMar>
+            <w:vAlign w:val="center"/>
+          </w:tcPr>
+          <w:p>
+            <w:pPr>
+              <w:spacing w:after="40"/>
+            </w:pPr>
+            <w:r>
+              <w:rPr>
+                <w:sz w:val="19"/>
+                <w:szCs w:val="19"/>
+              </w:rPr>
+              <w:t xml:space="preserve">No está en ninguna otra parte de tu colección. No la borres: búscala o vuelve a descargarla.</w:t>
+            </w:r>
+          </w:p>
+        </w:tc>
+      </w:tr>
+    </w:tbl>
+    <w:p>
+      <w:pPr>
+        <w:spacing w:after="120"/>
+      </w:pPr>
+    </w:p>
+    <w:p>
+      <w:pPr>
+        <w:spacing w:after="120" w:line="276"/>
+      </w:pPr>
+      <w:r>
+        <w:rPr>
+          <w:b/>
+          <w:bCs/>
+          <w:color w:val="1F2A44"/>
+        </w:rPr>
+        <w:t xml:space="preserve">Paso a paso</w:t>
+      </w:r>
+    </w:p>
+    <w:p>
+      <w:pPr>
+        <w:pStyle w:val="ListParagraph"/>
+        <w:numPr>
+          <w:ilvl w:val="0"/>
+          <w:numId w:val="2"/>
+        </w:numPr>
+        <w:spacing w:after="60" w:line="276"/>
+      </w:pPr>
+      <w:r>
+        <w:rPr>
+          <w:b/>
+          <w:bCs/>
+        </w:rPr>
+        <w:t xml:space="preserve">Paso 1: </w:t>
+      </w:r>
+      <w:r>
+        <w:t xml:space="preserve">abre «Perdidas en Rekordbox». Vienen marcadas las que tienen copia exacta o misma canción y están en alguna playlist.</w:t>
+      </w:r>
+    </w:p>
+    <w:p>
+      <w:pPr>
+        <w:pStyle w:val="ListParagraph"/>
+        <w:numPr>
+          <w:ilvl w:val="0"/>
+          <w:numId w:val="2"/>
+        </w:numPr>
+        <w:spacing w:after="60" w:line="276"/>
+      </w:pPr>
+      <w:r>
+        <w:rPr>
+          <w:b/>
+          <w:bCs/>
+        </w:rPr>
+        <w:t xml:space="preserve">Paso 2: </w:t>
+      </w:r>
+      <w:r>
+        <w:t xml:space="preserve">cierra Rekordbox y toca </w:t>
+      </w:r>
+      <w:r>
+        <w:rPr>
+          <w:b/>
+          <w:bCs/>
+        </w:rPr>
+        <w:t xml:space="preserve">Reemplazar por su copia</w:t>
+      </w:r>
+      <w:r>
+        <w:t xml:space="preserve">. En cada playlist la perdida pasa a ser su copia, en la misma posición; si la copia ya estaba en esa playlist, la perdida solo se quita.</w:t>
+      </w:r>
+    </w:p>
+    <w:p>
+      <w:pPr>
+        <w:pStyle w:val="ListParagraph"/>
+        <w:numPr>
+          <w:ilvl w:val="0"/>
+          <w:numId w:val="2"/>
+        </w:numPr>
+        <w:spacing w:after="60" w:line="276"/>
+      </w:pPr>
+      <w:r>
+        <w:rPr>
+          <w:b/>
+          <w:bCs/>
+        </w:rPr>
+        <w:t xml:space="preserve">Paso 3: </w:t>
+      </w:r>
+      <w:r>
+        <w:t xml:space="preserve">abre Rekordbox, entra al gestor de archivos perdidos (menú Archivo; en inglés «Missing File Manager») y elimina las perdidas. Ya no están en ninguna playlist, así que no pierdes nada.</w:t>
+      </w:r>
+    </w:p>
+    <w:p>
+      <w:pPr>
+        <w:spacing w:after="120"/>
+      </w:pPr>
+    </w:p>
+    <w:tbl>
+      <w:tblPr>
+        <w:tblW w:type="dxa" w:w="9360"/>
+        <w:tblBorders>
+          <w:top w:val="single" w:color="auto" w:sz="4"/>
+          <w:left w:val="single" w:color="auto" w:sz="4"/>
+          <w:bottom w:val="single" w:color="auto" w:sz="4"/>
+          <w:right w:val="single" w:color="auto" w:sz="4"/>
+          <w:insideH w:val="single" w:color="auto" w:sz="4"/>
+          <w:insideV w:val="single" w:color="auto" w:sz="4"/>
+        </w:tblBorders>
+      </w:tblPr>
+      <w:tblGrid>
+        <w:gridCol w:w="9360"/>
+      </w:tblGrid>
+      <w:tr>
+        <w:tc>
+          <w:tcPr>
+            <w:tcW w:type="dxa" w:w="9360"/>
+            <w:tcBorders>
+              <w:top w:val="none" w:color="FFFFFF" w:sz="0"/>
+              <w:left w:val="single" w:color="B26A00" w:sz="24"/>
+              <w:bottom w:val="none" w:color="FFFFFF" w:sz="0"/>
+              <w:right w:val="none" w:color="FFFFFF" w:sz="0"/>
+            </w:tcBorders>
+            <w:shd w:fill="FFF4E0" w:color="auto" w:val="clear"/>
+            <w:tcMar>
+              <w:top w:type="dxa" w:w="120"/>
+              <w:left w:type="dxa" w:w="200"/>
+              <w:bottom w:type="dxa" w:w="120"/>
+              <w:right w:type="dxa" w:w="200"/>
+            </w:tcMar>
+          </w:tcPr>
+          <w:p>
+            <w:pPr>
+              <w:spacing w:after="60"/>
+            </w:pPr>
+            <w:r>
+              <w:rPr>
+                <w:b/>
+                <w:bCs/>
+                <w:color w:val="B26A00"/>
+              </w:rPr>
+              <w:t xml:space="preserve">⚠️ Ojo al eliminar en Rekordbox</w:t>
+            </w:r>
+          </w:p>
+          <w:p>
+            <w:pPr>
+              <w:spacing w:after="40" w:line="264"/>
+            </w:pPr>
+            <w:r>
+              <w:t xml:space="preserve">Las que salen como «Sin copia» u «Otra versión» siguen en sus playlists: no las selecciones al eliminar. BrainOrder respalda la librería antes de reemplazar y puedes deshacerlo en Historial mientras no hayas eliminado las perdidas en Rekordbox. No se mueve ni se borra ningún archivo de música. Las canciones de un disco externo desconectado no cuentan como perdidas.</w:t>
+            </w:r>
+          </w:p>
+        </w:tc>
+      </w:tr>
+    </w:tbl>
+    <w:p>
+      <w:pPr>
+        <w:spacing w:after="120"/>
+      </w:pPr>
+    </w:p>
+    <w:p>
+      <w:pPr>
         <w:pStyle w:val="Heading1"/>
         <w:pageBreakBefore/>
         <w:spacing w:after="200" w:before="120"/>
@@ -12222,7 +12779,7 @@
                 <w:sz w:val="24"/>
                 <w:szCs w:val="24"/>
               </w:rPr>
-              <w:t xml:space="preserve">v2.18.6</w:t>
+              <w:t xml:space="preserve">v2.19.0</w:t>
             </w:r>
           </w:p>
           <w:p>
@@ -12269,7 +12826,7 @@
                 <w:sz w:val="23"/>
                 <w:szCs w:val="23"/>
               </w:rPr>
-              <w:t xml:space="preserve">Estadísticas de Mixed In Key</w:t>
+              <w:t xml:space="preserve">Perdidas en Rekordbox</w:t>
             </w:r>
             <w:r>
               <w:rPr>
@@ -12301,6 +12858,151 @@
           <w:b/>
           <w:bCs/>
         </w:rPr>
+        <w:t xml:space="preserve">Nuevo: </w:t>
+      </w:r>
+      <w:r>
+        <w:t xml:space="preserve">sección «Perdidas en Rekordbox»: para cada canción perdida te dice si hay otra copia en tu colección (copia exacta, misma canción, otra versión o sin copia).</w:t>
+      </w:r>
+    </w:p>
+    <w:p>
+      <w:pPr>
+        <w:pStyle w:val="ListParagraph"/>
+        <w:keepNext w:val="false"/>
+        <w:keepLines/>
+        <w:numPr>
+          <w:ilvl w:val="0"/>
+          <w:numId w:val="2"/>
+        </w:numPr>
+        <w:spacing w:after="60" w:line="276"/>
+      </w:pPr>
+      <w:r>
+        <w:rPr>
+          <w:b/>
+          <w:bCs/>
+        </w:rPr>
+        <w:t xml:space="preserve">Reemplazar por su copia: </w:t>
+      </w:r>
+      <w:r>
+        <w:t xml:space="preserve">cambia cada perdida por su copia en todas sus playlists, en la misma posición, con respaldo y Deshacer en Historial. Después las eliminas en Rekordbox sin vaciar ninguna playlist.</w:t>
+      </w:r>
+    </w:p>
+    <w:tbl>
+      <w:tblPr>
+        <w:tblW w:type="dxa" w:w="9360"/>
+        <w:tblBorders>
+          <w:top w:val="single" w:color="auto" w:sz="4"/>
+          <w:left w:val="single" w:color="auto" w:sz="4"/>
+          <w:bottom w:val="single" w:color="auto" w:sz="4"/>
+          <w:right w:val="single" w:color="auto" w:sz="4"/>
+          <w:insideH w:val="single" w:color="auto" w:sz="4"/>
+          <w:insideV w:val="single" w:color="auto" w:sz="4"/>
+        </w:tblBorders>
+      </w:tblPr>
+      <w:tblGrid>
+        <w:gridCol w:w="1900"/>
+        <w:gridCol w:w="7460"/>
+      </w:tblGrid>
+      <w:tr>
+        <w:tc>
+          <w:tcPr>
+            <w:tcW w:type="dxa" w:w="1900"/>
+            <w:tcBorders>
+              <w:top w:val="single" w:color="D5D9E0" w:sz="4"/>
+              <w:left w:val="single" w:color="D5D9E0" w:sz="4"/>
+              <w:bottom w:val="single" w:color="D5D9E0" w:sz="4"/>
+              <w:right w:val="single" w:color="D5D9E0" w:sz="4"/>
+            </w:tcBorders>
+            <w:shd w:fill="1F2A44" w:color="auto" w:val="clear"/>
+            <w:tcMar>
+              <w:top w:type="dxa" w:w="80"/>
+              <w:left w:type="dxa" w:w="140"/>
+              <w:bottom w:type="dxa" w:w="80"/>
+              <w:right w:type="dxa" w:w="140"/>
+            </w:tcMar>
+            <w:vAlign w:val="center"/>
+          </w:tcPr>
+          <w:p>
+            <w:pPr>
+              <w:keepNext/>
+              <w:keepLines/>
+            </w:pPr>
+            <w:r>
+              <w:rPr>
+                <w:b/>
+                <w:bCs/>
+                <w:color w:val="FFFFFF"/>
+                <w:sz w:val="24"/>
+                <w:szCs w:val="24"/>
+              </w:rPr>
+              <w:t xml:space="preserve">v2.18.6</w:t>
+            </w:r>
+          </w:p>
+          <w:p>
+            <w:pPr>
+              <w:keepNext/>
+            </w:pPr>
+            <w:r>
+              <w:rPr>
+                <w:color w:val="FFFFFF"/>
+                <w:sz w:val="17"/>
+                <w:szCs w:val="17"/>
+              </w:rPr>
+              <w:t xml:space="preserve">22 oct 2026</w:t>
+            </w:r>
+          </w:p>
+        </w:tc>
+        <w:tc>
+          <w:tcPr>
+            <w:tcW w:type="dxa" w:w="7460"/>
+            <w:tcBorders>
+              <w:top w:val="single" w:color="D5D9E0" w:sz="4"/>
+              <w:left w:val="single" w:color="D5D9E0" w:sz="4"/>
+              <w:bottom w:val="single" w:color="D5D9E0" w:sz="4"/>
+              <w:right w:val="single" w:color="D5D9E0" w:sz="4"/>
+            </w:tcBorders>
+            <w:shd w:fill="F5F7FA" w:color="auto" w:val="clear"/>
+            <w:tcMar>
+              <w:top w:type="dxa" w:w="80"/>
+              <w:left w:type="dxa" w:w="160"/>
+              <w:bottom w:type="dxa" w:w="80"/>
+              <w:right w:type="dxa" w:w="140"/>
+            </w:tcMar>
+            <w:vAlign w:val="center"/>
+          </w:tcPr>
+          <w:p>
+            <w:pPr>
+              <w:keepNext/>
+            </w:pPr>
+            <w:r>
+              <w:rPr>
+                <w:b/>
+                <w:bCs/>
+                <w:color w:val="1F2A44"/>
+                <w:sz w:val="23"/>
+                <w:szCs w:val="23"/>
+              </w:rPr>
+              <w:t xml:space="preserve">Estadísticas de Mixed In Key</w:t>
+            </w:r>
+          </w:p>
+        </w:tc>
+      </w:tr>
+    </w:tbl>
+    <w:p>
+      <w:pPr>
+        <w:pStyle w:val="ListParagraph"/>
+        <w:keepNext w:val="false"/>
+        <w:keepLines/>
+        <w:numPr>
+          <w:ilvl w:val="0"/>
+          <w:numId w:val="2"/>
+        </w:numPr>
+        <w:spacing w:after="60" w:line="276"/>
+      </w:pPr>
+      <w:r>
+        <w:rPr>
+          <w:b/>
+          <w:bCs/>
+        </w:rPr>
         <w:t xml:space="preserve">Arreglado: </w:t>
       </w:r>
       <w:r>
@@ -12310,7 +13012,7 @@
     <w:p>
       <w:pPr>
         <w:pStyle w:val="ListParagraph"/>
-        <w:keepNext/>
+        <w:keepNext w:val="false"/>
         <w:keepLines/>
         <w:numPr>
           <w:ilvl w:val="0"/>

</xml_diff>

<commit_message>
v2.19.1: Ocultar en Sin Mixed In Key; ignorar accesos directos rotos; leer WAV/AIFF con bloques raros
- Sin Mixed In Key: botón Ocultar / Mostrar otra vez (cfg mik_hidden); el contador no cuenta las ocultas.
- biblioteca.walk_audio salta accesos directos rotos (contaban como canciones que tienes).
- armonia: si mutagen no encuentra etiquetas en WAV/AIFF (p. ej. LIST de tamaño 0), se busca el bloque id3 a mano.

Co-Authored-By: Claude Opus 5.5 <noreply@anthropic.com>
Claude-Session: https://claude.ai/code/session_0178Q2opJQydcukphxsLu5ue
</commit_message>
<xml_diff>
--- a/docs/BrainOrder - Manual de usuario.docx
+++ b/docs/BrainOrder - Manual de usuario.docx
@@ -73,7 +73,7 @@
           <w:sz w:val="26"/>
           <w:szCs w:val="26"/>
         </w:rPr>
-        <w:t xml:space="preserve">Versión 2.19.0</w:t>
+        <w:t xml:space="preserve">Versión 2.19.1</w:t>
       </w:r>
     </w:p>
     <w:p>
@@ -444,7 +444,7 @@
           <w:sz w:val="22"/>
           <w:szCs w:val="22"/>
         </w:rPr>
-        <w:t xml:space="preserve">	19</w:t>
+        <w:t xml:space="preserve">	20</w:t>
       </w:r>
     </w:p>
     <w:p>
@@ -470,7 +470,7 @@
           <w:sz w:val="22"/>
           <w:szCs w:val="22"/>
         </w:rPr>
-        <w:t xml:space="preserve">	20</w:t>
+        <w:t xml:space="preserve">	21</w:t>
       </w:r>
     </w:p>
     <w:p>
@@ -496,7 +496,7 @@
           <w:sz w:val="22"/>
           <w:szCs w:val="22"/>
         </w:rPr>
-        <w:t xml:space="preserve">	20</w:t>
+        <w:t xml:space="preserve">	21</w:t>
       </w:r>
     </w:p>
     <w:p>
@@ -522,7 +522,7 @@
           <w:sz w:val="22"/>
           <w:szCs w:val="22"/>
         </w:rPr>
-        <w:t xml:space="preserve">	20</w:t>
+        <w:t xml:space="preserve">	21</w:t>
       </w:r>
     </w:p>
     <w:p>
@@ -548,7 +548,7 @@
           <w:sz w:val="22"/>
           <w:szCs w:val="22"/>
         </w:rPr>
-        <w:t xml:space="preserve">	21</w:t>
+        <w:t xml:space="preserve">	22</w:t>
       </w:r>
     </w:p>
     <w:p>
@@ -574,7 +574,7 @@
           <w:sz w:val="22"/>
           <w:szCs w:val="22"/>
         </w:rPr>
-        <w:t xml:space="preserve">	21</w:t>
+        <w:t xml:space="preserve">	22</w:t>
       </w:r>
     </w:p>
     <w:p>
@@ -600,7 +600,7 @@
           <w:sz w:val="22"/>
           <w:szCs w:val="22"/>
         </w:rPr>
-        <w:t xml:space="preserve">	22</w:t>
+        <w:t xml:space="preserve">	23</w:t>
       </w:r>
     </w:p>
     <w:p>
@@ -626,7 +626,7 @@
           <w:sz w:val="22"/>
           <w:szCs w:val="22"/>
         </w:rPr>
-        <w:t xml:space="preserve">	23</w:t>
+        <w:t xml:space="preserve">	24</w:t>
       </w:r>
     </w:p>
     <w:p>
@@ -9632,6 +9632,114 @@
     </w:p>
     <w:p>
       <w:pPr>
+        <w:pStyle w:val="Heading2"/>
+      </w:pPr>
+      <w:r>
+        <w:t xml:space="preserve">Ocultar canciones de «Sin Mixed In Key»</w:t>
+      </w:r>
+    </w:p>
+    <w:p>
+      <w:pPr>
+        <w:spacing w:after="120" w:line="276"/>
+      </w:pPr>
+      <w:r>
+        <w:t xml:space="preserve">Si hay canciones que no quieres analizar, márcalas y toca </w:t>
+      </w:r>
+      <w:r>
+        <w:rPr>
+          <w:b/>
+          <w:bCs/>
+        </w:rPr>
+        <w:t xml:space="preserve">🙈 Ocultar</w:t>
+      </w:r>
+      <w:r>
+        <w:t xml:space="preserve">. Salen de la lista y del contador del menú; no se toca ningún archivo. </w:t>
+      </w:r>
+      <w:r>
+        <w:rPr>
+          <w:b/>
+          <w:bCs/>
+        </w:rPr>
+        <w:t xml:space="preserve">Ver ocultas</w:t>
+      </w:r>
+      <w:r>
+        <w:t xml:space="preserve"> las muestra y </w:t>
+      </w:r>
+      <w:r>
+        <w:rPr>
+          <w:b/>
+          <w:bCs/>
+        </w:rPr>
+        <w:t xml:space="preserve">Mostrar otra vez</w:t>
+      </w:r>
+      <w:r>
+        <w:t xml:space="preserve"> las devuelve.</w:t>
+      </w:r>
+    </w:p>
+    <w:tbl>
+      <w:tblPr>
+        <w:tblW w:type="dxa" w:w="9360"/>
+        <w:tblBorders>
+          <w:top w:val="single" w:color="auto" w:sz="4"/>
+          <w:left w:val="single" w:color="auto" w:sz="4"/>
+          <w:bottom w:val="single" w:color="auto" w:sz="4"/>
+          <w:right w:val="single" w:color="auto" w:sz="4"/>
+          <w:insideH w:val="single" w:color="auto" w:sz="4"/>
+          <w:insideV w:val="single" w:color="auto" w:sz="4"/>
+        </w:tblBorders>
+      </w:tblPr>
+      <w:tblGrid>
+        <w:gridCol w:w="9360"/>
+      </w:tblGrid>
+      <w:tr>
+        <w:tc>
+          <w:tcPr>
+            <w:tcW w:type="dxa" w:w="9360"/>
+            <w:tcBorders>
+              <w:top w:val="none" w:color="FFFFFF" w:sz="0"/>
+              <w:left w:val="single" w:color="2F6FDE" w:sz="24"/>
+              <w:bottom w:val="none" w:color="FFFFFF" w:sz="0"/>
+              <w:right w:val="none" w:color="FFFFFF" w:sz="0"/>
+            </w:tcBorders>
+            <w:shd w:fill="E3ECFB" w:color="auto" w:val="clear"/>
+            <w:tcMar>
+              <w:top w:type="dxa" w:w="120"/>
+              <w:left w:type="dxa" w:w="200"/>
+              <w:bottom w:type="dxa" w:w="120"/>
+              <w:right w:type="dxa" w:w="200"/>
+            </w:tcMar>
+          </w:tcPr>
+          <w:p>
+            <w:pPr>
+              <w:spacing w:after="60"/>
+            </w:pPr>
+            <w:r>
+              <w:rPr>
+                <w:b/>
+                <w:bCs/>
+                <w:color w:val="2F6FDE"/>
+              </w:rPr>
+              <w:t xml:space="preserve">ℹ️ Bueno saber</w:t>
+            </w:r>
+          </w:p>
+          <w:p>
+            <w:pPr>
+              <w:spacing w:after="40" w:line="264"/>
+            </w:pPr>
+            <w:r>
+              <w:t xml:space="preserve">Los accesos directos rotos (alias que apuntan a un archivo que ya no existe) no cuentan como canciones que tienes: salen en «Faltan por descargar». Los WAV y AIFF con un bloque interno raro se leen bien, así que si Mixed In Key ya los analizó no aparecen aquí.</w:t>
+            </w:r>
+          </w:p>
+        </w:tc>
+      </w:tr>
+    </w:tbl>
+    <w:p>
+      <w:pPr>
+        <w:spacing w:after="120"/>
+      </w:pPr>
+    </w:p>
+    <w:p>
+      <w:pPr>
         <w:pStyle w:val="Heading1"/>
         <w:spacing w:after="200" w:before="480"/>
       </w:pPr>
@@ -12779,7 +12887,7 @@
                 <w:sz w:val="24"/>
                 <w:szCs w:val="24"/>
               </w:rPr>
-              <w:t xml:space="preserve">v2.19.0</w:t>
+              <w:t xml:space="preserve">v2.19.1</w:t>
             </w:r>
           </w:p>
           <w:p>
@@ -12826,7 +12934,7 @@
                 <w:sz w:val="23"/>
                 <w:szCs w:val="23"/>
               </w:rPr>
-              <w:t xml:space="preserve">Perdidas en Rekordbox</w:t>
+              <w:t xml:space="preserve">Ocultar en Sin Mixed In Key</w:t>
             </w:r>
             <w:r>
               <w:rPr>
@@ -12846,6 +12954,173 @@
       <w:pPr>
         <w:pStyle w:val="ListParagraph"/>
         <w:keepNext/>
+        <w:keepLines/>
+        <w:numPr>
+          <w:ilvl w:val="0"/>
+          <w:numId w:val="2"/>
+        </w:numPr>
+        <w:spacing w:after="60" w:line="276"/>
+      </w:pPr>
+      <w:r>
+        <w:rPr>
+          <w:b/>
+          <w:bCs/>
+        </w:rPr>
+        <w:t xml:space="preserve">Nuevo: </w:t>
+      </w:r>
+      <w:r>
+        <w:t xml:space="preserve">botón «Ocultar» en Sin Mixed In Key para sacar de la lista y del contador las canciones que no quieres analizar.</w:t>
+      </w:r>
+    </w:p>
+    <w:p>
+      <w:pPr>
+        <w:pStyle w:val="ListParagraph"/>
+        <w:keepNext/>
+        <w:keepLines/>
+        <w:numPr>
+          <w:ilvl w:val="0"/>
+          <w:numId w:val="2"/>
+        </w:numPr>
+        <w:spacing w:after="60" w:line="276"/>
+      </w:pPr>
+      <w:r>
+        <w:rPr>
+          <w:b/>
+          <w:bCs/>
+        </w:rPr>
+        <w:t xml:space="preserve">Arreglado: </w:t>
+      </w:r>
+      <w:r>
+        <w:t xml:space="preserve">los accesos directos rotos ya no cuentan como canciones que tienes.</w:t>
+      </w:r>
+    </w:p>
+    <w:p>
+      <w:pPr>
+        <w:pStyle w:val="ListParagraph"/>
+        <w:keepNext w:val="false"/>
+        <w:keepLines/>
+        <w:numPr>
+          <w:ilvl w:val="0"/>
+          <w:numId w:val="2"/>
+        </w:numPr>
+        <w:spacing w:after="60" w:line="276"/>
+      </w:pPr>
+      <w:r>
+        <w:rPr>
+          <w:b/>
+          <w:bCs/>
+        </w:rPr>
+        <w:t xml:space="preserve">Arreglado: </w:t>
+      </w:r>
+      <w:r>
+        <w:t xml:space="preserve">los WAV y AIFF analizados con Mixed In Key que traen un bloque interno raro ya se leen bien.</w:t>
+      </w:r>
+    </w:p>
+    <w:tbl>
+      <w:tblPr>
+        <w:tblW w:type="dxa" w:w="9360"/>
+        <w:tblBorders>
+          <w:top w:val="single" w:color="auto" w:sz="4"/>
+          <w:left w:val="single" w:color="auto" w:sz="4"/>
+          <w:bottom w:val="single" w:color="auto" w:sz="4"/>
+          <w:right w:val="single" w:color="auto" w:sz="4"/>
+          <w:insideH w:val="single" w:color="auto" w:sz="4"/>
+          <w:insideV w:val="single" w:color="auto" w:sz="4"/>
+        </w:tblBorders>
+      </w:tblPr>
+      <w:tblGrid>
+        <w:gridCol w:w="1900"/>
+        <w:gridCol w:w="7460"/>
+      </w:tblGrid>
+      <w:tr>
+        <w:tc>
+          <w:tcPr>
+            <w:tcW w:type="dxa" w:w="1900"/>
+            <w:tcBorders>
+              <w:top w:val="single" w:color="D5D9E0" w:sz="4"/>
+              <w:left w:val="single" w:color="D5D9E0" w:sz="4"/>
+              <w:bottom w:val="single" w:color="D5D9E0" w:sz="4"/>
+              <w:right w:val="single" w:color="D5D9E0" w:sz="4"/>
+            </w:tcBorders>
+            <w:shd w:fill="1F2A44" w:color="auto" w:val="clear"/>
+            <w:tcMar>
+              <w:top w:type="dxa" w:w="80"/>
+              <w:left w:type="dxa" w:w="140"/>
+              <w:bottom w:type="dxa" w:w="80"/>
+              <w:right w:type="dxa" w:w="140"/>
+            </w:tcMar>
+            <w:vAlign w:val="center"/>
+          </w:tcPr>
+          <w:p>
+            <w:pPr>
+              <w:keepNext/>
+              <w:keepLines/>
+            </w:pPr>
+            <w:r>
+              <w:rPr>
+                <w:b/>
+                <w:bCs/>
+                <w:color w:val="FFFFFF"/>
+                <w:sz w:val="24"/>
+                <w:szCs w:val="24"/>
+              </w:rPr>
+              <w:t xml:space="preserve">v2.19.0</w:t>
+            </w:r>
+          </w:p>
+          <w:p>
+            <w:pPr>
+              <w:keepNext/>
+            </w:pPr>
+            <w:r>
+              <w:rPr>
+                <w:color w:val="FFFFFF"/>
+                <w:sz w:val="17"/>
+                <w:szCs w:val="17"/>
+              </w:rPr>
+              <w:t xml:space="preserve">22 oct 2026</w:t>
+            </w:r>
+          </w:p>
+        </w:tc>
+        <w:tc>
+          <w:tcPr>
+            <w:tcW w:type="dxa" w:w="7460"/>
+            <w:tcBorders>
+              <w:top w:val="single" w:color="D5D9E0" w:sz="4"/>
+              <w:left w:val="single" w:color="D5D9E0" w:sz="4"/>
+              <w:bottom w:val="single" w:color="D5D9E0" w:sz="4"/>
+              <w:right w:val="single" w:color="D5D9E0" w:sz="4"/>
+            </w:tcBorders>
+            <w:shd w:fill="F5F7FA" w:color="auto" w:val="clear"/>
+            <w:tcMar>
+              <w:top w:type="dxa" w:w="80"/>
+              <w:left w:type="dxa" w:w="160"/>
+              <w:bottom w:type="dxa" w:w="80"/>
+              <w:right w:type="dxa" w:w="140"/>
+            </w:tcMar>
+            <w:vAlign w:val="center"/>
+          </w:tcPr>
+          <w:p>
+            <w:pPr>
+              <w:keepNext/>
+            </w:pPr>
+            <w:r>
+              <w:rPr>
+                <w:b/>
+                <w:bCs/>
+                <w:color w:val="1F2A44"/>
+                <w:sz w:val="23"/>
+                <w:szCs w:val="23"/>
+              </w:rPr>
+              <w:t xml:space="preserve">Perdidas en Rekordbox</w:t>
+            </w:r>
+          </w:p>
+        </w:tc>
+      </w:tr>
+    </w:tbl>
+    <w:p>
+      <w:pPr>
+        <w:pStyle w:val="ListParagraph"/>
+        <w:keepNext w:val="false"/>
         <w:keepLines/>
         <w:numPr>
           <w:ilvl w:val="0"/>

</xml_diff>

<commit_message>
v2.18.7: Probar Spotify (cuota, pausa, Premium, usuario, sesión) y menos consultas
Co-Authored-By: Claude Opus 5.5 <noreply@anthropic.com>
Claude-Session: https://claude.ai/code/session_013XWL8ZEgfzfbr29rvvM38F
</commit_message>
<xml_diff>
--- a/docs/BrainOrder - Manual de usuario.docx
+++ b/docs/BrainOrder - Manual de usuario.docx
@@ -13326,6 +13326,173 @@
       </w:r>
       <w:r>
         <w:t xml:space="preserve">cambia cada perdida por su copia en todas sus playlists, en la misma posición, con respaldo y Deshacer en Historial. Después las eliminas en Rekordbox sin vaciar ninguna playlist.</w:t>
+      </w:r>
+    </w:p>
+    <w:tbl>
+      <w:tblPr>
+        <w:tblW w:type="dxa" w:w="9360"/>
+        <w:tblBorders>
+          <w:top w:val="single" w:color="auto" w:sz="4"/>
+          <w:left w:val="single" w:color="auto" w:sz="4"/>
+          <w:bottom w:val="single" w:color="auto" w:sz="4"/>
+          <w:right w:val="single" w:color="auto" w:sz="4"/>
+          <w:insideH w:val="single" w:color="auto" w:sz="4"/>
+          <w:insideV w:val="single" w:color="auto" w:sz="4"/>
+        </w:tblBorders>
+      </w:tblPr>
+      <w:tblGrid>
+        <w:gridCol w:w="1900"/>
+        <w:gridCol w:w="7460"/>
+      </w:tblGrid>
+      <w:tr>
+        <w:tc>
+          <w:tcPr>
+            <w:tcW w:type="dxa" w:w="1900"/>
+            <w:tcBorders>
+              <w:top w:val="single" w:color="D5D9E0" w:sz="4"/>
+              <w:left w:val="single" w:color="D5D9E0" w:sz="4"/>
+              <w:bottom w:val="single" w:color="D5D9E0" w:sz="4"/>
+              <w:right w:val="single" w:color="D5D9E0" w:sz="4"/>
+            </w:tcBorders>
+            <w:shd w:fill="1F2A44" w:color="auto" w:val="clear"/>
+            <w:tcMar>
+              <w:top w:type="dxa" w:w="80"/>
+              <w:left w:type="dxa" w:w="140"/>
+              <w:bottom w:type="dxa" w:w="80"/>
+              <w:right w:type="dxa" w:w="140"/>
+            </w:tcMar>
+            <w:vAlign w:val="center"/>
+          </w:tcPr>
+          <w:p>
+            <w:pPr>
+              <w:keepNext/>
+              <w:keepLines/>
+            </w:pPr>
+            <w:r>
+              <w:rPr>
+                <w:b/>
+                <w:bCs/>
+                <w:color w:val="FFFFFF"/>
+                <w:sz w:val="24"/>
+                <w:szCs w:val="24"/>
+              </w:rPr>
+              <w:t xml:space="preserve">v2.18.7</w:t>
+            </w:r>
+          </w:p>
+          <w:p>
+            <w:pPr>
+              <w:keepNext/>
+            </w:pPr>
+            <w:r>
+              <w:rPr>
+                <w:color w:val="FFFFFF"/>
+                <w:sz w:val="17"/>
+                <w:szCs w:val="17"/>
+              </w:rPr>
+              <w:t xml:space="preserve">23 oct 2026</w:t>
+            </w:r>
+          </w:p>
+        </w:tc>
+        <w:tc>
+          <w:tcPr>
+            <w:tcW w:type="dxa" w:w="7460"/>
+            <w:tcBorders>
+              <w:top w:val="single" w:color="D5D9E0" w:sz="4"/>
+              <w:left w:val="single" w:color="D5D9E0" w:sz="4"/>
+              <w:bottom w:val="single" w:color="D5D9E0" w:sz="4"/>
+              <w:right w:val="single" w:color="D5D9E0" w:sz="4"/>
+            </w:tcBorders>
+            <w:shd w:fill="F5F7FA" w:color="auto" w:val="clear"/>
+            <w:tcMar>
+              <w:top w:type="dxa" w:w="80"/>
+              <w:left w:type="dxa" w:w="160"/>
+              <w:bottom w:type="dxa" w:w="80"/>
+              <w:right w:type="dxa" w:w="140"/>
+            </w:tcMar>
+            <w:vAlign w:val="center"/>
+          </w:tcPr>
+          <w:p>
+            <w:pPr>
+              <w:keepNext/>
+            </w:pPr>
+            <w:r>
+              <w:rPr>
+                <w:b/>
+                <w:bCs/>
+                <w:color w:val="1F2A44"/>
+                <w:sz w:val="23"/>
+                <w:szCs w:val="23"/>
+              </w:rPr>
+              <w:t xml:space="preserve">Probar Spotify</w:t>
+            </w:r>
+          </w:p>
+        </w:tc>
+      </w:tr>
+    </w:tbl>
+    <w:p>
+      <w:pPr>
+        <w:pStyle w:val="ListParagraph"/>
+        <w:keepNext w:val="false"/>
+        <w:keepLines/>
+        <w:numPr>
+          <w:ilvl w:val="0"/>
+          <w:numId w:val="2"/>
+        </w:numPr>
+        <w:spacing w:after="60" w:line="276"/>
+      </w:pPr>
+      <w:r>
+        <w:rPr>
+          <w:b/>
+          <w:bCs/>
+        </w:rPr>
+        <w:t xml:space="preserve">Nuevo: </w:t>
+      </w:r>
+      <w:r>
+        <w:t xml:space="preserve">Conexiones → Probar Spotify hace una sola consulta y dice exactamente por qué Spotify no carga: cuota de la app agotada, pausa por exceso de consultas, falta Premium en la cuenta dueña de la app, cuenta no registrada en User Management o sesión vencida. Con Reintentar ahora vuelve a preguntar sin esperar.</w:t>
+      </w:r>
+    </w:p>
+    <w:p>
+      <w:pPr>
+        <w:pStyle w:val="ListParagraph"/>
+        <w:keepNext w:val="false"/>
+        <w:keepLines/>
+        <w:numPr>
+          <w:ilvl w:val="0"/>
+          <w:numId w:val="2"/>
+        </w:numPr>
+        <w:spacing w:after="60" w:line="276"/>
+      </w:pPr>
+      <w:r>
+        <w:rPr>
+          <w:b/>
+          <w:bCs/>
+        </w:rPr>
+        <w:t xml:space="preserve">Menos consultas: </w:t>
+      </w:r>
+      <w:r>
+        <w:t xml:space="preserve">ya no intenta leer las canciones de playlists de otros (Spotify dejó de darlas en febrero de 2026); cada intento gastaba cuota.</w:t>
+      </w:r>
+    </w:p>
+    <w:p>
+      <w:pPr>
+        <w:pStyle w:val="ListParagraph"/>
+        <w:keepNext w:val="false"/>
+        <w:keepLines/>
+        <w:numPr>
+          <w:ilvl w:val="0"/>
+          <w:numId w:val="2"/>
+        </w:numPr>
+        <w:spacing w:after="60" w:line="276"/>
+      </w:pPr>
+      <w:r>
+        <w:rPr>
+          <w:b/>
+          <w:bCs/>
+        </w:rPr>
+        <w:t xml:space="preserve">Sin depender de la cuota: </w:t>
+      </w:r>
+      <w:r>
+        <w:t xml:space="preserve">exporta tus playlists a CSV con Exportify o TuneMyMusic y ponlas en Conexiones → Archivos exportados.</w:t>
       </w:r>
     </w:p>
     <w:tbl>

</xml_diff>

<commit_message>
v2.19.3: Probar Spotify — número de versión correcto (después de 2.19.2) y manual en orden
Co-Authored-By: Claude Opus 5.5 <noreply@anthropic.com>
Claude-Session: https://claude.ai/code/session_013XWL8ZEgfzfbr29rvvM38F
</commit_message>
<xml_diff>
--- a/docs/BrainOrder - Manual de usuario.docx
+++ b/docs/BrainOrder - Manual de usuario.docx
@@ -73,7 +73,7 @@
           <w:sz w:val="26"/>
           <w:szCs w:val="26"/>
         </w:rPr>
-        <w:t xml:space="preserve">Versión 2.19.2</w:t>
+        <w:t xml:space="preserve">Versión 2.19.3</w:t>
       </w:r>
     </w:p>
     <w:p>
@@ -83,7 +83,7 @@
           <w:sz w:val="22"/>
           <w:szCs w:val="22"/>
         </w:rPr>
-        <w:t xml:space="preserve">Actualizado: 22 de octubre de 2026 · macOS y Windows</w:t>
+        <w:t xml:space="preserve">Actualizado: 23 de octubre de 2026 · macOS y Windows</w:t>
       </w:r>
     </w:p>
     <w:p>
@@ -12887,7 +12887,7 @@
                 <w:sz w:val="24"/>
                 <w:szCs w:val="24"/>
               </w:rPr>
-              <w:t xml:space="preserve">v2.19.2</w:t>
+              <w:t xml:space="preserve">v2.19.3</w:t>
             </w:r>
           </w:p>
           <w:p>
@@ -12900,7 +12900,7 @@
                 <w:sz w:val="17"/>
                 <w:szCs w:val="17"/>
               </w:rPr>
-              <w:t xml:space="preserve">22 oct 2026</w:t>
+              <w:t xml:space="preserve">23 oct 2026</w:t>
             </w:r>
           </w:p>
         </w:tc>
@@ -12934,7 +12934,7 @@
                 <w:sz w:val="23"/>
                 <w:szCs w:val="23"/>
               </w:rPr>
-              <w:t xml:space="preserve">Fusionar y rutas de Rekordbox</w:t>
+              <w:t xml:space="preserve">Probar Spotify</w:t>
             </w:r>
             <w:r>
               <w:rPr>
@@ -12953,7 +12953,6 @@
     <w:p>
       <w:pPr>
         <w:pStyle w:val="ListParagraph"/>
-        <w:keepNext/>
         <w:keepLines/>
         <w:numPr>
           <w:ilvl w:val="0"/>
@@ -12966,16 +12965,15 @@
           <w:b/>
           <w:bCs/>
         </w:rPr>
-        <w:t xml:space="preserve">Arreglado: </w:t>
-      </w:r>
-      <w:r>
-        <w:t xml:space="preserve">al fusionar con Spotify en pausa, las canciones ya no desaparecen: se ven en la otra playlist con sus archivos mientras esperan en la cola, y varias fusiones hacia la misma playlist se suman.</w:t>
-      </w:r>
-    </w:p>
-    <w:p>
-      <w:pPr>
-        <w:pStyle w:val="ListParagraph"/>
-        <w:keepNext/>
+        <w:t xml:space="preserve">Nuevo: </w:t>
+      </w:r>
+      <w:r>
+        <w:t xml:space="preserve">Conexiones → Probar Spotify hace una sola consulta y dice exactamente por qué Spotify no carga: cuota de la app agotada, pausa por exceso de consultas, falta Premium en la cuenta dueña de la app, cuenta no registrada en User Management o sesión vencida. Con Reintentar ahora vuelve a preguntar sin esperar.</w:t>
+      </w:r>
+    </w:p>
+    <w:p>
+      <w:pPr>
+        <w:pStyle w:val="ListParagraph"/>
         <w:keepLines/>
         <w:numPr>
           <w:ilvl w:val="0"/>
@@ -12988,16 +12986,15 @@
           <w:b/>
           <w:bCs/>
         </w:rPr>
-        <w:t xml:space="preserve">Arreglado: </w:t>
-      </w:r>
-      <w:r>
-        <w:t xml:space="preserve">las pistas que Rekordbox guarda con «//» en la ruta se corrigen al mover archivos (antes quedaban perdidas) y no se agregan dos veces al sincronizar.</w:t>
-      </w:r>
-    </w:p>
-    <w:p>
-      <w:pPr>
-        <w:pStyle w:val="ListParagraph"/>
-        <w:keepNext w:val="false"/>
+        <w:t xml:space="preserve">Menos consultas: </w:t>
+      </w:r>
+      <w:r>
+        <w:t xml:space="preserve">ya no intenta leer las canciones de playlists de otros (Spotify dejó de darlas en febrero de 2026); cada intento gastaba cuota.</w:t>
+      </w:r>
+    </w:p>
+    <w:p>
+      <w:pPr>
+        <w:pStyle w:val="ListParagraph"/>
         <w:keepLines/>
         <w:numPr>
           <w:ilvl w:val="0"/>
@@ -13010,10 +13007,10 @@
           <w:b/>
           <w:bCs/>
         </w:rPr>
-        <w:t xml:space="preserve">Arreglado: </w:t>
-      </w:r>
-      <w:r>
-        <w:t xml:space="preserve">los accesos directos se mueven sin romperse y no cuentan como otra copia de la canción.</w:t>
+        <w:t xml:space="preserve">Sin depender de la cuota: </w:t>
+      </w:r>
+      <w:r>
+        <w:t xml:space="preserve">exporta tus playlists a CSV con Exportify o TuneMyMusic y ponlas en Conexiones → Archivos exportados.</w:t>
       </w:r>
     </w:p>
     <w:tbl>
@@ -13064,7 +13061,7 @@
                 <w:sz w:val="24"/>
                 <w:szCs w:val="24"/>
               </w:rPr>
-              <w:t xml:space="preserve">v2.19.1</w:t>
+              <w:t xml:space="preserve">v2.19.2</w:t>
             </w:r>
           </w:p>
           <w:p>
@@ -13111,7 +13108,17 @@
                 <w:sz w:val="23"/>
                 <w:szCs w:val="23"/>
               </w:rPr>
-              <w:t xml:space="preserve">Ocultar en Sin Mixed In Key</w:t>
+              <w:t xml:space="preserve">Fusionar y rutas de Rekordbox</w:t>
+            </w:r>
+            <w:r>
+              <w:rPr>
+                <w:b/>
+                <w:bCs/>
+                <w:color w:val="7FB800"/>
+                <w:sz w:val="18"/>
+                <w:szCs w:val="18"/>
+              </w:rPr>
+              <w:t xml:space="preserve"/>
             </w:r>
           </w:p>
         </w:tc>
@@ -13120,6 +13127,50 @@
     <w:p>
       <w:pPr>
         <w:pStyle w:val="ListParagraph"/>
+        <w:keepNext/>
+        <w:keepLines/>
+        <w:numPr>
+          <w:ilvl w:val="0"/>
+          <w:numId w:val="2"/>
+        </w:numPr>
+        <w:spacing w:after="60" w:line="276"/>
+      </w:pPr>
+      <w:r>
+        <w:rPr>
+          <w:b/>
+          <w:bCs/>
+        </w:rPr>
+        <w:t xml:space="preserve">Arreglado: </w:t>
+      </w:r>
+      <w:r>
+        <w:t xml:space="preserve">al fusionar con Spotify en pausa, las canciones ya no desaparecen: se ven en la otra playlist con sus archivos mientras esperan en la cola, y varias fusiones hacia la misma playlist se suman.</w:t>
+      </w:r>
+    </w:p>
+    <w:p>
+      <w:pPr>
+        <w:pStyle w:val="ListParagraph"/>
+        <w:keepNext/>
+        <w:keepLines/>
+        <w:numPr>
+          <w:ilvl w:val="0"/>
+          <w:numId w:val="2"/>
+        </w:numPr>
+        <w:spacing w:after="60" w:line="276"/>
+      </w:pPr>
+      <w:r>
+        <w:rPr>
+          <w:b/>
+          <w:bCs/>
+        </w:rPr>
+        <w:t xml:space="preserve">Arreglado: </w:t>
+      </w:r>
+      <w:r>
+        <w:t xml:space="preserve">las pistas que Rekordbox guarda con «//» en la ruta se corrigen al mover archivos (antes quedaban perdidas) y no se agregan dos veces al sincronizar.</w:t>
+      </w:r>
+    </w:p>
+    <w:p>
+      <w:pPr>
+        <w:pStyle w:val="ListParagraph"/>
         <w:keepNext w:val="false"/>
         <w:keepLines/>
         <w:numPr>
@@ -13133,54 +13184,10 @@
           <w:b/>
           <w:bCs/>
         </w:rPr>
-        <w:t xml:space="preserve">Nuevo: </w:t>
-      </w:r>
-      <w:r>
-        <w:t xml:space="preserve">botón «Ocultar» en Sin Mixed In Key para sacar de la lista y del contador las canciones que no quieres analizar.</w:t>
-      </w:r>
-    </w:p>
-    <w:p>
-      <w:pPr>
-        <w:pStyle w:val="ListParagraph"/>
-        <w:keepNext w:val="false"/>
-        <w:keepLines/>
-        <w:numPr>
-          <w:ilvl w:val="0"/>
-          <w:numId w:val="2"/>
-        </w:numPr>
-        <w:spacing w:after="60" w:line="276"/>
-      </w:pPr>
-      <w:r>
-        <w:rPr>
-          <w:b/>
-          <w:bCs/>
-        </w:rPr>
         <w:t xml:space="preserve">Arreglado: </w:t>
       </w:r>
       <w:r>
-        <w:t xml:space="preserve">los accesos directos rotos ya no cuentan como canciones que tienes.</w:t>
-      </w:r>
-    </w:p>
-    <w:p>
-      <w:pPr>
-        <w:pStyle w:val="ListParagraph"/>
-        <w:keepNext w:val="false"/>
-        <w:keepLines/>
-        <w:numPr>
-          <w:ilvl w:val="0"/>
-          <w:numId w:val="2"/>
-        </w:numPr>
-        <w:spacing w:after="60" w:line="276"/>
-      </w:pPr>
-      <w:r>
-        <w:rPr>
-          <w:b/>
-          <w:bCs/>
-        </w:rPr>
-        <w:t xml:space="preserve">Arreglado: </w:t>
-      </w:r>
-      <w:r>
-        <w:t xml:space="preserve">los WAV y AIFF analizados con Mixed In Key que traen un bloque interno raro ya se leen bien.</w:t>
+        <w:t xml:space="preserve">los accesos directos se mueven sin romperse y no cuentan como otra copia de la canción.</w:t>
       </w:r>
     </w:p>
     <w:tbl>
@@ -13231,7 +13238,7 @@
                 <w:sz w:val="24"/>
                 <w:szCs w:val="24"/>
               </w:rPr>
-              <w:t xml:space="preserve">v2.19.0</w:t>
+              <w:t xml:space="preserve">v2.19.1</w:t>
             </w:r>
           </w:p>
           <w:p>
@@ -13278,7 +13285,7 @@
                 <w:sz w:val="23"/>
                 <w:szCs w:val="23"/>
               </w:rPr>
-              <w:t xml:space="preserve">Perdidas en Rekordbox</w:t>
+              <w:t xml:space="preserve">Ocultar en Sin Mixed In Key</w:t>
             </w:r>
           </w:p>
         </w:tc>
@@ -13303,7 +13310,7 @@
         <w:t xml:space="preserve">Nuevo: </w:t>
       </w:r>
       <w:r>
-        <w:t xml:space="preserve">sección «Perdidas en Rekordbox»: para cada canción perdida te dice si hay otra copia en tu colección (copia exacta, misma canción, otra versión o sin copia).</w:t>
+        <w:t xml:space="preserve">botón «Ocultar» en Sin Mixed In Key para sacar de la lista y del contador las canciones que no quieres analizar.</w:t>
       </w:r>
     </w:p>
     <w:p>
@@ -13322,10 +13329,32 @@
           <w:b/>
           <w:bCs/>
         </w:rPr>
-        <w:t xml:space="preserve">Reemplazar por su copia: </w:t>
-      </w:r>
-      <w:r>
-        <w:t xml:space="preserve">cambia cada perdida por su copia en todas sus playlists, en la misma posición, con respaldo y Deshacer en Historial. Después las eliminas en Rekordbox sin vaciar ninguna playlist.</w:t>
+        <w:t xml:space="preserve">Arreglado: </w:t>
+      </w:r>
+      <w:r>
+        <w:t xml:space="preserve">los accesos directos rotos ya no cuentan como canciones que tienes.</w:t>
+      </w:r>
+    </w:p>
+    <w:p>
+      <w:pPr>
+        <w:pStyle w:val="ListParagraph"/>
+        <w:keepNext w:val="false"/>
+        <w:keepLines/>
+        <w:numPr>
+          <w:ilvl w:val="0"/>
+          <w:numId w:val="2"/>
+        </w:numPr>
+        <w:spacing w:after="60" w:line="276"/>
+      </w:pPr>
+      <w:r>
+        <w:rPr>
+          <w:b/>
+          <w:bCs/>
+        </w:rPr>
+        <w:t xml:space="preserve">Arreglado: </w:t>
+      </w:r>
+      <w:r>
+        <w:t xml:space="preserve">los WAV y AIFF analizados con Mixed In Key que traen un bloque interno raro ya se leen bien.</w:t>
       </w:r>
     </w:p>
     <w:tbl>
@@ -13376,7 +13405,7 @@
                 <w:sz w:val="24"/>
                 <w:szCs w:val="24"/>
               </w:rPr>
-              <w:t xml:space="preserve">v2.18.7</w:t>
+              <w:t xml:space="preserve">v2.19.0</w:t>
             </w:r>
           </w:p>
           <w:p>
@@ -13389,7 +13418,7 @@
                 <w:sz w:val="17"/>
                 <w:szCs w:val="17"/>
               </w:rPr>
-              <w:t xml:space="preserve">23 oct 2026</w:t>
+              <w:t xml:space="preserve">22 oct 2026</w:t>
             </w:r>
           </w:p>
         </w:tc>
@@ -13423,7 +13452,7 @@
                 <w:sz w:val="23"/>
                 <w:szCs w:val="23"/>
               </w:rPr>
-              <w:t xml:space="preserve">Probar Spotify</w:t>
+              <w:t xml:space="preserve">Perdidas en Rekordbox</w:t>
             </w:r>
           </w:p>
         </w:tc>
@@ -13448,7 +13477,7 @@
         <w:t xml:space="preserve">Nuevo: </w:t>
       </w:r>
       <w:r>
-        <w:t xml:space="preserve">Conexiones → Probar Spotify hace una sola consulta y dice exactamente por qué Spotify no carga: cuota de la app agotada, pausa por exceso de consultas, falta Premium en la cuenta dueña de la app, cuenta no registrada en User Management o sesión vencida. Con Reintentar ahora vuelve a preguntar sin esperar.</w:t>
+        <w:t xml:space="preserve">sección «Perdidas en Rekordbox»: para cada canción perdida te dice si hay otra copia en tu colección (copia exacta, misma canción, otra versión o sin copia).</w:t>
       </w:r>
     </w:p>
     <w:p>
@@ -13467,32 +13496,10 @@
           <w:b/>
           <w:bCs/>
         </w:rPr>
-        <w:t xml:space="preserve">Menos consultas: </w:t>
-      </w:r>
-      <w:r>
-        <w:t xml:space="preserve">ya no intenta leer las canciones de playlists de otros (Spotify dejó de darlas en febrero de 2026); cada intento gastaba cuota.</w:t>
-      </w:r>
-    </w:p>
-    <w:p>
-      <w:pPr>
-        <w:pStyle w:val="ListParagraph"/>
-        <w:keepNext w:val="false"/>
-        <w:keepLines/>
-        <w:numPr>
-          <w:ilvl w:val="0"/>
-          <w:numId w:val="2"/>
-        </w:numPr>
-        <w:spacing w:after="60" w:line="276"/>
-      </w:pPr>
-      <w:r>
-        <w:rPr>
-          <w:b/>
-          <w:bCs/>
-        </w:rPr>
-        <w:t xml:space="preserve">Sin depender de la cuota: </w:t>
-      </w:r>
-      <w:r>
-        <w:t xml:space="preserve">exporta tus playlists a CSV con Exportify o TuneMyMusic y ponlas en Conexiones → Archivos exportados.</w:t>
+        <w:t xml:space="preserve">Reemplazar por su copia: </w:t>
+      </w:r>
+      <w:r>
+        <w:t xml:space="preserve">cambia cada perdida por su copia en todas sus playlists, en la misma posición, con respaldo y Deshacer en Historial. Después las eliminas en Rekordbox sin vaciar ninguna playlist.</w:t>
       </w:r>
     </w:p>
     <w:tbl>

</xml_diff>

<commit_message>
v2.20.1: Buscar en la papelera las canciones perdidas o que faltan
- papelera.py: lee la papelera del Mac (~/.Trash y .Trashes de discos externos), Windows
  ($Recycle.Bin con la ruta original de cada $I) y Linux; cruza con perdidas de Rekordbox
  (nombre + tamaño o duración) y con «faltan por descargar» (Artista - Título + duración).
- API trash_scan / trash_restore: devuelve cada una a su lugar (la perdida a su ruta exacta: Rekordbox
  la encuentra con cues y playlists; si la ruta está ocupada, se reconecta), con Historial.
- macOS sin «Acceso total al disco»: aviso claro de cómo darlo.
- UI: botón «🗑 Buscar en la papelera» en Perdidas en Rekordbox y en Faltan por descargar.

Co-Authored-By: Claude Opus 5.5 <noreply@anthropic.com>
Claude-Session: https://claude.ai/code/session_0178Q2opJQydcukphxsLu5ue
</commit_message>
<xml_diff>
--- a/docs/BrainOrder - Manual de usuario.docx
+++ b/docs/BrainOrder - Manual de usuario.docx
@@ -73,7 +73,7 @@
           <w:sz w:val="26"/>
           <w:szCs w:val="26"/>
         </w:rPr>
-        <w:t xml:space="preserve">Versión 2.20.0</w:t>
+        <w:t xml:space="preserve">Versión 2.20.1</w:t>
       </w:r>
     </w:p>
     <w:p>
@@ -10550,6 +10550,21 @@
         <w:rPr>
           <w:b/>
           <w:bCs/>
+        </w:rPr>
+        <w:t xml:space="preserve">🗑 Buscar en la papelera: </w:t>
+      </w:r>
+      <w:r>
+        <w:t xml:space="preserve">el botón de arriba (también está en «Faltan por descargar») revisa la papelera del Mac o de Windows y te muestra las canciones que están ahí y que son perdidas de Rekordbox o te faltan en tus playlists. Recuperar las devuelve a su lugar; queda en el Historial. En el Mac hay que darle a BrainOrder «Acceso total al disco» (Ajustes del Sistema → Privacidad y seguridad); si falta, BrainOrder te avisa.</w:t>
+      </w:r>
+    </w:p>
+    <w:p>
+      <w:pPr>
+        <w:spacing w:after="120" w:line="276"/>
+      </w:pPr>
+      <w:r>
+        <w:rPr>
+          <w:b/>
+          <w:bCs/>
           <w:color w:val="1F2A44"/>
         </w:rPr>
         <w:t xml:space="preserve">Paso a paso</w:t>
@@ -12907,7 +12922,7 @@
                 <w:sz w:val="24"/>
                 <w:szCs w:val="24"/>
               </w:rPr>
-              <w:t xml:space="preserve">v2.20.0</w:t>
+              <w:t xml:space="preserve">v2.20.1</w:t>
             </w:r>
           </w:p>
           <w:p>
@@ -12954,7 +12969,7 @@
                 <w:sz w:val="23"/>
                 <w:szCs w:val="23"/>
               </w:rPr>
-              <w:t xml:space="preserve">Rekordbox sin perder música</w:t>
+              <w:t xml:space="preserve">Buscar en la papelera</w:t>
             </w:r>
             <w:r>
               <w:rPr>
@@ -12973,7 +12988,128 @@
     <w:p>
       <w:pPr>
         <w:pStyle w:val="ListParagraph"/>
-        <w:keepNext/>
+        <w:numPr>
+          <w:ilvl w:val="0"/>
+          <w:numId w:val="2"/>
+        </w:numPr>
+        <w:spacing w:after="60" w:line="276"/>
+      </w:pPr>
+      <w:r>
+        <w:rPr>
+          <w:b/>
+          <w:bCs/>
+        </w:rPr>
+        <w:t xml:space="preserve">Nuevo: </w:t>
+      </w:r>
+      <w:r>
+        <w:t xml:space="preserve">«🗑 Buscar en la papelera» en Perdidas en Rekordbox y en Faltan por descargar: encuentra ahí las canciones perdidas o que te faltan y las devuelve a su lugar, con Deshacer.</w:t>
+      </w:r>
+    </w:p>
+    <w:tbl>
+      <w:tblPr>
+        <w:tblW w:type="dxa" w:w="9360"/>
+        <w:tblBorders>
+          <w:top w:val="single" w:color="auto" w:sz="4"/>
+          <w:left w:val="single" w:color="auto" w:sz="4"/>
+          <w:bottom w:val="single" w:color="auto" w:sz="4"/>
+          <w:right w:val="single" w:color="auto" w:sz="4"/>
+          <w:insideH w:val="single" w:color="auto" w:sz="4"/>
+          <w:insideV w:val="single" w:color="auto" w:sz="4"/>
+        </w:tblBorders>
+      </w:tblPr>
+      <w:tblGrid>
+        <w:gridCol w:w="1900"/>
+        <w:gridCol w:w="7460"/>
+      </w:tblGrid>
+      <w:tr>
+        <w:tc>
+          <w:tcPr>
+            <w:tcW w:type="dxa" w:w="1900"/>
+            <w:tcBorders>
+              <w:top w:val="single" w:color="D5D9E0" w:sz="4"/>
+              <w:left w:val="single" w:color="D5D9E0" w:sz="4"/>
+              <w:bottom w:val="single" w:color="D5D9E0" w:sz="4"/>
+              <w:right w:val="single" w:color="D5D9E0" w:sz="4"/>
+            </w:tcBorders>
+            <w:shd w:fill="1F2A44" w:color="auto" w:val="clear"/>
+            <w:tcMar>
+              <w:top w:type="dxa" w:w="80"/>
+              <w:left w:type="dxa" w:w="140"/>
+              <w:bottom w:type="dxa" w:w="80"/>
+              <w:right w:type="dxa" w:w="140"/>
+            </w:tcMar>
+            <w:vAlign w:val="center"/>
+          </w:tcPr>
+          <w:p>
+            <w:pPr>
+              <w:keepNext/>
+              <w:keepLines/>
+            </w:pPr>
+            <w:r>
+              <w:rPr>
+                <w:b/>
+                <w:bCs/>
+                <w:color w:val="FFFFFF"/>
+                <w:sz w:val="24"/>
+                <w:szCs w:val="24"/>
+              </w:rPr>
+              <w:t xml:space="preserve">v2.20.0</w:t>
+            </w:r>
+          </w:p>
+          <w:p>
+            <w:pPr>
+              <w:keepNext/>
+            </w:pPr>
+            <w:r>
+              <w:rPr>
+                <w:color w:val="FFFFFF"/>
+                <w:sz w:val="17"/>
+                <w:szCs w:val="17"/>
+              </w:rPr>
+              <w:t xml:space="preserve">27 oct 2026</w:t>
+            </w:r>
+          </w:p>
+        </w:tc>
+        <w:tc>
+          <w:tcPr>
+            <w:tcW w:type="dxa" w:w="7460"/>
+            <w:tcBorders>
+              <w:top w:val="single" w:color="D5D9E0" w:sz="4"/>
+              <w:left w:val="single" w:color="D5D9E0" w:sz="4"/>
+              <w:bottom w:val="single" w:color="D5D9E0" w:sz="4"/>
+              <w:right w:val="single" w:color="D5D9E0" w:sz="4"/>
+            </w:tcBorders>
+            <w:shd w:fill="F5F7FA" w:color="auto" w:val="clear"/>
+            <w:tcMar>
+              <w:top w:type="dxa" w:w="80"/>
+              <w:left w:type="dxa" w:w="160"/>
+              <w:bottom w:type="dxa" w:w="80"/>
+              <w:right w:type="dxa" w:w="140"/>
+            </w:tcMar>
+            <w:vAlign w:val="center"/>
+          </w:tcPr>
+          <w:p>
+            <w:pPr>
+              <w:keepNext/>
+            </w:pPr>
+            <w:r>
+              <w:rPr>
+                <w:b/>
+                <w:bCs/>
+                <w:color w:val="1F2A44"/>
+                <w:sz w:val="23"/>
+                <w:szCs w:val="23"/>
+              </w:rPr>
+              <w:t xml:space="preserve">Rekordbox sin perder música</w:t>
+            </w:r>
+          </w:p>
+        </w:tc>
+      </w:tr>
+    </w:tbl>
+    <w:p>
+      <w:pPr>
+        <w:pStyle w:val="ListParagraph"/>
+        <w:keepNext w:val="false"/>
         <w:keepLines/>
         <w:numPr>
           <w:ilvl w:val="0"/>
@@ -12995,7 +13131,7 @@
     <w:p>
       <w:pPr>
         <w:pStyle w:val="ListParagraph"/>
-        <w:keepNext/>
+        <w:keepNext w:val="false"/>
         <w:keepLines/>
         <w:numPr>
           <w:ilvl w:val="0"/>
@@ -13017,7 +13153,7 @@
     <w:p>
       <w:pPr>
         <w:pStyle w:val="ListParagraph"/>
-        <w:keepNext/>
+        <w:keepNext w:val="false"/>
         <w:keepLines/>
         <w:numPr>
           <w:ilvl w:val="0"/>

</xml_diff>

<commit_message>
v2.20.2: el botón Recuperar del aviso de _duplicados ya no se sale de la pantalla
Co-Authored-By: Claude Opus 5.5 <noreply@anthropic.com>
Claude-Session: https://claude.ai/code/session_0178Q2opJQydcukphxsLu5ue
</commit_message>
<xml_diff>
--- a/docs/BrainOrder - Manual de usuario.docx
+++ b/docs/BrainOrder - Manual de usuario.docx
@@ -73,7 +73,7 @@
           <w:sz w:val="26"/>
           <w:szCs w:val="26"/>
         </w:rPr>
-        <w:t xml:space="preserve">Versión 2.20.1</w:t>
+        <w:t xml:space="preserve">Versión 2.20.2</w:t>
       </w:r>
     </w:p>
     <w:p>
@@ -12922,7 +12922,7 @@
                 <w:sz w:val="24"/>
                 <w:szCs w:val="24"/>
               </w:rPr>
-              <w:t xml:space="preserve">v2.20.1</w:t>
+              <w:t xml:space="preserve">v2.20.2</w:t>
             </w:r>
           </w:p>
           <w:p>
@@ -12969,7 +12969,7 @@
                 <w:sz w:val="23"/>
                 <w:szCs w:val="23"/>
               </w:rPr>
-              <w:t xml:space="preserve">Buscar en la papelera</w:t>
+              <w:t xml:space="preserve">Botón Recuperar visible</w:t>
             </w:r>
             <w:r>
               <w:rPr>
@@ -12980,6 +12980,127 @@
                 <w:szCs w:val="18"/>
               </w:rPr>
               <w:t xml:space="preserve">   · versión actual</w:t>
+            </w:r>
+          </w:p>
+        </w:tc>
+      </w:tr>
+    </w:tbl>
+    <w:p>
+      <w:pPr>
+        <w:pStyle w:val="ListParagraph"/>
+        <w:numPr>
+          <w:ilvl w:val="0"/>
+          <w:numId w:val="2"/>
+        </w:numPr>
+        <w:spacing w:after="60" w:line="276"/>
+      </w:pPr>
+      <w:r>
+        <w:rPr>
+          <w:b/>
+          <w:bCs/>
+        </w:rPr>
+        <w:t xml:space="preserve">Arreglado: </w:t>
+      </w:r>
+      <w:r>
+        <w:t xml:space="preserve">el botón «Recuperar» del aviso de _duplicados quedaba fuera de la pantalla cuando los nombres de las canciones eran largos.</w:t>
+      </w:r>
+    </w:p>
+    <w:tbl>
+      <w:tblPr>
+        <w:tblW w:type="dxa" w:w="9360"/>
+        <w:tblBorders>
+          <w:top w:val="single" w:color="auto" w:sz="4"/>
+          <w:left w:val="single" w:color="auto" w:sz="4"/>
+          <w:bottom w:val="single" w:color="auto" w:sz="4"/>
+          <w:right w:val="single" w:color="auto" w:sz="4"/>
+          <w:insideH w:val="single" w:color="auto" w:sz="4"/>
+          <w:insideV w:val="single" w:color="auto" w:sz="4"/>
+        </w:tblBorders>
+      </w:tblPr>
+      <w:tblGrid>
+        <w:gridCol w:w="1900"/>
+        <w:gridCol w:w="7460"/>
+      </w:tblGrid>
+      <w:tr>
+        <w:tc>
+          <w:tcPr>
+            <w:tcW w:type="dxa" w:w="1900"/>
+            <w:tcBorders>
+              <w:top w:val="single" w:color="D5D9E0" w:sz="4"/>
+              <w:left w:val="single" w:color="D5D9E0" w:sz="4"/>
+              <w:bottom w:val="single" w:color="D5D9E0" w:sz="4"/>
+              <w:right w:val="single" w:color="D5D9E0" w:sz="4"/>
+            </w:tcBorders>
+            <w:shd w:fill="1F2A44" w:color="auto" w:val="clear"/>
+            <w:tcMar>
+              <w:top w:type="dxa" w:w="80"/>
+              <w:left w:type="dxa" w:w="140"/>
+              <w:bottom w:type="dxa" w:w="80"/>
+              <w:right w:type="dxa" w:w="140"/>
+            </w:tcMar>
+            <w:vAlign w:val="center"/>
+          </w:tcPr>
+          <w:p>
+            <w:pPr>
+              <w:keepNext/>
+              <w:keepLines/>
+            </w:pPr>
+            <w:r>
+              <w:rPr>
+                <w:b/>
+                <w:bCs/>
+                <w:color w:val="FFFFFF"/>
+                <w:sz w:val="24"/>
+                <w:szCs w:val="24"/>
+              </w:rPr>
+              <w:t xml:space="preserve">v2.20.1</w:t>
+            </w:r>
+          </w:p>
+          <w:p>
+            <w:pPr>
+              <w:keepNext/>
+            </w:pPr>
+            <w:r>
+              <w:rPr>
+                <w:color w:val="FFFFFF"/>
+                <w:sz w:val="17"/>
+                <w:szCs w:val="17"/>
+              </w:rPr>
+              <w:t xml:space="preserve">27 oct 2026</w:t>
+            </w:r>
+          </w:p>
+        </w:tc>
+        <w:tc>
+          <w:tcPr>
+            <w:tcW w:type="dxa" w:w="7460"/>
+            <w:tcBorders>
+              <w:top w:val="single" w:color="D5D9E0" w:sz="4"/>
+              <w:left w:val="single" w:color="D5D9E0" w:sz="4"/>
+              <w:bottom w:val="single" w:color="D5D9E0" w:sz="4"/>
+              <w:right w:val="single" w:color="D5D9E0" w:sz="4"/>
+            </w:tcBorders>
+            <w:shd w:fill="F5F7FA" w:color="auto" w:val="clear"/>
+            <w:tcMar>
+              <w:top w:type="dxa" w:w="80"/>
+              <w:left w:type="dxa" w:w="160"/>
+              <w:bottom w:type="dxa" w:w="80"/>
+              <w:right w:type="dxa" w:w="140"/>
+            </w:tcMar>
+            <w:vAlign w:val="center"/>
+          </w:tcPr>
+          <w:p>
+            <w:pPr>
+              <w:keepNext/>
+            </w:pPr>
+            <w:r>
+              <w:rPr>
+                <w:b/>
+                <w:bCs/>
+                <w:color w:val="1F2A44"/>
+                <w:sz w:val="23"/>
+                <w:szCs w:val="23"/>
+              </w:rPr>
+              <w:t xml:space="preserve">Buscar en la papelera</w:t>
             </w:r>
           </w:p>
         </w:tc>

</xml_diff>

<commit_message>
v2.20.3: encontrar descargas en otra carpeta; Recuperar de _duplicados vuelve a la playlist
- Diagnóstico (27 oct): en ~/Music/Nuevas descargas musicales hay 61 descargas; 18 faltan en sus
  playlists con nombre y duración exactos (p. ej. Chromeo - Fall Back 2U 5:50) y el análisis de hoy
  las sigue dando por faltantes: esa carpeta no es la que BrainOrder revisa como descargas.
- Faltan por descargar muestra la carpeta de descargas configurada; «🔎 Buscar en otras carpetas»
  (Descargas, Escritorio y carpetas de Música fuera de Ajustes) cruza con lo que falta, mueve a la
  playlist con Historial y ofrece usar la carpeta como descargas (save_settings).
- rescate._origin: un solo paso atrás (antes seguía la cadena hasta la carpeta de descargas).

Co-Authored-By: Claude Opus 5.5 <noreply@anthropic.com>
Claude-Session: https://claude.ai/code/session_0178Q2opJQydcukphxsLu5ue
</commit_message>
<xml_diff>
--- a/docs/BrainOrder - Manual de usuario.docx
+++ b/docs/BrainOrder - Manual de usuario.docx
@@ -73,7 +73,7 @@
           <w:sz w:val="26"/>
           <w:szCs w:val="26"/>
         </w:rPr>
-        <w:t xml:space="preserve">Versión 2.20.2</w:t>
+        <w:t xml:space="preserve">Versión 2.20.3</w:t>
       </w:r>
     </w:p>
     <w:p>
@@ -12922,7 +12922,7 @@
                 <w:sz w:val="24"/>
                 <w:szCs w:val="24"/>
               </w:rPr>
-              <w:t xml:space="preserve">v2.20.2</w:t>
+              <w:t xml:space="preserve">v2.20.3</w:t>
             </w:r>
           </w:p>
           <w:p>
@@ -12969,7 +12969,7 @@
                 <w:sz w:val="23"/>
                 <w:szCs w:val="23"/>
               </w:rPr>
-              <w:t xml:space="preserve">Botón Recuperar visible</w:t>
+              <w:t xml:space="preserve">Descargas en otra carpeta</w:t>
             </w:r>
             <w:r>
               <w:rPr>
@@ -12980,6 +12980,127 @@
                 <w:szCs w:val="18"/>
               </w:rPr>
               <w:t xml:space="preserve">   · versión actual</w:t>
+            </w:r>
+          </w:p>
+        </w:tc>
+      </w:tr>
+    </w:tbl>
+    <w:p>
+      <w:pPr>
+        <w:pStyle w:val="ListParagraph"/>
+        <w:numPr>
+          <w:ilvl w:val="0"/>
+          <w:numId w:val="2"/>
+        </w:numPr>
+        <w:spacing w:after="60" w:line="276"/>
+      </w:pPr>
+      <w:r>
+        <w:rPr>
+          <w:b/>
+          <w:bCs/>
+        </w:rPr>
+        <w:t xml:space="preserve">Nuevo: </w:t>
+      </w:r>
+      <w:r>
+        <w:t xml:space="preserve">«Faltan por descargar» dice en qué carpeta busca tus descargas; «🔎 Buscar en otras carpetas» encuentra las que bajaste en otro lado, las lleva a su playlist y ofrece usar esa carpeta. «Recuperar» de _duplicados devuelve cada canción a la carpeta de su playlist.</w:t>
+      </w:r>
+    </w:p>
+    <w:tbl>
+      <w:tblPr>
+        <w:tblW w:type="dxa" w:w="9360"/>
+        <w:tblBorders>
+          <w:top w:val="single" w:color="auto" w:sz="4"/>
+          <w:left w:val="single" w:color="auto" w:sz="4"/>
+          <w:bottom w:val="single" w:color="auto" w:sz="4"/>
+          <w:right w:val="single" w:color="auto" w:sz="4"/>
+          <w:insideH w:val="single" w:color="auto" w:sz="4"/>
+          <w:insideV w:val="single" w:color="auto" w:sz="4"/>
+        </w:tblBorders>
+      </w:tblPr>
+      <w:tblGrid>
+        <w:gridCol w:w="1900"/>
+        <w:gridCol w:w="7460"/>
+      </w:tblGrid>
+      <w:tr>
+        <w:tc>
+          <w:tcPr>
+            <w:tcW w:type="dxa" w:w="1900"/>
+            <w:tcBorders>
+              <w:top w:val="single" w:color="D5D9E0" w:sz="4"/>
+              <w:left w:val="single" w:color="D5D9E0" w:sz="4"/>
+              <w:bottom w:val="single" w:color="D5D9E0" w:sz="4"/>
+              <w:right w:val="single" w:color="D5D9E0" w:sz="4"/>
+            </w:tcBorders>
+            <w:shd w:fill="1F2A44" w:color="auto" w:val="clear"/>
+            <w:tcMar>
+              <w:top w:type="dxa" w:w="80"/>
+              <w:left w:type="dxa" w:w="140"/>
+              <w:bottom w:type="dxa" w:w="80"/>
+              <w:right w:type="dxa" w:w="140"/>
+            </w:tcMar>
+            <w:vAlign w:val="center"/>
+          </w:tcPr>
+          <w:p>
+            <w:pPr>
+              <w:keepNext/>
+              <w:keepLines/>
+            </w:pPr>
+            <w:r>
+              <w:rPr>
+                <w:b/>
+                <w:bCs/>
+                <w:color w:val="FFFFFF"/>
+                <w:sz w:val="24"/>
+                <w:szCs w:val="24"/>
+              </w:rPr>
+              <w:t xml:space="preserve">v2.20.2</w:t>
+            </w:r>
+          </w:p>
+          <w:p>
+            <w:pPr>
+              <w:keepNext/>
+            </w:pPr>
+            <w:r>
+              <w:rPr>
+                <w:color w:val="FFFFFF"/>
+                <w:sz w:val="17"/>
+                <w:szCs w:val="17"/>
+              </w:rPr>
+              <w:t xml:space="preserve">27 oct 2026</w:t>
+            </w:r>
+          </w:p>
+        </w:tc>
+        <w:tc>
+          <w:tcPr>
+            <w:tcW w:type="dxa" w:w="7460"/>
+            <w:tcBorders>
+              <w:top w:val="single" w:color="D5D9E0" w:sz="4"/>
+              <w:left w:val="single" w:color="D5D9E0" w:sz="4"/>
+              <w:bottom w:val="single" w:color="D5D9E0" w:sz="4"/>
+              <w:right w:val="single" w:color="D5D9E0" w:sz="4"/>
+            </w:tcBorders>
+            <w:shd w:fill="F5F7FA" w:color="auto" w:val="clear"/>
+            <w:tcMar>
+              <w:top w:type="dxa" w:w="80"/>
+              <w:left w:type="dxa" w:w="160"/>
+              <w:bottom w:type="dxa" w:w="80"/>
+              <w:right w:type="dxa" w:w="140"/>
+            </w:tcMar>
+            <w:vAlign w:val="center"/>
+          </w:tcPr>
+          <w:p>
+            <w:pPr>
+              <w:keepNext/>
+            </w:pPr>
+            <w:r>
+              <w:rPr>
+                <w:b/>
+                <w:bCs/>
+                <w:color w:val="1F2A44"/>
+                <w:sz w:val="23"/>
+                <w:szCs w:val="23"/>
+              </w:rPr>
+              <w:t xml:space="preserve">Botón Recuperar visible</w:t>
             </w:r>
           </w:p>
         </w:tc>

</xml_diff>

<commit_message>
v2.22.0: Sin playlist elige de qué carpeta lee; crear playlist nueva ahí mismo (y en Spotify) con su carpeta
Co-Authored-By: Claude Opus 5.5 <noreply@anthropic.com>
Claude-Session: https://claude.ai/code/session_0178Q2opJQydcukphxsLu5ue
</commit_message>
<xml_diff>
--- a/docs/BrainOrder - Manual de usuario.docx
+++ b/docs/BrainOrder - Manual de usuario.docx
@@ -73,7 +73,7 @@
           <w:sz w:val="26"/>
           <w:szCs w:val="26"/>
         </w:rPr>
-        <w:t xml:space="preserve">Versión 2.21.0</w:t>
+        <w:t xml:space="preserve">Versión 2.22.0</w:t>
       </w:r>
     </w:p>
     <w:p>
@@ -10740,7 +10740,7 @@
         <w:t xml:space="preserve">Sin playlist</w:t>
       </w:r>
       <w:r>
-        <w:t xml:space="preserve"> muestra las descargas que no coinciden con ninguna playlist y las canciones de tu carpeta _SIn Playlist. En cada una eliges a qué playlist va (★ la sugerida es donde más tienes de ese artista) y tocas </w:t>
+        <w:t xml:space="preserve"> muestra las descargas que no coinciden con ninguna playlist y las canciones de tu carpeta sin playlist (_SIn Playlist o la que elijas). En cada una eliges a qué playlist va (★ la sugerida es donde más tienes de ese artista) y tocas </w:t>
       </w:r>
       <w:r>
         <w:rPr>
@@ -10805,6 +10805,48 @@
             </w:pPr>
             <w:r>
               <w:t xml:space="preserve">Antes de volver a leer tus playlists, BrainOrder pasa a Spotify lo que quedó pendiente (fusiones, canciones agregadas, playlists importadas). Lo ya buscado queda guardado, así que una pausa a la mitad no hace repetir nada. En «N pendientes» (arriba) ves por qué no avanzan y puedes darle «Hacerlos ya».</w:t>
+            </w:r>
+          </w:p>
+          <w:p>
+            <w:pPr>
+              <w:spacing w:after="60"/>
+            </w:pPr>
+            <w:r>
+              <w:rPr>
+                <w:b/>
+                <w:bCs/>
+                <w:color w:val="2F6FDE"/>
+              </w:rPr>
+              <w:t xml:space="preserve">📂 De qué carpeta lee</w:t>
+            </w:r>
+          </w:p>
+          <w:p>
+            <w:pPr>
+              <w:spacing w:after="40" w:line="264"/>
+            </w:pPr>
+            <w:r>
+              <w:t xml:space="preserve">Arriba ves de qué carpeta saca las canciones sin playlist (sola encuentra _SIn Playlist). «📁 Cambiar carpeta…» elige otra, «➕ Agregar otra carpeta» lee de varias a la vez (también sus subcarpetas) y ✕ quita una. «Que la detecte sola» vuelve a lo automático. Tus descargas se revisan siempre.</w:t>
+            </w:r>
+          </w:p>
+          <w:p>
+            <w:pPr>
+              <w:spacing w:after="60"/>
+            </w:pPr>
+            <w:r>
+              <w:rPr>
+                <w:b/>
+                <w:bCs/>
+                <w:color w:val="2F6FDE"/>
+              </w:rPr>
+              <w:t xml:space="preserve">➕ Playlist nueva</w:t>
+            </w:r>
+          </w:p>
+          <w:p>
+            <w:pPr>
+              <w:spacing w:after="40" w:line="264"/>
+            </w:pPr>
+            <w:r>
+              <w:t xml:space="preserve">Si ninguna playlist te sirve, elige «➕ Crear playlist nueva…» en la lista de la canción o el botón «➕ Playlist nueva» para las marcadas. Le pones nombre, ves la carpeta donde van a quedar sus canciones (con «📁 Elegir otra…» la cambias) y decides si se crea también en Spotify. Se crea al tocar Llevar; si Spotify está en pausa, pasa allá sola después. Si ya tienes una con ese nombre, van a esa.</w:t>
             </w:r>
           </w:p>
         </w:tc>
@@ -13020,7 +13062,7 @@
                 <w:sz w:val="24"/>
                 <w:szCs w:val="24"/>
               </w:rPr>
-              <w:t xml:space="preserve">v2.21.0</w:t>
+              <w:t xml:space="preserve">v2.22.0</w:t>
             </w:r>
           </w:p>
           <w:p>
@@ -13067,7 +13109,7 @@
                 <w:sz w:val="23"/>
                 <w:szCs w:val="23"/>
               </w:rPr>
-              <w:t xml:space="preserve">Sin playlist y pendientes primero</w:t>
+              <w:t xml:space="preserve">Sin playlist: tu carpeta y playlists nuevas</w:t>
             </w:r>
             <w:r>
               <w:rPr>
@@ -13099,10 +13141,10 @@
           <w:b/>
           <w:bCs/>
         </w:rPr>
-        <w:t xml:space="preserve">Nuevo: </w:t>
-      </w:r>
-      <w:r>
-        <w:t xml:space="preserve">sección «Sin playlist»: eliges a qué playlist llevar las descargas sueltas y las de _SIn Playlist (con playlist sugerida). El archivo va a su carpeta y la canción se agrega a la playlist, también en Spotify.</w:t>
+        <w:t xml:space="preserve">Eliges la carpeta: </w:t>
+      </w:r>
+      <w:r>
+        <w:t xml:space="preserve">en «Sin playlist» escoges de qué carpeta (o varias) lee las canciones sin playlist, o dejas que la detecte sola. Tus descargas se revisan siempre.</w:t>
       </w:r>
     </w:p>
     <w:p>
@@ -13110,6 +13152,167 @@
         <w:pStyle w:val="ListParagraph"/>
         <w:keepNext/>
         <w:keepLines/>
+        <w:numPr>
+          <w:ilvl w:val="0"/>
+          <w:numId w:val="2"/>
+        </w:numPr>
+        <w:spacing w:after="60" w:line="276"/>
+      </w:pPr>
+      <w:r>
+        <w:rPr>
+          <w:b/>
+          <w:bCs/>
+        </w:rPr>
+        <w:t xml:space="preserve">Playlist nueva: </w:t>
+      </w:r>
+      <w:r>
+        <w:t xml:space="preserve">si ninguna te sirve, creas una playlist ahí mismo con su nombre, la carpeta donde quedan sus canciones y, si quieres, también en Spotify.</w:t>
+      </w:r>
+    </w:p>
+    <w:p>
+      <w:pPr>
+        <w:pStyle w:val="ListParagraph"/>
+        <w:numPr>
+          <w:ilvl w:val="0"/>
+          <w:numId w:val="2"/>
+        </w:numPr>
+        <w:spacing w:after="60" w:line="276"/>
+      </w:pPr>
+      <w:r>
+        <w:rPr>
+          <w:b/>
+          <w:bCs/>
+        </w:rPr>
+        <w:t xml:space="preserve">Seguro: </w:t>
+      </w:r>
+      <w:r>
+        <w:t xml:space="preserve">si ya tienes una playlist con ese nombre, las canciones van a esa; no deja usar como carpeta tu música entera, las descargas, _duplicados ni la de otra playlist.</w:t>
+      </w:r>
+    </w:p>
+    <w:tbl>
+      <w:tblPr>
+        <w:tblW w:type="dxa" w:w="9360"/>
+        <w:tblBorders>
+          <w:top w:val="single" w:color="auto" w:sz="4"/>
+          <w:left w:val="single" w:color="auto" w:sz="4"/>
+          <w:bottom w:val="single" w:color="auto" w:sz="4"/>
+          <w:right w:val="single" w:color="auto" w:sz="4"/>
+          <w:insideH w:val="single" w:color="auto" w:sz="4"/>
+          <w:insideV w:val="single" w:color="auto" w:sz="4"/>
+        </w:tblBorders>
+      </w:tblPr>
+      <w:tblGrid>
+        <w:gridCol w:w="1900"/>
+        <w:gridCol w:w="7460"/>
+      </w:tblGrid>
+      <w:tr>
+        <w:tc>
+          <w:tcPr>
+            <w:tcW w:type="dxa" w:w="1900"/>
+            <w:tcBorders>
+              <w:top w:val="single" w:color="D5D9E0" w:sz="4"/>
+              <w:left w:val="single" w:color="D5D9E0" w:sz="4"/>
+              <w:bottom w:val="single" w:color="D5D9E0" w:sz="4"/>
+              <w:right w:val="single" w:color="D5D9E0" w:sz="4"/>
+            </w:tcBorders>
+            <w:shd w:fill="1F2A44" w:color="auto" w:val="clear"/>
+            <w:tcMar>
+              <w:top w:type="dxa" w:w="80"/>
+              <w:left w:type="dxa" w:w="140"/>
+              <w:bottom w:type="dxa" w:w="80"/>
+              <w:right w:type="dxa" w:w="140"/>
+            </w:tcMar>
+            <w:vAlign w:val="center"/>
+          </w:tcPr>
+          <w:p>
+            <w:pPr>
+              <w:keepNext/>
+              <w:keepLines/>
+            </w:pPr>
+            <w:r>
+              <w:rPr>
+                <w:b/>
+                <w:bCs/>
+                <w:color w:val="FFFFFF"/>
+                <w:sz w:val="24"/>
+                <w:szCs w:val="24"/>
+              </w:rPr>
+              <w:t xml:space="preserve">v2.21.0</w:t>
+            </w:r>
+          </w:p>
+          <w:p>
+            <w:pPr>
+              <w:keepNext/>
+            </w:pPr>
+            <w:r>
+              <w:rPr>
+                <w:color w:val="FFFFFF"/>
+                <w:sz w:val="17"/>
+                <w:szCs w:val="17"/>
+              </w:rPr>
+              <w:t xml:space="preserve">27 oct 2026</w:t>
+            </w:r>
+          </w:p>
+        </w:tc>
+        <w:tc>
+          <w:tcPr>
+            <w:tcW w:type="dxa" w:w="7460"/>
+            <w:tcBorders>
+              <w:top w:val="single" w:color="D5D9E0" w:sz="4"/>
+              <w:left w:val="single" w:color="D5D9E0" w:sz="4"/>
+              <w:bottom w:val="single" w:color="D5D9E0" w:sz="4"/>
+              <w:right w:val="single" w:color="D5D9E0" w:sz="4"/>
+            </w:tcBorders>
+            <w:shd w:fill="F5F7FA" w:color="auto" w:val="clear"/>
+            <w:tcMar>
+              <w:top w:type="dxa" w:w="80"/>
+              <w:left w:type="dxa" w:w="160"/>
+              <w:bottom w:type="dxa" w:w="80"/>
+              <w:right w:type="dxa" w:w="140"/>
+            </w:tcMar>
+            <w:vAlign w:val="center"/>
+          </w:tcPr>
+          <w:p>
+            <w:pPr>
+              <w:keepNext/>
+            </w:pPr>
+            <w:r>
+              <w:rPr>
+                <w:b/>
+                <w:bCs/>
+                <w:color w:val="1F2A44"/>
+                <w:sz w:val="23"/>
+                <w:szCs w:val="23"/>
+              </w:rPr>
+              <w:t xml:space="preserve">Sin playlist y pendientes primero</w:t>
+            </w:r>
+          </w:p>
+        </w:tc>
+      </w:tr>
+    </w:tbl>
+    <w:p>
+      <w:pPr>
+        <w:pStyle w:val="ListParagraph"/>
+        <w:numPr>
+          <w:ilvl w:val="0"/>
+          <w:numId w:val="2"/>
+        </w:numPr>
+        <w:spacing w:after="60" w:line="276"/>
+      </w:pPr>
+      <w:r>
+        <w:rPr>
+          <w:b/>
+          <w:bCs/>
+        </w:rPr>
+        <w:t xml:space="preserve">Nuevo: </w:t>
+      </w:r>
+      <w:r>
+        <w:t xml:space="preserve">sección «Sin playlist»: eliges a qué playlist llevar las descargas sueltas y las de _SIn Playlist (con playlist sugerida). El archivo va a su carpeta y la canción se agrega a la playlist, también en Spotify.</w:t>
+      </w:r>
+    </w:p>
+    <w:p>
+      <w:pPr>
+        <w:pStyle w:val="ListParagraph"/>
         <w:numPr>
           <w:ilvl w:val="0"/>
           <w:numId w:val="2"/>

</xml_diff>

<commit_message>
v2.22.1: la carpeta de canciones sin playlist se llama _Sin Playlist
Co-Authored-By: Claude Opus 5.5 <noreply@anthropic.com>
Claude-Session: https://claude.ai/code/session_0178Q2opJQydcukphxsLu5ue
</commit_message>
<xml_diff>
--- a/docs/BrainOrder - Manual de usuario.docx
+++ b/docs/BrainOrder - Manual de usuario.docx
@@ -73,7 +73,7 @@
           <w:sz w:val="26"/>
           <w:szCs w:val="26"/>
         </w:rPr>
-        <w:t xml:space="preserve">Versión 2.22.0</w:t>
+        <w:t xml:space="preserve">Versión 2.22.1</w:t>
       </w:r>
     </w:p>
     <w:p>
@@ -10740,7 +10740,7 @@
         <w:t xml:space="preserve">Sin playlist</w:t>
       </w:r>
       <w:r>
-        <w:t xml:space="preserve"> muestra las descargas que no coinciden con ninguna playlist y las canciones de tu carpeta sin playlist (_SIn Playlist o la que elijas). En cada una eliges a qué playlist va (★ la sugerida es donde más tienes de ese artista) y tocas </w:t>
+        <w:t xml:space="preserve"> muestra las descargas que no coinciden con ninguna playlist y las canciones de tu carpeta sin playlist (_Sin Playlist o la que elijas). En cada una eliges a qué playlist va (★ la sugerida es donde más tienes de ese artista) y tocas </w:t>
       </w:r>
       <w:r>
         <w:rPr>
@@ -10826,6 +10826,27 @@
             </w:pPr>
             <w:r>
               <w:t xml:space="preserve">Arriba ves de qué carpeta saca las canciones sin playlist (sola encuentra _SIn Playlist). «📁 Cambiar carpeta…» elige otra, «➕ Agregar otra carpeta» lee de varias a la vez (también sus subcarpetas) y ✕ quita una. «Que la detecte sola» vuelve a lo automático. Tus descargas se revisan siempre.</w:t>
+            </w:r>
+          </w:p>
+          <w:p>
+            <w:pPr>
+              <w:spacing w:after="60"/>
+            </w:pPr>
+            <w:r>
+              <w:rPr>
+                <w:b/>
+                <w:bCs/>
+                <w:color w:val="2F6FDE"/>
+              </w:rPr>
+              <w:t xml:space="preserve">✏️ Se llama _Sin Playlist</w:t>
+            </w:r>
+          </w:p>
+          <w:p>
+            <w:pPr>
+              <w:spacing w:after="40" w:line="264"/>
+            </w:pPr>
+            <w:r>
+              <w:t xml:space="preserve">Si no elegiste carpeta, la de canciones sin playlist se llama _Sin Playlist: si la tuya tenía otro nombre se renombra (con los programas de DJ cerrados; las rutas se corrigen y queda en el Historial) y si no tenías ninguna se crea en tu carpeta de playlists. La que elijas tú conserva su nombre.</w:t>
             </w:r>
           </w:p>
           <w:p>
@@ -13062,7 +13083,7 @@
                 <w:sz w:val="24"/>
                 <w:szCs w:val="24"/>
               </w:rPr>
-              <w:t xml:space="preserve">v2.22.0</w:t>
+              <w:t xml:space="preserve">v2.22.1</w:t>
             </w:r>
           </w:p>
           <w:p>
@@ -13109,7 +13130,7 @@
                 <w:sz w:val="23"/>
                 <w:szCs w:val="23"/>
               </w:rPr>
-              <w:t xml:space="preserve">Sin playlist: tu carpeta y playlists nuevas</w:t>
+              <w:t xml:space="preserve">La carpeta se llama _Sin Playlist</w:t>
             </w:r>
             <w:r>
               <w:rPr>
@@ -13141,6 +13162,147 @@
           <w:b/>
           <w:bCs/>
         </w:rPr>
+        <w:t xml:space="preserve">Nombre fijo: </w:t>
+      </w:r>
+      <w:r>
+        <w:t xml:space="preserve">si no eliges carpeta en «Sin playlist», la de canciones sin playlist se llama _Sin Playlist. Si la tuya se llamaba distinto (por ejemplo _SIn Playlist) se renombra sola, corrigiendo las rutas en tus programas de DJ, y queda en el Historial.</w:t>
+      </w:r>
+    </w:p>
+    <w:p>
+      <w:pPr>
+        <w:pStyle w:val="ListParagraph"/>
+        <w:numPr>
+          <w:ilvl w:val="0"/>
+          <w:numId w:val="2"/>
+        </w:numPr>
+        <w:spacing w:after="60" w:line="276"/>
+      </w:pPr>
+      <w:r>
+        <w:rPr>
+          <w:b/>
+          <w:bCs/>
+        </w:rPr>
+        <w:t xml:space="preserve">Si no tienes ninguna: </w:t>
+      </w:r>
+      <w:r>
+        <w:t xml:space="preserve">se crea _Sin Playlist en tu carpeta de playlists. Si eliges tú la carpeta, no se toca su nombre.</w:t>
+      </w:r>
+    </w:p>
+    <w:tbl>
+      <w:tblPr>
+        <w:tblW w:type="dxa" w:w="9360"/>
+        <w:tblBorders>
+          <w:top w:val="single" w:color="auto" w:sz="4"/>
+          <w:left w:val="single" w:color="auto" w:sz="4"/>
+          <w:bottom w:val="single" w:color="auto" w:sz="4"/>
+          <w:right w:val="single" w:color="auto" w:sz="4"/>
+          <w:insideH w:val="single" w:color="auto" w:sz="4"/>
+          <w:insideV w:val="single" w:color="auto" w:sz="4"/>
+        </w:tblBorders>
+      </w:tblPr>
+      <w:tblGrid>
+        <w:gridCol w:w="1900"/>
+        <w:gridCol w:w="7460"/>
+      </w:tblGrid>
+      <w:tr>
+        <w:tc>
+          <w:tcPr>
+            <w:tcW w:type="dxa" w:w="1900"/>
+            <w:tcBorders>
+              <w:top w:val="single" w:color="D5D9E0" w:sz="4"/>
+              <w:left w:val="single" w:color="D5D9E0" w:sz="4"/>
+              <w:bottom w:val="single" w:color="D5D9E0" w:sz="4"/>
+              <w:right w:val="single" w:color="D5D9E0" w:sz="4"/>
+            </w:tcBorders>
+            <w:shd w:fill="1F2A44" w:color="auto" w:val="clear"/>
+            <w:tcMar>
+              <w:top w:type="dxa" w:w="80"/>
+              <w:left w:type="dxa" w:w="140"/>
+              <w:bottom w:type="dxa" w:w="80"/>
+              <w:right w:type="dxa" w:w="140"/>
+            </w:tcMar>
+            <w:vAlign w:val="center"/>
+          </w:tcPr>
+          <w:p>
+            <w:pPr>
+              <w:keepNext/>
+              <w:keepLines/>
+            </w:pPr>
+            <w:r>
+              <w:rPr>
+                <w:b/>
+                <w:bCs/>
+                <w:color w:val="FFFFFF"/>
+                <w:sz w:val="24"/>
+                <w:szCs w:val="24"/>
+              </w:rPr>
+              <w:t xml:space="preserve">v2.22.0</w:t>
+            </w:r>
+          </w:p>
+          <w:p>
+            <w:pPr>
+              <w:keepNext/>
+            </w:pPr>
+            <w:r>
+              <w:rPr>
+                <w:color w:val="FFFFFF"/>
+                <w:sz w:val="17"/>
+                <w:szCs w:val="17"/>
+              </w:rPr>
+              <w:t xml:space="preserve">27 oct 2026</w:t>
+            </w:r>
+          </w:p>
+        </w:tc>
+        <w:tc>
+          <w:tcPr>
+            <w:tcW w:type="dxa" w:w="7460"/>
+            <w:tcBorders>
+              <w:top w:val="single" w:color="D5D9E0" w:sz="4"/>
+              <w:left w:val="single" w:color="D5D9E0" w:sz="4"/>
+              <w:bottom w:val="single" w:color="D5D9E0" w:sz="4"/>
+              <w:right w:val="single" w:color="D5D9E0" w:sz="4"/>
+            </w:tcBorders>
+            <w:shd w:fill="F5F7FA" w:color="auto" w:val="clear"/>
+            <w:tcMar>
+              <w:top w:type="dxa" w:w="80"/>
+              <w:left w:type="dxa" w:w="160"/>
+              <w:bottom w:type="dxa" w:w="80"/>
+              <w:right w:type="dxa" w:w="140"/>
+            </w:tcMar>
+            <w:vAlign w:val="center"/>
+          </w:tcPr>
+          <w:p>
+            <w:pPr>
+              <w:keepNext/>
+            </w:pPr>
+            <w:r>
+              <w:rPr>
+                <w:b/>
+                <w:bCs/>
+                <w:color w:val="1F2A44"/>
+                <w:sz w:val="23"/>
+                <w:szCs w:val="23"/>
+              </w:rPr>
+              <w:t xml:space="preserve">Sin playlist: tu carpeta y playlists nuevas</w:t>
+            </w:r>
+          </w:p>
+        </w:tc>
+      </w:tr>
+    </w:tbl>
+    <w:p>
+      <w:pPr>
+        <w:pStyle w:val="ListParagraph"/>
+        <w:numPr>
+          <w:ilvl w:val="0"/>
+          <w:numId w:val="2"/>
+        </w:numPr>
+        <w:spacing w:after="60" w:line="276"/>
+      </w:pPr>
+      <w:r>
+        <w:rPr>
+          <w:b/>
+          <w:bCs/>
+        </w:rPr>
         <w:t xml:space="preserve">Eliges la carpeta: </w:t>
       </w:r>
       <w:r>
@@ -13150,8 +13312,6 @@
     <w:p>
       <w:pPr>
         <w:pStyle w:val="ListParagraph"/>
-        <w:keepNext/>
-        <w:keepLines/>
         <w:numPr>
           <w:ilvl w:val="0"/>
           <w:numId w:val="2"/>

</xml_diff>

<commit_message>
v2.23.0: Sugerencias de playlists por género/energía/BPM con criterios propios; Datos incompletos (artista desconocido, títulos, géneros, nombres)
Co-Authored-By: Claude Opus 5.5 <noreply@anthropic.com>
Claude-Session: https://claude.ai/code/session_0178Q2opJQydcukphxsLu5ue
</commit_message>
<xml_diff>
--- a/docs/BrainOrder - Manual de usuario.docx
+++ b/docs/BrainOrder - Manual de usuario.docx
@@ -73,7 +73,7 @@
           <w:sz w:val="26"/>
           <w:szCs w:val="26"/>
         </w:rPr>
-        <w:t xml:space="preserve">Versión 2.22.1</w:t>
+        <w:t xml:space="preserve">Versión 2.23.0</w:t>
       </w:r>
     </w:p>
     <w:p>
@@ -444,7 +444,7 @@
           <w:sz w:val="22"/>
           <w:szCs w:val="22"/>
         </w:rPr>
-        <w:t xml:space="preserve">	20</w:t>
+        <w:t xml:space="preserve">	21</w:t>
       </w:r>
     </w:p>
     <w:p>
@@ -470,7 +470,7 @@
           <w:sz w:val="22"/>
           <w:szCs w:val="22"/>
         </w:rPr>
-        <w:t xml:space="preserve">	21</w:t>
+        <w:t xml:space="preserve">	22</w:t>
       </w:r>
     </w:p>
     <w:p>
@@ -496,7 +496,7 @@
           <w:sz w:val="22"/>
           <w:szCs w:val="22"/>
         </w:rPr>
-        <w:t xml:space="preserve">	21</w:t>
+        <w:t xml:space="preserve">	22</w:t>
       </w:r>
     </w:p>
     <w:p>
@@ -522,7 +522,7 @@
           <w:sz w:val="22"/>
           <w:szCs w:val="22"/>
         </w:rPr>
-        <w:t xml:space="preserve">	21</w:t>
+        <w:t xml:space="preserve">	22</w:t>
       </w:r>
     </w:p>
     <w:p>
@@ -548,7 +548,7 @@
           <w:sz w:val="22"/>
           <w:szCs w:val="22"/>
         </w:rPr>
-        <w:t xml:space="preserve">	22</w:t>
+        <w:t xml:space="preserve">	23</w:t>
       </w:r>
     </w:p>
     <w:p>
@@ -574,7 +574,7 @@
           <w:sz w:val="22"/>
           <w:szCs w:val="22"/>
         </w:rPr>
-        <w:t xml:space="preserve">	22</w:t>
+        <w:t xml:space="preserve">	23</w:t>
       </w:r>
     </w:p>
     <w:p>
@@ -600,7 +600,7 @@
           <w:sz w:val="22"/>
           <w:szCs w:val="22"/>
         </w:rPr>
-        <w:t xml:space="preserve">	23</w:t>
+        <w:t xml:space="preserve">	24</w:t>
       </w:r>
     </w:p>
     <w:p>
@@ -626,7 +626,7 @@
           <w:sz w:val="22"/>
           <w:szCs w:val="22"/>
         </w:rPr>
-        <w:t xml:space="preserve">	24</w:t>
+        <w:t xml:space="preserve">	25</w:t>
       </w:r>
     </w:p>
     <w:p>
@@ -10880,6 +10880,151 @@
     </w:p>
     <w:p>
       <w:pPr>
+        <w:pStyle w:val="Heading2"/>
+      </w:pPr>
+      <w:r>
+        <w:t xml:space="preserve">Sugerencias</w:t>
+      </w:r>
+    </w:p>
+    <w:p>
+      <w:pPr>
+        <w:spacing w:after="120" w:line="276"/>
+      </w:pPr>
+      <w:r>
+        <w:t xml:space="preserve">En el menú, </w:t>
+      </w:r>
+      <w:r>
+        <w:rPr>
+          <w:b/>
+          <w:bCs/>
+        </w:rPr>
+        <w:t xml:space="preserve">Sugerencias</w:t>
+      </w:r>
+      <w:r>
+        <w:t xml:space="preserve"> te propone playlists para ordenar tu música según tus criterios: por género (la etiqueta de cada archivo), por energía (la de Mixed In Key), por BPM o combinados (Género + energía, Género + BPM). Eliges si mira toda tu música o solo las sin playlist y el mínimo de canciones. Marca las que quieras, cámbiales el nombre si quieres y toca </w:t>
+      </w:r>
+      <w:r>
+        <w:rPr>
+          <w:b/>
+          <w:bCs/>
+        </w:rPr>
+        <w:t xml:space="preserve">Crear</w:t>
+      </w:r>
+      <w:r>
+        <w:t xml:space="preserve">. Si ya tienes una playlist con ese nombre, se le suman las que le faltan.</w:t>
+      </w:r>
+    </w:p>
+    <w:p>
+      <w:pPr>
+        <w:spacing w:after="60"/>
+      </w:pPr>
+      <w:r>
+        <w:rPr>
+          <w:b/>
+          <w:bCs/>
+          <w:color w:val="2F6FDE"/>
+        </w:rPr>
+        <w:t xml:space="preserve">📁 No se mueve nada</w:t>
+      </w:r>
+    </w:p>
+    <w:p>
+      <w:pPr>
+        <w:spacing w:after="40" w:line="264"/>
+      </w:pPr>
+      <w:r>
+        <w:t xml:space="preserve">Crear una playlist sugerida no mueve ningún archivo: cada canción se queda en su carpeta y la playlist la usa desde ahí. Las nuevas quedan al final de tu prioridad (Reglas), así ninguna canción cambia de carpeta; solo las que no tienen otra playlist se ordenan ahí al Organizar. Para verlas en tus programas de DJ, dale a Organizar.</w:t>
+      </w:r>
+    </w:p>
+    <w:p>
+      <w:pPr>
+        <w:spacing w:after="60"/>
+      </w:pPr>
+      <w:r>
+        <w:rPr>
+          <w:b/>
+          <w:bCs/>
+          <w:color w:val="2F6FDE"/>
+        </w:rPr>
+        <w:t xml:space="preserve">✏️ Mis criterios</w:t>
+      </w:r>
+    </w:p>
+    <w:p>
+      <w:pPr>
+        <w:spacing w:after="40" w:line="264"/>
+      </w:pPr>
+      <w:r>
+        <w:t xml:space="preserve">Cada usuario ajusta los suyos: grupos de géneros (nombre de la playlist + palabras que lo reconocen, por ejemplo Reggaetón ← reggaeton, reguetón, urbano), qué hacer con los géneros que no entran en ningún grupo, rangos de energía y de BPM con su nombre, y cómo se llaman las combinadas ({genero} · {energia}). Abajo ves los géneros de tus canciones y a qué grupo van; los cambias con un clic. Si un género coincide con varios grupos, gana la palabra más específica. «Volver a los de fábrica» los deja como venían.</w:t>
+      </w:r>
+    </w:p>
+    <w:p>
+      <w:pPr>
+        <w:spacing w:after="120"/>
+      </w:pPr>
+    </w:p>
+    <w:p>
+      <w:pPr>
+        <w:pStyle w:val="Heading2"/>
+      </w:pPr>
+      <w:r>
+        <w:t xml:space="preserve">Datos incompletos</w:t>
+      </w:r>
+    </w:p>
+    <w:p>
+      <w:pPr>
+        <w:spacing w:after="120" w:line="276"/>
+      </w:pPr>
+      <w:r>
+        <w:t xml:space="preserve">En el menú, </w:t>
+      </w:r>
+      <w:r>
+        <w:rPr>
+          <w:b/>
+          <w:bCs/>
+        </w:rPr>
+        <w:t xml:space="preserve">Datos incompletos</w:t>
+      </w:r>
+      <w:r>
+        <w:t xml:space="preserve"> muestra las canciones con artista desconocido (Desconocido, Unknown Artist…), sin título, sin género o con un nombre de archivo que no es «Artista - Título». Para cada una propone los datos (de Spotify, del título o del nombre del archivo, sin la basura de las descargas como «(WWW.ELGENERO.COM)»). Corrige lo que haga falta, usa 🔎 para buscar en Spotify cómo se llama de verdad o ponle género a varias a la vez, y toca </w:t>
+      </w:r>
+      <w:r>
+        <w:rPr>
+          <w:b/>
+          <w:bCs/>
+        </w:rPr>
+        <w:t xml:space="preserve">Arreglar</w:t>
+      </w:r>
+      <w:r>
+        <w:t xml:space="preserve">.</w:t>
+      </w:r>
+    </w:p>
+    <w:p>
+      <w:pPr>
+        <w:spacing w:after="60"/>
+      </w:pPr>
+      <w:r>
+        <w:rPr>
+          <w:b/>
+          <w:bCs/>
+          <w:color w:val="2F6FDE"/>
+        </w:rPr>
+        <w:t xml:space="preserve">🛟 Seguro y reversible</w:t>
+      </w:r>
+    </w:p>
+    <w:p>
+      <w:pPr>
+        <w:spacing w:after="40" w:line="264"/>
+      </w:pPr>
+      <w:r>
+        <w:t xml:space="preserve">Se escriben artista, título y género en el archivo sin tocar cues, key ni energía de Mixed In Key. Si marcas «Renombrar», el archivo pasa a llamarse «Artista - Título» y sus rutas se corrigen en tus programas de DJ (Rekordbox cerrado). Deshacer en Historial devuelve nombres y etiquetas. En Rekordbox, los datos nuevos se ven con clic derecho → «Volver a cargar etiqueta».</w:t>
+      </w:r>
+    </w:p>
+    <w:p>
+      <w:pPr>
+        <w:spacing w:after="120"/>
+      </w:pPr>
+    </w:p>
+    <w:p>
+      <w:pPr>
         <w:pStyle w:val="Heading1"/>
         <w:pageBreakBefore/>
         <w:spacing w:after="200" w:before="120"/>
@@ -13083,7 +13228,7 @@
                 <w:sz w:val="24"/>
                 <w:szCs w:val="24"/>
               </w:rPr>
-              <w:t xml:space="preserve">v2.22.1</w:t>
+              <w:t xml:space="preserve">v2.23.0</w:t>
             </w:r>
           </w:p>
           <w:p>
@@ -13130,7 +13275,7 @@
                 <w:sz w:val="23"/>
                 <w:szCs w:val="23"/>
               </w:rPr>
-              <w:t xml:space="preserve">La carpeta se llama _Sin Playlist</w:t>
+              <w:t xml:space="preserve">Sugerencias y datos incompletos</w:t>
             </w:r>
             <w:r>
               <w:rPr>
@@ -13151,6 +13296,147 @@
         <w:pStyle w:val="ListParagraph"/>
         <w:keepNext/>
         <w:keepLines/>
+        <w:numPr>
+          <w:ilvl w:val="0"/>
+          <w:numId w:val="2"/>
+        </w:numPr>
+        <w:spacing w:after="60" w:line="276"/>
+      </w:pPr>
+      <w:r>
+        <w:rPr>
+          <w:b/>
+          <w:bCs/>
+        </w:rPr>
+        <w:t xml:space="preserve">Sugerencias: </w:t>
+      </w:r>
+      <w:r>
+        <w:t xml:space="preserve">playlists por género, energía o BPM (o combinados) con tus propios criterios: grupos de géneros, rangos y nombres que ajustas tú. Crearlas no mueve ningún archivo; también en Spotify si quieres.</w:t>
+      </w:r>
+    </w:p>
+    <w:p>
+      <w:pPr>
+        <w:pStyle w:val="ListParagraph"/>
+        <w:numPr>
+          <w:ilvl w:val="0"/>
+          <w:numId w:val="2"/>
+        </w:numPr>
+        <w:spacing w:after="60" w:line="276"/>
+      </w:pPr>
+      <w:r>
+        <w:rPr>
+          <w:b/>
+          <w:bCs/>
+        </w:rPr>
+        <w:t xml:space="preserve">Datos incompletos: </w:t>
+      </w:r>
+      <w:r>
+        <w:t xml:space="preserve">encuentra canciones con artista desconocido, sin título, sin género o con nombre que no es «Artista - Título», propone cómo completarlas y las arregla (etiquetas y nombre), con Deshacer.</w:t>
+      </w:r>
+    </w:p>
+    <w:tbl>
+      <w:tblPr>
+        <w:tblW w:type="dxa" w:w="9360"/>
+        <w:tblBorders>
+          <w:top w:val="single" w:color="auto" w:sz="4"/>
+          <w:left w:val="single" w:color="auto" w:sz="4"/>
+          <w:bottom w:val="single" w:color="auto" w:sz="4"/>
+          <w:right w:val="single" w:color="auto" w:sz="4"/>
+          <w:insideH w:val="single" w:color="auto" w:sz="4"/>
+          <w:insideV w:val="single" w:color="auto" w:sz="4"/>
+        </w:tblBorders>
+      </w:tblPr>
+      <w:tblGrid>
+        <w:gridCol w:w="1900"/>
+        <w:gridCol w:w="7460"/>
+      </w:tblGrid>
+      <w:tr>
+        <w:tc>
+          <w:tcPr>
+            <w:tcW w:type="dxa" w:w="1900"/>
+            <w:tcBorders>
+              <w:top w:val="single" w:color="D5D9E0" w:sz="4"/>
+              <w:left w:val="single" w:color="D5D9E0" w:sz="4"/>
+              <w:bottom w:val="single" w:color="D5D9E0" w:sz="4"/>
+              <w:right w:val="single" w:color="D5D9E0" w:sz="4"/>
+            </w:tcBorders>
+            <w:shd w:fill="1F2A44" w:color="auto" w:val="clear"/>
+            <w:tcMar>
+              <w:top w:type="dxa" w:w="80"/>
+              <w:left w:type="dxa" w:w="140"/>
+              <w:bottom w:type="dxa" w:w="80"/>
+              <w:right w:type="dxa" w:w="140"/>
+            </w:tcMar>
+            <w:vAlign w:val="center"/>
+          </w:tcPr>
+          <w:p>
+            <w:pPr>
+              <w:keepNext/>
+              <w:keepLines/>
+            </w:pPr>
+            <w:r>
+              <w:rPr>
+                <w:b/>
+                <w:bCs/>
+                <w:color w:val="FFFFFF"/>
+                <w:sz w:val="24"/>
+                <w:szCs w:val="24"/>
+              </w:rPr>
+              <w:t xml:space="preserve">v2.22.1</w:t>
+            </w:r>
+          </w:p>
+          <w:p>
+            <w:pPr>
+              <w:keepNext/>
+            </w:pPr>
+            <w:r>
+              <w:rPr>
+                <w:color w:val="FFFFFF"/>
+                <w:sz w:val="17"/>
+                <w:szCs w:val="17"/>
+              </w:rPr>
+              <w:t xml:space="preserve">27 oct 2026</w:t>
+            </w:r>
+          </w:p>
+        </w:tc>
+        <w:tc>
+          <w:tcPr>
+            <w:tcW w:type="dxa" w:w="7460"/>
+            <w:tcBorders>
+              <w:top w:val="single" w:color="D5D9E0" w:sz="4"/>
+              <w:left w:val="single" w:color="D5D9E0" w:sz="4"/>
+              <w:bottom w:val="single" w:color="D5D9E0" w:sz="4"/>
+              <w:right w:val="single" w:color="D5D9E0" w:sz="4"/>
+            </w:tcBorders>
+            <w:shd w:fill="F5F7FA" w:color="auto" w:val="clear"/>
+            <w:tcMar>
+              <w:top w:type="dxa" w:w="80"/>
+              <w:left w:type="dxa" w:w="160"/>
+              <w:bottom w:type="dxa" w:w="80"/>
+              <w:right w:type="dxa" w:w="140"/>
+            </w:tcMar>
+            <w:vAlign w:val="center"/>
+          </w:tcPr>
+          <w:p>
+            <w:pPr>
+              <w:keepNext/>
+            </w:pPr>
+            <w:r>
+              <w:rPr>
+                <w:b/>
+                <w:bCs/>
+                <w:color w:val="1F2A44"/>
+                <w:sz w:val="23"/>
+                <w:szCs w:val="23"/>
+              </w:rPr>
+              <w:t xml:space="preserve">La carpeta se llama _Sin Playlist</w:t>
+            </w:r>
+          </w:p>
+        </w:tc>
+      </w:tr>
+    </w:tbl>
+    <w:p>
+      <w:pPr>
+        <w:pStyle w:val="ListParagraph"/>
         <w:numPr>
           <w:ilvl w:val="0"/>
           <w:numId w:val="2"/>

</xml_diff>

<commit_message>
v2.24.0: Datos incompletos busca artista, título y género en Deezer y Apple Music (compara la duración)
Co-Authored-By: Claude Opus 5.5 <noreply@anthropic.com>
Claude-Session: https://claude.ai/code/session_0178Q2opJQydcukphxsLu5ue
</commit_message>
<xml_diff>
--- a/docs/BrainOrder - Manual de usuario.docx
+++ b/docs/BrainOrder - Manual de usuario.docx
@@ -73,7 +73,7 @@
           <w:sz w:val="26"/>
           <w:szCs w:val="26"/>
         </w:rPr>
-        <w:t xml:space="preserve">Versión 2.23.0</w:t>
+        <w:t xml:space="preserve">Versión 2.24.0</w:t>
       </w:r>
     </w:p>
     <w:p>
@@ -11020,6 +11020,27 @@
     </w:p>
     <w:p>
       <w:pPr>
+        <w:spacing w:after="60"/>
+      </w:pPr>
+      <w:r>
+        <w:rPr>
+          <w:b/>
+          <w:bCs/>
+          <w:color w:val="2F6FDE"/>
+        </w:rPr>
+        <w:t xml:space="preserve">🌐 Buscar datos en internet</w:t>
+      </w:r>
+    </w:p>
+    <w:p>
+      <w:pPr>
+        <w:spacing w:after="40" w:line="264"/>
+      </w:pPr>
+      <w:r>
+        <w:t xml:space="preserve">Marca las canciones (o deja ninguna para todas las de la lista) y toca «🌐 Buscar datos en internet». Busco en Deezer y, si no aparece, en Apple Music: gratis y sin gastar consultas de Spotify. Comparo cada resultado con la duración de tu archivo: si dura igual y el nombre se parece, lo pongo yo (✅, revísalo antes de Arreglar); si no, te dejo las posibles para elegir. Solo lleno lo que falta y, si tu archivo es un remix o un edit, lo conservo en el título. Puedes parar la búsqueda cuando quieras.</w:t>
+      </w:r>
+    </w:p>
+    <w:p>
+      <w:pPr>
         <w:spacing w:after="120"/>
       </w:pPr>
     </w:p>
@@ -13228,7 +13249,7 @@
                 <w:sz w:val="24"/>
                 <w:szCs w:val="24"/>
               </w:rPr>
-              <w:t xml:space="preserve">v2.23.0</w:t>
+              <w:t xml:space="preserve">v2.24.0</w:t>
             </w:r>
           </w:p>
           <w:p>
@@ -13275,7 +13296,7 @@
                 <w:sz w:val="23"/>
                 <w:szCs w:val="23"/>
               </w:rPr>
-              <w:t xml:space="preserve">Sugerencias y datos incompletos</w:t>
+              <w:t xml:space="preserve">Buscar datos en internet</w:t>
             </w:r>
             <w:r>
               <w:rPr>
@@ -13296,6 +13317,147 @@
         <w:pStyle w:val="ListParagraph"/>
         <w:keepNext/>
         <w:keepLines/>
+        <w:numPr>
+          <w:ilvl w:val="0"/>
+          <w:numId w:val="2"/>
+        </w:numPr>
+        <w:spacing w:after="60" w:line="276"/>
+      </w:pPr>
+      <w:r>
+        <w:rPr>
+          <w:b/>
+          <w:bCs/>
+        </w:rPr>
+        <w:t xml:space="preserve">🌐 Buscar datos en internet: </w:t>
+      </w:r>
+      <w:r>
+        <w:t xml:space="preserve">en «Datos incompletos» busca artista, título y género en Deezer y Apple Music (gratis, sin gastar Spotify). Si dura igual que tu archivo y se parece, la propuesta se pone sola; si no, eliges entre las posibles.</w:t>
+      </w:r>
+    </w:p>
+    <w:p>
+      <w:pPr>
+        <w:pStyle w:val="ListParagraph"/>
+        <w:numPr>
+          <w:ilvl w:val="0"/>
+          <w:numId w:val="2"/>
+        </w:numPr>
+        <w:spacing w:after="60" w:line="276"/>
+      </w:pPr>
+      <w:r>
+        <w:rPr>
+          <w:b/>
+          <w:bCs/>
+        </w:rPr>
+        <w:t xml:space="preserve">Se conserva la versión: </w:t>
+      </w:r>
+      <w:r>
+        <w:t xml:space="preserve">si tu archivo es un remix o un edit, el título lo mantiene. El 🔎 de cada canción busca a mano en Deezer, Apple Music y Spotify.</w:t>
+      </w:r>
+    </w:p>
+    <w:tbl>
+      <w:tblPr>
+        <w:tblW w:type="dxa" w:w="9360"/>
+        <w:tblBorders>
+          <w:top w:val="single" w:color="auto" w:sz="4"/>
+          <w:left w:val="single" w:color="auto" w:sz="4"/>
+          <w:bottom w:val="single" w:color="auto" w:sz="4"/>
+          <w:right w:val="single" w:color="auto" w:sz="4"/>
+          <w:insideH w:val="single" w:color="auto" w:sz="4"/>
+          <w:insideV w:val="single" w:color="auto" w:sz="4"/>
+        </w:tblBorders>
+      </w:tblPr>
+      <w:tblGrid>
+        <w:gridCol w:w="1900"/>
+        <w:gridCol w:w="7460"/>
+      </w:tblGrid>
+      <w:tr>
+        <w:tc>
+          <w:tcPr>
+            <w:tcW w:type="dxa" w:w="1900"/>
+            <w:tcBorders>
+              <w:top w:val="single" w:color="D5D9E0" w:sz="4"/>
+              <w:left w:val="single" w:color="D5D9E0" w:sz="4"/>
+              <w:bottom w:val="single" w:color="D5D9E0" w:sz="4"/>
+              <w:right w:val="single" w:color="D5D9E0" w:sz="4"/>
+            </w:tcBorders>
+            <w:shd w:fill="1F2A44" w:color="auto" w:val="clear"/>
+            <w:tcMar>
+              <w:top w:type="dxa" w:w="80"/>
+              <w:left w:type="dxa" w:w="140"/>
+              <w:bottom w:type="dxa" w:w="80"/>
+              <w:right w:type="dxa" w:w="140"/>
+            </w:tcMar>
+            <w:vAlign w:val="center"/>
+          </w:tcPr>
+          <w:p>
+            <w:pPr>
+              <w:keepNext/>
+              <w:keepLines/>
+            </w:pPr>
+            <w:r>
+              <w:rPr>
+                <w:b/>
+                <w:bCs/>
+                <w:color w:val="FFFFFF"/>
+                <w:sz w:val="24"/>
+                <w:szCs w:val="24"/>
+              </w:rPr>
+              <w:t xml:space="preserve">v2.23.0</w:t>
+            </w:r>
+          </w:p>
+          <w:p>
+            <w:pPr>
+              <w:keepNext/>
+            </w:pPr>
+            <w:r>
+              <w:rPr>
+                <w:color w:val="FFFFFF"/>
+                <w:sz w:val="17"/>
+                <w:szCs w:val="17"/>
+              </w:rPr>
+              <w:t xml:space="preserve">27 oct 2026</w:t>
+            </w:r>
+          </w:p>
+        </w:tc>
+        <w:tc>
+          <w:tcPr>
+            <w:tcW w:type="dxa" w:w="7460"/>
+            <w:tcBorders>
+              <w:top w:val="single" w:color="D5D9E0" w:sz="4"/>
+              <w:left w:val="single" w:color="D5D9E0" w:sz="4"/>
+              <w:bottom w:val="single" w:color="D5D9E0" w:sz="4"/>
+              <w:right w:val="single" w:color="D5D9E0" w:sz="4"/>
+            </w:tcBorders>
+            <w:shd w:fill="F5F7FA" w:color="auto" w:val="clear"/>
+            <w:tcMar>
+              <w:top w:type="dxa" w:w="80"/>
+              <w:left w:type="dxa" w:w="160"/>
+              <w:bottom w:type="dxa" w:w="80"/>
+              <w:right w:type="dxa" w:w="140"/>
+            </w:tcMar>
+            <w:vAlign w:val="center"/>
+          </w:tcPr>
+          <w:p>
+            <w:pPr>
+              <w:keepNext/>
+            </w:pPr>
+            <w:r>
+              <w:rPr>
+                <w:b/>
+                <w:bCs/>
+                <w:color w:val="1F2A44"/>
+                <w:sz w:val="23"/>
+                <w:szCs w:val="23"/>
+              </w:rPr>
+              <w:t xml:space="preserve">Sugerencias y datos incompletos</w:t>
+            </w:r>
+          </w:p>
+        </w:tc>
+      </w:tr>
+    </w:tbl>
+    <w:p>
+      <w:pPr>
+        <w:pStyle w:val="ListParagraph"/>
         <w:numPr>
           <w:ilvl w:val="0"/>
           <w:numId w:val="2"/>

</xml_diff>

<commit_message>
v2.24.1: solo se aparta a _duplicados la misma grabación; Perdidas y Recuperar reconocen la copia que se quedó (sin bucle)
Co-Authored-By: Claude Opus 5.5 <noreply@anthropic.com>
Claude-Session: https://claude.ai/code/session_0178Q2opJQydcukphxsLu5ue
</commit_message>
<xml_diff>
--- a/docs/BrainOrder - Manual de usuario.docx
+++ b/docs/BrainOrder - Manual de usuario.docx
@@ -73,7 +73,7 @@
           <w:sz w:val="26"/>
           <w:szCs w:val="26"/>
         </w:rPr>
-        <w:t xml:space="preserve">Versión 2.24.0</w:t>
+        <w:t xml:space="preserve">Versión 2.24.1</w:t>
       </w:r>
     </w:p>
     <w:p>
@@ -13249,7 +13249,7 @@
                 <w:sz w:val="24"/>
                 <w:szCs w:val="24"/>
               </w:rPr>
-              <w:t xml:space="preserve">v2.24.0</w:t>
+              <w:t xml:space="preserve">v2.24.1</w:t>
             </w:r>
           </w:p>
           <w:p>
@@ -13296,7 +13296,7 @@
                 <w:sz w:val="23"/>
                 <w:szCs w:val="23"/>
               </w:rPr>
-              <w:t xml:space="preserve">Buscar datos en internet</w:t>
+              <w:t xml:space="preserve">Se acabó el bucle de _duplicados</w:t>
             </w:r>
             <w:r>
               <w:rPr>
@@ -13317,6 +13317,147 @@
         <w:pStyle w:val="ListParagraph"/>
         <w:keepNext/>
         <w:keepLines/>
+        <w:numPr>
+          <w:ilvl w:val="0"/>
+          <w:numId w:val="2"/>
+        </w:numPr>
+        <w:spacing w:after="60" w:line="276"/>
+      </w:pPr>
+      <w:r>
+        <w:rPr>
+          <w:b/>
+          <w:bCs/>
+        </w:rPr>
+        <w:t xml:space="preserve">Arreglado: </w:t>
+      </w:r>
+      <w:r>
+        <w:t xml:space="preserve">Organizar apartaba a _duplicados una descarga solo por tener el mismo nombre que otra. Ahora tiene que ser la misma grabación (copia exacta o misma duración); si dura distinto se guardan las dos.</w:t>
+      </w:r>
+    </w:p>
+    <w:p>
+      <w:pPr>
+        <w:pStyle w:val="ListParagraph"/>
+        <w:numPr>
+          <w:ilvl w:val="0"/>
+          <w:numId w:val="2"/>
+        </w:numPr>
+        <w:spacing w:after="60" w:line="276"/>
+      </w:pPr>
+      <w:r>
+        <w:rPr>
+          <w:b/>
+          <w:bCs/>
+        </w:rPr>
+        <w:t xml:space="preserve">Arreglado: </w:t>
+      </w:r>
+      <w:r>
+        <w:t xml:space="preserve">Perdidas en Rekordbox y Recuperar mostraban como «única copia» canciones que sí tenían su copia (con otro nombre, o sin duración en Rekordbox). Ahora usan la misma regla y la copia que anotó Organizar o Unificar.</w:t>
+      </w:r>
+    </w:p>
+    <w:tbl>
+      <w:tblPr>
+        <w:tblW w:type="dxa" w:w="9360"/>
+        <w:tblBorders>
+          <w:top w:val="single" w:color="auto" w:sz="4"/>
+          <w:left w:val="single" w:color="auto" w:sz="4"/>
+          <w:bottom w:val="single" w:color="auto" w:sz="4"/>
+          <w:right w:val="single" w:color="auto" w:sz="4"/>
+          <w:insideH w:val="single" w:color="auto" w:sz="4"/>
+          <w:insideV w:val="single" w:color="auto" w:sz="4"/>
+        </w:tblBorders>
+      </w:tblPr>
+      <w:tblGrid>
+        <w:gridCol w:w="1900"/>
+        <w:gridCol w:w="7460"/>
+      </w:tblGrid>
+      <w:tr>
+        <w:tc>
+          <w:tcPr>
+            <w:tcW w:type="dxa" w:w="1900"/>
+            <w:tcBorders>
+              <w:top w:val="single" w:color="D5D9E0" w:sz="4"/>
+              <w:left w:val="single" w:color="D5D9E0" w:sz="4"/>
+              <w:bottom w:val="single" w:color="D5D9E0" w:sz="4"/>
+              <w:right w:val="single" w:color="D5D9E0" w:sz="4"/>
+            </w:tcBorders>
+            <w:shd w:fill="1F2A44" w:color="auto" w:val="clear"/>
+            <w:tcMar>
+              <w:top w:type="dxa" w:w="80"/>
+              <w:left w:type="dxa" w:w="140"/>
+              <w:bottom w:type="dxa" w:w="80"/>
+              <w:right w:type="dxa" w:w="140"/>
+            </w:tcMar>
+            <w:vAlign w:val="center"/>
+          </w:tcPr>
+          <w:p>
+            <w:pPr>
+              <w:keepNext/>
+              <w:keepLines/>
+            </w:pPr>
+            <w:r>
+              <w:rPr>
+                <w:b/>
+                <w:bCs/>
+                <w:color w:val="FFFFFF"/>
+                <w:sz w:val="24"/>
+                <w:szCs w:val="24"/>
+              </w:rPr>
+              <w:t xml:space="preserve">v2.24.0</w:t>
+            </w:r>
+          </w:p>
+          <w:p>
+            <w:pPr>
+              <w:keepNext/>
+            </w:pPr>
+            <w:r>
+              <w:rPr>
+                <w:color w:val="FFFFFF"/>
+                <w:sz w:val="17"/>
+                <w:szCs w:val="17"/>
+              </w:rPr>
+              <w:t xml:space="preserve">27 oct 2026</w:t>
+            </w:r>
+          </w:p>
+        </w:tc>
+        <w:tc>
+          <w:tcPr>
+            <w:tcW w:type="dxa" w:w="7460"/>
+            <w:tcBorders>
+              <w:top w:val="single" w:color="D5D9E0" w:sz="4"/>
+              <w:left w:val="single" w:color="D5D9E0" w:sz="4"/>
+              <w:bottom w:val="single" w:color="D5D9E0" w:sz="4"/>
+              <w:right w:val="single" w:color="D5D9E0" w:sz="4"/>
+            </w:tcBorders>
+            <w:shd w:fill="F5F7FA" w:color="auto" w:val="clear"/>
+            <w:tcMar>
+              <w:top w:type="dxa" w:w="80"/>
+              <w:left w:type="dxa" w:w="160"/>
+              <w:bottom w:type="dxa" w:w="80"/>
+              <w:right w:type="dxa" w:w="140"/>
+            </w:tcMar>
+            <w:vAlign w:val="center"/>
+          </w:tcPr>
+          <w:p>
+            <w:pPr>
+              <w:keepNext/>
+            </w:pPr>
+            <w:r>
+              <w:rPr>
+                <w:b/>
+                <w:bCs/>
+                <w:color w:val="1F2A44"/>
+                <w:sz w:val="23"/>
+                <w:szCs w:val="23"/>
+              </w:rPr>
+              <w:t xml:space="preserve">Buscar datos en internet</w:t>
+            </w:r>
+          </w:p>
+        </w:tc>
+      </w:tr>
+    </w:tbl>
+    <w:p>
+      <w:pPr>
+        <w:pStyle w:val="ListParagraph"/>
         <w:numPr>
           <w:ilvl w:val="0"/>
           <w:numId w:val="2"/>

</xml_diff>